<commit_message>
feat: Update App and doc
</commit_message>
<xml_diff>
--- a/Hệ thống thông tin quản trị nhân lực/doc/PTTK_HTTT_KPI.docx
+++ b/Hệ thống thông tin quản trị nhân lực/doc/PTTK_HTTT_KPI.docx
@@ -5,385 +5,654 @@
     <w:p>
       <w:pPr>
         <w:pBdr>
-          <w:top w:val="thickThinSmallGap" w:color="000000" w:sz="24" w:space="31"/>
-          <w:left w:val="thickThinSmallGap" w:color="000000" w:sz="24" w:space="4"/>
-          <w:bottom w:val="thinThickSmallGap" w:color="000000" w:sz="24" w:space="0"/>
-          <w:right w:val="thinThickSmallGap" w:color="000000" w:sz="24" w:space="4"/>
+          <w:top w:val="thickThinSmallGap" w:sz="24" w:space="31" w:color="000000"/>
+          <w:left w:val="thickThinSmallGap" w:sz="24" w:space="4" w:color="000000"/>
+          <w:bottom w:val="thinThickSmallGap" w:sz="24" w:space="0" w:color="000000"/>
+          <w:right w:val="thinThickSmallGap" w:sz="24" w:space="4" w:color="000000"/>
         </w:pBdr>
-        <w:spacing w:line="220" w:lineRule="auto"/>
+        <w:spacing w:line="240" w:lineRule="auto"/>
         <w:jc w:val="center"/>
-      </w:pPr>
-      <w:r>
-        <w:rPr>
-          <w:rFonts w:ascii="Times New Roman" w:cs="Times New Roman" w:eastAsia="Times New Roman" w:hAnsi="Times New Roman"/>
-          <w:b w:val="false"/>
-          <w:bCs w:val="false"/>
-          <w:color w:val="000000"/>
-          <w:sz w:val="26"/>
-          <w:szCs w:val="26"/>
-        </w:rPr>
-        <w:t xml:space="preserve">HỌC VIỆN CHÍNH TRỊ QUỐC GIA HỒ CHÍ MINH</w:t>
+        <w:rPr>
+          <w:rFonts w:eastAsia="DengXian"/>
+          <w:szCs w:val="28"/>
+          <w:lang w:eastAsia="zh-CN"/>
+        </w:rPr>
+      </w:pPr>
+      <w:r>
+        <w:rPr>
+          <w:rFonts w:eastAsia="DengXian"/>
+          <w:szCs w:val="28"/>
+          <w:lang w:eastAsia="zh-CN"/>
+        </w:rPr>
+        <w:t>HỌC VIỆN CHÍNH TRỊ QUỐC GIA HỒ CHÍ MINH</w:t>
       </w:r>
     </w:p>
     <w:p>
       <w:pPr>
         <w:pBdr>
-          <w:top w:val="thickThinSmallGap" w:color="000000" w:sz="24" w:space="31"/>
-          <w:left w:val="thickThinSmallGap" w:color="000000" w:sz="24" w:space="4"/>
-          <w:bottom w:val="thinThickSmallGap" w:color="000000" w:sz="24" w:space="0"/>
-          <w:right w:val="thinThickSmallGap" w:color="000000" w:sz="24" w:space="4"/>
+          <w:top w:val="thickThinSmallGap" w:sz="24" w:space="31" w:color="000000"/>
+          <w:left w:val="thickThinSmallGap" w:sz="24" w:space="4" w:color="000000"/>
+          <w:bottom w:val="thinThickSmallGap" w:sz="24" w:space="0" w:color="000000"/>
+          <w:right w:val="thinThickSmallGap" w:sz="24" w:space="4" w:color="000000"/>
         </w:pBdr>
-        <w:spacing w:line="220" w:lineRule="auto"/>
+        <w:spacing w:line="240" w:lineRule="auto"/>
         <w:jc w:val="center"/>
-      </w:pPr>
-      <w:r>
-        <w:rPr>
-          <w:rFonts w:ascii="Times New Roman" w:cs="Times New Roman" w:eastAsia="Times New Roman" w:hAnsi="Times New Roman"/>
+        <w:rPr>
+          <w:rFonts w:eastAsia="DengXian"/>
           <w:b/>
           <w:bCs/>
-          <w:color w:val="000000"/>
-          <w:sz w:val="26"/>
-          <w:szCs w:val="26"/>
-        </w:rPr>
-        <w:t xml:space="preserve">HỌC VIỆN HÀNH CHÍNH VÀ QUẢN TRỊ CÔNG</w:t>
-      </w:r>
-    </w:p>
-    <w:p>
-      <w:pPr>
-        <w:pBdr>
-          <w:top w:val="thickThinSmallGap" w:color="000000" w:sz="24" w:space="31"/>
-          <w:left w:val="thickThinSmallGap" w:color="000000" w:sz="24" w:space="4"/>
-          <w:bottom w:val="thinThickSmallGap" w:color="000000" w:sz="24" w:space="0"/>
-          <w:right w:val="thinThickSmallGap" w:color="000000" w:sz="24" w:space="4"/>
-        </w:pBdr>
-        <w:spacing w:line="220" w:lineRule="auto"/>
-        <w:jc w:val="center"/>
-      </w:pPr>
-    </w:p>
-    <w:p>
-      <w:pPr>
-        <w:pBdr>
-          <w:top w:val="thickThinSmallGap" w:color="000000" w:sz="24" w:space="31"/>
-          <w:left w:val="thickThinSmallGap" w:color="000000" w:sz="24" w:space="4"/>
-          <w:bottom w:val="thinThickSmallGap" w:color="000000" w:sz="24" w:space="0"/>
-          <w:right w:val="thinThickSmallGap" w:color="000000" w:sz="24" w:space="4"/>
-        </w:pBdr>
-        <w:spacing w:line="220" w:lineRule="auto"/>
-        <w:jc w:val="center"/>
-      </w:pPr>
-    </w:p>
-    <w:p>
-      <w:pPr>
-        <w:pBdr>
-          <w:top w:val="thickThinSmallGap" w:color="000000" w:sz="24" w:space="31"/>
-          <w:left w:val="thickThinSmallGap" w:color="000000" w:sz="24" w:space="4"/>
-          <w:bottom w:val="thinThickSmallGap" w:color="000000" w:sz="24" w:space="0"/>
-          <w:right w:val="thinThickSmallGap" w:color="000000" w:sz="24" w:space="4"/>
-        </w:pBdr>
-        <w:spacing w:line="220" w:lineRule="auto"/>
-        <w:jc w:val="center"/>
-      </w:pPr>
-    </w:p>
-    <w:p>
-      <w:pPr>
-        <w:pBdr>
-          <w:top w:val="thickThinSmallGap" w:color="000000" w:sz="24" w:space="31"/>
-          <w:left w:val="thickThinSmallGap" w:color="000000" w:sz="24" w:space="4"/>
-          <w:bottom w:val="thinThickSmallGap" w:color="000000" w:sz="24" w:space="0"/>
-          <w:right w:val="thinThickSmallGap" w:color="000000" w:sz="24" w:space="4"/>
-        </w:pBdr>
-        <w:spacing w:line="220" w:lineRule="auto"/>
-        <w:jc w:val="center"/>
-      </w:pPr>
-    </w:p>
-    <w:p>
-      <w:pPr>
-        <w:pBdr>
-          <w:top w:val="thickThinSmallGap" w:color="000000" w:sz="24" w:space="31"/>
-          <w:left w:val="thickThinSmallGap" w:color="000000" w:sz="24" w:space="4"/>
-          <w:bottom w:val="thinThickSmallGap" w:color="000000" w:sz="24" w:space="0"/>
-          <w:right w:val="thinThickSmallGap" w:color="000000" w:sz="24" w:space="4"/>
-        </w:pBdr>
-        <w:spacing w:line="220" w:lineRule="auto"/>
-        <w:jc w:val="center"/>
-      </w:pPr>
-      <w:r>
-        <w:rPr>
-          <w:rFonts w:ascii="Times New Roman" w:cs="Times New Roman" w:eastAsia="Times New Roman" w:hAnsi="Times New Roman"/>
+          <w:szCs w:val="28"/>
+          <w:lang w:eastAsia="zh-CN"/>
+        </w:rPr>
+      </w:pPr>
+      <w:r>
+        <w:rPr>
+          <w:rFonts w:eastAsia="DengXian"/>
           <w:b/>
           <w:bCs/>
-          <w:color w:val="000000"/>
-          <w:sz w:val="28"/>
           <w:szCs w:val="28"/>
-        </w:rPr>
-        <w:t xml:space="preserve">TÊN ĐỀ TÀI:</w:t>
+          <w:lang w:eastAsia="zh-CN"/>
+        </w:rPr>
+        <w:t>HỌC VIỆN HÀNH CHÍNH VÀ QUẢN TRỊ CÔNG</w:t>
       </w:r>
     </w:p>
     <w:p>
       <w:pPr>
         <w:pBdr>
-          <w:top w:val="thickThinSmallGap" w:color="000000" w:sz="24" w:space="31"/>
-          <w:left w:val="thickThinSmallGap" w:color="000000" w:sz="24" w:space="4"/>
-          <w:bottom w:val="thinThickSmallGap" w:color="000000" w:sz="24" w:space="0"/>
-          <w:right w:val="thinThickSmallGap" w:color="000000" w:sz="24" w:space="4"/>
+          <w:top w:val="thickThinSmallGap" w:sz="24" w:space="31" w:color="000000"/>
+          <w:left w:val="thickThinSmallGap" w:sz="24" w:space="4" w:color="000000"/>
+          <w:bottom w:val="thinThickSmallGap" w:sz="24" w:space="0" w:color="000000"/>
+          <w:right w:val="thinThickSmallGap" w:sz="24" w:space="4" w:color="000000"/>
         </w:pBdr>
-        <w:spacing w:line="220" w:lineRule="auto"/>
+        <w:spacing w:line="240" w:lineRule="auto"/>
+        <w:rPr>
+          <w:rFonts w:eastAsia="DengXian"/>
+          <w:szCs w:val="28"/>
+          <w:lang w:eastAsia="zh-CN"/>
+        </w:rPr>
+      </w:pPr>
+    </w:p>
+    <w:p>
+      <w:pPr>
+        <w:pBdr>
+          <w:top w:val="thickThinSmallGap" w:sz="24" w:space="31" w:color="000000"/>
+          <w:left w:val="thickThinSmallGap" w:sz="24" w:space="4" w:color="000000"/>
+          <w:bottom w:val="thinThickSmallGap" w:sz="24" w:space="0" w:color="000000"/>
+          <w:right w:val="thinThickSmallGap" w:sz="24" w:space="4" w:color="000000"/>
+        </w:pBdr>
+        <w:spacing w:line="240" w:lineRule="auto"/>
+        <w:rPr>
+          <w:rFonts w:eastAsia="DengXian"/>
+          <w:szCs w:val="28"/>
+          <w:lang w:eastAsia="zh-CN"/>
+        </w:rPr>
+      </w:pPr>
+      <w:r>
+        <w:rPr>
+          <w:rFonts w:eastAsia="DengXian"/>
+          <w:noProof/>
+          <w:szCs w:val="28"/>
+          <w:lang w:eastAsia="zh-CN"/>
+        </w:rPr>
+        <w:drawing>
+          <wp:anchor distT="0" distB="0" distL="114300" distR="114300" simplePos="0" relativeHeight="251848704" behindDoc="0" locked="0" layoutInCell="1" allowOverlap="1" wp14:anchorId="6FCCB530" wp14:editId="1B4FEE12">
+            <wp:simplePos x="0" y="0"/>
+            <wp:positionH relativeFrom="column">
+              <wp:posOffset>1216025</wp:posOffset>
+            </wp:positionH>
+            <wp:positionV relativeFrom="paragraph">
+              <wp:posOffset>320675</wp:posOffset>
+            </wp:positionV>
+            <wp:extent cx="3362325" cy="965835"/>
+            <wp:effectExtent l="0" t="0" r="9525" b="5715"/>
+            <wp:wrapNone/>
+            <wp:docPr id="958090058" name="image1.png"/>
+            <wp:cNvGraphicFramePr/>
+            <a:graphic xmlns:a="http://schemas.openxmlformats.org/drawingml/2006/main">
+              <a:graphicData uri="http://schemas.openxmlformats.org/drawingml/2006/picture">
+                <pic:pic xmlns:pic="http://schemas.openxmlformats.org/drawingml/2006/picture">
+                  <pic:nvPicPr>
+                    <pic:cNvPr id="0" name="image1.png"/>
+                    <pic:cNvPicPr preferRelativeResize="0"/>
+                  </pic:nvPicPr>
+                  <pic:blipFill>
+                    <a:blip r:embed="rId18" cstate="print">
+                      <a:extLst>
+                        <a:ext uri="{28A0092B-C50C-407E-A947-70E740481C1C}">
+                          <a14:useLocalDpi xmlns:a14="http://schemas.microsoft.com/office/drawing/2010/main" val="0"/>
+                        </a:ext>
+                      </a:extLst>
+                    </a:blip>
+                    <a:srcRect/>
+                    <a:stretch>
+                      <a:fillRect/>
+                    </a:stretch>
+                  </pic:blipFill>
+                  <pic:spPr>
+                    <a:xfrm>
+                      <a:off x="0" y="0"/>
+                      <a:ext cx="3362325" cy="965835"/>
+                    </a:xfrm>
+                    <a:prstGeom prst="rect">
+                      <a:avLst/>
+                    </a:prstGeom>
+                    <a:ln/>
+                  </pic:spPr>
+                </pic:pic>
+              </a:graphicData>
+            </a:graphic>
+          </wp:anchor>
+        </w:drawing>
+      </w:r>
+    </w:p>
+    <w:p>
+      <w:pPr>
+        <w:pBdr>
+          <w:top w:val="thickThinSmallGap" w:sz="24" w:space="31" w:color="000000"/>
+          <w:left w:val="thickThinSmallGap" w:sz="24" w:space="4" w:color="000000"/>
+          <w:bottom w:val="thinThickSmallGap" w:sz="24" w:space="0" w:color="000000"/>
+          <w:right w:val="thinThickSmallGap" w:sz="24" w:space="4" w:color="000000"/>
+        </w:pBdr>
+        <w:spacing w:line="240" w:lineRule="auto"/>
+        <w:rPr>
+          <w:rFonts w:eastAsia="DengXian"/>
+          <w:szCs w:val="28"/>
+          <w:lang w:eastAsia="zh-CN"/>
+        </w:rPr>
+      </w:pPr>
+    </w:p>
+    <w:p>
+      <w:pPr>
+        <w:pBdr>
+          <w:top w:val="thickThinSmallGap" w:sz="24" w:space="31" w:color="000000"/>
+          <w:left w:val="thickThinSmallGap" w:sz="24" w:space="4" w:color="000000"/>
+          <w:bottom w:val="thinThickSmallGap" w:sz="24" w:space="0" w:color="000000"/>
+          <w:right w:val="thinThickSmallGap" w:sz="24" w:space="4" w:color="000000"/>
+        </w:pBdr>
+        <w:spacing w:line="240" w:lineRule="auto"/>
+        <w:rPr>
+          <w:rFonts w:eastAsia="DengXian"/>
+          <w:b/>
+          <w:szCs w:val="28"/>
+          <w:lang w:eastAsia="zh-CN"/>
+        </w:rPr>
+      </w:pPr>
+    </w:p>
+    <w:p>
+      <w:pPr>
+        <w:pBdr>
+          <w:top w:val="thickThinSmallGap" w:sz="24" w:space="31" w:color="000000"/>
+          <w:left w:val="thickThinSmallGap" w:sz="24" w:space="4" w:color="000000"/>
+          <w:bottom w:val="thinThickSmallGap" w:sz="24" w:space="0" w:color="000000"/>
+          <w:right w:val="thinThickSmallGap" w:sz="24" w:space="4" w:color="000000"/>
+        </w:pBdr>
+        <w:spacing w:line="240" w:lineRule="auto"/>
+        <w:rPr>
+          <w:rFonts w:eastAsia="DengXian"/>
+          <w:b/>
+          <w:szCs w:val="28"/>
+          <w:lang w:eastAsia="zh-CN"/>
+        </w:rPr>
+      </w:pPr>
+    </w:p>
+    <w:p>
+      <w:pPr>
+        <w:pBdr>
+          <w:top w:val="thickThinSmallGap" w:sz="24" w:space="31" w:color="000000"/>
+          <w:left w:val="thickThinSmallGap" w:sz="24" w:space="4" w:color="000000"/>
+          <w:bottom w:val="thinThickSmallGap" w:sz="24" w:space="0" w:color="000000"/>
+          <w:right w:val="thinThickSmallGap" w:sz="24" w:space="4" w:color="000000"/>
+        </w:pBdr>
+        <w:spacing w:line="240" w:lineRule="auto"/>
+        <w:rPr>
+          <w:rFonts w:eastAsia="DengXian"/>
+          <w:b/>
+          <w:szCs w:val="28"/>
+          <w:lang w:eastAsia="zh-CN"/>
+        </w:rPr>
+      </w:pPr>
+    </w:p>
+    <w:p>
+      <w:pPr>
+        <w:pBdr>
+          <w:top w:val="thickThinSmallGap" w:sz="24" w:space="31" w:color="000000"/>
+          <w:left w:val="thickThinSmallGap" w:sz="24" w:space="4" w:color="000000"/>
+          <w:bottom w:val="thinThickSmallGap" w:sz="24" w:space="0" w:color="000000"/>
+          <w:right w:val="thinThickSmallGap" w:sz="24" w:space="4" w:color="000000"/>
+        </w:pBdr>
+        <w:spacing w:line="240" w:lineRule="auto"/>
         <w:jc w:val="center"/>
+        <w:rPr>
+          <w:rFonts w:eastAsia="DengXian"/>
+          <w:b/>
+          <w:szCs w:val="28"/>
+          <w:lang w:eastAsia="zh-CN"/>
+        </w:rPr>
       </w:pPr>
     </w:p>
     <w:p>
       <w:pPr>
         <w:pBdr>
-          <w:top w:val="thickThinSmallGap" w:color="000000" w:sz="24" w:space="31"/>
-          <w:left w:val="thickThinSmallGap" w:color="000000" w:sz="24" w:space="4"/>
-          <w:bottom w:val="thinThickSmallGap" w:color="000000" w:sz="24" w:space="0"/>
-          <w:right w:val="thinThickSmallGap" w:color="000000" w:sz="24" w:space="4"/>
+          <w:top w:val="thickThinSmallGap" w:sz="24" w:space="31" w:color="000000"/>
+          <w:left w:val="thickThinSmallGap" w:sz="24" w:space="4" w:color="000000"/>
+          <w:bottom w:val="thinThickSmallGap" w:sz="24" w:space="0" w:color="000000"/>
+          <w:right w:val="thinThickSmallGap" w:sz="24" w:space="4" w:color="000000"/>
         </w:pBdr>
-        <w:spacing w:line="220" w:lineRule="auto"/>
+        <w:spacing w:line="240" w:lineRule="auto"/>
         <w:jc w:val="center"/>
-      </w:pPr>
-      <w:r>
-        <w:rPr>
-          <w:rFonts w:ascii="Times New Roman" w:cs="Times New Roman" w:eastAsia="Times New Roman" w:hAnsi="Times New Roman"/>
+        <w:rPr>
+          <w:rFonts w:eastAsia="DengXian"/>
+          <w:b/>
+          <w:szCs w:val="28"/>
+          <w:lang w:eastAsia="zh-CN"/>
+        </w:rPr>
+      </w:pPr>
+      <w:r>
+        <w:rPr>
+          <w:rFonts w:eastAsia="DengXian"/>
+          <w:b/>
+          <w:szCs w:val="28"/>
+          <w:lang w:eastAsia="zh-CN"/>
+        </w:rPr>
+        <w:t>TÊN ĐỀ TÀI:</w:t>
+      </w:r>
+    </w:p>
+    <w:p>
+      <w:pPr>
+        <w:pBdr>
+          <w:top w:val="thickThinSmallGap" w:sz="24" w:space="31" w:color="000000"/>
+          <w:left w:val="thickThinSmallGap" w:sz="24" w:space="4" w:color="000000"/>
+          <w:bottom w:val="thinThickSmallGap" w:sz="24" w:space="0" w:color="000000"/>
+          <w:right w:val="thinThickSmallGap" w:sz="24" w:space="4" w:color="000000"/>
+        </w:pBdr>
+        <w:spacing w:line="240" w:lineRule="auto"/>
+        <w:jc w:val="center"/>
+        <w:rPr>
           <w:b/>
           <w:bCs/>
-          <w:color w:val="000000"/>
-          <w:sz w:val="36"/>
-          <w:szCs w:val="36"/>
-        </w:rPr>
-        <w:t xml:space="preserve">PHÂN TÍCH VÀ THIẾT KẾ HỆ THỐNG THÔNG TIN ĐÁNH GIÁ HIỆU QUẢ CÔNG VIỆC (KPI) CHO KHỐI DOANH NGHIỆP VÀ CƠ QUAN NHÀ NƯỚC</w:t>
-      </w:r>
+          <w:sz w:val="40"/>
+          <w:szCs w:val="40"/>
+          <w:lang w:val="en-US"/>
+        </w:rPr>
+      </w:pPr>
     </w:p>
     <w:p>
       <w:pPr>
         <w:pBdr>
-          <w:top w:val="thickThinSmallGap" w:color="000000" w:sz="24" w:space="31"/>
-          <w:left w:val="thickThinSmallGap" w:color="000000" w:sz="24" w:space="4"/>
-          <w:bottom w:val="thinThickSmallGap" w:color="000000" w:sz="24" w:space="0"/>
-          <w:right w:val="thinThickSmallGap" w:color="000000" w:sz="24" w:space="4"/>
+          <w:top w:val="thickThinSmallGap" w:sz="24" w:space="31" w:color="000000"/>
+          <w:left w:val="thickThinSmallGap" w:sz="24" w:space="4" w:color="000000"/>
+          <w:bottom w:val="thinThickSmallGap" w:sz="24" w:space="0" w:color="000000"/>
+          <w:right w:val="thinThickSmallGap" w:sz="24" w:space="4" w:color="000000"/>
         </w:pBdr>
-        <w:spacing w:line="220" w:lineRule="auto"/>
+        <w:spacing w:line="240" w:lineRule="auto"/>
         <w:jc w:val="center"/>
-      </w:pPr>
-      <w:r>
-        <w:rPr>
-          <w:rFonts w:ascii="Times New Roman" w:cs="Times New Roman" w:eastAsia="Times New Roman" w:hAnsi="Times New Roman"/>
+        <w:rPr>
+          <w:rFonts w:eastAsia="DengXian"/>
           <w:b/>
           <w:bCs/>
-          <w:color w:val="000000"/>
-          <w:sz w:val="26"/>
-          <w:szCs w:val="26"/>
-        </w:rPr>
-        <w:t xml:space="preserve">---------------------------------------------------------</w:t>
-      </w:r>
-    </w:p>
-    <w:p>
-      <w:pPr>
-        <w:pBdr>
-          <w:top w:val="thickThinSmallGap" w:color="000000" w:sz="24" w:space="31"/>
-          <w:left w:val="thickThinSmallGap" w:color="000000" w:sz="24" w:space="4"/>
-          <w:bottom w:val="thinThickSmallGap" w:color="000000" w:sz="24" w:space="0"/>
-          <w:right w:val="thinThickSmallGap" w:color="000000" w:sz="24" w:space="4"/>
-        </w:pBdr>
-        <w:spacing w:line="220" w:lineRule="auto"/>
-        <w:jc w:val="center"/>
-      </w:pPr>
-    </w:p>
-    <w:p>
-      <w:pPr>
-        <w:pBdr>
-          <w:top w:val="thickThinSmallGap" w:color="000000" w:sz="24" w:space="31"/>
-          <w:left w:val="thickThinSmallGap" w:color="000000" w:sz="24" w:space="4"/>
-          <w:bottom w:val="thinThickSmallGap" w:color="000000" w:sz="24" w:space="0"/>
-          <w:right w:val="thinThickSmallGap" w:color="000000" w:sz="24" w:space="4"/>
-        </w:pBdr>
-        <w:spacing w:line="220" w:lineRule="auto"/>
-        <w:jc w:val="center"/>
-      </w:pPr>
-    </w:p>
-    <w:p>
-      <w:pPr>
-        <w:pBdr>
-          <w:top w:val="thickThinSmallGap" w:color="000000" w:sz="24" w:space="31"/>
-          <w:left w:val="thickThinSmallGap" w:color="000000" w:sz="24" w:space="4"/>
-          <w:bottom w:val="thinThickSmallGap" w:color="000000" w:sz="24" w:space="0"/>
-          <w:right w:val="thinThickSmallGap" w:color="000000" w:sz="24" w:space="4"/>
-        </w:pBdr>
-        <w:spacing w:line="220" w:lineRule="auto"/>
-        <w:jc w:val="center"/>
-      </w:pPr>
-      <w:r>
-        <w:rPr>
-          <w:rFonts w:ascii="Times New Roman" w:cs="Times New Roman" w:eastAsia="Times New Roman" w:hAnsi="Times New Roman"/>
+          <w:sz w:val="40"/>
+          <w:szCs w:val="40"/>
+          <w:lang w:eastAsia="zh-CN"/>
+        </w:rPr>
+      </w:pPr>
+      <w:r>
+        <w:rPr>
           <w:b/>
           <w:bCs/>
-          <w:color w:val="000000"/>
-          <w:sz w:val="28"/>
+          <w:sz w:val="40"/>
+          <w:szCs w:val="40"/>
+          <w:lang w:val="en-US"/>
+        </w:rPr>
+        <w:t>PHÂN TÍCH VÀ THIẾT KẾ HỆ THỐNG THÔNG TIN ĐÁNH GIÁ HIỆU QUẢ CÔNG VIỆC (KPI) CHO KHỐI DOANH NGHIỆP VÀ CƠ QUAN NHÀ NƯỚC</w:t>
+      </w:r>
+    </w:p>
+    <w:p>
+      <w:pPr>
+        <w:pBdr>
+          <w:top w:val="thickThinSmallGap" w:sz="24" w:space="31" w:color="000000"/>
+          <w:left w:val="thickThinSmallGap" w:sz="24" w:space="4" w:color="000000"/>
+          <w:bottom w:val="thinThickSmallGap" w:sz="24" w:space="0" w:color="000000"/>
+          <w:right w:val="thinThickSmallGap" w:sz="24" w:space="4" w:color="000000"/>
+        </w:pBdr>
+        <w:spacing w:line="240" w:lineRule="auto"/>
+        <w:jc w:val="center"/>
+        <w:rPr>
+          <w:rFonts w:eastAsia="DengXian"/>
+          <w:b/>
           <w:szCs w:val="28"/>
-        </w:rPr>
-        <w:t xml:space="preserve">BÀI TẬP LỚN KẾT THÚC HỌC PHẦN</w:t>
+          <w:lang w:eastAsia="zh-CN"/>
+        </w:rPr>
+      </w:pPr>
+      <w:r>
+        <w:rPr>
+          <w:rFonts w:eastAsia="DengXian"/>
+          <w:b/>
+          <w:szCs w:val="28"/>
+          <w:lang w:eastAsia="zh-CN"/>
+        </w:rPr>
+        <w:t>---------------------------------------------------------</w:t>
       </w:r>
     </w:p>
     <w:p>
       <w:pPr>
         <w:pBdr>
-          <w:top w:val="thickThinSmallGap" w:color="000000" w:sz="24" w:space="31"/>
-          <w:left w:val="thickThinSmallGap" w:color="000000" w:sz="24" w:space="4"/>
-          <w:bottom w:val="thinThickSmallGap" w:color="000000" w:sz="24" w:space="0"/>
-          <w:right w:val="thinThickSmallGap" w:color="000000" w:sz="24" w:space="4"/>
+          <w:top w:val="thickThinSmallGap" w:sz="24" w:space="31" w:color="000000"/>
+          <w:left w:val="thickThinSmallGap" w:sz="24" w:space="4" w:color="000000"/>
+          <w:bottom w:val="thinThickSmallGap" w:sz="24" w:space="0" w:color="000000"/>
+          <w:right w:val="thinThickSmallGap" w:sz="24" w:space="4" w:color="000000"/>
         </w:pBdr>
-        <w:spacing w:line="220" w:lineRule="auto"/>
+        <w:spacing w:line="240" w:lineRule="auto"/>
+        <w:rPr>
+          <w:rFonts w:eastAsia="DengXian"/>
+          <w:b/>
+          <w:szCs w:val="28"/>
+          <w:lang w:eastAsia="zh-CN"/>
+        </w:rPr>
+      </w:pPr>
+    </w:p>
+    <w:p>
+      <w:pPr>
+        <w:pBdr>
+          <w:top w:val="thickThinSmallGap" w:sz="24" w:space="31" w:color="000000"/>
+          <w:left w:val="thickThinSmallGap" w:sz="24" w:space="4" w:color="000000"/>
+          <w:bottom w:val="thinThickSmallGap" w:sz="24" w:space="0" w:color="000000"/>
+          <w:right w:val="thinThickSmallGap" w:sz="24" w:space="4" w:color="000000"/>
+        </w:pBdr>
+        <w:spacing w:line="240" w:lineRule="auto"/>
+        <w:rPr>
+          <w:rFonts w:eastAsia="DengXian"/>
+          <w:b/>
+          <w:szCs w:val="28"/>
+          <w:lang w:eastAsia="zh-CN"/>
+        </w:rPr>
+      </w:pPr>
+    </w:p>
+    <w:p>
+      <w:pPr>
+        <w:pBdr>
+          <w:top w:val="thickThinSmallGap" w:sz="24" w:space="31" w:color="000000"/>
+          <w:left w:val="thickThinSmallGap" w:sz="24" w:space="4" w:color="000000"/>
+          <w:bottom w:val="thinThickSmallGap" w:sz="24" w:space="0" w:color="000000"/>
+          <w:right w:val="thinThickSmallGap" w:sz="24" w:space="4" w:color="000000"/>
+        </w:pBdr>
+        <w:spacing w:line="240" w:lineRule="auto"/>
         <w:jc w:val="center"/>
-      </w:pPr>
+        <w:rPr>
+          <w:rFonts w:eastAsia="DengXian"/>
+          <w:b/>
+          <w:szCs w:val="28"/>
+          <w:lang w:eastAsia="zh-CN"/>
+        </w:rPr>
+      </w:pPr>
+      <w:r>
+        <w:rPr>
+          <w:rFonts w:eastAsia="DengXian"/>
+          <w:b/>
+          <w:szCs w:val="28"/>
+          <w:lang w:eastAsia="zh-CN"/>
+        </w:rPr>
+        <w:t>BÀI TẬP LỚN KẾT THÚC HỌC PHẦN</w:t>
+      </w:r>
     </w:p>
     <w:p>
       <w:pPr>
         <w:pBdr>
-          <w:top w:val="thickThinSmallGap" w:color="000000" w:sz="24" w:space="31"/>
-          <w:left w:val="thickThinSmallGap" w:color="000000" w:sz="24" w:space="4"/>
-          <w:bottom w:val="thinThickSmallGap" w:color="000000" w:sz="24" w:space="0"/>
-          <w:right w:val="thinThickSmallGap" w:color="000000" w:sz="24" w:space="4"/>
+          <w:top w:val="thickThinSmallGap" w:sz="24" w:space="31" w:color="000000"/>
+          <w:left w:val="thickThinSmallGap" w:sz="24" w:space="4" w:color="000000"/>
+          <w:bottom w:val="thinThickSmallGap" w:sz="24" w:space="0" w:color="000000"/>
+          <w:right w:val="thinThickSmallGap" w:sz="24" w:space="4" w:color="000000"/>
         </w:pBdr>
-        <w:spacing w:line="220" w:lineRule="auto"/>
+        <w:spacing w:line="240" w:lineRule="auto"/>
         <w:jc w:val="center"/>
+        <w:rPr>
+          <w:rFonts w:eastAsia="DengXian"/>
+          <w:b/>
+          <w:szCs w:val="28"/>
+          <w:lang w:eastAsia="zh-CN"/>
+        </w:rPr>
       </w:pPr>
     </w:p>
     <w:p>
       <w:pPr>
         <w:pBdr>
-          <w:top w:val="thickThinSmallGap" w:color="000000" w:sz="24" w:space="31"/>
-          <w:left w:val="thickThinSmallGap" w:color="000000" w:sz="24" w:space="4"/>
-          <w:bottom w:val="thinThickSmallGap" w:color="000000" w:sz="24" w:space="0"/>
-          <w:right w:val="thinThickSmallGap" w:color="000000" w:sz="24" w:space="4"/>
+          <w:top w:val="thickThinSmallGap" w:sz="24" w:space="31" w:color="000000"/>
+          <w:left w:val="thickThinSmallGap" w:sz="24" w:space="4" w:color="000000"/>
+          <w:bottom w:val="thinThickSmallGap" w:sz="24" w:space="0" w:color="000000"/>
+          <w:right w:val="thinThickSmallGap" w:sz="24" w:space="4" w:color="000000"/>
         </w:pBdr>
-        <w:spacing w:line="220" w:lineRule="auto"/>
+        <w:spacing w:line="240" w:lineRule="auto"/>
+        <w:rPr>
+          <w:rFonts w:eastAsia="DengXian"/>
+          <w:b/>
+          <w:szCs w:val="28"/>
+          <w:lang w:eastAsia="zh-CN"/>
+        </w:rPr>
+      </w:pPr>
+    </w:p>
+    <w:p>
+      <w:pPr>
+        <w:pBdr>
+          <w:top w:val="thickThinSmallGap" w:sz="24" w:space="31" w:color="000000"/>
+          <w:left w:val="thickThinSmallGap" w:sz="24" w:space="4" w:color="000000"/>
+          <w:bottom w:val="thinThickSmallGap" w:sz="24" w:space="0" w:color="000000"/>
+          <w:right w:val="thinThickSmallGap" w:sz="24" w:space="4" w:color="000000"/>
+        </w:pBdr>
+        <w:tabs>
+          <w:tab w:val="left" w:pos="3686"/>
+        </w:tabs>
+        <w:spacing w:line="240" w:lineRule="auto"/>
         <w:ind w:firstLine="1890"/>
-        <w:jc w:val="left"/>
-      </w:pPr>
-      <w:r>
-        <w:rPr>
-          <w:rFonts w:ascii="Times New Roman" w:cs="Times New Roman" w:eastAsia="Times New Roman" w:hAnsi="Times New Roman"/>
+        <w:rPr>
+          <w:rFonts w:eastAsia="DengXian"/>
+          <w:b/>
+          <w:szCs w:val="28"/>
+          <w:lang w:eastAsia="zh-CN"/>
+        </w:rPr>
+      </w:pPr>
+      <w:r>
+        <w:rPr>
+          <w:rFonts w:eastAsia="DengXian"/>
+          <w:b/>
+          <w:szCs w:val="28"/>
+          <w:lang w:eastAsia="zh-CN"/>
+        </w:rPr>
+        <w:t>Học phần: Hệ thống thông tin tác nghiệp</w:t>
+      </w:r>
+    </w:p>
+    <w:p>
+      <w:pPr>
+        <w:pBdr>
+          <w:top w:val="thickThinSmallGap" w:sz="24" w:space="31" w:color="000000"/>
+          <w:left w:val="thickThinSmallGap" w:sz="24" w:space="4" w:color="000000"/>
+          <w:bottom w:val="thinThickSmallGap" w:sz="24" w:space="0" w:color="000000"/>
+          <w:right w:val="thinThickSmallGap" w:sz="24" w:space="4" w:color="000000"/>
+        </w:pBdr>
+        <w:tabs>
+          <w:tab w:val="left" w:leader="dot" w:pos="7371"/>
+        </w:tabs>
+        <w:spacing w:line="240" w:lineRule="auto"/>
+        <w:ind w:firstLine="1890"/>
+        <w:rPr>
+          <w:b/>
+          <w:szCs w:val="28"/>
+        </w:rPr>
+      </w:pPr>
+      <w:r>
+        <w:rPr>
+          <w:b/>
+          <w:szCs w:val="28"/>
+        </w:rPr>
+        <w:t>Mã phách:</w:t>
+      </w:r>
+      <w:r>
+        <w:rPr>
+          <w:b/>
+          <w:szCs w:val="28"/>
+        </w:rPr>
+        <w:tab/>
+      </w:r>
+    </w:p>
+    <w:p>
+      <w:pPr>
+        <w:pBdr>
+          <w:top w:val="thickThinSmallGap" w:sz="24" w:space="31" w:color="000000"/>
+          <w:left w:val="thickThinSmallGap" w:sz="24" w:space="4" w:color="000000"/>
+          <w:bottom w:val="thinThickSmallGap" w:sz="24" w:space="0" w:color="000000"/>
+          <w:right w:val="thinThickSmallGap" w:sz="24" w:space="4" w:color="000000"/>
+        </w:pBdr>
+        <w:tabs>
+          <w:tab w:val="left" w:pos="4536"/>
+        </w:tabs>
+        <w:spacing w:line="240" w:lineRule="auto"/>
+        <w:rPr>
+          <w:rFonts w:eastAsia="DengXian"/>
+          <w:b/>
+          <w:szCs w:val="28"/>
+          <w:lang w:eastAsia="zh-CN"/>
+        </w:rPr>
+      </w:pPr>
+    </w:p>
+    <w:p>
+      <w:pPr>
+        <w:pBdr>
+          <w:top w:val="thickThinSmallGap" w:sz="24" w:space="31" w:color="000000"/>
+          <w:left w:val="thickThinSmallGap" w:sz="24" w:space="4" w:color="000000"/>
+          <w:bottom w:val="thinThickSmallGap" w:sz="24" w:space="0" w:color="000000"/>
+          <w:right w:val="thinThickSmallGap" w:sz="24" w:space="4" w:color="000000"/>
+        </w:pBdr>
+        <w:tabs>
+          <w:tab w:val="left" w:pos="4536"/>
+        </w:tabs>
+        <w:spacing w:line="240" w:lineRule="auto"/>
+        <w:rPr>
+          <w:rFonts w:eastAsia="DengXian"/>
+          <w:b/>
+          <w:szCs w:val="28"/>
+          <w:lang w:eastAsia="zh-CN"/>
+        </w:rPr>
+      </w:pPr>
+    </w:p>
+    <w:p>
+      <w:pPr>
+        <w:pBdr>
+          <w:top w:val="thickThinSmallGap" w:sz="24" w:space="31" w:color="000000"/>
+          <w:left w:val="thickThinSmallGap" w:sz="24" w:space="4" w:color="000000"/>
+          <w:bottom w:val="thinThickSmallGap" w:sz="24" w:space="0" w:color="000000"/>
+          <w:right w:val="thinThickSmallGap" w:sz="24" w:space="4" w:color="000000"/>
+        </w:pBdr>
+        <w:tabs>
+          <w:tab w:val="left" w:pos="4536"/>
+        </w:tabs>
+        <w:spacing w:line="240" w:lineRule="auto"/>
+        <w:rPr>
+          <w:rFonts w:eastAsia="DengXian"/>
+          <w:b/>
+          <w:szCs w:val="28"/>
+          <w:lang w:val="en-US" w:eastAsia="zh-CN"/>
+        </w:rPr>
+      </w:pPr>
+    </w:p>
+    <w:p>
+      <w:pPr>
+        <w:pBdr>
+          <w:top w:val="thickThinSmallGap" w:sz="24" w:space="31" w:color="000000"/>
+          <w:left w:val="thickThinSmallGap" w:sz="24" w:space="4" w:color="000000"/>
+          <w:bottom w:val="thinThickSmallGap" w:sz="24" w:space="0" w:color="000000"/>
+          <w:right w:val="thinThickSmallGap" w:sz="24" w:space="4" w:color="000000"/>
+        </w:pBdr>
+        <w:tabs>
+          <w:tab w:val="left" w:pos="4536"/>
+        </w:tabs>
+        <w:spacing w:line="240" w:lineRule="auto"/>
+        <w:rPr>
+          <w:rFonts w:eastAsia="DengXian"/>
+          <w:b/>
+          <w:szCs w:val="28"/>
+          <w:lang w:val="en-US" w:eastAsia="zh-CN"/>
+        </w:rPr>
+      </w:pPr>
+    </w:p>
+    <w:p>
+      <w:pPr>
+        <w:pBdr>
+          <w:top w:val="thickThinSmallGap" w:sz="24" w:space="31" w:color="000000"/>
+          <w:left w:val="thickThinSmallGap" w:sz="24" w:space="4" w:color="000000"/>
+          <w:bottom w:val="thinThickSmallGap" w:sz="24" w:space="0" w:color="000000"/>
+          <w:right w:val="thinThickSmallGap" w:sz="24" w:space="4" w:color="000000"/>
+        </w:pBdr>
+        <w:tabs>
+          <w:tab w:val="left" w:pos="4536"/>
+        </w:tabs>
+        <w:spacing w:line="240" w:lineRule="auto"/>
+        <w:rPr>
+          <w:rFonts w:eastAsia="DengXian"/>
+          <w:b/>
+          <w:szCs w:val="28"/>
+          <w:lang w:val="en-US" w:eastAsia="zh-CN"/>
+        </w:rPr>
+      </w:pPr>
+    </w:p>
+    <w:p>
+      <w:pPr>
+        <w:pBdr>
+          <w:top w:val="thickThinSmallGap" w:sz="24" w:space="31" w:color="000000"/>
+          <w:left w:val="thickThinSmallGap" w:sz="24" w:space="4" w:color="000000"/>
+          <w:bottom w:val="thinThickSmallGap" w:sz="24" w:space="0" w:color="000000"/>
+          <w:right w:val="thinThickSmallGap" w:sz="24" w:space="4" w:color="000000"/>
+        </w:pBdr>
+        <w:tabs>
+          <w:tab w:val="left" w:pos="4536"/>
+        </w:tabs>
+        <w:spacing w:line="240" w:lineRule="auto"/>
+        <w:rPr>
+          <w:rFonts w:eastAsia="DengXian"/>
+          <w:b/>
+          <w:szCs w:val="28"/>
+          <w:lang w:val="en-US" w:eastAsia="zh-CN"/>
+        </w:rPr>
+      </w:pPr>
+    </w:p>
+    <w:p>
+      <w:pPr>
+        <w:pBdr>
+          <w:top w:val="thickThinSmallGap" w:sz="24" w:space="31" w:color="000000"/>
+          <w:left w:val="thickThinSmallGap" w:sz="24" w:space="4" w:color="000000"/>
+          <w:bottom w:val="thinThickSmallGap" w:sz="24" w:space="0" w:color="000000"/>
+          <w:right w:val="thinThickSmallGap" w:sz="24" w:space="4" w:color="000000"/>
+        </w:pBdr>
+        <w:tabs>
+          <w:tab w:val="left" w:pos="4536"/>
+        </w:tabs>
+        <w:spacing w:line="240" w:lineRule="auto"/>
+        <w:jc w:val="center"/>
+        <w:rPr>
+          <w:rFonts w:eastAsia="DengXian"/>
+          <w:szCs w:val="28"/>
+          <w:lang w:eastAsia="zh-CN"/>
+        </w:rPr>
+      </w:pPr>
+      <w:r>
+        <w:rPr>
+          <w:rFonts w:eastAsia="DengXian"/>
+          <w:b/>
+          <w:szCs w:val="28"/>
+          <w:lang w:eastAsia="zh-CN"/>
+        </w:rPr>
+        <w:t>Hà Nội - 2026</w:t>
+      </w:r>
+    </w:p>
+    <w:p>
+      <w:pPr>
+        <w:spacing w:line="240" w:lineRule="auto"/>
+        <w:rPr>
           <w:b/>
           <w:bCs/>
-          <w:color w:val="000000"/>
-          <w:sz w:val="26"/>
-          <w:szCs w:val="26"/>
-        </w:rPr>
-        <w:t xml:space="preserve">Học phần: Hệ thống thông tin quản lý nhân lực</w:t>
-      </w:r>
-    </w:p>
-    <w:p>
-      <w:pPr>
-        <w:pBdr>
-          <w:top w:val="thickThinSmallGap" w:color="000000" w:sz="24" w:space="31"/>
-          <w:left w:val="thickThinSmallGap" w:color="000000" w:sz="24" w:space="4"/>
-          <w:bottom w:val="thinThickSmallGap" w:color="000000" w:sz="24" w:space="0"/>
-          <w:right w:val="thinThickSmallGap" w:color="000000" w:sz="24" w:space="4"/>
-        </w:pBdr>
-        <w:spacing w:line="220" w:lineRule="auto"/>
-        <w:ind w:firstLine="1890"/>
-        <w:jc w:val="left"/>
-      </w:pPr>
-      <w:r>
-        <w:rPr>
-          <w:rFonts w:ascii="Times New Roman" w:cs="Times New Roman" w:eastAsia="Times New Roman" w:hAnsi="Times New Roman"/>
-          <w:b/>
-          <w:bCs/>
-          <w:color w:val="000000"/>
-          <w:sz w:val="26"/>
-          <w:szCs w:val="26"/>
-        </w:rPr>
-        <w:t xml:space="preserve">Mã phách:</w:t>
-      </w:r>
-      <w:r>
-        <w:rPr>
-          <w:rFonts w:ascii="Times New Roman" w:cs="Times New Roman" w:eastAsia="Times New Roman" w:hAnsi="Times New Roman"/>
-          <w:b/>
-          <w:bCs/>
-          <w:color w:val="000000"/>
-          <w:sz w:val="26"/>
-          <w:szCs w:val="26"/>
-        </w:rPr>
-        <w:t xml:space="preserve">	................................................................</w:t>
-      </w:r>
-    </w:p>
-    <w:p>
-      <w:pPr>
-        <w:pBdr>
-          <w:top w:val="thickThinSmallGap" w:color="000000" w:sz="24" w:space="31"/>
-          <w:left w:val="thickThinSmallGap" w:color="000000" w:sz="24" w:space="4"/>
-          <w:bottom w:val="thinThickSmallGap" w:color="000000" w:sz="24" w:space="0"/>
-          <w:right w:val="thinThickSmallGap" w:color="000000" w:sz="24" w:space="4"/>
-        </w:pBdr>
-        <w:spacing w:line="220" w:lineRule="auto"/>
-        <w:jc w:val="center"/>
-      </w:pPr>
-    </w:p>
-    <w:p>
-      <w:pPr>
-        <w:pBdr>
-          <w:top w:val="thickThinSmallGap" w:color="000000" w:sz="24" w:space="31"/>
-          <w:left w:val="thickThinSmallGap" w:color="000000" w:sz="24" w:space="4"/>
-          <w:bottom w:val="thinThickSmallGap" w:color="000000" w:sz="24" w:space="0"/>
-          <w:right w:val="thinThickSmallGap" w:color="000000" w:sz="24" w:space="4"/>
-        </w:pBdr>
-        <w:spacing w:line="220" w:lineRule="auto"/>
-        <w:jc w:val="center"/>
-      </w:pPr>
-    </w:p>
-    <w:p>
-      <w:pPr>
-        <w:pBdr>
-          <w:top w:val="thickThinSmallGap" w:color="000000" w:sz="24" w:space="31"/>
-          <w:left w:val="thickThinSmallGap" w:color="000000" w:sz="24" w:space="4"/>
-          <w:bottom w:val="thinThickSmallGap" w:color="000000" w:sz="24" w:space="0"/>
-          <w:right w:val="thinThickSmallGap" w:color="000000" w:sz="24" w:space="4"/>
-        </w:pBdr>
-        <w:spacing w:line="220" w:lineRule="auto"/>
-        <w:jc w:val="center"/>
-      </w:pPr>
-    </w:p>
-    <w:p>
-      <w:pPr>
-        <w:pBdr>
-          <w:top w:val="thickThinSmallGap" w:color="000000" w:sz="24" w:space="31"/>
-          <w:left w:val="thickThinSmallGap" w:color="000000" w:sz="24" w:space="4"/>
-          <w:bottom w:val="thinThickSmallGap" w:color="000000" w:sz="24" w:space="0"/>
-          <w:right w:val="thinThickSmallGap" w:color="000000" w:sz="24" w:space="4"/>
-        </w:pBdr>
-        <w:spacing w:line="220" w:lineRule="auto"/>
-        <w:jc w:val="center"/>
-      </w:pPr>
-    </w:p>
-    <w:p>
-      <w:pPr>
-        <w:pBdr>
-          <w:top w:val="thickThinSmallGap" w:color="000000" w:sz="24" w:space="31"/>
-          <w:left w:val="thickThinSmallGap" w:color="000000" w:sz="24" w:space="4"/>
-          <w:bottom w:val="thinThickSmallGap" w:color="000000" w:sz="24" w:space="0"/>
-          <w:right w:val="thinThickSmallGap" w:color="000000" w:sz="24" w:space="4"/>
-        </w:pBdr>
-        <w:spacing w:line="220" w:lineRule="auto"/>
-        <w:jc w:val="center"/>
-      </w:pPr>
-      <w:r>
-        <w:rPr>
-          <w:rFonts w:ascii="Times New Roman" w:cs="Times New Roman" w:eastAsia="Times New Roman" w:hAnsi="Times New Roman"/>
-          <w:b/>
-          <w:bCs/>
-          <w:color w:val="000000"/>
-          <w:sz w:val="26"/>
-          <w:szCs w:val="26"/>
-        </w:rPr>
-        <w:t xml:space="preserve">Hà Nội - 2026</w:t>
-      </w:r>
-    </w:p>
-    <w:p>
-      <w:pPr>
+          <w:szCs w:val="28"/>
+        </w:rPr>
         <w:sectPr>
-          <w:pgSz w:w="11906" w:h="16838" w:orient="portrait"/>
-          <w:pgMar w:top="1134" w:right="1134" w:bottom="1134" w:left="1701" w:header="708" w:footer="708" w:gutter="0"/>
-          <w:pgNumType/>
+          <w:pgSz w:w="11906" w:h="16838" w:code="9"/>
+          <w:pgMar w:top="1134" w:right="1134" w:bottom="1134" w:left="1701" w:header="709" w:footer="709" w:gutter="0"/>
+          <w:cols w:space="720"/>
           <w:docGrid w:linePitch="360"/>
         </w:sectPr>
       </w:pPr>
@@ -461,7 +730,7 @@
           <w:sz w:val="26"/>
           <w:szCs w:val="26"/>
         </w:rPr>
-        <w:t xml:space="preserve">Thầy Hoàng Minh Ngọc - Giảng viên học phần Hệ thống thông tin quản lý nhân lực.</w:t>
+        <w:t>Thầy Hoàng Minh Ngọc - Giảng viên học phần Hệ thống thông tin tác nghiệp.</w:t>
       </w:r>
     </w:p>
     <w:p>
@@ -598,7 +867,7 @@
           <w:sz w:val="26"/>
           <w:szCs w:val="26"/>
         </w:rPr>
-        <w:t xml:space="preserve">Đề tài này được thực hiện dựa trên nền tảng kiến thức lý thuyết đã được trang bị trong học phần Hệ thống thông tin quản lý nhân lực, kết hợp chặt chẽ với quá trình nghiên cứu sâu rộng về hệ thống thể chế pháp lý công vụ (Luật Cán bộ, công chức; Luật Viên chức; Nghị định số 90/2020/NĐ-CP; Nghị định số 48/2023/NĐ-CP; Kết luận số 14-KL/TW) và thực tiễn vận hành quản trị hiệu suất tại các doanh nghiệp sản xuất, kinh doanh hiện đại.</w:t>
+        <w:t>Đề tài được thực hiện trên nền tảng kiến thức của học phần Hệ thống thông tin tác nghiệp, kết hợp nghiên cứu quản trị hiệu suất doanh nghiệp và căn cứ đánh giá khu vực công đang có hiệu lực năm 2026: Nghị định 335/2025/NĐ-CP đối với công chức và Nghị định 233/2026/NĐ-CP đối với viên chức. Báo cáo phân biệt phần phân tích thiết kế đề xuất với chức năng đã có trong HRMS; không coi mô hình, tích hợp hay số liệu minh họa là kết quả triển khai đã kiểm chứng.</w:t>
       </w:r>
     </w:p>
     <w:p>
@@ -837,7 +1106,8 @@
     </w:p>
     <w:p>
       <w:pPr>
-        <w:spacing w:after="120" w:before="0" w:line="312"/>
+        <w:spacing/>
+        <w:ind w:firstLine="720"/>
         <w:jc w:val="both"/>
       </w:pPr>
       <w:r>
@@ -976,7 +1246,8 @@
     </w:p>
     <w:p>
       <w:pPr>
-        <w:spacing w:after="120" w:before="0" w:line="312"/>
+        <w:spacing/>
+        <w:ind w:firstLine="720"/>
         <w:jc w:val="both"/>
       </w:pPr>
       <w:r>
@@ -1070,7 +1341,7 @@
           <w:sz w:val="26"/>
           <w:szCs w:val="26"/>
         </w:rPr>
-        <w:t xml:space="preserve">2.4. Thiết kế hệ thống (Kiến trúc 3 tầng, CSDL 26 bảng chuẩn 3NF, ERD, Dashboard)</w:t>
+        <w:t>2.4. Thiết kế hệ thống (kiến trúc đề xuất, mô hình dữ liệu 26 bảng tham khảo, ERD, Dashboard)</w:t>
       </w:r>
     </w:p>
     <w:p>
@@ -1095,7 +1366,8 @@
     </w:p>
     <w:p>
       <w:pPr>
-        <w:spacing w:after="120" w:before="0" w:line="312"/>
+        <w:spacing/>
+        <w:ind w:firstLine="720"/>
         <w:jc w:val="both"/>
       </w:pPr>
       <w:r>
@@ -1271,8 +1543,8 @@
     </w:p>
     <w:p>
       <w:pPr>
-        <w:spacing w:after="120" w:before="0" w:line="312"/>
-        <w:ind w:firstLine="450"/>
+        <w:spacing/>
+        <w:ind w:firstLine="720"/>
         <w:jc w:val="both"/>
       </w:pPr>
       <w:r>
@@ -3128,7 +3400,7 @@
                 <w:sz w:val="22"/>
                 <w:szCs w:val="22"/>
               </w:rPr>
-              <w:t xml:space="preserve">Hình thức chi trả tiền lương và tiền thưởng dựa trên kết quả hoàn thành công việc thực tế.</w:t>
+              <w:t>Phần lương theo hiệu suất theo chính sách doanh nghiệp; chỉ nối với KPI khi có quy chế và tích hợp riêng. HRMS hiện tại chưa tự động xuất hoặc tính P3.</w:t>
             </w:r>
           </w:p>
         </w:tc>
@@ -3814,7 +4086,7 @@
           <w:sz w:val="26"/>
           <w:szCs w:val="26"/>
         </w:rPr>
-        <w:t xml:space="preserve">Bảng 1.2: Tiêu chuẩn xếp loại chất lượng cán bộ, công chức, viên chức theo Nghị định 48/2023/NĐ-CP</w:t>
+        <w:t>Bảng 1.2: Khung chấm điểm và xếp loại công chức, viên chức theo quy định áp dụng năm 2026</w:t>
       </w:r>
     </w:p>
     <w:p>
@@ -3874,7 +4146,7 @@
           <w:sz w:val="26"/>
           <w:szCs w:val="26"/>
         </w:rPr>
-        <w:t xml:space="preserve">Bảng 1.5: Bộ tiêu chí đánh giá công vụ cho Khối Cơ quan Nhà nước theo Nghị định số 48/2023/NĐ-CP</w:t>
+        <w:t>Bảng 1.5: Ví dụ bộ tiêu chí khu vực công theo khung 30/70 năm 2026</w:t>
       </w:r>
     </w:p>
     <w:p>
@@ -3894,7 +4166,7 @@
           <w:sz w:val="26"/>
           <w:szCs w:val="26"/>
         </w:rPr>
-        <w:t xml:space="preserve">Bảng 2.1: Danh mục đặc tả cấu trúc vật lý 26 bảng cơ sở dữ liệu quan hệ chuẩn hóa 3NF</w:t>
+        <w:t>Bảng 2.1: Mô hình dữ liệu 26 bảng đề xuất, không phải lược đồ HRMS hiện tại</w:t>
       </w:r>
     </w:p>
     <w:p>
@@ -3963,6 +4235,132 @@
         <w:jc w:val="both"/>
       </w:pPr>
       <w:r>
+        <w:t>Hình 2.1: Sơ đồ phân cấp tác nhân tham gia đánh giá</w:t>
+      </w:r>
+    </w:p>
+    <w:p>
+      <w:pPr>
+        <w:spacing w:after="120" w:before="0" w:line="312"/>
+        <w:ind w:firstLine="450"/>
+        <w:jc w:val="both"/>
+      </w:pPr>
+      <w:r>
+        <w:t>Hình 2.2: Biểu đồ Use Case tổng quan đánh giá hiệu quả công việc</w:t>
+      </w:r>
+    </w:p>
+    <w:p>
+      <w:pPr>
+        <w:spacing w:after="120" w:before="0" w:line="312"/>
+        <w:ind w:firstLine="450"/>
+        <w:jc w:val="both"/>
+      </w:pPr>
+      <w:r>
+        <w:t>Hình 2.3: Sơ đồ gói nghiệp vụ đánh giá KPI (UML Package Diagram)</w:t>
+      </w:r>
+    </w:p>
+    <w:p>
+      <w:pPr>
+        <w:spacing w:after="120" w:before="0" w:line="312"/>
+        <w:ind w:firstLine="450"/>
+        <w:jc w:val="both"/>
+      </w:pPr>
+      <w:r>
+        <w:t>Hình 2.4: Sơ đồ lớp rút gọn theo mô hình dữ liệu HRMS</w:t>
+      </w:r>
+    </w:p>
+    <w:p>
+      <w:pPr>
+        <w:spacing w:after="120" w:before="0" w:line="312"/>
+        <w:ind w:firstLine="450"/>
+        <w:jc w:val="both"/>
+      </w:pPr>
+      <w:r>
+        <w:t>Hình 2.5: Biểu đồ tuần tự tự đánh giá, phản hồi và tính điểm doanh nghiệp</w:t>
+      </w:r>
+    </w:p>
+    <w:p>
+      <w:pPr>
+        <w:spacing w:after="120" w:before="0" w:line="312"/>
+        <w:ind w:firstLine="450"/>
+        <w:jc w:val="both"/>
+      </w:pPr>
+      <w:r>
+        <w:t>Hình 2.6: Quy trình đánh giá khu vực công theo căn cứ áp dụng năm 2026</w:t>
+      </w:r>
+    </w:p>
+    <w:p>
+      <w:pPr>
+        <w:spacing w:after="120" w:before="0" w:line="312"/>
+        <w:ind w:firstLine="450"/>
+        <w:jc w:val="both"/>
+      </w:pPr>
+      <w:r>
+        <w:t>Hình 2.7: Biểu đồ trạng thái chu kỳ đánh giá HRMS hiện tại</w:t>
+      </w:r>
+    </w:p>
+    <w:p>
+      <w:pPr>
+        <w:spacing w:after="120" w:before="0" w:line="312"/>
+        <w:ind w:firstLine="450"/>
+        <w:jc w:val="both"/>
+      </w:pPr>
+      <w:r>
+        <w:t>Hình 2.8: Kiến trúc HRMS hiện tại và điểm tích hợp đề xuất</w:t>
+      </w:r>
+    </w:p>
+    <w:p>
+      <w:pPr>
+        <w:spacing w:after="120" w:before="0" w:line="312"/>
+        <w:ind w:firstLine="450"/>
+        <w:jc w:val="both"/>
+      </w:pPr>
+      <w:r>
+        <w:t>Hình 2.9: ERD rút gọn cho phân hệ đánh giá HRMS</w:t>
+      </w:r>
+    </w:p>
+    <w:p>
+      <w:pPr>
+        <w:pageBreakBefore/>
+        <w:spacing w:after="180" w:before="240"/>
+        <w:jc w:val="center"/>
+      </w:pPr>
+      <w:r>
+        <w:rPr>
+          <w:rFonts w:ascii="Times New Roman" w:cs="Times New Roman" w:eastAsia="Times New Roman" w:hAnsi="Times New Roman"/>
+          <w:b/>
+          <w:bCs/>
+          <w:color w:val="000000"/>
+          <w:sz w:val="30"/>
+          <w:szCs w:val="30"/>
+        </w:rPr>
+        <w:t xml:space="preserve">PHẦN MỞ ĐẦU</w:t>
+      </w:r>
+    </w:p>
+    <w:p>
+      <w:pPr>
+        <w:pStyle w:val="Heading1"/>
+        <w:spacing w:after="100" w:before="240"/>
+        <w:jc w:val="left"/>
+      </w:pPr>
+      <w:r>
+        <w:rPr>
+          <w:rFonts w:ascii="Times New Roman" w:cs="Times New Roman" w:eastAsia="Times New Roman" w:hAnsi="Times New Roman"/>
+          <w:b/>
+          <w:bCs/>
+          <w:color w:val="000000"/>
+          <w:sz w:val="28"/>
+          <w:szCs w:val="28"/>
+        </w:rPr>
+        <w:t xml:space="preserve">1. Lý do chọn đề tài</w:t>
+      </w:r>
+    </w:p>
+    <w:p>
+      <w:pPr>
+        <w:spacing/>
+        <w:ind w:firstLine="720"/>
+        <w:jc w:val="both"/>
+      </w:pPr>
+      <w:r>
         <w:rPr>
           <w:rFonts w:ascii="Times New Roman" w:cs="Times New Roman" w:eastAsia="Times New Roman" w:hAnsi="Times New Roman"/>
           <w:b w:val="false"/>
@@ -3973,13 +4371,13 @@
           <w:sz w:val="26"/>
           <w:szCs w:val="26"/>
         </w:rPr>
-        <w:t xml:space="preserve">Hình 2.1: Biểu đồ cây phân cấp Tác nhân Hệ thống Đánh giá KPI</w:t>
-      </w:r>
-    </w:p>
-    <w:p>
-      <w:pPr>
-        <w:spacing w:after="120" w:before="0" w:line="312"/>
-        <w:ind w:firstLine="450"/>
+        <w:t>Trong doanh nghiệp, KPI/BSC giúp chuyển mục tiêu kinh doanh thành kết quả có thể đo theo vai trò, bộ phận và chu kỳ. Doanh nghiệp có thể dùng kết quả KPI như một căn cứ cho chính sách hiệu suất P3 nếu đã ban hành quy chế, thang trả lương và quy trình phê duyệt riêng. HRMS hiện tại chưa tự kết nối điểm KPI sang tính lương hoặc xuất P3; báo cáo này xem đó là hướng tích hợp đề xuất.</w:t>
+      </w:r>
+    </w:p>
+    <w:p>
+      <w:pPr>
+        <w:spacing/>
+        <w:ind w:firstLine="720"/>
         <w:jc w:val="both"/>
       </w:pPr>
       <w:r>
@@ -3993,13 +4391,13 @@
           <w:sz w:val="26"/>
           <w:szCs w:val="26"/>
         </w:rPr>
-        <w:t xml:space="preserve">Hình 2.2: Biểu đồ Use Case tổng quan Hệ thống Đánh giá Hiệu suất KPI</w:t>
-      </w:r>
-    </w:p>
-    <w:p>
-      <w:pPr>
-        <w:spacing w:after="120" w:before="0" w:line="312"/>
-        <w:ind w:firstLine="450"/>
+        <w:t>Khu vực công áp dụng khung riêng theo đối tượng: công chức tại cơ quan hành chính theo Nghị định 335/2025/NĐ-CP (hiệu lực từ 01/01/2026) và viên chức tại đơn vị sự nghiệp công lập theo Nghị định 233/2026/NĐ-CP (hiệu lực từ 01/07/2026). Hai nghị định quy định khung điểm, điều kiện xếp loại và tỷ lệ xuất sắc trong phạm vi công vụ; các tỷ lệ này tuyệt đối không áp vào doanh nghiệp. Kết luận 14-KL/TW không tự tạo điểm cộng hay miễn trừ tự động; tình huống cụ thể phải do cấp có thẩm quyền xem xét.</w:t>
+      </w:r>
+    </w:p>
+    <w:p>
+      <w:pPr>
+        <w:spacing/>
+        <w:ind w:firstLine="720"/>
         <w:jc w:val="both"/>
       </w:pPr>
       <w:r>
@@ -4013,13 +4411,31 @@
           <w:sz w:val="26"/>
           <w:szCs w:val="26"/>
         </w:rPr>
-        <w:t xml:space="preserve">Hình 2.3: Sơ đồ phân rã gói hệ thống Đánh giá KPI (Package Diagram)</w:t>
-      </w:r>
-    </w:p>
-    <w:p>
-      <w:pPr>
-        <w:spacing w:after="120" w:before="0" w:line="312"/>
-        <w:ind w:firstLine="450"/>
+        <w:t>Thực tế đặt ra yêu cầu minh bạch hóa mục tiêu, căn cứ và quy trình đánh giá. Đề tài phân tích và thiết kế một giải pháp tác nghiệp tham khảo cho hai chế độ tổ chức; đây là hồ sơ đề xuất, không phải khẳng định đã xây dựng xong một sản phẩm độc lập hay đã triển khai tại doanh nghiệp/cơ quan cụ thể.</w:t>
+      </w:r>
+    </w:p>
+    <w:p>
+      <w:pPr>
+        <w:pStyle w:val="Heading1"/>
+        <w:spacing w:after="100" w:before="240"/>
+        <w:jc w:val="left"/>
+      </w:pPr>
+      <w:r>
+        <w:rPr>
+          <w:rFonts w:ascii="Times New Roman" w:cs="Times New Roman" w:eastAsia="Times New Roman" w:hAnsi="Times New Roman"/>
+          <w:b/>
+          <w:bCs/>
+          <w:color w:val="000000"/>
+          <w:sz w:val="28"/>
+          <w:szCs w:val="28"/>
+        </w:rPr>
+        <w:t xml:space="preserve">2. Mục tiêu và nhiệm vụ nghiên cứu</w:t>
+      </w:r>
+    </w:p>
+    <w:p>
+      <w:pPr>
+        <w:spacing/>
+        <w:ind w:firstLine="720"/>
         <w:jc w:val="both"/>
       </w:pPr>
       <w:r>
@@ -4033,7 +4449,7 @@
           <w:sz w:val="26"/>
           <w:szCs w:val="26"/>
         </w:rPr>
-        <w:t xml:space="preserve">Hình 2.4: Sơ đồ lớp miền nghiệp vụ Hệ thống Đánh giá KPI (Domain Class Diagram)</w:t>
+        <w:t>Mục tiêu tổng quát: phân tích và thiết kế mô hình hệ thống thông tin đánh giá hiệu suất có thể cấu hình riêng cho doanh nghiệp tư nhân hoặc khu vực công; mỗi chế độ dùng quy tắc, quy trình và biểu mẫu phù hợp với đối tượng pháp lý.</w:t>
       </w:r>
     </w:p>
     <w:p>
@@ -4053,13 +4469,13 @@
           <w:sz w:val="26"/>
           <w:szCs w:val="26"/>
         </w:rPr>
-        <w:t xml:space="preserve">Hình 2.5: Biểu đồ tuần tự quy trình đánh giá và chốt sổ điểm KPI</w:t>
-      </w:r>
-    </w:p>
-    <w:p>
-      <w:pPr>
-        <w:spacing w:after="120" w:before="0" w:line="312"/>
-        <w:ind w:firstLine="450"/>
+        <w:t xml:space="preserve">Mục tiêu cụ thể và các nhiệm vụ nghiên cứu trọng tâm:</w:t>
+      </w:r>
+    </w:p>
+    <w:p>
+      <w:pPr>
+        <w:spacing/>
+        <w:ind w:left="504" w:hanging="288"/>
         <w:jc w:val="both"/>
       </w:pPr>
       <w:r>
@@ -4073,13 +4489,13 @@
           <w:sz w:val="26"/>
           <w:szCs w:val="26"/>
         </w:rPr>
-        <w:t xml:space="preserve">Hình 2.6: Biểu đồ hoạt động quy trình đánh giá theo Nghị định 48/2023/NĐ-CP</w:t>
-      </w:r>
-    </w:p>
-    <w:p>
-      <w:pPr>
-        <w:spacing w:after="120" w:before="0" w:line="312"/>
-        <w:ind w:firstLine="450"/>
+        <w:t>• Thứ nhất: Hệ thống hóa BSC, OKR, PDCA, phản hồi nhiều nguồn và 3P ở doanh nghiệp; cập nhật riêng căn cứ đánh giá công chức theo Nghị định 335/2025/NĐ-CP và viên chức theo Nghị định 233/2026/NĐ-CP.</w:t>
+      </w:r>
+    </w:p>
+    <w:p>
+      <w:pPr>
+        <w:spacing/>
+        <w:ind w:left="504" w:hanging="288"/>
         <w:jc w:val="both"/>
       </w:pPr>
       <w:r>
@@ -4093,13 +4509,13 @@
           <w:sz w:val="26"/>
           <w:szCs w:val="26"/>
         </w:rPr>
-        <w:t xml:space="preserve">Hình 2.7: Biểu đồ trạng thái vòng đời Phiếu đánh giá KPI</w:t>
-      </w:r>
-    </w:p>
-    <w:p>
-      <w:pPr>
-        <w:spacing w:after="120" w:before="0" w:line="312"/>
-        <w:ind w:firstLine="450"/>
+        <w:t xml:space="preserve">• Thứ hai: Khảo sát, mô hình hóa các yêu cầu nghiệp vụ chức năng và phi chức năng của hai khối đối tượng.</w:t>
+      </w:r>
+    </w:p>
+    <w:p>
+      <w:pPr>
+        <w:spacing/>
+        <w:ind w:left="504" w:hanging="288"/>
         <w:jc w:val="both"/>
       </w:pPr>
       <w:r>
@@ -4113,13 +4529,13 @@
           <w:sz w:val="26"/>
           <w:szCs w:val="26"/>
         </w:rPr>
-        <w:t xml:space="preserve">Hình 2.8: Sơ đồ kiến trúc hệ thống 3 tầng (3-Tier Architecture)</w:t>
-      </w:r>
-    </w:p>
-    <w:p>
-      <w:pPr>
-        <w:spacing w:after="120" w:before="0" w:line="312"/>
-        <w:ind w:firstLine="450"/>
+        <w:t xml:space="preserve">• Thứ ba: Thiết kế cấu trúc tĩnh và hành vi động của hệ thống bằng ngôn ngữ mô hình hóa thống nhất UML (Actor Tree, Use Case, Package, Class, Sequence, Activity, State Machine).</w:t>
+      </w:r>
+    </w:p>
+    <w:p>
+      <w:pPr>
+        <w:spacing/>
+        <w:ind w:left="504" w:hanging="288"/>
         <w:jc w:val="both"/>
       </w:pPr>
       <w:r>
@@ -4133,49 +4549,13 @@
           <w:sz w:val="26"/>
           <w:szCs w:val="26"/>
         </w:rPr>
-        <w:t xml:space="preserve">Hình 2.9: Sơ đồ thực thể quan hệ Cơ sở dữ liệu KPI (ERD - Chuẩn 3NF)</w:t>
-      </w:r>
-    </w:p>
-    <w:p>
-      <w:pPr>
-        <w:pageBreakBefore/>
-        <w:spacing w:after="180" w:before="240"/>
-        <w:jc w:val="center"/>
-      </w:pPr>
-      <w:r>
-        <w:rPr>
-          <w:rFonts w:ascii="Times New Roman" w:cs="Times New Roman" w:eastAsia="Times New Roman" w:hAnsi="Times New Roman"/>
-          <w:b/>
-          <w:bCs/>
-          <w:color w:val="000000"/>
-          <w:sz w:val="30"/>
-          <w:szCs w:val="30"/>
-        </w:rPr>
-        <w:t xml:space="preserve">PHẦN MỞ ĐẦU</w:t>
-      </w:r>
-    </w:p>
-    <w:p>
-      <w:pPr>
-        <w:pStyle w:val="Heading1"/>
-        <w:spacing w:after="100" w:before="240"/>
-        <w:jc w:val="left"/>
-      </w:pPr>
-      <w:r>
-        <w:rPr>
-          <w:rFonts w:ascii="Times New Roman" w:cs="Times New Roman" w:eastAsia="Times New Roman" w:hAnsi="Times New Roman"/>
-          <w:b/>
-          <w:bCs/>
-          <w:color w:val="000000"/>
-          <w:sz w:val="28"/>
-          <w:szCs w:val="28"/>
-        </w:rPr>
-        <w:t xml:space="preserve">1. Lý do chọn đề tài</w:t>
-      </w:r>
-    </w:p>
-    <w:p>
-      <w:pPr>
-        <w:spacing w:after="120" w:before="0" w:line="312"/>
-        <w:ind w:firstLine="450"/>
+        <w:t>• Thứ tư: Đề xuất kiến trúc nhiều tầng và mô hình dữ liệu quan hệ 26 bảng như phương án thiết kế. Cấu trúc này không phải lược đồ cơ sở dữ liệu đang triển khai của HRMS hiện tại.</w:t>
+      </w:r>
+    </w:p>
+    <w:p>
+      <w:pPr>
+        <w:spacing/>
+        <w:ind w:left="504" w:hanging="288"/>
         <w:jc w:val="both"/>
       </w:pPr>
       <w:r>
@@ -4189,13 +4569,31 @@
           <w:sz w:val="26"/>
           <w:szCs w:val="26"/>
         </w:rPr>
-        <w:t xml:space="preserve">Trong bối cảnh chuyển đổi số toàn diện và cải cách hành chính sâu rộng, việc nâng cao năng suất lao động và chuẩn hóa chất lượng đội ngũ nhân sự đã trở thành mệnh lệnh sống còn đối với mọi tổ chức. Đối với khối doanh nghiệp, việc áp dụng hệ thống đánh giá hiệu quả công việc (Key Performance Indicators - KPI) dựa trên Thẻ điểm cân bằng (Balanced Scorecard - BSC) giúp liên kết chặt chẽ mục tiêu chiến lược với hành động tác nghiệp hàng ngày, đồng thời tạo cơ sở công bằng cho chính sách lương thưởng theo hiệu suất (P3).</w:t>
-      </w:r>
-    </w:p>
-    <w:p>
-      <w:pPr>
-        <w:spacing w:after="120" w:before="0" w:line="312"/>
-        <w:ind w:firstLine="450"/>
+        <w:t xml:space="preserve">• Thứ năm: Xây dựng kế hoạch triển khai 16 tuần, ma trận quản trị rủi ro và lộ trình tích hợp công nghệ Trí tuệ nhân tạo (AI) trong tương lai.</w:t>
+      </w:r>
+    </w:p>
+    <w:p>
+      <w:pPr>
+        <w:pStyle w:val="Heading1"/>
+        <w:spacing w:after="100" w:before="240"/>
+        <w:jc w:val="left"/>
+      </w:pPr>
+      <w:r>
+        <w:rPr>
+          <w:rFonts w:ascii="Times New Roman" w:cs="Times New Roman" w:eastAsia="Times New Roman" w:hAnsi="Times New Roman"/>
+          <w:b/>
+          <w:bCs/>
+          <w:color w:val="000000"/>
+          <w:sz w:val="28"/>
+          <w:szCs w:val="28"/>
+        </w:rPr>
+        <w:t xml:space="preserve">3. Đối tượng và phạm vi nghiên cứu</w:t>
+      </w:r>
+    </w:p>
+    <w:p>
+      <w:pPr>
+        <w:spacing/>
+        <w:ind w:firstLine="720"/>
         <w:jc w:val="both"/>
       </w:pPr>
       <w:r>
@@ -4209,13 +4607,13 @@
           <w:sz w:val="26"/>
           <w:szCs w:val="26"/>
         </w:rPr>
-        <w:t xml:space="preserve">Đối với khối cơ quan hành chính nhà nước và đơn vị sự nghiệp công lập, Chính phủ đã ban hành Nghị định số 48/2023/NĐ-CP ngày 17/7/2023 sửa đổi, bổ sung một số điều của Nghị định số 90/2020/NĐ-CP về đánh giá, xếp loại chất lượng cán bộ, công chức, viên chức. Nghị định mới đặt ra yêu cầu cấp thiết về việc lượng hóa kết quả công tác, gắn đánh giá cá nhân với tiến độ giải quyết thủ tục hành chính, mức độ hài lòng của nhân dân và siết chặt kỷ luật kỷ cương công vụ. Đồng thời, Kết luận số 14-KL/TW ngày 22/9/2021 của Bộ Chính trị về chủ trương khuyến khích, bảo vệ cán bộ năng động, sáng tạo vì lợi ích chung đòi hỏi hệ thống đánh giá phải có cơ chế ghi nhận và cộng điểm ưu tiên cho những sáng kiến đột phá.</w:t>
-      </w:r>
-    </w:p>
-    <w:p>
-      <w:pPr>
-        <w:spacing w:after="120" w:before="0" w:line="312"/>
-        <w:ind w:firstLine="450"/>
+        <w:t xml:space="preserve">Đối tượng nghiên cứu: Quy trình nghiệp vụ quản trị hiệu suất, phương pháp đánh giá kết quả thực hiện công việc và giải pháp thiết kế hệ thống thông tin tác nghiệp hỗ trợ đánh giá KPI.</w:t>
+      </w:r>
+    </w:p>
+    <w:p>
+      <w:pPr>
+        <w:spacing/>
+        <w:ind w:firstLine="720"/>
         <w:jc w:val="both"/>
       </w:pPr>
       <w:r>
@@ -4229,7 +4627,7 @@
           <w:sz w:val="26"/>
           <w:szCs w:val="26"/>
         </w:rPr>
-        <w:t xml:space="preserve">Tuy nhiên, thực tiễn triển khai tại các cơ quan, doanh nghiệp hiện nay vẫn bộc lộ nhiều bất cập: quy trình đánh giá mang tính thủ công, cào bằng, nể nang, dữ liệu thu thập phân tán và thiếu tính minh bạch. Xuất phát từ yêu cầu thực tiễn cấp bách đó, đề tài "Phân tích và thiết kế hệ thống thông tin đánh giá hiệu quả công việc (KPI) cho khối doanh nghiệp và cơ quan nhà nước" được lựa chọn nghiên cứu nhằm xây dựng một giải pháp phần mềm toàn diện, chuẩn hóa nghiệp vụ và bảo đảm tính khoa học, khách quan trong quản trị nhân lực hiện đại.</w:t>
+        <w:t>Phạm vi nghiên cứu gồm hai bối cảnh được tách riêng: doanh nghiệp sản xuất - kinh doanh, nơi ERP/MES/IoT có thể là nguồn tích hợp nếu doanh nghiệp có và cấp quyền kết nối; cơ quan hành chính/đơn vị sự nghiệp công lập, nơi dữ liệu nhiệm vụ và phân loại tuân theo chế độ công chức hoặc viên chức tương ứng. Ví dụ KPI, tên tổ chức, số liệu, bảng biểu, yêu cầu phi chức năng, sơ đồ UML, kiến trúc và CSDL 26 bảng trong báo cáo là mockup/giả định phân tích, không phải dữ liệu khảo sát hay kết quả kiểm thử đã xác minh. HRMS đang đối chiếu là ứng dụng web Next.js, API NestJS, PostgreSQL/Prisma với phân hệ chu kỳ, KRA, minh chứng, điểm và phản hồi doanh nghiệp; không có sản phẩm KPI tách biệt hay các tích hợp ERP/MES/IoT/Kafka/Redis/MinIO/DVC nêu trong phương án này.</w:t>
       </w:r>
     </w:p>
     <w:p>
@@ -4247,13 +4645,13 @@
           <w:sz w:val="28"/>
           <w:szCs w:val="28"/>
         </w:rPr>
-        <w:t xml:space="preserve">2. Mục tiêu và nhiệm vụ nghiên cứu</w:t>
-      </w:r>
-    </w:p>
-    <w:p>
-      <w:pPr>
-        <w:spacing w:after="120" w:before="0" w:line="312"/>
-        <w:ind w:firstLine="450"/>
+        <w:t xml:space="preserve">4. Phương pháp nghiên cứu</w:t>
+      </w:r>
+    </w:p>
+    <w:p>
+      <w:pPr>
+        <w:spacing/>
+        <w:ind w:firstLine="720"/>
         <w:jc w:val="both"/>
       </w:pPr>
       <w:r>
@@ -4267,13 +4665,13 @@
           <w:sz w:val="26"/>
           <w:szCs w:val="26"/>
         </w:rPr>
-        <w:t xml:space="preserve">Mục tiêu tổng quát: Phân tích và thiết kế hoàn chỉnh hệ thống thông tin đánh giá hiệu quả công việc (KPI) có khả năng ứng dụng linh hoạt cho cả hai môi trường: Doanh nghiệp tư nhân và Cơ quan hành chính Nhà nước.</w:t>
-      </w:r>
-    </w:p>
-    <w:p>
-      <w:pPr>
-        <w:spacing w:after="120" w:before="0" w:line="312"/>
-        <w:ind w:firstLine="450"/>
+        <w:t xml:space="preserve">Đề tài áp dụng kết hợp các phương pháp nghiên cứu khoa học sau:</w:t>
+      </w:r>
+    </w:p>
+    <w:p>
+      <w:pPr>
+        <w:spacing/>
+        <w:ind w:left="504" w:hanging="288"/>
         <w:jc w:val="both"/>
       </w:pPr>
       <w:r>
@@ -4287,13 +4685,13 @@
           <w:sz w:val="26"/>
           <w:szCs w:val="26"/>
         </w:rPr>
-        <w:t xml:space="preserve">Mục tiêu cụ thể và các nhiệm vụ nghiên cứu trọng tâm:</w:t>
-      </w:r>
-    </w:p>
-    <w:p>
-      <w:pPr>
-        <w:spacing w:after="120" w:before="0" w:line="312"/>
-        <w:ind w:firstLine="450"/>
+        <w:t xml:space="preserve">• Phương pháp nghiên cứu tài liệu và văn bản pháp quy: Nghiên cứu các quy định pháp luật về cán bộ công chức và các tài liệu chuẩn mực quản trị quốc tế về BSC/KPI.</w:t>
+      </w:r>
+    </w:p>
+    <w:p>
+      <w:pPr>
+        <w:spacing/>
+        <w:ind w:left="504" w:hanging="288"/>
         <w:jc w:val="both"/>
       </w:pPr>
       <w:r>
@@ -4307,13 +4705,13 @@
           <w:sz w:val="26"/>
           <w:szCs w:val="26"/>
         </w:rPr>
-        <w:t xml:space="preserve">• Thứ nhất: Hệ thống hóa cơ sở lý luận về quản trị hiệu suất (BSC, OKR, PDCA, Đánh giá 360 độ, 3P) và thể chế pháp lý công vụ Việt Nam (Nghị định 48/2023/NĐ-CP, Kết luận 14-KL/TW).</w:t>
-      </w:r>
-    </w:p>
-    <w:p>
-      <w:pPr>
-        <w:spacing w:after="120" w:before="0" w:line="312"/>
-        <w:ind w:firstLine="450"/>
+        <w:t xml:space="preserve">• Phương pháp phân tích và thiết kế hướng đối tượng (OOAD): Sử dụng ngôn ngữ UML để mô hình hóa toàn diện các thành phần của hệ thống thông tin.</w:t>
+      </w:r>
+    </w:p>
+    <w:p>
+      <w:pPr>
+        <w:spacing/>
+        <w:ind w:left="504" w:hanging="288"/>
         <w:jc w:val="both"/>
       </w:pPr>
       <w:r>
@@ -4327,13 +4725,31 @@
           <w:sz w:val="26"/>
           <w:szCs w:val="26"/>
         </w:rPr>
-        <w:t xml:space="preserve">• Thứ hai: Khảo sát, mô hình hóa các yêu cầu nghiệp vụ chức năng và phi chức năng của hai khối đối tượng.</w:t>
-      </w:r>
-    </w:p>
-    <w:p>
-      <w:pPr>
-        <w:spacing w:after="120" w:before="0" w:line="312"/>
-        <w:ind w:firstLine="450"/>
+        <w:t xml:space="preserve">• Phương pháp mô hình hóa toán học: Xây dựng các thuật toán tính điểm chuẩn hóa, công thức tỷ lệ thuận/nghịch và thuật toán kiểm chuẩn dữ liệu bất thường.</w:t>
+      </w:r>
+    </w:p>
+    <w:p>
+      <w:pPr>
+        <w:pStyle w:val="Heading1"/>
+        <w:spacing w:after="100" w:before="240"/>
+        <w:jc w:val="left"/>
+      </w:pPr>
+      <w:r>
+        <w:rPr>
+          <w:rFonts w:ascii="Times New Roman" w:cs="Times New Roman" w:eastAsia="Times New Roman" w:hAnsi="Times New Roman"/>
+          <w:b/>
+          <w:bCs/>
+          <w:color w:val="000000"/>
+          <w:sz w:val="28"/>
+          <w:szCs w:val="28"/>
+        </w:rPr>
+        <w:t xml:space="preserve">5. Cấu trúc của báo cáo</w:t>
+      </w:r>
+    </w:p>
+    <w:p>
+      <w:pPr>
+        <w:spacing/>
+        <w:ind w:firstLine="720"/>
         <w:jc w:val="both"/>
       </w:pPr>
       <w:r>
@@ -4347,13 +4763,13 @@
           <w:sz w:val="26"/>
           <w:szCs w:val="26"/>
         </w:rPr>
-        <w:t xml:space="preserve">• Thứ ba: Thiết kế cấu trúc tĩnh và hành vi động của hệ thống bằng ngôn ngữ mô hình hóa thống nhất UML (Actor Tree, Use Case, Package, Class, Sequence, Activity, State Machine).</w:t>
-      </w:r>
-    </w:p>
-    <w:p>
-      <w:pPr>
-        <w:spacing w:after="120" w:before="0" w:line="312"/>
-        <w:ind w:firstLine="450"/>
+        <w:t xml:space="preserve">Báo cáo được kết cấu thành 3 chương chính bên cạnh Phần mở đầu và Kết luận:</w:t>
+      </w:r>
+    </w:p>
+    <w:p>
+      <w:pPr>
+        <w:spacing/>
+        <w:ind w:left="504" w:hanging="288"/>
         <w:jc w:val="both"/>
       </w:pPr>
       <w:r>
@@ -4367,13 +4783,13 @@
           <w:sz w:val="26"/>
           <w:szCs w:val="26"/>
         </w:rPr>
-        <w:t xml:space="preserve">• Thứ tư: Thiết kế kiến trúc kỹ thuật 3 tầng và cơ sở dữ liệu quan hệ chuẩn hóa 3NF gồm 26 bảng thực thể, tối ưu hóa đường ống dữ liệu thời gian thực và thuật toán chống gian lận.</w:t>
-      </w:r>
-    </w:p>
-    <w:p>
-      <w:pPr>
-        <w:spacing w:after="120" w:before="0" w:line="312"/>
-        <w:ind w:firstLine="450"/>
+        <w:t xml:space="preserve">• Chương 1: Cơ sở lý luận về quản trị hiệu suất và hệ thống thông tin đánh giá KPI.</w:t>
+      </w:r>
+    </w:p>
+    <w:p>
+      <w:pPr>
+        <w:spacing/>
+        <w:ind w:left="504" w:hanging="288"/>
         <w:jc w:val="both"/>
       </w:pPr>
       <w:r>
@@ -4387,31 +4803,13 @@
           <w:sz w:val="26"/>
           <w:szCs w:val="26"/>
         </w:rPr>
-        <w:t xml:space="preserve">• Thứ năm: Xây dựng kế hoạch triển khai 16 tuần, ma trận quản trị rủi ro và lộ trình tích hợp công nghệ Trí tuệ nhân tạo (AI) trong tương lai.</w:t>
-      </w:r>
-    </w:p>
-    <w:p>
-      <w:pPr>
-        <w:pStyle w:val="Heading1"/>
-        <w:spacing w:after="100" w:before="240"/>
-        <w:jc w:val="left"/>
-      </w:pPr>
-      <w:r>
-        <w:rPr>
-          <w:rFonts w:ascii="Times New Roman" w:cs="Times New Roman" w:eastAsia="Times New Roman" w:hAnsi="Times New Roman"/>
-          <w:b/>
-          <w:bCs/>
-          <w:color w:val="000000"/>
-          <w:sz w:val="28"/>
-          <w:szCs w:val="28"/>
-        </w:rPr>
-        <w:t xml:space="preserve">3. Đối tượng và phạm vi nghiên cứu</w:t>
-      </w:r>
-    </w:p>
-    <w:p>
-      <w:pPr>
-        <w:spacing w:after="120" w:before="0" w:line="312"/>
-        <w:ind w:firstLine="450"/>
+        <w:t xml:space="preserve">• Chương 2: Phân tích và thiết kế hệ thống thông tin đánh giá KPI.</w:t>
+      </w:r>
+    </w:p>
+    <w:p>
+      <w:pPr>
+        <w:spacing/>
+        <w:ind w:left="504" w:hanging="288"/>
         <w:jc w:val="both"/>
       </w:pPr>
       <w:r>
@@ -4425,13 +4823,50 @@
           <w:sz w:val="26"/>
           <w:szCs w:val="26"/>
         </w:rPr>
-        <w:t xml:space="preserve">Đối tượng nghiên cứu: Quy trình nghiệp vụ quản trị hiệu suất, phương pháp đánh giá kết quả thực hiện công việc và giải pháp thiết kế hệ thống thông tin tác nghiệp hỗ trợ đánh giá KPI.</w:t>
-      </w:r>
-    </w:p>
-    <w:p>
-      <w:pPr>
-        <w:spacing w:after="120" w:before="0" w:line="312"/>
-        <w:ind w:firstLine="450"/>
+        <w:t xml:space="preserve">• Chương 3: Kết quả đạt được, kế hoạch triển khai và hướng phát triển.</w:t>
+      </w:r>
+    </w:p>
+    <w:p>
+      <w:pPr>
+        <w:pageBreakBefore/>
+        <w:spacing/>
+        <w:ind w:firstLine="720"/>
+        <w:jc w:val="both"/>
+      </w:pPr>
+      <w:r>
+        <w:rPr>
+          <w:rFonts w:ascii="Times New Roman" w:cs="Times New Roman" w:eastAsia="Times New Roman" w:hAnsi="Times New Roman"/>
+          <w:b/>
+          <w:bCs/>
+          <w:color w:val="000000"/>
+          <w:sz w:val="30"/>
+          <w:szCs w:val="30"/>
+        </w:rPr>
+        <w:t xml:space="preserve">CHƯƠNG 1: CƠ SỞ LÝ LUẬN VỀ QUẢN TRỊ HIỆU SUẤT VÀ HỆ THỐNG THÔNG TIN ĐÁNH GIÁ KPI</w:t>
+      </w:r>
+    </w:p>
+    <w:p>
+      <w:pPr>
+        <w:pStyle w:val="Heading1"/>
+        <w:spacing w:after="100" w:before="240"/>
+        <w:jc w:val="left"/>
+      </w:pPr>
+      <w:r>
+        <w:rPr>
+          <w:rFonts w:ascii="Times New Roman" w:cs="Times New Roman" w:eastAsia="Times New Roman" w:hAnsi="Times New Roman"/>
+          <w:b/>
+          <w:bCs/>
+          <w:color w:val="000000"/>
+          <w:sz w:val="28"/>
+          <w:szCs w:val="28"/>
+        </w:rPr>
+        <w:t xml:space="preserve">1.1. Hệ thống hóa các mô hình lý thuyết quản trị hiệu suất</w:t>
+      </w:r>
+    </w:p>
+    <w:p>
+      <w:pPr>
+        <w:spacing/>
+        <w:ind w:firstLine="720"/>
         <w:jc w:val="both"/>
       </w:pPr>
       <w:r>
@@ -4445,13 +4880,13 @@
           <w:sz w:val="26"/>
           <w:szCs w:val="26"/>
         </w:rPr>
-        <w:t xml:space="preserve">Phạm vi nghiên cứu: Tập trung vào hai mô hình điển hình là Doanh nghiệp sản xuất - kinh doanh (với quy trình thu thập dữ liệu tác nghiệp từ ERP/MES/IoT) và Cơ quan hành chính nhà nước (với quy trình đánh giá xếp loại theo Nghị định số 48/2023/NĐ-CP và Kết luận số 14-KL/TW).</w:t>
-      </w:r>
-    </w:p>
-    <w:p>
-      <w:pPr>
-        <w:pStyle w:val="Heading1"/>
-        <w:spacing w:after="100" w:before="240"/>
+        <w:t xml:space="preserve">Quản trị hiệu suất (Performance Management) là quá trình mang tính chiến lược và tích hợp nhằm duy trì sự thành công bền vững của tổ chức thông qua việc nâng cao năng lực của các tập thể và cá nhân. Trọng tâm của quản trị hiệu suất hiện đại là chuyển dịch từ phương thức đánh giá hồi tố mang tính phán xét sang việc đồng hành, theo dõi tiến độ thời gian thực và cải tiến liên tục.</w:t>
+      </w:r>
+    </w:p>
+    <w:p>
+      <w:pPr>
+        <w:pStyle w:val="Heading2"/>
+        <w:spacing w:after="80" w:before="180"/>
         <w:jc w:val="left"/>
       </w:pPr>
       <w:r>
@@ -4460,16 +4895,16 @@
           <w:b/>
           <w:bCs/>
           <w:color w:val="000000"/>
-          <w:sz w:val="28"/>
-          <w:szCs w:val="28"/>
-        </w:rPr>
-        <w:t xml:space="preserve">4. Phương pháp nghiên cứu</w:t>
-      </w:r>
-    </w:p>
-    <w:p>
-      <w:pPr>
-        <w:spacing w:after="120" w:before="0" w:line="312"/>
-        <w:ind w:firstLine="450"/>
+          <w:sz w:val="26"/>
+          <w:szCs w:val="26"/>
+        </w:rPr>
+        <w:t xml:space="preserve">1.1.1. Mô hình Thẻ điểm cân bằng (Balanced Scorecard - BSC)</w:t>
+      </w:r>
+    </w:p>
+    <w:p>
+      <w:pPr>
+        <w:spacing/>
+        <w:ind w:firstLine="720"/>
         <w:jc w:val="both"/>
       </w:pPr>
       <w:r>
@@ -4483,7 +4918,7 @@
           <w:sz w:val="26"/>
           <w:szCs w:val="26"/>
         </w:rPr>
-        <w:t xml:space="preserve">Đề tài áp dụng kết hợp các phương pháp nghiên cứu khoa học sau:</w:t>
+        <w:t xml:space="preserve">Được phát triển bởi Robert Kaplan và David Norton, mô hình Thẻ điểm cân bằng giúp chuyển hóa tầm nhìn và chiến lược của tổ chức thành hệ thống các mục tiêu và chỉ số đo lường cụ thể theo bốn khía cạnh then chốt:</w:t>
       </w:r>
     </w:p>
     <w:p>
@@ -4503,7 +4938,7 @@
           <w:sz w:val="26"/>
           <w:szCs w:val="26"/>
         </w:rPr>
-        <w:t xml:space="preserve">• Phương pháp nghiên cứu tài liệu và văn bản pháp quy: Nghiên cứu các quy định pháp luật về cán bộ công chức và các tài liệu chuẩn mực quản trị quốc tế về BSC/KPI.</w:t>
+        <w:t xml:space="preserve">1. Khía cạnh Tài chính: Đo lường kết quả tài chính cuối cùng như Doanh thu, Lợi nhuận gộp, Tỷ suất hoàn vốn đầu tư (ROI).</w:t>
       </w:r>
     </w:p>
     <w:p>
@@ -4523,7 +4958,7 @@
           <w:sz w:val="26"/>
           <w:szCs w:val="26"/>
         </w:rPr>
-        <w:t xml:space="preserve">• Phương pháp phân tích và thiết kế hướng đối tượng (OOAD): Sử dụng ngôn ngữ UML để mô hình hóa toàn diện các thành phần của hệ thống thông tin.</w:t>
+        <w:t xml:space="preserve">2. Khía cạnh Khách hàng: Đo lường mức độ thỏa mãn của thị trường như Tỷ lệ giữ chân khách hàng, Điểm hài lòng khách hàng (CSAT), Thị phần.</w:t>
       </w:r>
     </w:p>
     <w:p>
@@ -4543,25 +4978,7 @@
           <w:sz w:val="26"/>
           <w:szCs w:val="26"/>
         </w:rPr>
-        <w:t xml:space="preserve">• Phương pháp mô hình hóa toán học: Xây dựng các thuật toán tính điểm chuẩn hóa, công thức tỷ lệ thuận/nghịch và thuật toán kiểm chuẩn dữ liệu bất thường.</w:t>
-      </w:r>
-    </w:p>
-    <w:p>
-      <w:pPr>
-        <w:pStyle w:val="Heading1"/>
-        <w:spacing w:after="100" w:before="240"/>
-        <w:jc w:val="left"/>
-      </w:pPr>
-      <w:r>
-        <w:rPr>
-          <w:rFonts w:ascii="Times New Roman" w:cs="Times New Roman" w:eastAsia="Times New Roman" w:hAnsi="Times New Roman"/>
-          <w:b/>
-          <w:bCs/>
-          <w:color w:val="000000"/>
-          <w:sz w:val="28"/>
-          <w:szCs w:val="28"/>
-        </w:rPr>
-        <w:t xml:space="preserve">5. Cấu trúc của báo cáo</w:t>
+        <w:t xml:space="preserve">3. Khía cạnh Quy trình nội bộ: Đo lường hiệu quả vận hành như Tỷ lệ sản phẩm lỗi (PPM), Năng suất lao động (PPH), Thời gian xử lý đơn hàng.</w:t>
       </w:r>
     </w:p>
     <w:p>
@@ -4581,123 +4998,7 @@
           <w:sz w:val="26"/>
           <w:szCs w:val="26"/>
         </w:rPr>
-        <w:t xml:space="preserve">Báo cáo được kết cấu thành 3 chương chính bên cạnh Phần mở đầu và Kết luận:</w:t>
-      </w:r>
-    </w:p>
-    <w:p>
-      <w:pPr>
-        <w:spacing w:after="120" w:before="0" w:line="312"/>
-        <w:ind w:firstLine="450"/>
-        <w:jc w:val="both"/>
-      </w:pPr>
-      <w:r>
-        <w:rPr>
-          <w:rFonts w:ascii="Times New Roman" w:cs="Times New Roman" w:eastAsia="Times New Roman" w:hAnsi="Times New Roman"/>
-          <w:b w:val="false"/>
-          <w:bCs w:val="false"/>
-          <w:i w:val="false"/>
-          <w:iCs w:val="false"/>
-          <w:color w:val="000000"/>
-          <w:sz w:val="26"/>
-          <w:szCs w:val="26"/>
-        </w:rPr>
-        <w:t xml:space="preserve">• Chương 1: Cơ sở lý luận về quản trị hiệu suất và hệ thống thông tin đánh giá KPI.</w:t>
-      </w:r>
-    </w:p>
-    <w:p>
-      <w:pPr>
-        <w:spacing w:after="120" w:before="0" w:line="312"/>
-        <w:ind w:firstLine="450"/>
-        <w:jc w:val="both"/>
-      </w:pPr>
-      <w:r>
-        <w:rPr>
-          <w:rFonts w:ascii="Times New Roman" w:cs="Times New Roman" w:eastAsia="Times New Roman" w:hAnsi="Times New Roman"/>
-          <w:b w:val="false"/>
-          <w:bCs w:val="false"/>
-          <w:i w:val="false"/>
-          <w:iCs w:val="false"/>
-          <w:color w:val="000000"/>
-          <w:sz w:val="26"/>
-          <w:szCs w:val="26"/>
-        </w:rPr>
-        <w:t xml:space="preserve">• Chương 2: Phân tích và thiết kế hệ thống thông tin đánh giá KPI.</w:t>
-      </w:r>
-    </w:p>
-    <w:p>
-      <w:pPr>
-        <w:spacing w:after="120" w:before="0" w:line="312"/>
-        <w:ind w:firstLine="450"/>
-        <w:jc w:val="both"/>
-      </w:pPr>
-      <w:r>
-        <w:rPr>
-          <w:rFonts w:ascii="Times New Roman" w:cs="Times New Roman" w:eastAsia="Times New Roman" w:hAnsi="Times New Roman"/>
-          <w:b w:val="false"/>
-          <w:bCs w:val="false"/>
-          <w:i w:val="false"/>
-          <w:iCs w:val="false"/>
-          <w:color w:val="000000"/>
-          <w:sz w:val="26"/>
-          <w:szCs w:val="26"/>
-        </w:rPr>
-        <w:t xml:space="preserve">• Chương 3: Kết quả đạt được, kế hoạch triển khai và hướng phát triển.</w:t>
-      </w:r>
-    </w:p>
-    <w:p>
-      <w:pPr>
-        <w:pageBreakBefore/>
-        <w:spacing w:after="180" w:before="240"/>
-        <w:jc w:val="center"/>
-      </w:pPr>
-      <w:r>
-        <w:rPr>
-          <w:rFonts w:ascii="Times New Roman" w:cs="Times New Roman" w:eastAsia="Times New Roman" w:hAnsi="Times New Roman"/>
-          <w:b/>
-          <w:bCs/>
-          <w:color w:val="000000"/>
-          <w:sz w:val="30"/>
-          <w:szCs w:val="30"/>
-        </w:rPr>
-        <w:t xml:space="preserve">CHƯƠNG 1: CƠ SỞ LÝ LUẬN VỀ QUẢN TRỊ HIỆU SUẤT VÀ HỆ THỐNG THÔNG TIN ĐÁNH GIÁ KPI</w:t>
-      </w:r>
-    </w:p>
-    <w:p>
-      <w:pPr>
-        <w:pStyle w:val="Heading1"/>
-        <w:spacing w:after="100" w:before="240"/>
-        <w:jc w:val="left"/>
-      </w:pPr>
-      <w:r>
-        <w:rPr>
-          <w:rFonts w:ascii="Times New Roman" w:cs="Times New Roman" w:eastAsia="Times New Roman" w:hAnsi="Times New Roman"/>
-          <w:b/>
-          <w:bCs/>
-          <w:color w:val="000000"/>
-          <w:sz w:val="28"/>
-          <w:szCs w:val="28"/>
-        </w:rPr>
-        <w:t xml:space="preserve">1.1. Hệ thống hóa các mô hình lý thuyết quản trị hiệu suất</w:t>
-      </w:r>
-    </w:p>
-    <w:p>
-      <w:pPr>
-        <w:spacing w:after="120" w:before="0" w:line="312"/>
-        <w:ind w:firstLine="450"/>
-        <w:jc w:val="both"/>
-      </w:pPr>
-      <w:r>
-        <w:rPr>
-          <w:rFonts w:ascii="Times New Roman" w:cs="Times New Roman" w:eastAsia="Times New Roman" w:hAnsi="Times New Roman"/>
-          <w:b w:val="false"/>
-          <w:bCs w:val="false"/>
-          <w:i w:val="false"/>
-          <w:iCs w:val="false"/>
-          <w:color w:val="000000"/>
-          <w:sz w:val="26"/>
-          <w:szCs w:val="26"/>
-        </w:rPr>
-        <w:t xml:space="preserve">Quản trị hiệu suất (Performance Management) là quá trình mang tính chiến lược và tích hợp nhằm duy trì sự thành công bền vững của tổ chức thông qua việc nâng cao năng lực của các tập thể và cá nhân. Trọng tâm của quản trị hiệu suất hiện đại là chuyển dịch từ phương thức đánh giá hồi tố mang tính phán xét sang việc đồng hành, theo dõi tiến độ thời gian thực và cải tiến liên tục.</w:t>
+        <w:t xml:space="preserve">4. Khía cạnh Học hỏi và Phát triển: Đo lường năng lực con người và công nghệ như Giờ đào tạo/nhân viên, Tỷ lệ áp dụng sáng kiến đổi mới, Chỉ số gắn kết nhân viên.</w:t>
       </w:r>
     </w:p>
     <w:p>
@@ -4715,131 +5016,13 @@
           <w:sz w:val="26"/>
           <w:szCs w:val="26"/>
         </w:rPr>
-        <w:t xml:space="preserve">1.1.1. Mô hình Thẻ điểm cân bằng (Balanced Scorecard - BSC)</w:t>
-      </w:r>
-    </w:p>
-    <w:p>
-      <w:pPr>
-        <w:spacing w:after="120" w:before="0" w:line="312"/>
-        <w:ind w:firstLine="450"/>
-        <w:jc w:val="both"/>
-      </w:pPr>
-      <w:r>
-        <w:rPr>
-          <w:rFonts w:ascii="Times New Roman" w:cs="Times New Roman" w:eastAsia="Times New Roman" w:hAnsi="Times New Roman"/>
-          <w:b w:val="false"/>
-          <w:bCs w:val="false"/>
-          <w:i w:val="false"/>
-          <w:iCs w:val="false"/>
-          <w:color w:val="000000"/>
-          <w:sz w:val="26"/>
-          <w:szCs w:val="26"/>
-        </w:rPr>
-        <w:t xml:space="preserve">Được phát triển bởi Robert Kaplan và David Norton, mô hình Thẻ điểm cân bằng giúp chuyển hóa tầm nhìn và chiến lược của tổ chức thành hệ thống các mục tiêu và chỉ số đo lường cụ thể theo bốn khía cạnh then chốt:</w:t>
-      </w:r>
-    </w:p>
-    <w:p>
-      <w:pPr>
-        <w:spacing w:after="120" w:before="0" w:line="312"/>
-        <w:ind w:firstLine="450"/>
-        <w:jc w:val="both"/>
-      </w:pPr>
-      <w:r>
-        <w:rPr>
-          <w:rFonts w:ascii="Times New Roman" w:cs="Times New Roman" w:eastAsia="Times New Roman" w:hAnsi="Times New Roman"/>
-          <w:b w:val="false"/>
-          <w:bCs w:val="false"/>
-          <w:i w:val="false"/>
-          <w:iCs w:val="false"/>
-          <w:color w:val="000000"/>
-          <w:sz w:val="26"/>
-          <w:szCs w:val="26"/>
-        </w:rPr>
-        <w:t xml:space="preserve">1. Khía cạnh Tài chính: Đo lường kết quả tài chính cuối cùng như Doanh thu, Lợi nhuận gộp, Tỷ suất hoàn vốn đầu tư (ROI).</w:t>
-      </w:r>
-    </w:p>
-    <w:p>
-      <w:pPr>
-        <w:spacing w:after="120" w:before="0" w:line="312"/>
-        <w:ind w:firstLine="450"/>
-        <w:jc w:val="both"/>
-      </w:pPr>
-      <w:r>
-        <w:rPr>
-          <w:rFonts w:ascii="Times New Roman" w:cs="Times New Roman" w:eastAsia="Times New Roman" w:hAnsi="Times New Roman"/>
-          <w:b w:val="false"/>
-          <w:bCs w:val="false"/>
-          <w:i w:val="false"/>
-          <w:iCs w:val="false"/>
-          <w:color w:val="000000"/>
-          <w:sz w:val="26"/>
-          <w:szCs w:val="26"/>
-        </w:rPr>
-        <w:t xml:space="preserve">2. Khía cạnh Khách hàng: Đo lường mức độ thỏa mãn của thị trường như Tỷ lệ giữ chân khách hàng, Điểm hài lòng khách hàng (CSAT), Thị phần.</w:t>
-      </w:r>
-    </w:p>
-    <w:p>
-      <w:pPr>
-        <w:spacing w:after="120" w:before="0" w:line="312"/>
-        <w:ind w:firstLine="450"/>
-        <w:jc w:val="both"/>
-      </w:pPr>
-      <w:r>
-        <w:rPr>
-          <w:rFonts w:ascii="Times New Roman" w:cs="Times New Roman" w:eastAsia="Times New Roman" w:hAnsi="Times New Roman"/>
-          <w:b w:val="false"/>
-          <w:bCs w:val="false"/>
-          <w:i w:val="false"/>
-          <w:iCs w:val="false"/>
-          <w:color w:val="000000"/>
-          <w:sz w:val="26"/>
-          <w:szCs w:val="26"/>
-        </w:rPr>
-        <w:t xml:space="preserve">3. Khía cạnh Quy trình nội bộ: Đo lường hiệu quả vận hành như Tỷ lệ sản phẩm lỗi (PPM), Năng suất lao động (PPH), Thời gian xử lý đơn hàng.</w:t>
-      </w:r>
-    </w:p>
-    <w:p>
-      <w:pPr>
-        <w:spacing w:after="120" w:before="0" w:line="312"/>
-        <w:ind w:firstLine="450"/>
-        <w:jc w:val="both"/>
-      </w:pPr>
-      <w:r>
-        <w:rPr>
-          <w:rFonts w:ascii="Times New Roman" w:cs="Times New Roman" w:eastAsia="Times New Roman" w:hAnsi="Times New Roman"/>
-          <w:b w:val="false"/>
-          <w:bCs w:val="false"/>
-          <w:i w:val="false"/>
-          <w:iCs w:val="false"/>
-          <w:color w:val="000000"/>
-          <w:sz w:val="26"/>
-          <w:szCs w:val="26"/>
-        </w:rPr>
-        <w:t xml:space="preserve">4. Khía cạnh Học hỏi và Phát triển: Đo lường năng lực con người và công nghệ như Giờ đào tạo/nhân viên, Tỷ lệ áp dụng sáng kiến đổi mới, Chỉ số gắn kết nhân viên.</w:t>
-      </w:r>
-    </w:p>
-    <w:p>
-      <w:pPr>
-        <w:pStyle w:val="Heading2"/>
-        <w:spacing w:after="80" w:before="180"/>
-        <w:jc w:val="left"/>
-      </w:pPr>
-      <w:r>
-        <w:rPr>
-          <w:rFonts w:ascii="Times New Roman" w:cs="Times New Roman" w:eastAsia="Times New Roman" w:hAnsi="Times New Roman"/>
-          <w:b/>
-          <w:bCs/>
-          <w:color w:val="000000"/>
-          <w:sz w:val="26"/>
-          <w:szCs w:val="26"/>
-        </w:rPr>
         <w:t xml:space="preserve">1.1.2. Mô hình Mục tiêu và Kết quả then chốt (OKRs) và mối quan hệ với KPI</w:t>
       </w:r>
     </w:p>
     <w:p>
       <w:pPr>
-        <w:spacing w:after="120" w:before="0" w:line="312"/>
-        <w:ind w:firstLine="450"/>
+        <w:spacing/>
+        <w:ind w:firstLine="720"/>
         <w:jc w:val="both"/>
       </w:pPr>
       <w:r>
@@ -5349,7 +5532,7 @@
                 <w:sz w:val="22"/>
                 <w:szCs w:val="22"/>
               </w:rPr>
-              <w:t xml:space="preserve">Liên kết trực tiếp và chặt chẽ với lương P3 và tiền thưởng</w:t>
+              <w:t>Có thể dùng làm căn cứ P3 theo chính sách đã ban hành; không tự động. HRMS hiện chưa nối KPI với bảng lương.</w:t>
             </w:r>
           </w:p>
         </w:tc>
@@ -5382,7 +5565,7 @@
                 <w:sz w:val="22"/>
                 <w:szCs w:val="22"/>
               </w:rPr>
-              <w:t xml:space="preserve">Tách biệt khỏi quỹ lương cơ bản, tránh việc đặt mục tiêu an toàn</w:t>
+              <w:t>Thường tách khỏi tiền lương để khuyến khích mục tiêu thách thức; tùy quy chế doanh nghiệp.</w:t>
             </w:r>
           </w:p>
         </w:tc>
@@ -5509,8 +5692,8 @@
     </w:p>
     <w:p>
       <w:pPr>
-        <w:spacing w:after="120" w:before="0" w:line="312"/>
-        <w:ind w:firstLine="450"/>
+        <w:spacing/>
+        <w:ind w:firstLine="720"/>
         <w:jc w:val="both"/>
       </w:pPr>
       <w:r>
@@ -5529,8 +5712,8 @@
     </w:p>
     <w:p>
       <w:pPr>
-        <w:spacing w:after="120" w:before="0" w:line="312"/>
-        <w:ind w:firstLine="450"/>
+        <w:spacing/>
+        <w:ind w:firstLine="720"/>
         <w:jc w:val="both"/>
       </w:pPr>
       <w:r>
@@ -5544,13 +5727,13 @@
           <w:sz w:val="26"/>
           <w:szCs w:val="26"/>
         </w:rPr>
-        <w:t xml:space="preserve">Phương pháp đánh giá đa chiều 360 độ bổ sung góc nhìn toàn diện cho hệ thống: Kết hợp điểm tự đánh giá của cá nhân, điểm đánh giá của Quản lý trực tiếp, điểm nhận xét của Đồng nghiệp ngang hàng và điểm đánh giá của Cấp dưới (đối với vị trí quản lý).</w:t>
-      </w:r>
-    </w:p>
-    <w:p>
-      <w:pPr>
-        <w:spacing w:after="120" w:before="0" w:line="312"/>
-        <w:ind w:firstLine="450"/>
+        <w:t>Phản hồi nhiều nguồn là lựa chọn quản trị nội bộ của doanh nghiệp, không thay thế quy trình đánh giá công vụ. HRMS doanh nghiệp hiện áp dụng nhân viên 20% tự đánh giá, 30% đồng nghiệp, 50% quản lý; quản lý có cấp dưới áp dụng 20% tự đánh giá, 20% đồng nghiệp, 50% cấp trên, 10% cấp dưới. Chế độ khu vực công không dùng công thức 360 này.</w:t>
+      </w:r>
+    </w:p>
+    <w:p>
+      <w:pPr>
+        <w:spacing/>
+        <w:ind w:firstLine="720"/>
         <w:jc w:val="both"/>
       </w:pPr>
       <w:r>
@@ -5564,7 +5747,7 @@
           <w:sz w:val="26"/>
           <w:szCs w:val="26"/>
         </w:rPr>
-        <w:t xml:space="preserve">Mô hình đãi ngộ 3P (Position - Person - Performance) bảo đảm tính công bằng tuyệt đối: Lương vị trí việc làm (P1), Lương năng lực cá nhân (P2) và Lương hiệu quả công việc hoàn thành theo chỉ số KPI (P3).</w:t>
+        <w:t>Mô hình đãi ngộ 3P (Position - Person - Performance) là một lựa chọn chính sách của doanh nghiệp, không phải chuẩn bắt buộc cho mọi đơn vị. P3 chỉ được nối với điểm KPI khi doanh nghiệp ban hành quy chế và tích hợp bảng lương; phần mềm HRMS hiện tại chưa tự tính hoặc xuất P3.</w:t>
       </w:r>
     </w:p>
     <w:p>
@@ -5587,8 +5770,8 @@
     </w:p>
     <w:p>
       <w:pPr>
-        <w:spacing w:after="120" w:before="0" w:line="312"/>
-        <w:ind w:firstLine="450"/>
+        <w:spacing/>
+        <w:ind w:firstLine="720"/>
         <w:jc w:val="both"/>
       </w:pPr>
       <w:r>
@@ -5620,13 +5803,13 @@
           <w:sz w:val="26"/>
           <w:szCs w:val="26"/>
         </w:rPr>
-        <w:t xml:space="preserve">1.2.1. Khung thể chế pháp lý: Nghị định số 48/2023/NĐ-CP</w:t>
-      </w:r>
-    </w:p>
-    <w:p>
-      <w:pPr>
-        <w:spacing w:after="120" w:before="0" w:line="312"/>
-        <w:ind w:firstLine="450"/>
+        <w:t>1.2.1. Khung áp dụng năm 2026 đối với công chức và viên chức</w:t>
+      </w:r>
+    </w:p>
+    <w:p>
+      <w:pPr>
+        <w:spacing/>
+        <w:ind w:firstLine="720"/>
         <w:jc w:val="both"/>
       </w:pPr>
       <w:r>
@@ -5640,13 +5823,13 @@
           <w:sz w:val="26"/>
           <w:szCs w:val="26"/>
         </w:rPr>
-        <w:t xml:space="preserve">Nghị định số 48/2023/NĐ-CP ngày 17/7/2023 của Chính phủ đã sửa đổi, bổ sung quy định về đánh giá, xếp loại chất lượng cán bộ, công chức, viên chức với những nguyên tắc mang tính đột phá:</w:t>
-      </w:r>
-    </w:p>
-    <w:p>
-      <w:pPr>
-        <w:spacing w:after="120" w:before="0" w:line="312"/>
-        <w:ind w:firstLine="450"/>
+        <w:t>Từ năm 2026, căn cứ được lựa chọn theo loại hình đơn vị và đối tượng: Nghị định 335/2025/NĐ-CP áp dụng với cơ quan hành chính nhà nước và công chức từ 01/01/2026; Nghị định 233/2026/NĐ-CP áp dụng với đơn vị sự nghiệp công lập và viên chức từ 01/07/2026. Các quy định xếp loại cũ tại Nghị định 90/2020 và phần sửa đổi năm 2023 đã được thay thế theo phạm vi đối tượng kể từ ngày hiệu lực của hai nghị định mới.</w:t>
+      </w:r>
+    </w:p>
+    <w:p>
+      <w:pPr>
+        <w:spacing/>
+        <w:ind w:left="504" w:hanging="288"/>
         <w:jc w:val="both"/>
       </w:pPr>
       <w:r>
@@ -5660,13 +5843,13 @@
           <w:sz w:val="26"/>
           <w:szCs w:val="26"/>
         </w:rPr>
-        <w:t xml:space="preserve">• Nguyên tắc lượng hóa tối đa: Kết quả đánh giá phải dựa trên sản phẩm đầu ra cụ thể, gắn liền với tiến độ và chất lượng thực thi nhiệm vụ được giao.</w:t>
-      </w:r>
-    </w:p>
-    <w:p>
-      <w:pPr>
-        <w:spacing w:after="120" w:before="0" w:line="312"/>
-        <w:ind w:firstLine="450"/>
+        <w:t>• Kết quả phải gắn tiêu chí chung và sản phẩm/nhiệm vụ được giao, có căn cứ kiểm chứng và thẩm quyền kết luận.</w:t>
+      </w:r>
+    </w:p>
+    <w:p>
+      <w:pPr>
+        <w:spacing/>
+        <w:ind w:left="504" w:hanging="288"/>
         <w:jc w:val="both"/>
       </w:pPr>
       <w:r>
@@ -5680,13 +5863,13 @@
           <w:sz w:val="26"/>
           <w:szCs w:val="26"/>
         </w:rPr>
-        <w:t xml:space="preserve">• Nguyên tắc không cào bằng: Kết quả đánh giá của người đứng đầu không được cao hơn kết quả đánh giá của cơ quan, tổ chức, đơn vị do mình trực tiếp phụ trách.</w:t>
-      </w:r>
-    </w:p>
-    <w:p>
-      <w:pPr>
-        <w:spacing w:after="120" w:before="0" w:line="312"/>
-        <w:ind w:firstLine="450"/>
+        <w:t>• Mức điểm chỉ là căn cứ định lượng; điều kiện cụ thể theo loại đối tượng, chức vụ và quy chế của cấp có thẩm quyền vẫn phải được xem xét trước khi công nhận xếp loại.</w:t>
+      </w:r>
+    </w:p>
+    <w:p>
+      <w:pPr>
+        <w:spacing/>
+        <w:ind w:left="504" w:hanging="288"/>
         <w:jc w:val="both"/>
       </w:pPr>
       <w:r>
@@ -5700,7 +5883,7 @@
           <w:sz w:val="26"/>
           <w:szCs w:val="26"/>
         </w:rPr>
-        <w:t xml:space="preserve">• Khống chế trần tỷ lệ 20%: Tỷ lệ cán bộ, công chức, viên chức xếp loại "Hoàn thành xuất sắc nhiệm vụ" trong tổng số được xếp loại "Hoàn thành tốt nhiệm vụ" không quá 20% tại từng cơ quan, đơn vị.</w:t>
+        <w:t>• Tỷ lệ “Hoàn thành xuất sắc nhiệm vụ” tối đa thông thường là 20% trên số người được xếp loại “Hoàn thành tốt nhiệm vụ” trong cùng đơn vị và nhóm nhiệm vụ tương đồng. Chỉ xem xét đến 25% nếu đủ điều kiện và có quyết định của cấp có thẩm quyền; không áp dụng cho KPI doanh nghiệp.</w:t>
       </w:r>
     </w:p>
     <w:tbl>
@@ -5755,7 +5938,7 @@
                 <w:sz w:val="22"/>
                 <w:szCs w:val="22"/>
               </w:rPr>
-              <w:t xml:space="preserve">Mức xếp loại theo NĐ 48</w:t>
+              <w:t>Khung xếp loại công chức/viên chức 2026</w:t>
             </w:r>
           </w:p>
         </w:tc>
@@ -5790,7 +5973,7 @@
                 <w:sz w:val="22"/>
                 <w:szCs w:val="22"/>
               </w:rPr>
-              <w:t xml:space="preserve">Tiêu chuẩn định lượng và Tiêu chí nghiệp vụ cốt lõi</w:t>
+              <w:t>Điểm tổng &gt;=90: xem xét xuất sắc và phải đủ điều kiện cụ thể; từ 70 đến dưới 90: tốt; từ 50 đến dưới 70: hoàn thành; dưới 50 hoặc trường hợp loại trừ: không hoàn thành. Cấp có thẩm quyền còn phải xem sản phẩm, tiến độ, chất lượng, kỷ luật và quy chế theo loại đối tượng.</w:t>
             </w:r>
           </w:p>
         </w:tc>
@@ -5825,7 +6008,7 @@
                 <w:sz w:val="22"/>
                 <w:szCs w:val="22"/>
               </w:rPr>
-              <w:t xml:space="preserve">Tỷ lệ khống chế</w:t>
+              <w:t>Chỉ áp dụng khu vực công; doanh nghiệp không áp dụng hạn ngạch này.</w:t>
             </w:r>
           </w:p>
         </w:tc>
@@ -5860,7 +6043,7 @@
                 <w:sz w:val="22"/>
                 <w:szCs w:val="22"/>
               </w:rPr>
-              <w:t xml:space="preserve">Hoàn thành xuất sắc nhiệm vụ</w:t>
+              <w:t>Hoàn thành xuất sắc nhiệm vụ</w:t>
             </w:r>
           </w:p>
         </w:tc>
@@ -5893,7 +6076,7 @@
                 <w:sz w:val="22"/>
                 <w:szCs w:val="22"/>
               </w:rPr>
-              <w:t xml:space="preserve">Đạt 100% chỉ tiêu theo kế hoạch; 100% nhiệm vụ hoàn thành đúng tiến độ, bảo đảm chất lượng; có ít nhất 01 sáng kiến đổi mới được công nhận; khống chế tối đa không quá 20%.</w:t>
+              <w:t>Điểm từ 90 trở lên và đủ điều kiện theo NĐ 335/2025 (công chức) hoặc NĐ 233/2026 (viên chức); cần thẩm quyền kết luận và đối chiếu nhóm nhiệm vụ tương đồng.</w:t>
             </w:r>
           </w:p>
         </w:tc>
@@ -5926,7 +6109,7 @@
                 <w:sz w:val="22"/>
                 <w:szCs w:val="22"/>
               </w:rPr>
-              <w:t xml:space="preserve">Tối đa 20%</w:t>
+              <w:t>Khu vực công; mặc định 20%, ngoại lệ đến 25% theo quyết định có thẩm quyền.</w:t>
             </w:r>
           </w:p>
         </w:tc>
@@ -5961,7 +6144,7 @@
                 <w:sz w:val="22"/>
                 <w:szCs w:val="22"/>
               </w:rPr>
-              <w:t xml:space="preserve">Hoàn thành tốt nhiệm vụ</w:t>
+              <w:t>Hoàn thành tốt nhiệm vụ</w:t>
             </w:r>
           </w:p>
         </w:tc>
@@ -5994,7 +6177,7 @@
                 <w:sz w:val="22"/>
                 <w:szCs w:val="22"/>
               </w:rPr>
-              <w:t xml:space="preserve">Đạt 100% chỉ tiêu kế hoạch; bảo đảm chất lượng và tiến độ công việc; các tiêu chí thành phần đều đạt mức tốt trở lên.</w:t>
+              <w:t>Thông thường từ 70 đến dưới 90 điểm, kèm điều kiện hoàn thành nhiệm vụ theo nghị định và quy chế áp dụng.</w:t>
             </w:r>
           </w:p>
         </w:tc>
@@ -6027,7 +6210,7 @@
                 <w:sz w:val="22"/>
                 <w:szCs w:val="22"/>
               </w:rPr>
-              <w:t xml:space="preserve">Không khống chế</w:t>
+              <w:t>Không áp dụng hạn ngạch xuất sắc.</w:t>
             </w:r>
           </w:p>
         </w:tc>
@@ -6062,7 +6245,7 @@
                 <w:sz w:val="22"/>
                 <w:szCs w:val="22"/>
               </w:rPr>
-              <w:t xml:space="preserve">Hoàn thành nhiệm vụ</w:t>
+              <w:t>Hoàn thành nhiệm vụ</w:t>
             </w:r>
           </w:p>
         </w:tc>
@@ -6095,7 +6278,7 @@
                 <w:sz w:val="22"/>
                 <w:szCs w:val="22"/>
               </w:rPr>
-              <w:t xml:space="preserve">Đạt từ 80% đến dưới 100% chỉ tiêu kế hoạch; có không quá 20% số lượng nhiệm vụ còn chậm tiến độ hoặc chất lượng chưa đạt yêu cầu tối ưu.</w:t>
+              <w:t>Thông thường từ 50 đến dưới 70 điểm; áp dụng điều kiện nhiệm vụ, tiến độ, chất lượng theo nghị định.</w:t>
             </w:r>
           </w:p>
         </w:tc>
@@ -6128,7 +6311,7 @@
                 <w:sz w:val="22"/>
                 <w:szCs w:val="22"/>
               </w:rPr>
-              <w:t xml:space="preserve">Không khống chế</w:t>
+              <w:t>Không áp dụng hạn ngạch xuất sắc.</w:t>
             </w:r>
           </w:p>
         </w:tc>
@@ -6163,7 +6346,7 @@
                 <w:sz w:val="22"/>
                 <w:szCs w:val="22"/>
               </w:rPr>
-              <w:t xml:space="preserve">Không hoàn thành nhiệm vụ</w:t>
+              <w:t>Không hoàn thành nhiệm vụ</w:t>
             </w:r>
           </w:p>
         </w:tc>
@@ -6196,7 +6379,7 @@
                 <w:sz w:val="22"/>
                 <w:szCs w:val="22"/>
               </w:rPr>
-              <w:t xml:space="preserve">Có trên 20% nhiệm vụ chậm tiến độ hoặc không hoàn thành; vi phạm kỷ luật công vụ hoặc để cơ quan, đơn vị phụ trách xảy ra sai phạm nghiêm trọng.</w:t>
+              <w:t>Dưới 50 điểm hoặc thuộc trường hợp pháp lý khác theo nghị định/quy chế áp dụng.</w:t>
             </w:r>
           </w:p>
         </w:tc>
@@ -6229,7 +6412,7 @@
                 <w:sz w:val="22"/>
                 <w:szCs w:val="22"/>
               </w:rPr>
-              <w:t xml:space="preserve">Không khống chế</w:t>
+              <w:t>Không áp dụng hạn ngạch xuất sắc.</w:t>
             </w:r>
           </w:p>
         </w:tc>
@@ -6255,8 +6438,8 @@
     </w:p>
     <w:p>
       <w:pPr>
-        <w:spacing w:after="120" w:before="0" w:line="312"/>
-        <w:ind w:firstLine="450"/>
+        <w:spacing/>
+        <w:ind w:firstLine="720"/>
         <w:jc w:val="both"/>
       </w:pPr>
       <w:r>
@@ -6270,7 +6453,7 @@
           <w:sz w:val="26"/>
           <w:szCs w:val="26"/>
         </w:rPr>
-        <w:t xml:space="preserve">Kết luận số 14-KL/TW ngày 22/9/2021 của Bộ Chính trị đặt ra yêu cầu bảo vệ cán bộ năng động, sáng tạo, dám nghĩ, dám làm, dám đột phá vì lợi ích chung. Trong hệ thống phần mềm đánh giá KPI, nguyên tắc này được cụ thể hóa bằng cơ chế miễn trừ trách nhiệm kỷ luật và cộng điểm ưu tiên khi cán bộ đăng ký đề án đổi mới sáng tạo hợp lệ nhưng gặp rủi ro khách quan trong quá trình thí điểm.</w:t>
+        <w:t>Kết luận 14-KL/TW là căn cứ định hướng xem xét trường hợp cán bộ đổi mới, sáng tạo vì lợi ích chung, không phải công thức cộng điểm, miễn kỷ luật hoặc tự động vượt tỷ lệ. Phần mềm chỉ nên lưu hồ sơ, lý do và quyết định của cấp có thẩm quyền; không tự suy diễn miễn trừ.</w:t>
       </w:r>
     </w:p>
     <w:p>
@@ -6293,8 +6476,8 @@
     </w:p>
     <w:p>
       <w:pPr>
-        <w:spacing w:after="120" w:before="0" w:line="312"/>
-        <w:ind w:firstLine="450"/>
+        <w:spacing/>
+        <w:ind w:firstLine="720"/>
         <w:jc w:val="both"/>
       </w:pPr>
       <w:r>
@@ -6308,13 +6491,23 @@
           <w:sz w:val="26"/>
           <w:szCs w:val="26"/>
         </w:rPr>
-        <w:t xml:space="preserve">Trong khối doanh nghiệp, hệ thống KPI tập trung đo lường hiệu quả sử dụng nguồn lực và tốc độ đáp ứng khách hàng:</w:t>
-      </w:r>
-    </w:p>
-    <w:p>
-      <w:pPr>
-        <w:spacing w:after="120" w:before="0" w:line="312"/>
-        <w:ind w:firstLine="450"/>
+        <w:t>Trong doanh nghiệp, KPI có thể gắn với hiệu quả nguồn lực, chất lượng và đáp ứng khách hàng. OEE, PPM và kết nối dữ liệu dưới đây là ví dụ theo ngành hoặc phương án phân tích; chỉ áp dụng khi có định nghĩa, dữ liệu và nguồn phù hợp, không phải chức năng HRMS hiện tại:</w:t>
+      </w:r>
+    </w:p>
+    <w:p>
+      <w:pPr>
+        <w:spacing/>
+        <w:ind w:left="504" w:hanging="288"/>
+        <w:jc w:val="both"/>
+      </w:pPr>
+      <w:r>
+        <w:t>• Đo lường hiệu suất thiết bị tổng thể (OEE): OEE = Mức độ sẵn sàng × Hiệu suất vận hành × Tỷ lệ chất lượng sản phẩm.</w:t>
+      </w:r>
+    </w:p>
+    <w:p>
+      <w:pPr>
+        <w:spacing/>
+        <w:ind w:left="504" w:hanging="288"/>
         <w:jc w:val="both"/>
       </w:pPr>
       <w:r>
@@ -6328,13 +6521,13 @@
           <w:sz w:val="26"/>
           <w:szCs w:val="26"/>
         </w:rPr>
-        <w:t xml:space="preserve">• Đo lường hiệu suất thiết bị tổng thể (OEE): $OEE = A 	imes P 	imes Q$ trong đó $A$ là mức độ sẵn sàng, $P$ là hiệu suất vận hành, và $Q$ là tỷ lệ chất lượng sản phẩm.</w:t>
-      </w:r>
-    </w:p>
-    <w:p>
-      <w:pPr>
-        <w:spacing w:after="120" w:before="0" w:line="312"/>
-        <w:ind w:firstLine="450"/>
+        <w:t>• Tỷ lệ sai hỏng trên một triệu sản phẩm (PPM): Số đơn vị lỗi ÷ tổng đơn vị sản phẩm × 1.000.000; chỉ dùng khi quy tắc đếm lỗi và nguồn dữ liệu chất lượng được thống nhất.</w:t>
+      </w:r>
+    </w:p>
+    <w:p>
+      <w:pPr>
+        <w:spacing/>
+        <w:ind w:left="504" w:hanging="288"/>
         <w:jc w:val="both"/>
       </w:pPr>
       <w:r>
@@ -6348,13 +6541,13 @@
           <w:sz w:val="26"/>
           <w:szCs w:val="26"/>
         </w:rPr>
-        <w:t xml:space="preserve">• Tỷ lệ sai hỏng trên một triệu sản phẩm (PPM): Phản ánh độ chính xác và kỷ luật sản xuất.</w:t>
-      </w:r>
-    </w:p>
-    <w:p>
-      <w:pPr>
-        <w:spacing w:after="120" w:before="0" w:line="312"/>
-        <w:ind w:firstLine="450"/>
+        <w:t>• Kết nối nguồn dữ liệu (phương án): Nếu doanh nghiệp có ERP/MES/IoT và cấp quyền, có thể nạp sản lượng, thời gian vận hành và lỗi theo lô. HRMS hiện chưa tích hợp các nguồn này; dữ liệu cần đối soát, phân quyền sửa và lưu vết.</w:t>
+      </w:r>
+    </w:p>
+    <w:p>
+      <w:pPr>
+        <w:spacing/>
+        <w:ind w:left="504" w:hanging="288"/>
         <w:jc w:val="both"/>
       </w:pPr>
       <w:r>
@@ -6368,13 +6561,31 @@
           <w:sz w:val="26"/>
           <w:szCs w:val="26"/>
         </w:rPr>
-        <w:t xml:space="preserve">• Tự động hóa đường ống nạp dữ liệu (Data Pipeline): Dữ liệu sản lượng, thời gian máy chạy, tỷ lệ lỗi được thu thập tự động từ cảm biến IoT công nghiệp và phần mềm điều hành sản xuất MES/ERP, loại bỏ hoàn toàn việc can thiệp chỉnh sửa số liệu thủ công.</w:t>
-      </w:r>
-    </w:p>
-    <w:p>
-      <w:pPr>
-        <w:spacing w:after="120" w:before="0" w:line="312"/>
-        <w:ind w:firstLine="450"/>
+        <w:t>• Kiểm soát gian lận (phương án nâng cao): Ưu tiên phân quyền, nhật ký thay đổi, khóa kỳ và đối soát chứng từ. Phát hiện ngoại lai (Anomaly Detection) hoặc băm SHA-256 là lựa chọn kỹ thuật tùy rủi ro, không thay thế kiểm tra nghiệp vụ và chưa có trong HRMS.</w:t>
+      </w:r>
+    </w:p>
+    <w:p>
+      <w:pPr>
+        <w:pStyle w:val="Heading1"/>
+        <w:spacing w:after="100" w:before="240"/>
+        <w:jc w:val="left"/>
+      </w:pPr>
+      <w:r>
+        <w:rPr>
+          <w:rFonts w:ascii="Times New Roman" w:cs="Times New Roman" w:eastAsia="Times New Roman" w:hAnsi="Times New Roman"/>
+          <w:b/>
+          <w:bCs/>
+          <w:color w:val="000000"/>
+          <w:sz w:val="28"/>
+          <w:szCs w:val="28"/>
+        </w:rPr>
+        <w:t xml:space="preserve">1.4. Mô hình toán học và công thức tính toán chỉ số hiệu quả</w:t>
+      </w:r>
+    </w:p>
+    <w:p>
+      <w:pPr>
+        <w:spacing/>
+        <w:ind w:firstLine="720"/>
         <w:jc w:val="both"/>
       </w:pPr>
       <w:r>
@@ -6388,7 +6599,207 @@
           <w:sz w:val="26"/>
           <w:szCs w:val="26"/>
         </w:rPr>
-        <w:t xml:space="preserve">• Thuật toán kiểm chuẩn chống gian lận: Áp dụng thuật toán quét ngoại lai (Anomaly Detection) và băm dữ liệu SHA-256 đối với mọi bản ghi tác nghiệp nhằm ngăn chặn hành vi sửa đổi dữ liệu sau giờ chốt ca.</w:t>
+        <w:t xml:space="preserve">Nhằm bảo đảm tính minh bạch và chuẩn xác tuyệt đối trong khâu tính điểm, các công thức toán học được chuẩn hóa như sau:</w:t>
+      </w:r>
+    </w:p>
+    <w:p>
+      <w:pPr>
+        <w:spacing w:after="60" w:before="160"/>
+      </w:pPr>
+      <w:r>
+        <w:rPr>
+          <w:rFonts w:ascii="Times New Roman" w:cs="Times New Roman" w:eastAsia="Times New Roman" w:hAnsi="Times New Roman"/>
+          <w:b/>
+          <w:bCs/>
+          <w:color w:val="000000"/>
+          <w:sz w:val="26"/>
+          <w:szCs w:val="26"/>
+        </w:rPr>
+        <w:t xml:space="preserve">Công thức 1.1: Điểm số chỉ tiêu tỷ lệ thuận (Càng cao càng tốt - Doanh thu, Sản lượng, Điểm hài lòng):</w:t>
+      </w:r>
+    </w:p>
+    <w:p>
+      <w:pPr>
+        <w:spacing/>
+        <w:ind w:firstLine="720"/>
+        <w:jc w:val="both"/>
+      </w:pPr>
+      <w:r>
+        <w:rPr>
+          <w:rFonts w:ascii="Times New Roman" w:cs="Times New Roman" w:eastAsia="Times New Roman" w:hAnsi="Times New Roman"/>
+          <w:b/>
+          <w:bCs/>
+          <w:color w:val="000000"/>
+          <w:sz w:val="26"/>
+          <w:szCs w:val="26"/>
+        </w:rPr>
+        <w:t>Điểm = min(max(Thực tế ÷ Mục tiêu × 100, 0), Điểm trần), với mục tiêu lớn hơn 0.</w:t>
+      </w:r>
+    </w:p>
+    <w:p>
+      <w:pPr>
+        <w:spacing/>
+        <w:ind w:firstLine="720"/>
+        <w:jc w:val="both"/>
+      </w:pPr>
+      <w:r>
+        <w:rPr>
+          <w:rFonts w:ascii="Times New Roman" w:cs="Times New Roman" w:eastAsia="Times New Roman" w:hAnsi="Times New Roman"/>
+          <w:i/>
+          <w:iCs/>
+          <w:color w:val="000000"/>
+          <w:sz w:val="26"/>
+          <w:szCs w:val="26"/>
+        </w:rPr>
+        <w:t xml:space="preserve">Giải thích: Trong đó: S_i là điểm số của chỉ tiêu thứ i; A_i là giá trị thực hiện thực tế đo lường được; T_i là giá trị chỉ tiêu kế hoạch được giao; S_max là trần điểm khống chế tối đa (thường là 120% hoặc 150% nhằm tránh việc chạy theo số lượng).</w:t>
+      </w:r>
+    </w:p>
+    <w:p>
+      <w:pPr>
+        <w:spacing w:after="60" w:before="160"/>
+      </w:pPr>
+      <w:r>
+        <w:rPr>
+          <w:rFonts w:ascii="Times New Roman" w:cs="Times New Roman" w:eastAsia="Times New Roman" w:hAnsi="Times New Roman"/>
+          <w:b/>
+          <w:bCs/>
+          <w:color w:val="000000"/>
+          <w:sz w:val="26"/>
+          <w:szCs w:val="26"/>
+        </w:rPr>
+        <w:t xml:space="preserve">Công thức 1.2: Điểm số chỉ tiêu tỷ lệ nghịch (Càng thấp càng tốt - Tỷ lệ phế phẩm PPM, Tỷ lệ trễ hạn hồ sơ):</w:t>
+      </w:r>
+    </w:p>
+    <w:p>
+      <w:pPr>
+        <w:spacing/>
+        <w:ind w:firstLine="720"/>
+        <w:jc w:val="both"/>
+      </w:pPr>
+      <w:r>
+        <w:rPr>
+          <w:rFonts w:ascii="Times New Roman" w:cs="Times New Roman" w:eastAsia="Times New Roman" w:hAnsi="Times New Roman"/>
+          <w:b/>
+          <w:bCs/>
+          <w:color w:val="000000"/>
+          <w:sz w:val="26"/>
+          <w:szCs w:val="26"/>
+        </w:rPr>
+        <w:t>Điểm = min(max((2 − Thực tế ÷ Mục tiêu) × 100, 0), Điểm trần), với mục tiêu lớn hơn 0.</w:t>
+      </w:r>
+    </w:p>
+    <w:p>
+      <w:pPr>
+        <w:spacing/>
+        <w:ind w:firstLine="720"/>
+        <w:jc w:val="both"/>
+      </w:pPr>
+      <w:r>
+        <w:rPr>
+          <w:rFonts w:ascii="Times New Roman" w:cs="Times New Roman" w:eastAsia="Times New Roman" w:hAnsi="Times New Roman"/>
+          <w:i/>
+          <w:iCs/>
+          <w:color w:val="000000"/>
+          <w:sz w:val="26"/>
+          <w:szCs w:val="26"/>
+        </w:rPr>
+        <w:t xml:space="preserve">Giải thích: Trong đó: Khi giá trị thực tế A_i bằng đúng kế hoạch T_i thì điểm số đạt 100 điểm. Nếu tỷ lệ lỗi A_i vượt quá 2 lần ngưỡng trần cho phép (A_i &gt;= 2*T_i) thì điểm số chỉ tiêu bị triệt tiêu về 0 điểm.</w:t>
+      </w:r>
+    </w:p>
+    <w:p>
+      <w:pPr>
+        <w:spacing w:after="60" w:before="160"/>
+      </w:pPr>
+      <w:r>
+        <w:rPr>
+          <w:rFonts w:ascii="Times New Roman" w:cs="Times New Roman" w:eastAsia="Times New Roman" w:hAnsi="Times New Roman"/>
+          <w:b/>
+          <w:bCs/>
+          <w:color w:val="000000"/>
+          <w:sz w:val="26"/>
+          <w:szCs w:val="26"/>
+        </w:rPr>
+        <w:t xml:space="preserve">Công thức 1.3: Điểm đánh giá tổng hợp có trọng số trong kỳ (Composite Score):</w:t>
+      </w:r>
+    </w:p>
+    <w:p>
+      <w:pPr>
+        <w:spacing/>
+        <w:ind w:firstLine="720"/>
+        <w:jc w:val="both"/>
+      </w:pPr>
+      <w:r>
+        <w:t>Điểm tổng hợp = tổng (trọng số chỉ tiêu × điểm chỉ tiêu); tổng trọng số của các chỉ tiêu được giao trong kỳ bắt buộc bằng 100%.</w:t>
+      </w:r>
+    </w:p>
+    <w:p>
+      <w:pPr>
+        <w:spacing/>
+        <w:ind w:firstLine="720"/>
+        <w:jc w:val="both"/>
+      </w:pPr>
+      <w:r>
+        <w:rPr>
+          <w:rFonts w:ascii="Times New Roman" w:cs="Times New Roman" w:eastAsia="Times New Roman" w:hAnsi="Times New Roman"/>
+          <w:i/>
+          <w:iCs/>
+          <w:color w:val="000000"/>
+          <w:sz w:val="26"/>
+          <w:szCs w:val="26"/>
+        </w:rPr>
+        <w:t xml:space="preserve">Giải thích: Trong đó: w_i là trọng số của chỉ tiêu thứ i; S_i là điểm số thành phần của chỉ tiêu thứ i; tổng trọng số của toàn bộ danh mục chỉ tiêu giao cho một cá nhân trong chu kỳ bắt buộc phải đúng bằng 100%.</w:t>
+      </w:r>
+    </w:p>
+    <w:p>
+      <w:pPr>
+        <w:spacing w:after="60" w:before="160"/>
+      </w:pPr>
+      <w:r>
+        <w:rPr>
+          <w:rFonts w:ascii="Times New Roman" w:cs="Times New Roman" w:eastAsia="Times New Roman" w:hAnsi="Times New Roman"/>
+          <w:b/>
+          <w:bCs/>
+          <w:color w:val="000000"/>
+          <w:sz w:val="26"/>
+          <w:szCs w:val="26"/>
+        </w:rPr>
+        <w:t xml:space="preserve">Công thức 1.4: Điểm tổng hợp đánh giá đa chiều 360 độ (Multi-rater Feedback):</w:t>
+      </w:r>
+    </w:p>
+    <w:p>
+      <w:pPr>
+        <w:spacing/>
+        <w:ind w:firstLine="720"/>
+        <w:jc w:val="both"/>
+      </w:pPr>
+      <w:r>
+        <w:rPr>
+          <w:rFonts w:ascii="Times New Roman" w:cs="Times New Roman" w:eastAsia="Times New Roman" w:hAnsi="Times New Roman"/>
+          <w:b/>
+          <w:bCs/>
+          <w:color w:val="000000"/>
+          <w:sz w:val="26"/>
+          <w:szCs w:val="26"/>
+        </w:rPr>
+        <w:t>Nhân viên doanh nghiệp: S = 0,20 × S_tự đánh giá + 0,30 × S_đồng nghiệp + 0,50 × S_quản lý. Quản lý có cấp dưới: S = 0,20 × S_tự đánh giá + 0,20 × S_đồng nghiệp + 0,50 × S_cấp trên + 0,10 × S_cấp dưới. Đây là trọng số chính sách nội bộ của HRMS, không phải chuẩn pháp lý phổ quát; kỳ khu vực công dùng mô hình 30/70 riêng.</w:t>
+      </w:r>
+    </w:p>
+    <w:p>
+      <w:pPr>
+        <w:spacing/>
+        <w:ind w:firstLine="720"/>
+        <w:jc w:val="both"/>
+      </w:pPr>
+      <w:r>
+        <w:rPr>
+          <w:rFonts w:ascii="Times New Roman" w:cs="Times New Roman" w:eastAsia="Times New Roman" w:hAnsi="Times New Roman"/>
+          <w:i/>
+          <w:iCs/>
+          <w:color w:val="000000"/>
+          <w:sz w:val="26"/>
+          <w:szCs w:val="26"/>
+        </w:rPr>
+        <w:t>Các điểm thành phần được quy đổi về thang 100 trước khi tổng hợp. Với nhân viên không quản lý, phản hồi cấp dưới không áp dụng; phần 30% đồng nghiệp không bị chia lại. Với quản lý có cấp dưới, phần phản hồi đồng nghiệp là 20% và cấp dưới 10%. Kết quả vẫn cần quản lý xem xét minh chứng; không tự quyết định lương P3.</w:t>
       </w:r>
     </w:p>
     <w:p>
@@ -6406,13 +6817,13 @@
           <w:sz w:val="28"/>
           <w:szCs w:val="28"/>
         </w:rPr>
-        <w:t xml:space="preserve">1.4. Mô hình toán học và công thức tính toán chỉ số hiệu quả</w:t>
-      </w:r>
-    </w:p>
-    <w:p>
-      <w:pPr>
-        <w:spacing w:after="120" w:before="0" w:line="312"/>
-        <w:ind w:firstLine="450"/>
+        <w:t xml:space="preserve">1.5. Danh mục Từ điển chỉ số hiệu quả mẫu</w:t>
+      </w:r>
+    </w:p>
+    <w:p>
+      <w:pPr>
+        <w:spacing/>
+        <w:ind w:firstLine="720"/>
         <w:jc w:val="both"/>
       </w:pPr>
       <w:r>
@@ -6426,249 +6837,7 @@
           <w:sz w:val="26"/>
           <w:szCs w:val="26"/>
         </w:rPr>
-        <w:t xml:space="preserve">Nhằm bảo đảm tính minh bạch và chuẩn xác tuyệt đối trong khâu tính điểm, các công thức toán học được chuẩn hóa như sau:</w:t>
-      </w:r>
-    </w:p>
-    <w:p>
-      <w:pPr>
-        <w:spacing w:after="60" w:before="160"/>
-      </w:pPr>
-      <w:r>
-        <w:rPr>
-          <w:rFonts w:ascii="Times New Roman" w:cs="Times New Roman" w:eastAsia="Times New Roman" w:hAnsi="Times New Roman"/>
-          <w:b/>
-          <w:bCs/>
-          <w:color w:val="000000"/>
-          <w:sz w:val="26"/>
-          <w:szCs w:val="26"/>
-        </w:rPr>
-        <w:t xml:space="preserve">Công thức 1.1: Điểm số chỉ tiêu tỷ lệ thuận (Càng cao càng tốt - Doanh thu, Sản lượng, Điểm hài lòng):</w:t>
-      </w:r>
-    </w:p>
-    <w:p>
-      <w:pPr>
-        <w:spacing w:after="80" w:before="60"/>
-        <w:jc w:val="center"/>
-      </w:pPr>
-      <w:r>
-        <w:rPr>
-          <w:rFonts w:ascii="Times New Roman" w:cs="Times New Roman" w:eastAsia="Times New Roman" w:hAnsi="Times New Roman"/>
-          <w:b/>
-          <w:bCs/>
-          <w:color w:val="000000"/>
-          <w:sz w:val="26"/>
-          <w:szCs w:val="26"/>
-        </w:rPr>
-        <w:t xml:space="preserve">S_i = \min\left( \max\left( \frac{A_i}{T_i} \times 100, 0 \right), S_{\max} \right)</w:t>
-      </w:r>
-    </w:p>
-    <w:p>
-      <w:pPr>
-        <w:spacing w:after="160" w:before="40"/>
-        <w:ind w:firstLine="450"/>
-        <w:jc w:val="both"/>
-      </w:pPr>
-      <w:r>
-        <w:rPr>
-          <w:rFonts w:ascii="Times New Roman" w:cs="Times New Roman" w:eastAsia="Times New Roman" w:hAnsi="Times New Roman"/>
-          <w:i/>
-          <w:iCs/>
-          <w:color w:val="000000"/>
-          <w:sz w:val="26"/>
-          <w:szCs w:val="26"/>
-        </w:rPr>
-        <w:t xml:space="preserve">Giải thích: Trong đó: S_i là điểm số của chỉ tiêu thứ i; A_i là giá trị thực hiện thực tế đo lường được; T_i là giá trị chỉ tiêu kế hoạch được giao; S_max là trần điểm khống chế tối đa (thường là 120% hoặc 150% nhằm tránh việc chạy theo số lượng).</w:t>
-      </w:r>
-    </w:p>
-    <w:p>
-      <w:pPr>
-        <w:spacing w:after="60" w:before="160"/>
-      </w:pPr>
-      <w:r>
-        <w:rPr>
-          <w:rFonts w:ascii="Times New Roman" w:cs="Times New Roman" w:eastAsia="Times New Roman" w:hAnsi="Times New Roman"/>
-          <w:b/>
-          <w:bCs/>
-          <w:color w:val="000000"/>
-          <w:sz w:val="26"/>
-          <w:szCs w:val="26"/>
-        </w:rPr>
-        <w:t xml:space="preserve">Công thức 1.2: Điểm số chỉ tiêu tỷ lệ nghịch (Càng thấp càng tốt - Tỷ lệ phế phẩm PPM, Tỷ lệ trễ hạn hồ sơ):</w:t>
-      </w:r>
-    </w:p>
-    <w:p>
-      <w:pPr>
-        <w:spacing w:after="80" w:before="60"/>
-        <w:jc w:val="center"/>
-      </w:pPr>
-      <w:r>
-        <w:rPr>
-          <w:rFonts w:ascii="Times New Roman" w:cs="Times New Roman" w:eastAsia="Times New Roman" w:hAnsi="Times New Roman"/>
-          <w:b/>
-          <w:bCs/>
-          <w:color w:val="000000"/>
-          <w:sz w:val="26"/>
-          <w:szCs w:val="26"/>
-        </w:rPr>
-        <w:t xml:space="preserve">S_i = \min\left( \max\left( \left( 2 - \frac{A_i}{T_i} \right) \times 100, 0 \right), S_{\max} \right)</w:t>
-      </w:r>
-    </w:p>
-    <w:p>
-      <w:pPr>
-        <w:spacing w:after="160" w:before="40"/>
-        <w:ind w:firstLine="450"/>
-        <w:jc w:val="both"/>
-      </w:pPr>
-      <w:r>
-        <w:rPr>
-          <w:rFonts w:ascii="Times New Roman" w:cs="Times New Roman" w:eastAsia="Times New Roman" w:hAnsi="Times New Roman"/>
-          <w:i/>
-          <w:iCs/>
-          <w:color w:val="000000"/>
-          <w:sz w:val="26"/>
-          <w:szCs w:val="26"/>
-        </w:rPr>
-        <w:t xml:space="preserve">Giải thích: Trong đó: Khi giá trị thực tế A_i bằng đúng kế hoạch T_i thì điểm số đạt 100 điểm. Nếu tỷ lệ lỗi A_i vượt quá 2 lần ngưỡng trần cho phép (A_i &gt;= 2*T_i) thì điểm số chỉ tiêu bị triệt tiêu về 0 điểm.</w:t>
-      </w:r>
-    </w:p>
-    <w:p>
-      <w:pPr>
-        <w:spacing w:after="60" w:before="160"/>
-      </w:pPr>
-      <w:r>
-        <w:rPr>
-          <w:rFonts w:ascii="Times New Roman" w:cs="Times New Roman" w:eastAsia="Times New Roman" w:hAnsi="Times New Roman"/>
-          <w:b/>
-          <w:bCs/>
-          <w:color w:val="000000"/>
-          <w:sz w:val="26"/>
-          <w:szCs w:val="26"/>
-        </w:rPr>
-        <w:t xml:space="preserve">Công thức 1.3: Điểm đánh giá tổng hợp có trọng số trong kỳ (Composite Score):</w:t>
-      </w:r>
-    </w:p>
-    <w:p>
-      <w:pPr>
-        <w:spacing w:after="80" w:before="60"/>
-        <w:jc w:val="center"/>
-      </w:pPr>
-      <w:r>
-        <w:rPr>
-          <w:rFonts w:ascii="Times New Roman" w:cs="Times New Roman" w:eastAsia="Times New Roman" w:hAnsi="Times New Roman"/>
-          <w:b/>
-          <w:bCs/>
-          <w:color w:val="000000"/>
-          <w:sz w:val="26"/>
-          <w:szCs w:val="26"/>
-        </w:rPr>
-        <w:t xml:space="preserve">S_{\text{total}} = \sum_{i=1}^{n} \left( w_i \times S_i \right) \quad \text{với điều kiện bắt buộc:} \quad \sum_{i=1}^{n} w_i = 100\%</w:t>
-      </w:r>
-    </w:p>
-    <w:p>
-      <w:pPr>
-        <w:spacing w:after="160" w:before="40"/>
-        <w:ind w:firstLine="450"/>
-        <w:jc w:val="both"/>
-      </w:pPr>
-      <w:r>
-        <w:rPr>
-          <w:rFonts w:ascii="Times New Roman" w:cs="Times New Roman" w:eastAsia="Times New Roman" w:hAnsi="Times New Roman"/>
-          <w:i/>
-          <w:iCs/>
-          <w:color w:val="000000"/>
-          <w:sz w:val="26"/>
-          <w:szCs w:val="26"/>
-        </w:rPr>
-        <w:t xml:space="preserve">Giải thích: Trong đó: w_i là trọng số của chỉ tiêu thứ i; S_i là điểm số thành phần của chỉ tiêu thứ i; tổng trọng số của toàn bộ danh mục chỉ tiêu giao cho một cá nhân trong chu kỳ bắt buộc phải đúng bằng 100%.</w:t>
-      </w:r>
-    </w:p>
-    <w:p>
-      <w:pPr>
-        <w:spacing w:after="60" w:before="160"/>
-      </w:pPr>
-      <w:r>
-        <w:rPr>
-          <w:rFonts w:ascii="Times New Roman" w:cs="Times New Roman" w:eastAsia="Times New Roman" w:hAnsi="Times New Roman"/>
-          <w:b/>
-          <w:bCs/>
-          <w:color w:val="000000"/>
-          <w:sz w:val="26"/>
-          <w:szCs w:val="26"/>
-        </w:rPr>
-        <w:t xml:space="preserve">Công thức 1.4: Điểm tổng hợp đánh giá đa chiều 360 độ (Multi-rater Feedback):</w:t>
-      </w:r>
-    </w:p>
-    <w:p>
-      <w:pPr>
-        <w:spacing w:after="80" w:before="60"/>
-        <w:jc w:val="center"/>
-      </w:pPr>
-      <w:r>
-        <w:rPr>
-          <w:rFonts w:ascii="Times New Roman" w:cs="Times New Roman" w:eastAsia="Times New Roman" w:hAnsi="Times New Roman"/>
-          <w:b/>
-          <w:bCs/>
-          <w:color w:val="000000"/>
-          <w:sz w:val="26"/>
-          <w:szCs w:val="26"/>
-        </w:rPr>
-        <w:t xml:space="preserve">S_{360} = 0.50 \times S_{\text{QL}} + 0.20 \times S_{\text{Tu}} + 0.20 \times S_{\text{DongNghiep}} + 0.10 \times S_{\text{CapDuoi}}</w:t>
-      </w:r>
-    </w:p>
-    <w:p>
-      <w:pPr>
-        <w:spacing w:after="160" w:before="40"/>
-        <w:ind w:firstLine="450"/>
-        <w:jc w:val="both"/>
-      </w:pPr>
-      <w:r>
-        <w:rPr>
-          <w:rFonts w:ascii="Times New Roman" w:cs="Times New Roman" w:eastAsia="Times New Roman" w:hAnsi="Times New Roman"/>
-          <w:i/>
-          <w:iCs/>
-          <w:color w:val="000000"/>
-          <w:sz w:val="26"/>
-          <w:szCs w:val="26"/>
-        </w:rPr>
-        <w:t xml:space="preserve">Giải thích: Trong đó: S_QL là điểm đánh giá của Quản lý trực tiếp (chiếm 50%); S_Tu là điểm tự đánh giá của cá nhân (chiếm 20%); S_DongNghiep là điểm đánh giá bình quân của các đồng nghiệp ngang hàng (chiếm 20%); S_CapDuoi là điểm đánh giá của nhân viên cấp dưới (chiếm 10%).</w:t>
-      </w:r>
-    </w:p>
-    <w:p>
-      <w:pPr>
-        <w:pStyle w:val="Heading1"/>
-        <w:spacing w:after="100" w:before="240"/>
-        <w:jc w:val="left"/>
-      </w:pPr>
-      <w:r>
-        <w:rPr>
-          <w:rFonts w:ascii="Times New Roman" w:cs="Times New Roman" w:eastAsia="Times New Roman" w:hAnsi="Times New Roman"/>
-          <w:b/>
-          <w:bCs/>
-          <w:color w:val="000000"/>
-          <w:sz w:val="28"/>
-          <w:szCs w:val="28"/>
-        </w:rPr>
-        <w:t xml:space="preserve">1.5. Danh mục Từ điển chỉ số hiệu quả mẫu</w:t>
-      </w:r>
-    </w:p>
-    <w:p>
-      <w:pPr>
-        <w:spacing w:after="120" w:before="0" w:line="312"/>
-        <w:ind w:firstLine="450"/>
-        <w:jc w:val="both"/>
-      </w:pPr>
-      <w:r>
-        <w:rPr>
-          <w:rFonts w:ascii="Times New Roman" w:cs="Times New Roman" w:eastAsia="Times New Roman" w:hAnsi="Times New Roman"/>
-          <w:b w:val="false"/>
-          <w:bCs w:val="false"/>
-          <w:i w:val="false"/>
-          <w:iCs w:val="false"/>
-          <w:color w:val="000000"/>
-          <w:sz w:val="26"/>
-          <w:szCs w:val="26"/>
-        </w:rPr>
-        <w:t xml:space="preserve">Hệ thống thiết lập sẵn từ điển chỉ số chuẩn hóa cho cả hai khu vực công và tư:</w:t>
+        <w:t>Từ điển chỉ số trong báo cáo là thư viện ví dụ để minh họa khả năng cấu hình. Khi triển khai thực tế cần HR và quản lý chuyên môn xác nhận định nghĩa, đơn vị đo, nguồn dữ liệu, kỳ đo, mức sàn/trần và người chịu trách nhiệm; mẫu khu vực công phải theo chế độ riêng.</w:t>
       </w:r>
     </w:p>
     <w:p>
@@ -8140,7 +8309,7 @@
           <w:sz w:val="26"/>
           <w:szCs w:val="26"/>
         </w:rPr>
-        <w:t xml:space="preserve">1.5.2. Bộ tiêu chí đánh giá công vụ theo Nghị định 48/2023/NĐ-CP</w:t>
+        <w:t>1.5.2. Ví dụ nhóm tiêu chí công chức/viên chức theo khung đánh giá năm 2026</w:t>
       </w:r>
     </w:p>
     <w:tbl>
@@ -8232,7 +8401,7 @@
                 <w:sz w:val="22"/>
                 <w:szCs w:val="22"/>
               </w:rPr>
-              <w:t xml:space="preserve">Nội dung tiêu chí đánh giá công vụ</w:t>
+              <w:t>Ví dụ tiêu chí đánh giá khu vực công theo khung 2026 (không phải mẫu pháp quy)</w:t>
             </w:r>
           </w:p>
         </w:tc>
@@ -8438,7 +8607,7 @@
                 <w:sz w:val="22"/>
                 <w:szCs w:val="22"/>
               </w:rPr>
-              <w:t xml:space="preserve">Khối I (Chung)</w:t>
+              <w:t>Khối I (Chung)</w:t>
             </w:r>
           </w:p>
         </w:tc>
@@ -8471,7 +8640,7 @@
                 <w:sz w:val="22"/>
                 <w:szCs w:val="22"/>
               </w:rPr>
-              <w:t xml:space="preserve">20 điểm</w:t>
+              <w:t>15 điểm</w:t>
             </w:r>
           </w:p>
         </w:tc>
@@ -8504,7 +8673,7 @@
                 <w:sz w:val="22"/>
                 <w:szCs w:val="22"/>
               </w:rPr>
-              <w:t xml:space="preserve">Bản tự kiểm điểm, Ý kiến Cấp ủy Chi bộ nơi công tác</w:t>
+              <w:t>Ví dụ căn cứ; cơ quan cấu hình theo tiêu chí/quy chế thuộc thẩm quyền.</w:t>
             </w:r>
           </w:p>
         </w:tc>
@@ -8605,7 +8774,7 @@
                 <w:sz w:val="22"/>
                 <w:szCs w:val="22"/>
               </w:rPr>
-              <w:t xml:space="preserve">Khối I (Chung)</w:t>
+              <w:t>Khối I (Chung)</w:t>
             </w:r>
           </w:p>
         </w:tc>
@@ -8638,7 +8807,7 @@
                 <w:sz w:val="22"/>
                 <w:szCs w:val="22"/>
               </w:rPr>
-              <w:t xml:space="preserve">20 điểm</w:t>
+              <w:t>15 điểm</w:t>
             </w:r>
           </w:p>
         </w:tc>
@@ -8671,7 +8840,7 @@
                 <w:sz w:val="22"/>
                 <w:szCs w:val="22"/>
               </w:rPr>
-              <w:t xml:space="preserve">Dữ liệu chấm công điện tử, Biên bản họp cơ quan</w:t>
+              <w:t>Ví dụ căn cứ; cơ quan cấu hình theo tiêu chí/quy chế thuộc thẩm quyền.</w:t>
             </w:r>
           </w:p>
         </w:tc>
@@ -8772,7 +8941,7 @@
                 <w:sz w:val="22"/>
                 <w:szCs w:val="22"/>
               </w:rPr>
-              <w:t xml:space="preserve">Khối II (Nhiệm vụ)</w:t>
+              <w:t>Khối II (Nhiệm vụ)</w:t>
             </w:r>
           </w:p>
         </w:tc>
@@ -8805,7 +8974,7 @@
                 <w:sz w:val="22"/>
                 <w:szCs w:val="22"/>
               </w:rPr>
-              <w:t xml:space="preserve">30 điểm</w:t>
+              <w:t>30 điểm</w:t>
             </w:r>
           </w:p>
         </w:tc>
@@ -8838,7 +9007,7 @@
                 <w:sz w:val="22"/>
                 <w:szCs w:val="22"/>
               </w:rPr>
-              <w:t xml:space="preserve">Hệ thống Một cửa điện tử: 100% đúng hạn</w:t>
+              <w:t>Nguồn minh chứng cần cấu hình theo hệ thống và nhiệm vụ thực tế của cơ quan.</w:t>
             </w:r>
           </w:p>
         </w:tc>
@@ -8939,7 +9108,7 @@
                 <w:sz w:val="22"/>
                 <w:szCs w:val="22"/>
               </w:rPr>
-              <w:t xml:space="preserve">Khối II (Nhiệm vụ)</w:t>
+              <w:t>Khối II (Nhiệm vụ)</w:t>
             </w:r>
           </w:p>
         </w:tc>
@@ -8972,7 +9141,7 @@
                 <w:sz w:val="22"/>
                 <w:szCs w:val="22"/>
               </w:rPr>
-              <w:t xml:space="preserve">20 điểm</w:t>
+              <w:t>25 điểm</w:t>
             </w:r>
           </w:p>
         </w:tc>
@@ -9005,7 +9174,7 @@
                 <w:sz w:val="22"/>
                 <w:szCs w:val="22"/>
               </w:rPr>
-              <w:t xml:space="preserve">Phần mềm Quản lý văn bản điều hành (QLVB)</w:t>
+              <w:t>Nguồn minh chứng cần cấu hình theo hệ thống và nhiệm vụ thực tế của cơ quan.</w:t>
             </w:r>
           </w:p>
         </w:tc>
@@ -9106,7 +9275,7 @@
                 <w:sz w:val="22"/>
                 <w:szCs w:val="22"/>
               </w:rPr>
-              <w:t xml:space="preserve">Khối II (Nhiệm vụ)</w:t>
+              <w:t>Khối II (Nhiệm vụ)</w:t>
             </w:r>
           </w:p>
         </w:tc>
@@ -9139,7 +9308,7 @@
                 <w:sz w:val="22"/>
                 <w:szCs w:val="22"/>
               </w:rPr>
-              <w:t xml:space="preserve">10 điểm</w:t>
+              <w:t>15 điểm</w:t>
             </w:r>
           </w:p>
         </w:tc>
@@ -9172,7 +9341,7 @@
                 <w:sz w:val="22"/>
                 <w:szCs w:val="22"/>
               </w:rPr>
-              <w:t xml:space="preserve">Thiết bị đánh giá Kiosk cảm ứng tại Bộ phận Một cửa</w:t>
+              <w:t>Nguồn minh chứng cần cấu hình theo hệ thống và nhiệm vụ thực tế của cơ quan.</w:t>
             </w:r>
           </w:p>
         </w:tc>
@@ -9213,14 +9382,15 @@
           <w:sz w:val="26"/>
           <w:szCs w:val="26"/>
         </w:rPr>
-        <w:t xml:space="preserve">Chương 1 đã hệ thống hóa toàn diện cơ sở lý luận quản trị hiệu suất, khung thể chế pháp lý công vụ và các mô hình toán học lượng hóa điểm số. Đây là tiền đề khoa học vững chắc để tiến hành phân tích thiết kế hệ thống phần mềm tại Chương 2.</w:t>
+        <w:t>Chương 1 tổng hợp phương pháp quản trị doanh nghiệp và căn cứ khu vực công thành hai chế độ riêng, làm cơ sở cho mô hình yêu cầu. Điểm KPI nội bộ doanh nghiệp không đồng nhất với kết quả xếp loại công chức, viên chức.</w:t>
       </w:r>
     </w:p>
     <w:p>
       <w:pPr>
         <w:pageBreakBefore/>
-        <w:spacing w:after="180" w:before="240"/>
-        <w:jc w:val="center"/>
+        <w:spacing/>
+        <w:ind w:firstLine="720"/>
+        <w:jc w:val="both"/>
       </w:pPr>
       <w:r>
         <w:rPr>
@@ -9254,8 +9424,8 @@
     </w:p>
     <w:p>
       <w:pPr>
-        <w:spacing w:after="120" w:before="0" w:line="312"/>
-        <w:ind w:firstLine="450"/>
+        <w:spacing/>
+        <w:ind w:firstLine="720"/>
         <w:jc w:val="both"/>
       </w:pPr>
       <w:r>
@@ -9269,13 +9439,13 @@
           <w:sz w:val="26"/>
           <w:szCs w:val="26"/>
         </w:rPr>
-        <w:t xml:space="preserve">Hệ thống thông tin đánh giá KPI được thiết kế để giải quyết toàn diện các bài toán tác nghiệp của cả hai khối đối tượng:</w:t>
-      </w:r>
-    </w:p>
-    <w:p>
-      <w:pPr>
-        <w:spacing w:after="120" w:before="0" w:line="312"/>
-        <w:ind w:firstLine="450"/>
+        <w:t>Hệ thống được mô hình hóa thành hai chế độ loại trừ lẫn nhau tại một thời điểm cấu hình: doanh nghiệp tư nhân dùng KPI/KRA và phản hồi 360 theo hồ sơ vai trò; khu vực công dùng điểm tiêu chí chung 30% và kết quả nhiệm vụ 70%, sau đó cần bước kết luận/hiệu chuẩn của cấp có thẩm quyền. Kỳ đánh giá lưu ảnh chụp chế độ tại thời điểm tạo để việc đổi cấu hình không làm thay đổi kỳ đã mở.</w:t>
+      </w:r>
+    </w:p>
+    <w:p>
+      <w:pPr>
+        <w:spacing/>
+        <w:ind w:firstLine="720"/>
         <w:jc w:val="both"/>
       </w:pPr>
       <w:r>
@@ -9289,13 +9459,13 @@
           <w:sz w:val="26"/>
           <w:szCs w:val="26"/>
         </w:rPr>
-        <w:t xml:space="preserve">Yêu cầu chức năng phân hệ Doanh nghiệp: Bao quát 15 trường hợp sử dụng tác nghiệp cốt lõi, từ phân rã mục tiêu chiến lược theo Thẻ điểm cân bằng, giao chỉ tiêu điện tử, nạp dữ liệu tự động từ hệ thống điều hành sản xuất xưởng và phần mềm ERP, kiểm soát chống gian lận, bảng điều khiển hiệu suất thời gian thực, tự đánh giá, đánh giá đa chiều 360 độ, đến hiệu chuẩn điểm số và kết xuất dữ liệu sang bảng lương hiệu quả P3.</w:t>
-      </w:r>
-    </w:p>
-    <w:p>
-      <w:pPr>
-        <w:spacing w:after="120" w:before="0" w:line="312"/>
-        <w:ind w:firstLine="450"/>
+        <w:t>Yêu cầu doanh nghiệp (phương án): phân rã mục tiêu, giao KPI, đính kèm minh chứng, chấm điểm theo trọng số vai trò và xuất báo cáo. Kết nối ERP/MES, chống gian lận nâng cao, bảng điều khiển thời gian thực và P3 là hạng mục đề xuất; HRMS đang có KRA, minh chứng, điểm và phản hồi 360 nhưng chưa có các kết nối hoặc xuất P3 này.</w:t>
+      </w:r>
+    </w:p>
+    <w:p>
+      <w:pPr>
+        <w:spacing/>
+        <w:ind w:firstLine="720"/>
         <w:jc w:val="both"/>
       </w:pPr>
       <w:r>
@@ -9309,13 +9479,13 @@
           <w:sz w:val="26"/>
           <w:szCs w:val="26"/>
         </w:rPr>
-        <w:t xml:space="preserve">Yêu cầu chức năng phân hệ Cơ quan Nhà nước: Thiết lập quy trình công vụ 5 bước chuẩn hóa (Kê khai tự đánh giá, Ý kiến nhận xét của Cấp ủy chi bộ và tập thể, Lãnh đạo thẩm định sản phẩm đầu ra, Hội đồng thi đua hiệu chuẩn và kiểm soát trần 20% theo Nghị định 48, Thủ trưởng ký số ban hành quyết định và đồng bộ dữ liệu vào CSDL quốc gia mẫu 2C-BNV, mở cổng tiếp nhận khiếu nại 7 ngày).</w:t>
-      </w:r>
-    </w:p>
-    <w:p>
-      <w:pPr>
-        <w:spacing w:after="120" w:before="0" w:line="312"/>
-        <w:ind w:firstLine="450"/>
+        <w:t>Yêu cầu khu vực công (phương án): tách loại công chức/viên chức, dùng căn cứ 335/2025 hoặc 233/2026, chấm 30/70, lưu quyết định cuối cùng theo nhóm nhiệm vụ tương đồng và kiểm tra tỷ lệ 20%/ngoại lệ tối đa 25% theo quyết định có thẩm quyền. HRMS hiện đã có chế độ đánh giá 30/70 và màn hình lưu kết luận/kiểm tra tỷ lệ cho chu kỳ khu vực công; biểu mẫu pháp quy chính thức, chữ ký số, luồng hội đồng và tích hợp hệ thống công vụ chưa được triển khai đầy đủ.</w:t>
+      </w:r>
+    </w:p>
+    <w:p>
+      <w:pPr>
+        <w:spacing/>
+        <w:ind w:firstLine="720"/>
         <w:jc w:val="both"/>
       </w:pPr>
       <w:r>
@@ -9329,7 +9499,7 @@
           <w:sz w:val="26"/>
           <w:szCs w:val="26"/>
         </w:rPr>
-        <w:t xml:space="preserve">Yêu cầu phi chức năng: Bảo đảm tính sẵn sàng 99.9%, bảo mật phân quyền theo vai trò RBAC kết hợp mã hóa dữ liệu, thời gian đáp ứng API dưới 200 mili-giây và khả năng chịu tải hàng đợi bất đồng bộ lên đến 10.000 thông điệp mỗi giây trong các khung giờ cao điểm.</w:t>
+        <w:t>Yêu cầu phi chức năng nêu trong báo cáo (99,9%, API dưới 200 ms, 10.000 thông điệp/giây) là mục tiêu thiết kế giả định cần được đo bằng kiểm thử tải và theo dõi vận hành; không phải cam kết SLA hay số liệu đo của HRMS hiện tại.</w:t>
       </w:r>
     </w:p>
     <w:p>
@@ -9352,8 +9522,8 @@
     </w:p>
     <w:p>
       <w:pPr>
-        <w:spacing w:after="120" w:before="0" w:line="312"/>
-        <w:ind w:firstLine="450"/>
+        <w:spacing/>
+        <w:ind w:firstLine="720"/>
         <w:jc w:val="both"/>
       </w:pPr>
       <w:r>
@@ -9378,7 +9548,7 @@
       <w:r>
         <w:drawing>
           <wp:inline distT="0" distB="0" distL="0" distR="0">
-            <wp:extent cx="4953000" cy="2924175"/>
+            <wp:extent cx="5486400" cy="2804160"/>
             <wp:effectExtent t="0" r="0" b="0" l="0"/>
             <wp:docPr id="1" name="" descr="" title=""/>
             <wp:cNvGraphicFramePr>
@@ -9394,7 +9564,7 @@
                     </pic:cNvPicPr>
                   </pic:nvPicPr>
                   <pic:blipFill>
-                    <a:blip r:embed="rId8" cstate="none"/>
+                    <a:blip r:embed="rId19" cstate="none"/>
                     <a:srcRect/>
                     <a:stretch>
                       <a:fillRect/>
@@ -9403,7 +9573,7 @@
                   <pic:spPr bwMode="auto">
                     <a:xfrm>
                       <a:off x="0" y="0"/>
-                      <a:ext cx="4953000" cy="2924175"/>
+                      <a:ext cx="5486400" cy="2804160"/>
                     </a:xfrm>
                     <a:prstGeom prst="rect">
                       <a:avLst/>
@@ -9422,37 +9592,17 @@
         <w:jc w:val="center"/>
       </w:pPr>
       <w:r>
-        <w:rPr>
-          <w:rFonts w:ascii="Times New Roman" w:cs="Times New Roman" w:eastAsia="Times New Roman" w:hAnsi="Times New Roman"/>
-          <w:b/>
-          <w:bCs/>
-          <w:i/>
-          <w:iCs/>
-          <w:color w:val="000000"/>
-          <w:sz w:val="22"/>
-          <w:szCs w:val="22"/>
-        </w:rPr>
-        <w:t xml:space="preserve">Hình 2.1: Biểu đồ cây phân cấp Tác nhân Hệ thống Đánh giá KPI</w:t>
-      </w:r>
-    </w:p>
-    <w:p>
-      <w:pPr>
-        <w:spacing w:after="120" w:before="0" w:line="312"/>
-        <w:ind w:firstLine="450"/>
+        <w:t>Hình 2.1: Sơ đồ phân cấp tác nhân tham gia đánh giá</w:t>
+      </w:r>
+    </w:p>
+    <w:p>
+      <w:pPr>
+        <w:spacing/>
+        <w:ind w:firstLine="720"/>
         <w:jc w:val="both"/>
       </w:pPr>
       <w:r>
-        <w:rPr>
-          <w:rFonts w:ascii="Times New Roman" w:cs="Times New Roman" w:eastAsia="Times New Roman" w:hAnsi="Times New Roman"/>
-          <w:b w:val="false"/>
-          <w:bCs w:val="false"/>
-          <w:i w:val="false"/>
-          <w:iCs w:val="false"/>
-          <w:color w:val="000000"/>
-          <w:sz w:val="26"/>
-          <w:szCs w:val="26"/>
-        </w:rPr>
-        <w:t xml:space="preserve">Biểu đồ phân cấp tác nhân (Hình 2.1) thể hiện rõ rệt sự phân quyền và vai trò trách nhiệm: Người lao động / Cán bộ công chức (thực hiện chỉ tiêu, cập nhật minh chứng, tự chấm điểm); Quản lý trực tiếp / Thủ trưởng đơn vị (giao chỉ tiêu, thẩm định và chấm điểm sơ bộ); Hội đồng Thẩm định / Thi đua khen thưởng (tổ chức đánh giá, áp trần tỷ lệ 20% theo Nghị định 48); Ban Giám đốc / Lãnh đạo cấp cao (phê duyệt quyết định, theo dõi Dashboard điều hành); Quản trị hệ thống (cấu hình từ điển, phân quyền) và Hệ thống tác nghiệp ngoài (ERP, MES, IoT, DVC).</w:t>
+        <w:t>Sơ đồ phân vai ở mức khái niệm. Trong HRMS hiện tại, quyền thao tác phụ thuộc vai trò và cấu hình tổ chức; các vai trò chuyên trách, hội đồng, cổng dịch vụ công và hệ thống ngoài chỉ là phạm vi mở rộng, chưa được xem là tích hợp đang chạy.</w:t>
       </w:r>
     </w:p>
     <w:p>
@@ -9463,7 +9613,7 @@
       <w:r>
         <w:drawing>
           <wp:inline distT="0" distB="0" distL="0" distR="0">
-            <wp:extent cx="4886325" cy="3333750"/>
+            <wp:extent cx="5486400" cy="3444240"/>
             <wp:effectExtent t="0" r="0" b="0" l="0"/>
             <wp:docPr id="2" name="" descr="" title=""/>
             <wp:cNvGraphicFramePr>
@@ -9479,7 +9629,7 @@
                     </pic:cNvPicPr>
                   </pic:nvPicPr>
                   <pic:blipFill>
-                    <a:blip r:embed="rId9" cstate="none"/>
+                    <a:blip r:embed="rId20" cstate="none"/>
                     <a:srcRect/>
                     <a:stretch>
                       <a:fillRect/>
@@ -9488,7 +9638,7 @@
                   <pic:spPr bwMode="auto">
                     <a:xfrm>
                       <a:off x="0" y="0"/>
-                      <a:ext cx="4886325" cy="3333750"/>
+                      <a:ext cx="5486400" cy="3444240"/>
                     </a:xfrm>
                     <a:prstGeom prst="rect">
                       <a:avLst/>
@@ -9507,37 +9657,17 @@
         <w:jc w:val="center"/>
       </w:pPr>
       <w:r>
-        <w:rPr>
-          <w:rFonts w:ascii="Times New Roman" w:cs="Times New Roman" w:eastAsia="Times New Roman" w:hAnsi="Times New Roman"/>
-          <w:b/>
-          <w:bCs/>
-          <w:i/>
-          <w:iCs/>
-          <w:color w:val="000000"/>
-          <w:sz w:val="22"/>
-          <w:szCs w:val="22"/>
-        </w:rPr>
-        <w:t xml:space="preserve">Hình 2.2: Biểu đồ Use Case tổng quan Hệ thống Đánh giá Hiệu suất KPI</w:t>
-      </w:r>
-    </w:p>
-    <w:p>
-      <w:pPr>
-        <w:spacing w:after="120" w:before="0" w:line="312"/>
-        <w:ind w:firstLine="450"/>
+        <w:t>Hình 2.2: Biểu đồ Use Case tổng quan đánh giá hiệu quả công việc</w:t>
+      </w:r>
+    </w:p>
+    <w:p>
+      <w:pPr>
+        <w:spacing/>
+        <w:ind w:firstLine="720"/>
         <w:jc w:val="both"/>
       </w:pPr>
       <w:r>
-        <w:rPr>
-          <w:rFonts w:ascii="Times New Roman" w:cs="Times New Roman" w:eastAsia="Times New Roman" w:hAnsi="Times New Roman"/>
-          <w:b w:val="false"/>
-          <w:bCs w:val="false"/>
-          <w:i w:val="false"/>
-          <w:iCs w:val="false"/>
-          <w:color w:val="000000"/>
-          <w:sz w:val="26"/>
-          <w:szCs w:val="26"/>
-        </w:rPr>
-        <w:t xml:space="preserve">Biểu đồ Use Case tổng quan (Hình 2.2) bao quát các ca sử dụng nghiệp vụ cốt lõi: UC01 Cập nhật minh chứng KPI, UC02 Tự đánh giá, UC03 Khiếu nại kết quả, UC04 Giao chỉ tiêu và trọng số, UC05 Thẩm định điểm quản lý, UC06 Họp hội đồng thẩm định, UC07 Bỏ phiếu và áp trần 20%, UC08 Phê duyệt kết quả toàn cơ quan, UC09 Giám sát Dashboard điều hành, UC10 Tính điểm tự động và báo cáo, UC11 Tích hợp dữ liệu từ ERP/MES/DVC.</w:t>
+        <w:t>Use Case mô tả chức năng đánh giá ở mức nghiệp vụ. Chế độ doanh nghiệp và chế độ công vụ được cấu hình tách biệt; quy tắc xếp loại, tỷ lệ và thẩm quyền công vụ chỉ áp dụng cho đúng nhóm đối tượng theo văn bản hiện hành, tuyệt đối không áp sang KPI doanh nghiệp. Kết nối ERP/MES, P3, khiếu nại trực tuyến và ký số là phần mở rộng chưa có trong HRMS đang đối chiếu.</w:t>
       </w:r>
     </w:p>
     <w:p>
@@ -9548,7 +9678,7 @@
       <w:r>
         <w:drawing>
           <wp:inline distT="0" distB="0" distL="0" distR="0">
-            <wp:extent cx="4953000" cy="2924175"/>
+            <wp:extent cx="5486400" cy="2743200"/>
             <wp:effectExtent t="0" r="0" b="0" l="0"/>
             <wp:docPr id="3" name="" descr="" title=""/>
             <wp:cNvGraphicFramePr>
@@ -9564,7 +9694,7 @@
                     </pic:cNvPicPr>
                   </pic:nvPicPr>
                   <pic:blipFill>
-                    <a:blip r:embed="rId10" cstate="none"/>
+                    <a:blip r:embed="rId21" cstate="none"/>
                     <a:srcRect/>
                     <a:stretch>
                       <a:fillRect/>
@@ -9573,7 +9703,7 @@
                   <pic:spPr bwMode="auto">
                     <a:xfrm>
                       <a:off x="0" y="0"/>
-                      <a:ext cx="4953000" cy="2924175"/>
+                      <a:ext cx="5486400" cy="2743200"/>
                     </a:xfrm>
                     <a:prstGeom prst="rect">
                       <a:avLst/>
@@ -9592,37 +9722,17 @@
         <w:jc w:val="center"/>
       </w:pPr>
       <w:r>
-        <w:rPr>
-          <w:rFonts w:ascii="Times New Roman" w:cs="Times New Roman" w:eastAsia="Times New Roman" w:hAnsi="Times New Roman"/>
-          <w:b/>
-          <w:bCs/>
-          <w:i/>
-          <w:iCs/>
-          <w:color w:val="000000"/>
-          <w:sz w:val="22"/>
-          <w:szCs w:val="22"/>
-        </w:rPr>
-        <w:t xml:space="preserve">Hình 2.3: Sơ đồ phân rã gói hệ thống Đánh giá KPI (Package Diagram)</w:t>
-      </w:r>
-    </w:p>
-    <w:p>
-      <w:pPr>
-        <w:spacing w:after="120" w:before="0" w:line="312"/>
-        <w:ind w:firstLine="450"/>
+        <w:t>Hình 2.3: Sơ đồ gói nghiệp vụ đánh giá KPI (UML Package Diagram)</w:t>
+      </w:r>
+    </w:p>
+    <w:p>
+      <w:pPr>
+        <w:spacing/>
+        <w:ind w:firstLine="720"/>
         <w:jc w:val="both"/>
       </w:pPr>
       <w:r>
-        <w:rPr>
-          <w:rFonts w:ascii="Times New Roman" w:cs="Times New Roman" w:eastAsia="Times New Roman" w:hAnsi="Times New Roman"/>
-          <w:b w:val="false"/>
-          <w:bCs w:val="false"/>
-          <w:i w:val="false"/>
-          <w:iCs w:val="false"/>
-          <w:color w:val="000000"/>
-          <w:sz w:val="26"/>
-          <w:szCs w:val="26"/>
-        </w:rPr>
-        <w:t xml:space="preserve">Sơ đồ Gói phần mềm (Hình 2.3) thể hiện tính module hóa cao của kiến trúc hệ thống, bao gồm 6 gói chức năng chính: Gói Giao diện &amp; Trình diễn (Web Portal, Cổng e-Gov, Mobile App); Gói Thiết lập &amp; Giao chỉ tiêu; Gói Thu thập Minh chứng &amp; Dữ liệu tác nghiệp; Gói Đánh giá &amp; Tính điểm (Scoring Engine); Gói Xếp loại &amp; Khen thưởng (Calibration theo Nghị định 48); và Gói Báo cáo &amp; Lưu trữ CSDL.</w:t>
+        <w:t>Sơ đồ phân biệt các tầng phần mềm hiện có với các phần mở rộng. Tích hợp ERP/MES, cổng công vụ, ký số và P3 là phương án đề xuất; chưa có trong mã nguồn được đối chiếu.</w:t>
       </w:r>
     </w:p>
     <w:p>
@@ -9633,7 +9743,7 @@
       <w:r>
         <w:drawing>
           <wp:inline distT="0" distB="0" distL="0" distR="0">
-            <wp:extent cx="4953000" cy="3238500"/>
+            <wp:extent cx="5486400" cy="3962399"/>
             <wp:effectExtent t="0" r="0" b="0" l="0"/>
             <wp:docPr id="4" name="" descr="" title=""/>
             <wp:cNvGraphicFramePr>
@@ -9649,7 +9759,7 @@
                     </pic:cNvPicPr>
                   </pic:nvPicPr>
                   <pic:blipFill>
-                    <a:blip r:embed="rId11" cstate="none"/>
+                    <a:blip r:embed="rId31" cstate="none"/>
                     <a:srcRect/>
                     <a:stretch>
                       <a:fillRect/>
@@ -9658,7 +9768,7 @@
                   <pic:spPr bwMode="auto">
                     <a:xfrm>
                       <a:off x="0" y="0"/>
-                      <a:ext cx="4953000" cy="3238500"/>
+                      <a:ext cx="5486400" cy="3962399"/>
                     </a:xfrm>
                     <a:prstGeom prst="rect">
                       <a:avLst/>
@@ -9677,23 +9787,41 @@
         <w:jc w:val="center"/>
       </w:pPr>
       <w:r>
+        <w:t>Hình 2.4: Sơ đồ lớp rút gọn theo mô hình dữ liệu HRMS</w:t>
+      </w:r>
+    </w:p>
+    <w:p>
+      <w:pPr>
+        <w:spacing/>
+        <w:ind w:firstLine="720"/>
+        <w:jc w:val="both"/>
+      </w:pPr>
+      <w:r>
+        <w:t>Sơ đồ lớp rút gọn minh họa các thực thể đang được dùng ở phân hệ đánh giá. HRMS dùng các model Prisma chia sẻ với những phân hệ nhân sự khác; sơ đồ không đại diện toàn bộ 95 model và không phải một schema KPI 26 bảng độc lập.</w:t>
+      </w:r>
+    </w:p>
+    <w:p>
+      <w:pPr>
+        <w:pStyle w:val="Heading1"/>
+        <w:spacing w:after="100" w:before="240"/>
+        <w:jc w:val="left"/>
+      </w:pPr>
+      <w:r>
         <w:rPr>
           <w:rFonts w:ascii="Times New Roman" w:cs="Times New Roman" w:eastAsia="Times New Roman" w:hAnsi="Times New Roman"/>
           <w:b/>
           <w:bCs/>
-          <w:i/>
-          <w:iCs/>
-          <w:color w:val="000000"/>
-          <w:sz w:val="22"/>
-          <w:szCs w:val="22"/>
-        </w:rPr>
-        <w:t xml:space="preserve">Hình 2.4: Sơ đồ lớp miền nghiệp vụ Hệ thống Đánh giá KPI (Domain Class Diagram)</w:t>
-      </w:r>
-    </w:p>
-    <w:p>
-      <w:pPr>
-        <w:spacing w:after="120" w:before="0" w:line="312"/>
-        <w:ind w:firstLine="450"/>
+          <w:color w:val="000000"/>
+          <w:sz w:val="28"/>
+          <w:szCs w:val="28"/>
+        </w:rPr>
+        <w:t xml:space="preserve">2.3. Phân tích hành vi của hệ thống</w:t>
+      </w:r>
+    </w:p>
+    <w:p>
+      <w:pPr>
+        <w:spacing/>
+        <w:ind w:firstLine="720"/>
         <w:jc w:val="both"/>
       </w:pPr>
       <w:r>
@@ -9707,44 +9835,6 @@
           <w:sz w:val="26"/>
           <w:szCs w:val="26"/>
         </w:rPr>
-        <w:t xml:space="preserve">Sơ đồ Lớp miền nghiệp vụ (Hình 2.4) mô hình hóa các thực thể cốt lõi và mối quan hệ giữa chúng: Lớp ChiTieuKPI (KpiDefinition), KyDanhGia (EvaluationPeriod), PhieuGiaoKPI (KpiAssignment), DuLieuThucHien (ActualData), PhieuDanhGia (EvaluationForm), và HoiDongThamDinh (ReviewBoard), bảo đảm toàn vẹn dữ liệu từ khâu giao việc đến khâu ra quyết định xếp loại.</w:t>
-      </w:r>
-    </w:p>
-    <w:p>
-      <w:pPr>
-        <w:pStyle w:val="Heading1"/>
-        <w:spacing w:after="100" w:before="240"/>
-        <w:jc w:val="left"/>
-      </w:pPr>
-      <w:r>
-        <w:rPr>
-          <w:rFonts w:ascii="Times New Roman" w:cs="Times New Roman" w:eastAsia="Times New Roman" w:hAnsi="Times New Roman"/>
-          <w:b/>
-          <w:bCs/>
-          <w:color w:val="000000"/>
-          <w:sz w:val="28"/>
-          <w:szCs w:val="28"/>
-        </w:rPr>
-        <w:t xml:space="preserve">2.3. Phân tích hành vi của hệ thống</w:t>
-      </w:r>
-    </w:p>
-    <w:p>
-      <w:pPr>
-        <w:spacing w:after="120" w:before="0" w:line="312"/>
-        <w:ind w:firstLine="450"/>
-        <w:jc w:val="both"/>
-      </w:pPr>
-      <w:r>
-        <w:rPr>
-          <w:rFonts w:ascii="Times New Roman" w:cs="Times New Roman" w:eastAsia="Times New Roman" w:hAnsi="Times New Roman"/>
-          <w:b w:val="false"/>
-          <w:bCs w:val="false"/>
-          <w:i w:val="false"/>
-          <w:iCs w:val="false"/>
-          <w:color w:val="000000"/>
-          <w:sz w:val="26"/>
-          <w:szCs w:val="26"/>
-        </w:rPr>
         <w:t xml:space="preserve">Hành vi động và các quy trình luân chuyển dữ liệu được đặc tả chi tiết qua ba biểu đồ tương tác:</w:t>
       </w:r>
     </w:p>
@@ -9756,7 +9846,7 @@
       <w:r>
         <w:drawing>
           <wp:inline distT="0" distB="0" distL="0" distR="0">
-            <wp:extent cx="4943475" cy="3143250"/>
+            <wp:extent cx="5486400" cy="3108960"/>
             <wp:effectExtent t="0" r="0" b="0" l="0"/>
             <wp:docPr id="5" name="" descr="" title=""/>
             <wp:cNvGraphicFramePr>
@@ -9772,7 +9862,7 @@
                     </pic:cNvPicPr>
                   </pic:nvPicPr>
                   <pic:blipFill>
-                    <a:blip r:embed="rId12" cstate="none"/>
+                    <a:blip r:embed="rId30" cstate="none"/>
                     <a:srcRect/>
                     <a:stretch>
                       <a:fillRect/>
@@ -9781,7 +9871,7 @@
                   <pic:spPr bwMode="auto">
                     <a:xfrm>
                       <a:off x="0" y="0"/>
-                      <a:ext cx="4943475" cy="3143250"/>
+                      <a:ext cx="5486400" cy="3108960"/>
                     </a:xfrm>
                     <a:prstGeom prst="rect">
                       <a:avLst/>
@@ -9800,23 +9890,13 @@
         <w:jc w:val="center"/>
       </w:pPr>
       <w:r>
-        <w:rPr>
-          <w:rFonts w:ascii="Times New Roman" w:cs="Times New Roman" w:eastAsia="Times New Roman" w:hAnsi="Times New Roman"/>
-          <w:b/>
-          <w:bCs/>
-          <w:i/>
-          <w:iCs/>
-          <w:color w:val="000000"/>
-          <w:sz w:val="22"/>
-          <w:szCs w:val="22"/>
-        </w:rPr>
-        <w:t xml:space="preserve">Hình 2.5: Biểu đồ tuần tự quy trình đánh giá và chốt sổ điểm KPI</w:t>
-      </w:r>
-    </w:p>
-    <w:p>
-      <w:pPr>
-        <w:spacing w:after="120" w:before="0" w:line="312"/>
-        <w:ind w:firstLine="450"/>
+        <w:t>Hình 2.5: Biểu đồ tuần tự tự đánh giá, phản hồi và tính điểm doanh nghiệp</w:t>
+      </w:r>
+    </w:p>
+    <w:p>
+      <w:pPr>
+        <w:spacing/>
+        <w:ind w:firstLine="720"/>
         <w:jc w:val="both"/>
       </w:pPr>
       <w:r>
@@ -9830,7 +9910,7 @@
           <w:sz w:val="26"/>
           <w:szCs w:val="26"/>
         </w:rPr>
-        <w:t xml:space="preserve">Biểu đồ Tuần tự (Hình 2.5) mô tả tiến trình 11 bước xử lý dữ liệu minh bạch: Bắt đầu từ khi Nhân viên mở phiếu tự đánh giá, hệ thống tự động truy vấn chỉ tiêu và dữ liệu thực tế từ CSDL, nhân viên gửi điểm tự chấm kèm minh chứng, KpiEngineService tính điểm sơ bộ, chuyển tiếp cho Quản lý thẩm định nhận xét, kích hoạt thuật toán tính điểm tổng hợp trọng số, lưu trữ vào CSDL và gửi thông báo kết quả cuối cùng.</w:t>
+        <w:t>Biểu đồ tuần tự là luồng mục tiêu minh họa. Trong phần mềm hiện tại, người dùng tạo kỳ, mục tiêu KRA, nhập điểm/minh chứng; nhánh doanh nghiệp tính điểm theo hồ sơ vai trò. Nạp số liệu tác nghiệp tự động và thông báo kết quả thời gian thực từ hệ thống ngoài chưa được triển khai.</w:t>
       </w:r>
     </w:p>
     <w:p>
@@ -9841,7 +9921,7 @@
       <w:r>
         <w:drawing>
           <wp:inline distT="0" distB="0" distL="0" distR="0">
-            <wp:extent cx="4886325" cy="3333750"/>
+            <wp:extent cx="5486400" cy="3596640"/>
             <wp:effectExtent t="0" r="0" b="0" l="0"/>
             <wp:docPr id="6" name="" descr="" title=""/>
             <wp:cNvGraphicFramePr>
@@ -9857,7 +9937,7 @@
                     </pic:cNvPicPr>
                   </pic:nvPicPr>
                   <pic:blipFill>
-                    <a:blip r:embed="rId13" cstate="none"/>
+                    <a:blip r:embed="rId24" cstate="none"/>
                     <a:srcRect/>
                     <a:stretch>
                       <a:fillRect/>
@@ -9866,7 +9946,7 @@
                   <pic:spPr bwMode="auto">
                     <a:xfrm>
                       <a:off x="0" y="0"/>
-                      <a:ext cx="4886325" cy="3333750"/>
+                      <a:ext cx="5486400" cy="3596640"/>
                     </a:xfrm>
                     <a:prstGeom prst="rect">
                       <a:avLst/>
@@ -9885,37 +9965,17 @@
         <w:jc w:val="center"/>
       </w:pPr>
       <w:r>
-        <w:rPr>
-          <w:rFonts w:ascii="Times New Roman" w:cs="Times New Roman" w:eastAsia="Times New Roman" w:hAnsi="Times New Roman"/>
-          <w:b/>
-          <w:bCs/>
-          <w:i/>
-          <w:iCs/>
-          <w:color w:val="000000"/>
-          <w:sz w:val="22"/>
-          <w:szCs w:val="22"/>
-        </w:rPr>
-        <w:t xml:space="preserve">Hình 2.6: Biểu đồ hoạt động quy trình đánh giá theo Nghị định 48/2023/NĐ-CP</w:t>
-      </w:r>
-    </w:p>
-    <w:p>
-      <w:pPr>
-        <w:spacing w:after="120" w:before="0" w:line="312"/>
-        <w:ind w:firstLine="450"/>
+        <w:t>Hình 2.6: Quy trình đánh giá khu vực công theo căn cứ áp dụng năm 2026</w:t>
+      </w:r>
+    </w:p>
+    <w:p>
+      <w:pPr>
+        <w:spacing/>
+        <w:ind w:firstLine="720"/>
         <w:jc w:val="both"/>
       </w:pPr>
       <w:r>
-        <w:rPr>
-          <w:rFonts w:ascii="Times New Roman" w:cs="Times New Roman" w:eastAsia="Times New Roman" w:hAnsi="Times New Roman"/>
-          <w:b w:val="false"/>
-          <w:bCs w:val="false"/>
-          <w:i w:val="false"/>
-          <w:iCs w:val="false"/>
-          <w:color w:val="000000"/>
-          <w:sz w:val="26"/>
-          <w:szCs w:val="26"/>
-        </w:rPr>
-        <w:t xml:space="preserve">Biểu đồ Hoạt động (Hình 2.6) mô hình hóa quy trình đánh giá công vụ khép kín 6 bước: Cán bộ tự chấm và viết báo cáo công tác -&gt; Lấy ý kiến cấp ủy chi bộ và tập thể đồng nghiệp -&gt; Thủ trưởng cơ quan trực tiếp nhận xét -&gt; Hội đồng thẩm định họp bỏ phiếu -&gt; Kiểm tra điều kiện rẽ nhánh: Nếu tỷ lệ xuất sắc vượt trần 20% thì bắt buộc bỏ phiếu lại; nếu thỏa mãn thì tiến hành công bố kết quả và tiếp nhận khiếu nại -&gt; Ban hành quyết định xếp loại chính thức.</w:t>
+        <w:t>Đây là quy trình tham chiếu cho chế độ công vụ, cần cấu hình theo thẩm quyền và văn bản áp dụng cho từng nhóm đối tượng. Không dùng luồng này cho doanh nghiệp tư nhân. HRMS hiện hỗ trợ cấu hình chế độ, tính điểm 30/70, ghi nhận kết luận và kiểm tra tỷ lệ; hồ sơ thẩm định, quyết định theo thẩm quyền, biểu mẫu pháp quy và ký số cần được triển khai, kiểm chứng riêng trước khi xem là quy trình hoàn chỉnh.</w:t>
       </w:r>
     </w:p>
     <w:p>
@@ -9926,7 +9986,7 @@
       <w:r>
         <w:drawing>
           <wp:inline distT="0" distB="0" distL="0" distR="0">
-            <wp:extent cx="4953000" cy="2924175"/>
+            <wp:extent cx="5486400" cy="2133600"/>
             <wp:effectExtent t="0" r="0" b="0" l="0"/>
             <wp:docPr id="7" name="" descr="" title=""/>
             <wp:cNvGraphicFramePr>
@@ -9942,7 +10002,7 @@
                     </pic:cNvPicPr>
                   </pic:nvPicPr>
                   <pic:blipFill>
-                    <a:blip r:embed="rId14" cstate="none"/>
+                    <a:blip r:embed="rId25" cstate="none"/>
                     <a:srcRect/>
                     <a:stretch>
                       <a:fillRect/>
@@ -9951,7 +10011,7 @@
                   <pic:spPr bwMode="auto">
                     <a:xfrm>
                       <a:off x="0" y="0"/>
-                      <a:ext cx="4953000" cy="2924175"/>
+                      <a:ext cx="5486400" cy="2133600"/>
                     </a:xfrm>
                     <a:prstGeom prst="rect">
                       <a:avLst/>
@@ -9970,37 +10030,17 @@
         <w:jc w:val="center"/>
       </w:pPr>
       <w:r>
-        <w:rPr>
-          <w:rFonts w:ascii="Times New Roman" w:cs="Times New Roman" w:eastAsia="Times New Roman" w:hAnsi="Times New Roman"/>
-          <w:b/>
-          <w:bCs/>
-          <w:i/>
-          <w:iCs/>
-          <w:color w:val="000000"/>
-          <w:sz w:val="22"/>
-          <w:szCs w:val="22"/>
-        </w:rPr>
-        <w:t xml:space="preserve">Hình 2.7: Biểu đồ trạng thái vòng đời Phiếu đánh giá KPI</w:t>
-      </w:r>
-    </w:p>
-    <w:p>
-      <w:pPr>
-        <w:spacing w:after="120" w:before="0" w:line="312"/>
-        <w:ind w:firstLine="450"/>
+        <w:t>Hình 2.7: Biểu đồ trạng thái chu kỳ đánh giá HRMS hiện tại</w:t>
+      </w:r>
+    </w:p>
+    <w:p>
+      <w:pPr>
+        <w:spacing/>
+        <w:ind w:firstLine="720"/>
         <w:jc w:val="both"/>
       </w:pPr>
       <w:r>
-        <w:rPr>
-          <w:rFonts w:ascii="Times New Roman" w:cs="Times New Roman" w:eastAsia="Times New Roman" w:hAnsi="Times New Roman"/>
-          <w:b w:val="false"/>
-          <w:bCs w:val="false"/>
-          <w:i w:val="false"/>
-          <w:iCs w:val="false"/>
-          <w:color w:val="000000"/>
-          <w:sz w:val="26"/>
-          <w:szCs w:val="26"/>
-        </w:rPr>
-        <w:t xml:space="preserve">Biểu đồ Trạng thái (Hình 2.7) định nghĩa vòng đời chuyển đổi trạng thái của phiếu đánh giá: KHOI_TAO -&gt; DANG_THUC_HIEN -&gt; CHO_TU_DANH_GIA -&gt; CHO_QUAN_LY_DUYET -&gt; CHO_HOI_DONG_XET -&gt; DA_CONG_BO -&gt; DANG_KHIEU_NAI (nếu có khiếu nại phát sinh) -&gt; DA_KHOA_SO_LUU_TRU, bảo đảm tính bất biến của dữ liệu lịch sử.</w:t>
+        <w:t>Trong mã nguồn hiện tại, chu kỳ đánh giá chỉ có hai trạng thái ACTIVE và COMPLETED. Các bước khiếu nại, hội đồng, ký ban hành và lưu hồ sơ công vụ chưa được triển khai thành vòng đời trạng thái đầy đủ.</w:t>
       </w:r>
     </w:p>
     <w:p>
@@ -10029,7 +10069,7 @@
       <w:r>
         <w:drawing>
           <wp:inline distT="0" distB="0" distL="0" distR="0">
-            <wp:extent cx="4943475" cy="3143250"/>
+            <wp:extent cx="5486400" cy="2987040"/>
             <wp:effectExtent t="0" r="0" b="0" l="0"/>
             <wp:docPr id="8" name="" descr="" title=""/>
             <wp:cNvGraphicFramePr>
@@ -10045,7 +10085,7 @@
                     </pic:cNvPicPr>
                   </pic:nvPicPr>
                   <pic:blipFill>
-                    <a:blip r:embed="rId15" cstate="none"/>
+                    <a:blip r:embed="rId26" cstate="none"/>
                     <a:srcRect/>
                     <a:stretch>
                       <a:fillRect/>
@@ -10054,7 +10094,7 @@
                   <pic:spPr bwMode="auto">
                     <a:xfrm>
                       <a:off x="0" y="0"/>
-                      <a:ext cx="4943475" cy="3143250"/>
+                      <a:ext cx="5486400" cy="2987040"/>
                     </a:xfrm>
                     <a:prstGeom prst="rect">
                       <a:avLst/>
@@ -10073,17 +10113,28 @@
         <w:jc w:val="center"/>
       </w:pPr>
       <w:r>
-        <w:rPr>
-          <w:rFonts w:ascii="Times New Roman" w:cs="Times New Roman" w:eastAsia="Times New Roman" w:hAnsi="Times New Roman"/>
-          <w:b/>
-          <w:bCs/>
-          <w:i/>
-          <w:iCs/>
-          <w:color w:val="000000"/>
-          <w:sz w:val="22"/>
-          <w:szCs w:val="22"/>
-        </w:rPr>
-        <w:t xml:space="preserve">Hình 2.8: Sơ đồ kiến trúc hệ thống 3 tầng (3-Tier Architecture)</w:t>
+        <w:t>Hình 2.8: Kiến trúc HRMS hiện tại và điểm tích hợp đề xuất</w:t>
+      </w:r>
+    </w:p>
+    <w:p>
+      <w:pPr>
+        <w:spacing/>
+        <w:ind w:firstLine="720"/>
+        <w:jc w:val="both"/>
+      </w:pPr>
+      <w:r>
+        <w:t>HRMS hiện tại gồm giao diện web Next.js/React, API nghiệp vụ NestJS và PostgreSQL qua Prisma. Sơ đồ thể hiện ba tầng để giải thích kiến trúc đang đối chiếu; ERP/MES, cổng e-Gov, ký số và P3 nằm ở phần mở rộng đề xuất. Năng lực chịu tải và độ trễ chưa được đo, nên các ngưỡng trong yêu cầu phi chức năng là mục tiêu cần kiểm thử, không phải số liệu vận hành đã xác nhận.</w:t>
+      </w:r>
+    </w:p>
+    <w:p>
+      <w:pPr>
+        <w:pStyle w:val="Heading2"/>
+        <w:keepNext/>
+        <w:spacing w:after="80" w:before="180"/>
+        <w:jc w:val="left"/>
+      </w:pPr>
+      <w:r>
+        <w:t>2.4.1. Mô hình dữ liệu đề xuất và đối chiếu HRMS hiện tại</w:t>
       </w:r>
     </w:p>
     <w:p>
@@ -10103,45 +10154,7 @@
           <w:sz w:val="26"/>
           <w:szCs w:val="26"/>
         </w:rPr>
-        <w:t xml:space="preserve">Kiến trúc kỹ thuật ba tầng (Hình 2.8) phân tách rõ ràng các tầng trách nhiệm: Tầng Trình diễn (Web Portal ReactJS, Cổng công vụ tích hợp SSO, Mobile App); Tầng Nghiệp vụ (API Gateway xác thực OAuth2/JWT, KPI Scoring Engine, Calibration Service khống chế trần 20%, Data Connector Ingestion xử lý ngầm qua Kafka); và Tầng Dữ liệu (PostgreSQL 26 bảng chuẩn 3NF, Redis In-Memory Cache, MinIO Object Storage lưu trữ hồ sơ minh chứng số).</w:t>
-      </w:r>
-    </w:p>
-    <w:p>
-      <w:pPr>
-        <w:pStyle w:val="Heading2"/>
-        <w:spacing w:after="80" w:before="180"/>
-        <w:jc w:val="left"/>
-      </w:pPr>
-      <w:r>
-        <w:rPr>
-          <w:rFonts w:ascii="Times New Roman" w:cs="Times New Roman" w:eastAsia="Times New Roman" w:hAnsi="Times New Roman"/>
-          <w:b/>
-          <w:bCs/>
-          <w:color w:val="000000"/>
-          <w:sz w:val="26"/>
-          <w:szCs w:val="26"/>
-        </w:rPr>
-        <w:t xml:space="preserve">2.4.1. Thiết kế Cơ sở dữ liệu quan hệ vật lý 26 bảng chuẩn hóa 3NF</w:t>
-      </w:r>
-    </w:p>
-    <w:p>
-      <w:pPr>
-        <w:spacing w:after="120" w:before="0" w:line="312"/>
-        <w:ind w:firstLine="450"/>
-        <w:jc w:val="both"/>
-      </w:pPr>
-      <w:r>
-        <w:rPr>
-          <w:rFonts w:ascii="Times New Roman" w:cs="Times New Roman" w:eastAsia="Times New Roman" w:hAnsi="Times New Roman"/>
-          <w:b w:val="false"/>
-          <w:bCs w:val="false"/>
-          <w:i w:val="false"/>
-          <w:iCs w:val="false"/>
-          <w:color w:val="000000"/>
-          <w:sz w:val="26"/>
-          <w:szCs w:val="26"/>
-        </w:rPr>
-        <w:t xml:space="preserve">Cơ sở dữ liệu của hệ thống được chuẩn hóa ở dạng chuẩn ba (3NF), bao gồm 26 bảng quan hệ có khả năng đáp ứng đồng thời cả mô hình vận hành sản xuất kinh doanh của doanh nghiệp và mô hình xếp loại cán bộ công chức theo Nghị định 48:</w:t>
+        <w:t>Bảng 2.1 là mô hình dữ liệu quan hệ giả định do báo cáo đề xuất để thảo luận một hệ KPI độc lập. Đây không phải cấu trúc cơ sở dữ liệu triển khai của HRMS hiện tại, vốn dùng PostgreSQL/Prisma với các mô hình dùng chung cho nhiều phân hệ nhân sự.</w:t>
       </w:r>
     </w:p>
     <w:tbl>
@@ -12243,7 +12256,7 @@
                 <w:sz w:val="22"/>
                 <w:szCs w:val="22"/>
               </w:rPr>
-              <w:t xml:space="preserve">general_criteria_scores</w:t>
+              <w:t>public_general_criteria_scores (đề xuất)</w:t>
             </w:r>
           </w:p>
         </w:tc>
@@ -12276,7 +12289,7 @@
                 <w:sz w:val="22"/>
                 <w:szCs w:val="22"/>
               </w:rPr>
-              <w:t xml:space="preserve">Bảng điểm chi tiết Khối I tiêu chí chung theo Nghị định 48</w:t>
+              <w:t>Điểm tiêu chí chung theo NĐ 335/2025 hoặc 233/2026 (khu vực công)</w:t>
             </w:r>
           </w:p>
         </w:tc>
@@ -12911,7 +12924,7 @@
                 <w:sz w:val="22"/>
                 <w:szCs w:val="22"/>
               </w:rPr>
-              <w:t xml:space="preserve">decree48_quotas</w:t>
+              <w:t>public_calibration_decisions (đề xuất)</w:t>
             </w:r>
           </w:p>
         </w:tc>
@@ -12944,7 +12957,7 @@
                 <w:sz w:val="22"/>
                 <w:szCs w:val="22"/>
               </w:rPr>
-              <w:t xml:space="preserve">Bảng kiểm soát hạn ngạch trần 20% theo cơ quan đơn vị</w:t>
+              <w:t>Lưu quyết định hiệu chuẩn và rà tỷ lệ xuất sắc 20%/ngoại lệ tối đa 25%; chỉ dùng khu vực công</w:t>
             </w:r>
           </w:p>
         </w:tc>
@@ -13245,7 +13258,7 @@
                 <w:sz w:val="22"/>
                 <w:szCs w:val="22"/>
               </w:rPr>
-              <w:t xml:space="preserve">p3_payroll_exports</w:t>
+              <w:t>planned_enterprise_p3_exports</w:t>
             </w:r>
           </w:p>
         </w:tc>
@@ -13278,7 +13291,7 @@
                 <w:sz w:val="22"/>
                 <w:szCs w:val="22"/>
               </w:rPr>
-              <w:t xml:space="preserve">Dữ liệu kết xuất đồng bộ sang phân hệ tính tiền lương hiệu quả</w:t>
+              <w:t>Đầu ra tích hợp P3 doanh nghiệp theo quy chế; hạng mục đề xuất, chưa có trong HRMS hiện tại</w:t>
             </w:r>
           </w:p>
         </w:tc>
@@ -14694,7 +14707,7 @@
       <w:r>
         <w:drawing>
           <wp:inline distT="0" distB="0" distL="0" distR="0">
-            <wp:extent cx="4886325" cy="3333750"/>
+            <wp:extent cx="5486400" cy="3779520"/>
             <wp:effectExtent t="0" r="0" b="0" l="0"/>
             <wp:docPr id="9" name="" descr="" title=""/>
             <wp:cNvGraphicFramePr>
@@ -14710,7 +14723,7 @@
                     </pic:cNvPicPr>
                   </pic:nvPicPr>
                   <pic:blipFill>
-                    <a:blip r:embed="rId16" cstate="none"/>
+                    <a:blip r:embed="rId27" cstate="none"/>
                     <a:srcRect/>
                     <a:stretch>
                       <a:fillRect/>
@@ -14719,7 +14732,7 @@
                   <pic:spPr bwMode="auto">
                     <a:xfrm>
                       <a:off x="0" y="0"/>
-                      <a:ext cx="4886325" cy="3333750"/>
+                      <a:ext cx="5486400" cy="3779520"/>
                     </a:xfrm>
                     <a:prstGeom prst="rect">
                       <a:avLst/>
@@ -14738,23 +14751,88 @@
         <w:jc w:val="center"/>
       </w:pPr>
       <w:r>
+        <w:t>Hình 2.9: ERD rút gọn cho phân hệ đánh giá HRMS</w:t>
+      </w:r>
+    </w:p>
+    <w:p>
+      <w:pPr>
+        <w:spacing/>
+        <w:ind w:firstLine="720"/>
+        <w:jc w:val="both"/>
+      </w:pPr>
+      <w:r>
+        <w:t>ERD thể hiện một phần các bảng/model hiện có liên quan đến chu kỳ, mục tiêu, minh chứng, phản hồi và quyết định đánh giá. Đây là sơ đồ rút gọn, không bao quát toàn bộ schema Prisma; hiệu năng chỉ có thể kết luận sau khi đo trên dữ liệu và môi trường đại diện.</w:t>
+      </w:r>
+    </w:p>
+    <w:p>
+      <w:pPr>
+        <w:pStyle w:val="Heading2"/>
+        <w:spacing w:after="80" w:before="180"/>
+        <w:jc w:val="left"/>
+      </w:pPr>
+      <w:r>
         <w:rPr>
           <w:rFonts w:ascii="Times New Roman" w:cs="Times New Roman" w:eastAsia="Times New Roman" w:hAnsi="Times New Roman"/>
           <w:b/>
           <w:bCs/>
-          <w:i/>
-          <w:iCs/>
-          <w:color w:val="000000"/>
-          <w:sz w:val="22"/>
-          <w:szCs w:val="22"/>
-        </w:rPr>
-        <w:t xml:space="preserve">Hình 2.9: Sơ đồ thực thể quan hệ Cơ sở dữ liệu KPI (ERD - Chuẩn 3NF)</w:t>
+          <w:color w:val="000000"/>
+          <w:sz w:val="26"/>
+          <w:szCs w:val="26"/>
+        </w:rPr>
+        <w:t xml:space="preserve">Tóm tắt Chương 2</w:t>
       </w:r>
     </w:p>
     <w:p>
       <w:pPr>
         <w:spacing w:after="120" w:before="0" w:line="312"/>
         <w:ind w:firstLine="450"/>
+        <w:jc w:val="both"/>
+      </w:pPr>
+      <w:r>
+        <w:t>Chương 2 trình bày yêu cầu, tác nhân, luồng đánh giá và mô hình dữ liệu liên quan. Các sơ đồ phân biệt chức năng đã có trong HRMS với phần công vụ và tích hợp mở rộng cần triển khai; Bảng 2.1 chỉ là mô hình tham khảo, không mô tả schema đang chạy.</w:t>
+      </w:r>
+    </w:p>
+    <w:p>
+      <w:pPr>
+        <w:pageBreakBefore/>
+        <w:spacing/>
+        <w:ind w:firstLine="720"/>
+        <w:jc w:val="both"/>
+      </w:pPr>
+      <w:r>
+        <w:rPr>
+          <w:rFonts w:ascii="Times New Roman" w:cs="Times New Roman" w:eastAsia="Times New Roman" w:hAnsi="Times New Roman"/>
+          <w:b/>
+          <w:bCs/>
+          <w:color w:val="000000"/>
+          <w:sz w:val="30"/>
+          <w:szCs w:val="30"/>
+        </w:rPr>
+        <w:t xml:space="preserve">CHƯƠNG 3: KẾT QUẢ ĐẠT ĐƯỢC, KẾ HOẠCH TRIỂN KHAI VÀ HƯỚNG PHÁT TRIỂN</w:t>
+      </w:r>
+    </w:p>
+    <w:p>
+      <w:pPr>
+        <w:pStyle w:val="Heading1"/>
+        <w:spacing w:after="100" w:before="240"/>
+        <w:jc w:val="left"/>
+      </w:pPr>
+      <w:r>
+        <w:rPr>
+          <w:rFonts w:ascii="Times New Roman" w:cs="Times New Roman" w:eastAsia="Times New Roman" w:hAnsi="Times New Roman"/>
+          <w:b/>
+          <w:bCs/>
+          <w:color w:val="000000"/>
+          <w:sz w:val="28"/>
+          <w:szCs w:val="28"/>
+        </w:rPr>
+        <w:t xml:space="preserve">3.1. Những kết quả đạt được của đề tài</w:t>
+      </w:r>
+    </w:p>
+    <w:p>
+      <w:pPr>
+        <w:spacing/>
+        <w:ind w:firstLine="720"/>
         <w:jc w:val="both"/>
       </w:pPr>
       <w:r>
@@ -14768,31 +14846,13 @@
           <w:sz w:val="26"/>
           <w:szCs w:val="26"/>
         </w:rPr>
-        <w:t xml:space="preserve">Sơ đồ Quan hệ thực thể (Hình 2.9) thể hiện đầy đủ các mối liên kết quan hệ 1-Nhiều và Nhiều-Nhiều giữa các thực thể bảng cốt lõi của hệ thống đánh giá KPI: Users, Departments, Kpis, Periods, Assignments, ActualData, Evaluations, và Audit Logs. CSDL được thiết kế với các chỉ mục tổng hợp (Composite Index) trên các khóa (nguoi_dung_id, ky_id) giúp truy vấn dữ liệu báo cáo tức thời với độ trễ dưới 50ms.</w:t>
-      </w:r>
-    </w:p>
-    <w:p>
-      <w:pPr>
-        <w:pStyle w:val="Heading2"/>
-        <w:spacing w:after="80" w:before="180"/>
-        <w:jc w:val="left"/>
-      </w:pPr>
-      <w:r>
-        <w:rPr>
-          <w:rFonts w:ascii="Times New Roman" w:cs="Times New Roman" w:eastAsia="Times New Roman" w:hAnsi="Times New Roman"/>
-          <w:b/>
-          <w:bCs/>
-          <w:color w:val="000000"/>
-          <w:sz w:val="26"/>
-          <w:szCs w:val="26"/>
-        </w:rPr>
-        <w:t xml:space="preserve">Tóm tắt Chương 2</w:t>
-      </w:r>
-    </w:p>
-    <w:p>
-      <w:pPr>
-        <w:spacing w:after="120" w:before="0" w:line="312"/>
-        <w:ind w:firstLine="450"/>
+        <w:t>Báo cáo đạt được các kết quả nghiên cứu và thiết kế sau; các nội dung dưới đây là sản phẩm học thuật/đề xuất, không phải nghiệm thu phần mềm đã triển khai:</w:t>
+      </w:r>
+    </w:p>
+    <w:p>
+      <w:pPr>
+        <w:spacing/>
+        <w:ind w:firstLine="720"/>
         <w:jc w:val="both"/>
       </w:pPr>
       <w:r>
@@ -14806,49 +14866,13 @@
           <w:sz w:val="26"/>
           <w:szCs w:val="26"/>
         </w:rPr>
-        <w:t xml:space="preserve">Chương 2 đã hoàn thành toàn diện công tác phân tích thiết kế hệ thống thông tin đánh giá KPI từ yêu cầu nghiệp vụ, cấu trúc tĩnh, hành vi động đến kiến trúc 3 tầng và cơ sở dữ liệu 26 bảng chuẩn 3NF kèm 9 sơ đồ kỹ thuật chuyên biệt.</w:t>
-      </w:r>
-    </w:p>
-    <w:p>
-      <w:pPr>
-        <w:pageBreakBefore/>
-        <w:spacing w:after="180" w:before="240"/>
-        <w:jc w:val="center"/>
-      </w:pPr>
-      <w:r>
-        <w:rPr>
-          <w:rFonts w:ascii="Times New Roman" w:cs="Times New Roman" w:eastAsia="Times New Roman" w:hAnsi="Times New Roman"/>
-          <w:b/>
-          <w:bCs/>
-          <w:color w:val="000000"/>
-          <w:sz w:val="30"/>
-          <w:szCs w:val="30"/>
-        </w:rPr>
-        <w:t xml:space="preserve">CHƯƠNG 3: KẾT QUẢ ĐẠT ĐƯỢC, KẾ HOẠCH TRIỂN KHAI VÀ HƯỚNG PHÁT TRIỂN</w:t>
-      </w:r>
-    </w:p>
-    <w:p>
-      <w:pPr>
-        <w:pStyle w:val="Heading1"/>
-        <w:spacing w:after="100" w:before="240"/>
-        <w:jc w:val="left"/>
-      </w:pPr>
-      <w:r>
-        <w:rPr>
-          <w:rFonts w:ascii="Times New Roman" w:cs="Times New Roman" w:eastAsia="Times New Roman" w:hAnsi="Times New Roman"/>
-          <w:b/>
-          <w:bCs/>
-          <w:color w:val="000000"/>
-          <w:sz w:val="28"/>
-          <w:szCs w:val="28"/>
-        </w:rPr>
-        <w:t xml:space="preserve">3.1. Những kết quả đạt được của đề tài</w:t>
-      </w:r>
-    </w:p>
-    <w:p>
-      <w:pPr>
-        <w:spacing w:after="120" w:before="0" w:line="312"/>
-        <w:ind w:firstLine="450"/>
+        <w:t>Thứ nhất: Hệ thống hóa BSC, OKR, PDCA, 3P và tách căn cứ đánh giá công chức theo Nghị định 335/2025/NĐ-CP khỏi căn cứ viên chức theo Nghị định 233/2026/NĐ-CP. Kết luận 14-KL/TW được xem xét theo từng trường hợp, không tự động cộng điểm.</w:t>
+      </w:r>
+    </w:p>
+    <w:p>
+      <w:pPr>
+        <w:spacing/>
+        <w:ind w:firstLine="720"/>
         <w:jc w:val="both"/>
       </w:pPr>
       <w:r>
@@ -14862,13 +14886,13 @@
           <w:sz w:val="26"/>
           <w:szCs w:val="26"/>
         </w:rPr>
-        <w:t xml:space="preserve">Báo cáo nghiên cứu đã giải quyết trọn vẹn và đạt được những kết quả xuất sắc sau:</w:t>
-      </w:r>
-    </w:p>
-    <w:p>
-      <w:pPr>
-        <w:spacing w:after="120" w:before="0" w:line="312"/>
-        <w:ind w:firstLine="450"/>
+        <w:t>Thứ hai: Đề xuất mô hình công thức chuẩn hóa KPI, có thể dùng làm đầu vào quy chế nội bộ. Việc dùng kết quả cho P3 cần doanh nghiệp phê duyệt chính sách, đối soát dữ liệu và tích hợp riêng; HRMS hiện tại chưa nối tự động kết quả KPI sang lương.</w:t>
+      </w:r>
+    </w:p>
+    <w:p>
+      <w:pPr>
+        <w:spacing/>
+        <w:ind w:firstLine="720"/>
         <w:jc w:val="both"/>
       </w:pPr>
       <w:r>
@@ -14882,47 +14906,7 @@
           <w:sz w:val="26"/>
           <w:szCs w:val="26"/>
         </w:rPr>
-        <w:t xml:space="preserve">Thứ nhất: Xây dựng thành công cơ sở lý luận và thể chế pháp lý vững chắc, tích hợp nhuần nhuyễn giữa chuẩn mực quản trị hiện đại quốc tế (BSC, OKR, 3P, PDCA) và thể chế công vụ Việt Nam theo Nghị định số 48/2023/NĐ-CP cùng Kết luận số 14-KL/TW.</w:t>
-      </w:r>
-    </w:p>
-    <w:p>
-      <w:pPr>
-        <w:spacing w:after="120" w:before="0" w:line="312"/>
-        <w:ind w:firstLine="450"/>
-        <w:jc w:val="both"/>
-      </w:pPr>
-      <w:r>
-        <w:rPr>
-          <w:rFonts w:ascii="Times New Roman" w:cs="Times New Roman" w:eastAsia="Times New Roman" w:hAnsi="Times New Roman"/>
-          <w:b w:val="false"/>
-          <w:bCs w:val="false"/>
-          <w:i w:val="false"/>
-          <w:iCs w:val="false"/>
-          <w:color w:val="000000"/>
-          <w:sz w:val="26"/>
-          <w:szCs w:val="26"/>
-        </w:rPr>
-        <w:t xml:space="preserve">Thứ hai: Thiết lập mô hình toán học đo lường định lượng minh bạch với các công thức tỷ lệ thuận, tỷ lệ nghịch, khống chế ngưỡng sàn/trần an toàn và liên kết trực tiếp với chính sách đãi ngộ tiền lương hiệu quả.</w:t>
-      </w:r>
-    </w:p>
-    <w:p>
-      <w:pPr>
-        <w:spacing w:after="120" w:before="0" w:line="312"/>
-        <w:ind w:firstLine="450"/>
-        <w:jc w:val="both"/>
-      </w:pPr>
-      <w:r>
-        <w:rPr>
-          <w:rFonts w:ascii="Times New Roman" w:cs="Times New Roman" w:eastAsia="Times New Roman" w:hAnsi="Times New Roman"/>
-          <w:b w:val="false"/>
-          <w:bCs w:val="false"/>
-          <w:i w:val="false"/>
-          <w:iCs w:val="false"/>
-          <w:color w:val="000000"/>
-          <w:sz w:val="26"/>
-          <w:szCs w:val="26"/>
-        </w:rPr>
-        <w:t xml:space="preserve">Thứ ba: Hoàn thiện hồ sơ thiết kế kỹ thuật chuẩn mực với 9 biểu đồ UML &amp; Kiến trúc chuyên biệt cho hệ thống KPI, CSDL 26 bảng chuẩn 3NF và đường ống nạp dữ liệu tác nghiệp thời gian thực chống gian lận.</w:t>
+        <w:t>Thứ ba: Hoàn thiện hồ sơ phân tích thiết kế gồm 9 sơ đồ UML/kiến trúc và mô hình CSDL 26 bảng. Các tích hợp ERP/MES/IoT, hàng đợi, chống gian lận và hiệu năng chưa được xây dựng hay kiểm chứng.</w:t>
       </w:r>
     </w:p>
     <w:p>
@@ -15622,7 +15606,7 @@
                 <w:sz w:val="22"/>
                 <w:szCs w:val="22"/>
               </w:rPr>
-              <w:t xml:space="preserve">Lập trình công cụ tính toán điểm số và thuật toán kiểm soát trần Nghị định 48</w:t>
+              <w:t>Lập trình công cụ tính toán điểm số và thuật toán kiểm soát trần Nghị định 335/2025 và 233/2026 (chỉ khu vực công)</w:t>
             </w:r>
           </w:p>
         </w:tc>
@@ -15923,7 +15907,7 @@
                 <w:sz w:val="22"/>
                 <w:szCs w:val="22"/>
               </w:rPr>
-              <w:t xml:space="preserve">Màn hình hiệu chuẩn trực quan; Cổng đồng bộ lương P3</w:t>
+              <w:t>Màn hình hiệu chuẩn khu vực công; thiết kế connector P3 doanh nghiệp (đề xuất)</w:t>
             </w:r>
           </w:p>
         </w:tc>
@@ -16191,7 +16175,7 @@
                 <w:sz w:val="22"/>
                 <w:szCs w:val="22"/>
               </w:rPr>
-              <w:t xml:space="preserve">Hệ thống vận hành chính thức; Biên bản chuyển giao</w:t>
+              <w:t>Kế hoạch nghiệm thu và chuyển giao sau khi triển khai thực tế</w:t>
             </w:r>
           </w:p>
         </w:tc>
@@ -16811,7 +16795,7 @@
                 <w:sz w:val="22"/>
                 <w:szCs w:val="22"/>
               </w:rPr>
-              <w:t xml:space="preserve">Vi phạm hạn ngạch trần 20% xuất sắc theo Nghị định 48</w:t>
+              <w:t>Sai lệch tỷ lệ xếp loại xuất sắc trong nhóm công chức/viên chức</w:t>
             </w:r>
           </w:p>
         </w:tc>
@@ -16910,7 +16894,7 @@
                 <w:sz w:val="22"/>
                 <w:szCs w:val="22"/>
               </w:rPr>
-              <w:t xml:space="preserve">Khóa cứng điều kiện nghiệp vụ trong mã nguồn phần mềm, ngăn chặn hoàn toàn nút phê duyệt</w:t>
+              <w:t>Chỉ bật kiểm tra ở chế độ khu vực công; phân nhóm cùng đơn vị/nhiệm vụ tương đồng, lưu căn cứ và số quyết định ngoại lệ. Không áp dụng hạn ngạch cho doanh nghiệp.</w:t>
             </w:r>
           </w:p>
         </w:tc>
@@ -17437,8 +17421,8 @@
     </w:p>
     <w:p>
       <w:pPr>
-        <w:spacing w:after="120" w:before="0" w:line="312"/>
-        <w:ind w:firstLine="450"/>
+        <w:spacing/>
+        <w:ind w:firstLine="720"/>
         <w:jc w:val="both"/>
       </w:pPr>
       <w:r>
@@ -17452,13 +17436,13 @@
           <w:sz w:val="26"/>
           <w:szCs w:val="26"/>
         </w:rPr>
-        <w:t xml:space="preserve">Hệ thống thông tin đánh giá hiệu quả công việc có lộ trình tích hợp công nghệ trí tuệ nhân tạo qua ba giai đoạn chiến lược:</w:t>
-      </w:r>
-    </w:p>
-    <w:p>
-      <w:pPr>
-        <w:spacing w:after="120" w:before="0" w:line="312"/>
-        <w:ind w:firstLine="450"/>
+        <w:t>AI là lộ trình nghiên cứu đề xuất, chỉ xem xét sau khi dữ liệu hợp pháp, có chất lượng, có sự giám sát của người có thẩm quyền và đánh giá rủi ro; không phải chức năng hiện hành.</w:t>
+      </w:r>
+    </w:p>
+    <w:p>
+      <w:pPr>
+        <w:spacing/>
+        <w:ind w:firstLine="720"/>
         <w:jc w:val="both"/>
       </w:pPr>
       <w:r>
@@ -17477,8 +17461,8 @@
     </w:p>
     <w:p>
       <w:pPr>
-        <w:spacing w:after="120" w:before="0" w:line="312"/>
-        <w:ind w:firstLine="450"/>
+        <w:spacing/>
+        <w:ind w:firstLine="720"/>
         <w:jc w:val="both"/>
       </w:pPr>
       <w:r>
@@ -17497,8 +17481,8 @@
     </w:p>
     <w:p>
       <w:pPr>
-        <w:spacing w:after="120" w:before="0" w:line="312"/>
-        <w:ind w:firstLine="450"/>
+        <w:spacing/>
+        <w:ind w:firstLine="720"/>
         <w:jc w:val="both"/>
       </w:pPr>
       <w:r>
@@ -17535,8 +17519,8 @@
     </w:p>
     <w:p>
       <w:pPr>
-        <w:spacing w:after="120" w:before="0" w:line="312"/>
-        <w:ind w:firstLine="450"/>
+        <w:spacing/>
+        <w:ind w:firstLine="720"/>
         <w:jc w:val="both"/>
       </w:pPr>
       <w:r>
@@ -17550,13 +17534,13 @@
           <w:sz w:val="26"/>
           <w:szCs w:val="26"/>
         </w:rPr>
-        <w:t xml:space="preserve">Khung chỉ dẫn tám phiên được thiết kế bài bản nhằm hướng dẫn các kỹ sư phần mềm hoặc các công cụ lập trình trí tuệ nhân tạo xây dựng hoàn thiện từng cấu phần kỹ thuật của hệ thống:</w:t>
-      </w:r>
-    </w:p>
-    <w:p>
-      <w:pPr>
-        <w:spacing w:after="120" w:before="0" w:line="312"/>
-        <w:ind w:firstLine="450"/>
+        <w:t>Tám phiên dưới đây là kế hoạch phát triển một sản phẩm KPI độc lập hoặc mở rộng HRMS sau khi có phê duyệt phạm vi, khảo sát tích hợp và thiết kế bảo mật; không mô tả tám hạng mục đã hoàn thành.</w:t>
+      </w:r>
+    </w:p>
+    <w:p>
+      <w:pPr>
+        <w:spacing/>
+        <w:ind w:firstLine="720"/>
         <w:jc w:val="both"/>
       </w:pPr>
       <w:r>
@@ -17570,13 +17554,13 @@
           <w:sz w:val="26"/>
           <w:szCs w:val="26"/>
         </w:rPr>
-        <w:t xml:space="preserve">Phiên 1 - Khởi tạo mô hình dữ liệu quan hệ: Lập trình toàn diện 26 thực thể bảng dữ liệu trên tầng ánh xạ cơ sở dữ liệu, định nghĩa đầy đủ các khóa chính, khóa ngoại, các quan hệ liên kết và thiết lập chỉ mục tra cứu tốc độ cao.</w:t>
-      </w:r>
-    </w:p>
-    <w:p>
-      <w:pPr>
-        <w:spacing w:after="120" w:before="0" w:line="312"/>
-        <w:ind w:firstLine="450"/>
+        <w:t>Phiên 1 - Rà soát và thiết kế lược đồ dữ liệu KPI; đối chiếu với các mô hình hiện có để tránh tạo dữ liệu nhân sự trùng lặp.</w:t>
+      </w:r>
+    </w:p>
+    <w:p>
+      <w:pPr>
+        <w:spacing/>
+        <w:ind w:firstLine="720"/>
         <w:jc w:val="both"/>
       </w:pPr>
       <w:r>
@@ -17590,13 +17574,13 @@
           <w:sz w:val="26"/>
           <w:szCs w:val="26"/>
         </w:rPr>
-        <w:t xml:space="preserve">Phiên 2 - Xây dựng đường ống tiếp nhận dữ liệu thời gian thực: Phát triển cổng giao diện ứng dụng tiếp nhận thông điệp sản xuất và hồ sơ công vụ, đẩy dữ liệu vào hàng đợi thông điệp và lập trình tiến trình công nhân xử lý ngầm kiểm tra tính toàn vẹn dữ liệu.</w:t>
-      </w:r>
-    </w:p>
-    <w:p>
-      <w:pPr>
-        <w:spacing w:after="120" w:before="0" w:line="312"/>
-        <w:ind w:firstLine="450"/>
+        <w:t>Phiên 2 - Khảo sát, thiết kế và thử nghiệm bộ kết nối dữ liệu với ERP/MES/DVC nếu có hệ thống nguồn, quyền truy cập và thỏa thuận tích hợp.</w:t>
+      </w:r>
+    </w:p>
+    <w:p>
+      <w:pPr>
+        <w:spacing/>
+        <w:ind w:firstLine="720"/>
         <w:jc w:val="both"/>
       </w:pPr>
       <w:r>
@@ -17610,13 +17594,13 @@
           <w:sz w:val="26"/>
           <w:szCs w:val="26"/>
         </w:rPr>
-        <w:t xml:space="preserve">Phiên 3 - Xây dựng công cụ tính toán điểm số và đánh giá đa chiều: Lập trình dịch vụ tính toán độc lập thực hiện các phép tính chỉ số tỷ lệ thuận, tỷ lệ nghịch, ngưỡng chặn biên độ, hàm suy biến phi tuyến và công thức tổng hợp điểm có trọng số.</w:t>
-      </w:r>
-    </w:p>
-    <w:p>
-      <w:pPr>
-        <w:spacing w:after="120" w:before="0" w:line="312"/>
-        <w:ind w:firstLine="450"/>
+        <w:t>Phiên 3 - Đặc tả và kiểm chứng công thức tính điểm, dữ liệu thiếu, làm tròn, ngưỡng và vai trò phê duyệt.</w:t>
+      </w:r>
+    </w:p>
+    <w:p>
+      <w:pPr>
+        <w:spacing/>
+        <w:ind w:firstLine="720"/>
         <w:jc w:val="both"/>
       </w:pPr>
       <w:r>
@@ -17630,13 +17614,13 @@
           <w:sz w:val="26"/>
           <w:szCs w:val="26"/>
         </w:rPr>
-        <w:t xml:space="preserve">Phiên 4 - Triển khai thuật toán hiệu chuẩn và khống chế trần Nghị định 48: Hiện thực hóa dịch vụ hiệu chuẩn điểm số tập thể, tự động xác định hạn ngạch tối đa 20% cá nhân Hoàn thành xuất sắc nhiệm vụ và kích hoạt cơ chế khóa phê duyệt khi vi phạm.</w:t>
-      </w:r>
-    </w:p>
-    <w:p>
-      <w:pPr>
-        <w:spacing w:after="120" w:before="0" w:line="312"/>
-        <w:ind w:firstLine="450"/>
+        <w:t>Phiên 4 - Hoàn thiện hiệu chuẩn khu vực công theo Nghị định 335/2025 và 233/2026, bao gồm nhóm nhiệm vụ, điều kiện xếp loại, tỷ lệ 20% và ngoại lệ đến 25% có quyết định; không đưa hạn ngạch này vào nhánh doanh nghiệp.</w:t>
+      </w:r>
+    </w:p>
+    <w:p>
+      <w:pPr>
+        <w:spacing/>
+        <w:ind w:firstLine="720"/>
         <w:jc w:val="both"/>
       </w:pPr>
       <w:r>
@@ -17650,13 +17634,13 @@
           <w:sz w:val="26"/>
           <w:szCs w:val="26"/>
         </w:rPr>
-        <w:t xml:space="preserve">Phiên 5 - Xây dựng giao diện ứng dụng di động tự phục vụ: Lập trình màn hình hiển thị điểm số thời gian thực, bảng theo dõi tiến độ công việc hàng ngày, chức năng chụp ảnh tải lên minh chứng và nộp đơn khiếu nại trực tuyến.</w:t>
-      </w:r>
-    </w:p>
-    <w:p>
-      <w:pPr>
-        <w:spacing w:after="120" w:before="0" w:line="312"/>
-        <w:ind w:firstLine="450"/>
+        <w:t>Phiên 5 - Xem xét ứng dụng di động và kênh tự phục vụ sau khi thống nhất yêu cầu, quyền dữ liệu và nền tảng vận hành.</w:t>
+      </w:r>
+    </w:p>
+    <w:p>
+      <w:pPr>
+        <w:spacing/>
+        <w:ind w:firstLine="720"/>
         <w:jc w:val="both"/>
       </w:pPr>
       <w:r>
@@ -17670,13 +17654,13 @@
           <w:sz w:val="26"/>
           <w:szCs w:val="26"/>
         </w:rPr>
-        <w:t xml:space="preserve">Phiên 6 - Phát triển không gian hiệu chuẩn trực quan dành cho người quản lý: Xây dựng biểu đồ phân bố đường cong chuẩn hóa kết quả đánh giá, tính năng kéo thả điều chỉnh điểm số và cảnh báo vi phạm hạn ngạch tức thời.</w:t>
-      </w:r>
-    </w:p>
-    <w:p>
-      <w:pPr>
-        <w:spacing w:after="120" w:before="0" w:line="312"/>
-        <w:ind w:firstLine="450"/>
+        <w:t>Phiên 6 - Bổ sung màn hình rà soát phân phối mức xếp loại, lưu lý do điều chỉnh và vết phê duyệt; không cho phép hiệu chuẩn tự động thay quyết định của người có thẩm quyền.</w:t>
+      </w:r>
+    </w:p>
+    <w:p>
+      <w:pPr>
+        <w:spacing/>
+        <w:ind w:firstLine="720"/>
         <w:jc w:val="both"/>
       </w:pPr>
       <w:r>
@@ -17690,13 +17674,13 @@
           <w:sz w:val="26"/>
           <w:szCs w:val="26"/>
         </w:rPr>
-        <w:t xml:space="preserve">Phiên 7 - Xây dựng cổng liên thông tích hợp dữ liệu tiền lương hiệu quả: Lập trình dịch vụ kết xuất hệ số hoàn thành công việc sang phần mềm quản trị nguồn nhân lực và tính toán tự động quỹ lương hiệu quả theo mô hình 3P.</w:t>
-      </w:r>
-    </w:p>
-    <w:p>
-      <w:pPr>
-        <w:spacing w:after="120" w:before="0" w:line="312"/>
-        <w:ind w:firstLine="450"/>
+        <w:t>Phiên 7 - Chỉ đề xuất tích hợp P3 khi doanh nghiệp ban hành quy chế lương thưởng, nguyên tắc đối soát và quy trình phê duyệt; không dùng nhánh công vụ.</w:t>
+      </w:r>
+    </w:p>
+    <w:p>
+      <w:pPr>
+        <w:spacing/>
+        <w:ind w:firstLine="720"/>
         <w:jc w:val="both"/>
       </w:pPr>
       <w:r>
@@ -17710,7 +17694,7 @@
           <w:sz w:val="26"/>
           <w:szCs w:val="26"/>
         </w:rPr>
-        <w:t xml:space="preserve">Phiên 8 - Kiểm thử tự động và hoàn thiện hệ thống cảnh báo gian lận: Viết các kịch bản kiểm thử tải trọng lớn, kiểm tra tính toán công thức toán học và kích hoạt tiến trình định kỳ phát hiện bất thường số liệu.</w:t>
+        <w:t>Phiên 8 - Kiểm thử công thức, phân quyền, bảo mật, tải và khôi phục; chỉ công bố năng lực sau khi có kết quả đo và biên bản nghiệm thu.</w:t>
       </w:r>
     </w:p>
     <w:p>
@@ -17753,8 +17737,8 @@
     </w:p>
     <w:p>
       <w:pPr>
-        <w:spacing w:after="120" w:before="0" w:line="312"/>
-        <w:ind w:firstLine="450"/>
+        <w:spacing/>
+        <w:ind w:left="504" w:hanging="288"/>
         <w:jc w:val="both"/>
       </w:pPr>
       <w:r>
@@ -17768,13 +17752,13 @@
           <w:sz w:val="26"/>
           <w:szCs w:val="26"/>
         </w:rPr>
-        <w:t xml:space="preserve">• Tính bao quát và linh hoạt: Giải quyết đồng thời bài toán đo lường năng suất sản xuất kinh doanh theo chuẩn quốc tế và bài toán xếp loại công chức viên chức theo pháp luật Việt Nam.</w:t>
-      </w:r>
-    </w:p>
-    <w:p>
-      <w:pPr>
-        <w:spacing w:after="120" w:before="0" w:line="312"/>
-        <w:ind w:firstLine="450"/>
+        <w:t>• Tính bao quát ở mức thiết kế: cùng một đề tài phân tích hai bối cảnh nhưng áp dụng quy tắc, màn hình và căn cứ riêng theo chế độ tổ chức.</w:t>
+      </w:r>
+    </w:p>
+    <w:p>
+      <w:pPr>
+        <w:spacing/>
+        <w:ind w:left="504" w:hanging="288"/>
         <w:jc w:val="both"/>
       </w:pPr>
       <w:r>
@@ -17788,13 +17772,13 @@
           <w:sz w:val="26"/>
           <w:szCs w:val="26"/>
         </w:rPr>
-        <w:t xml:space="preserve">• Tính khách quan và tự động hóa cao: Thu thập dữ liệu tác nghiệp thời gian thực từ máy móc và hệ thống Một cửa điện tử, giảm thiểu tối đa sự can thiệp chủ quan của con người.</w:t>
-      </w:r>
-    </w:p>
-    <w:p>
-      <w:pPr>
-        <w:spacing w:after="120" w:before="0" w:line="312"/>
-        <w:ind w:firstLine="450"/>
+        <w:t>• Tính kiểm chứng được: yêu cầu đề xuất nhấn mạnh minh chứng; thu thập tự động từ ERP/MES/IoT/Một cửa chỉ khả thi sau khi xây dựng và kiểm tra connector.</w:t>
+      </w:r>
+    </w:p>
+    <w:p>
+      <w:pPr>
+        <w:spacing/>
+        <w:ind w:left="504" w:hanging="288"/>
         <w:jc w:val="both"/>
       </w:pPr>
       <w:r>
@@ -17808,7 +17792,7 @@
           <w:sz w:val="26"/>
           <w:szCs w:val="26"/>
         </w:rPr>
-        <w:t xml:space="preserve">• Khả năng kiểm soát pháp lý nghiêm ngặt: Tích hợp sẵn thuật toán khóa cứng trần 20% xuất sắc theo Nghị định 48 và bảo lưu quyền lợi cho cán bộ sáng tạo theo Kết luận 14-KL/TW.</w:t>
+        <w:t>• Tính cập nhật pháp lý: mô hình phân biệt 335/2025 cho công chức và 233/2026 cho viên chức; cơ chế 20%/ngoại lệ 25% chỉ ở nhánh khu vực công. HRMS hiện có ghi quyết định và chặn vượt tỷ lệ, nhưng chưa thay thế toàn bộ biểu mẫu/quy trình công vụ của đơn vị.</w:t>
       </w:r>
     </w:p>
     <w:p>
@@ -17833,8 +17817,8 @@
     </w:p>
     <w:p>
       <w:pPr>
-        <w:spacing w:after="120" w:before="0" w:line="312"/>
-        <w:ind w:firstLine="450"/>
+        <w:spacing/>
+        <w:ind w:left="504" w:hanging="288"/>
         <w:jc w:val="both"/>
       </w:pPr>
       <w:r>
@@ -17848,13 +17832,13 @@
           <w:sz w:val="26"/>
           <w:szCs w:val="26"/>
         </w:rPr>
-        <w:t xml:space="preserve">• Phụ thuộc vào mức độ số hóa của cơ quan, doanh nghiệp: Đối với các đơn vị chưa có hệ thống ERP/MES hoặc chưa số hóa quy trình công vụ, việc thu thập dữ liệu minh chứng vẫn phải dựa vào nhập liệu thủ công.</w:t>
-      </w:r>
-    </w:p>
-    <w:p>
-      <w:pPr>
-        <w:spacing w:after="120" w:before="0" w:line="312"/>
-        <w:ind w:firstLine="450"/>
+        <w:t>• Phụ thuộc vào mức độ số hóa và quyền tích hợp: khi chưa có connector ERP/MES/DVC, minh chứng phải nhập hoặc nạp thủ công; dữ liệu minh họa trong báo cáo không chứng minh kết nối đã vận hành.</w:t>
+      </w:r>
+    </w:p>
+    <w:p>
+      <w:pPr>
+        <w:spacing/>
+        <w:ind w:left="504" w:hanging="288"/>
         <w:jc w:val="both"/>
       </w:pPr>
       <w:r>
@@ -17893,8 +17877,8 @@
     </w:p>
     <w:p>
       <w:pPr>
-        <w:spacing w:after="120" w:before="0" w:line="312"/>
-        <w:ind w:firstLine="450"/>
+        <w:spacing/>
+        <w:ind w:left="504" w:hanging="288"/>
         <w:jc w:val="both"/>
       </w:pPr>
       <w:r>
@@ -17908,13 +17892,13 @@
           <w:sz w:val="26"/>
           <w:szCs w:val="26"/>
         </w:rPr>
-        <w:t xml:space="preserve">• Đối với các cơ quan, đơn vị: Cần sớm chuẩn hóa đề án vị trí việc làm và danh mục chỉ số đo lường đầu ra cho từng chức danh trước khi triển khai phần mềm.</w:t>
-      </w:r>
-    </w:p>
-    <w:p>
-      <w:pPr>
-        <w:spacing w:after="120" w:before="0" w:line="312"/>
-        <w:ind w:firstLine="450"/>
+        <w:t>• Đối với đơn vị công: ban hành quy chế, tiêu chí đầu ra, nhóm nhiệm vụ tương đồng, thẩm quyền kết luận, hồ sơ ngoại lệ và biểu mẫu tương ứng trước khi dùng phần mềm.</w:t>
+      </w:r>
+    </w:p>
+    <w:p>
+      <w:pPr>
+        <w:spacing/>
+        <w:ind w:left="504" w:hanging="288"/>
         <w:jc w:val="both"/>
       </w:pPr>
       <w:r>
@@ -17928,7 +17912,7 @@
           <w:sz w:val="26"/>
           <w:szCs w:val="26"/>
         </w:rPr>
-        <w:t xml:space="preserve">• Đối với đội ngũ phát triển: Tiếp tục nghiên cứu mở rộng tích hợp các mô hình trí tuệ nhân tạo để hỗ trợ tự động gợi ý chỉ tiêu và phân tích xu hướng hiệu suất dài hạn.</w:t>
+        <w:t>• Đối với doanh nghiệp: xây dựng KPI theo vai trò và quy chế P3 riêng nếu muốn liên kết lương; thử nghiệm, đối soát và phê duyệt trước khi chi trả.</w:t>
       </w:r>
     </w:p>
     <w:p>
@@ -17966,7 +17950,7 @@
           <w:sz w:val="26"/>
           <w:szCs w:val="26"/>
         </w:rPr>
-        <w:t xml:space="preserve">Chương 3 đã tổng kết toàn diện các đóng góp học thuật và thực tiễn của đề tài, đồng thời xây dựng kế hoạch triển khai 16 tuần, ma trận rủi ro và lộ trình phát triển AI Engine, khẳng định tính khả thi và giá trị ứng dụng cao của hệ thống.</w:t>
+        <w:t>Chương 3 tóm tắt sản phẩm phân tích thiết kế và lộ trình khả thi. Tiến độ 16 tuần, AI, ứng dụng di động, tích hợp dữ liệu ngoài và nghiệm thu là kế hoạch tham khảo; chưa phải kết quả triển khai thực tế.</w:t>
       </w:r>
     </w:p>
     <w:p>
@@ -18083,7 +18067,7 @@
           <w:sz w:val="26"/>
           <w:szCs w:val="26"/>
         </w:rPr>
-        <w:t xml:space="preserve">4. Chính phủ nước Cộng hòa xã hội chủ nghĩa Việt Nam (2020), Nghị định số 90/2020/NĐ-CP ngày 13 tháng 8 năm 2020 về đánh giá, xếp loại chất lượng cán bộ, công chức, viên chức.</w:t>
+        <w:t>4. Chính phủ (2025), Nghị định số 335/2025/NĐ-CP ngày 21/12/2025 quy định về đánh giá, xếp loại chất lượng đối với cơ quan hành chính nhà nước và công chức; hiệu lực 01/01/2026. https://vanban.chinhphu.vn/?classid=1&amp;docid=216292&amp;pageid=27160</w:t>
       </w:r>
     </w:p>
     <w:p>
@@ -18103,7 +18087,7 @@
           <w:sz w:val="26"/>
           <w:szCs w:val="26"/>
         </w:rPr>
-        <w:t xml:space="preserve">5. Chính phủ nước Cộng hòa xã hội chủ nghĩa Việt Nam (2023), Nghị định số 48/2023/NĐ-CP ngày 17 tháng 7 năm 2023 sửa đổi, bổ sung một số điều của Nghị định số 90/2020/NĐ-CP về đánh giá, xếp loại chất lượng cán bộ, công chức, viên chức.</w:t>
+        <w:t>5. Chính phủ (2026), Nghị định số 233/2026/NĐ-CP ngày 26/06/2026 quy định về đánh giá, xếp loại chất lượng đối với đơn vị sự nghiệp công lập và viên chức; hiệu lực 01/07/2026. https://vanban.chinhphu.vn/?docid=218616&amp;pageid=27160</w:t>
       </w:r>
     </w:p>
     <w:p>
@@ -18143,7 +18127,7 @@
           <w:sz w:val="26"/>
           <w:szCs w:val="26"/>
         </w:rPr>
-        <w:t xml:space="preserve">7. Bộ Nội vụ (2023), Thông tư hướng dẫn một số điều của Nghị định số 48/2023/NĐ-CP về tiêu chuẩn và quy trình đánh giá xếp loại công vụ.</w:t>
+        <w:t>7. Cổng Thông tin điện tử Chính phủ, toàn văn và thông tin hướng dẫn thi hành Nghị định 335/2025/NĐ-CP và Nghị định 233/2026/NĐ-CP (truy cập ngày 05/10/2026).</w:t>
       </w:r>
     </w:p>
     <w:p>
@@ -18524,6 +18508,14 @@
   <w:style w:type="paragraph" w:styleId="Normal" w:default="1">
     <w:name w:val="Normal"/>
     <w:qFormat/>
+    <w:pPr>
+      <w:ind w:firstLine="720"/>
+      <w:jc w:val="both"/>
+    </w:pPr>
+    <w:rPr>
+      <w:rFonts w:ascii="Times New Roman" w:hAnsi="Times New Roman"/>
+      <w:sz w:val="26"/>
+    </w:rPr>
   </w:style>
   <w:style w:type="paragraph" w:styleId="Title">
     <w:name w:val="Title"/>

</xml_diff>

<commit_message>
Update App and Doc
</commit_message>
<xml_diff>
--- a/Hệ thống thông tin quản trị nhân lực/doc/PTTK_HTTT_KPI.docx
+++ b/Hệ thống thông tin quản trị nhân lực/doc/PTTK_HTTT_KPI.docx
@@ -71,6 +71,7 @@
     </w:p>
     <w:p>
       <w:pPr>
+        <w:keepNext/>
         <w:pBdr>
           <w:top w:val="thickThinSmallGap" w:sz="24" w:space="31" w:color="000000"/>
           <w:left w:val="thickThinSmallGap" w:sz="24" w:space="4" w:color="000000"/>
@@ -91,7 +92,7 @@
           <w:lang w:eastAsia="zh-CN"/>
         </w:rPr>
         <w:drawing>
-          <wp:anchor distT="0" distB="0" distL="114300" distR="114300" simplePos="0" relativeHeight="251848704" behindDoc="0" locked="0" layoutInCell="1" allowOverlap="1" wp14:anchorId="4872F72C" wp14:editId="7D8128D9">
+          <wp:anchor distT="0" distB="0" distL="114300" distR="114300" simplePos="0" relativeHeight="251848704" behindDoc="0" locked="0" layoutInCell="1" allowOverlap="1" wp14:anchorId="28F05BE1" wp14:editId="28019377">
             <wp:simplePos x="0" y="0"/>
             <wp:positionH relativeFrom="column">
               <wp:posOffset>1216025</wp:posOffset>
@@ -630,6 +631,7 @@
     <w:p>
       <w:pPr>
         <w:pStyle w:val="umctrcnidung"/>
+        <w:pageBreakBefore/>
         <w:spacing w:before="240" w:after="180"/>
       </w:pPr>
       <w:r>
@@ -680,12 +682,12 @@
     </w:p>
     <w:p>
       <w:r>
-        <w:t>Đồng thời, em cũng xin bày tỏ lòng biết ơn chân thành đến Ban Giám hiệu cùng tập thể quý Thầy, Cô giáo tại Học viện Hành chính và Quản trị công đã không ngừng tạo dựng môi trường học thuật chất lượng cao, trang bị cơ sở vật chất hiện đại để chúng em được trau dồi tri thức, rèn luyện kỹ năng tư duy hệ thống và phương pháp luận giải quyết vấn đề thực tiễn.</w:t>
-      </w:r>
-    </w:p>
-    <w:p>
-      <w:r>
-        <w:t>Cuối cùng, em xin gửi lời tri ân sâu sắc đến gia đình, người thân và bạn bè – những người luôn là điểm tựa tinh thần vững chắc, không ngừng động viên, hỗ trợ và đồng hành cùng em trong suốt chặng đường học tập và nghiên cứu vừa qua.</w:t>
+        <w:t>Em xin cảm ơn các thầy, cô tại Học viện Hành chính và Quản trị công đã giảng dạy và hỗ trợ em trong quá trình học tập.</w:t>
+      </w:r>
+    </w:p>
+    <w:p>
+      <w:r>
+        <w:t>Em cũng cảm ơn gia đình và bạn bè đã động viên, giúp đỡ em trong thời gian thực hiện báo cáo.</w:t>
       </w:r>
     </w:p>
     <w:p>
@@ -704,6 +706,7 @@
     <w:p>
       <w:pPr>
         <w:pStyle w:val="umctrcnidung"/>
+        <w:pageBreakBefore/>
         <w:spacing w:before="240" w:after="180"/>
       </w:pPr>
       <w:r>
@@ -713,12 +716,13 @@
           <w:sz w:val="30"/>
           <w:szCs w:val="30"/>
         </w:rPr>
+        <w:lastRenderedPageBreak/>
         <w:t>LỜI CAM ĐOAN</w:t>
       </w:r>
     </w:p>
     <w:p>
       <w:r>
-        <w:t>Em xin cam đoan rằng toàn bộ nội dung được trình bày trong bài báo cáo bài tập lớn kết thúc học phần với đề tài "Phân tích và thiết kế hệ thống thông tin đánh giá hiệu quả công việc (KPI) cho khối doanh nghiệp và cơ quan nhà nước" là công trình nghiên cứu độc lập, nghiêm túc của riêng bản thân em dưới sự hướng dẫn khoa học của Thầy Hoàng Minh Ngọc.</w:t>
+        <w:t>Em chịu trách nhiệm về nội dung báo cáo, các số liệu minh họa và việc trích dẫn tài liệu. Báo cáo được thực hiện trong phạm vi học phần dưới sự hướng dẫn của Thầy Hoàng Minh Ngọc.</w:t>
       </w:r>
     </w:p>
     <w:p>
@@ -728,12 +732,12 @@
     </w:p>
     <w:p>
       <w:r>
-        <w:t>Em xin khẳng định rằng mọi số liệu, bảng biểu, công thức toán học và kết quả phân tích trong báo cáo là trung thực, rõ ràng và có trích dẫn nguồn gốc đầy đủ theo đúng quy chuẩn học thuật. Toàn bộ 9 sơ đồ kỹ thuật UML và sơ đồ kiến trúc hệ thống đều được tự xây dựng dựa trên bài toán phân tích thiết kế thực tế của hệ thống đánh giá KPI.</w:t>
-      </w:r>
-    </w:p>
-    <w:p>
-      <w:r>
-        <w:t>Em xin hoàn toàn chịu trách nhiệm trước Bộ môn, Khoa và Ban Giám hiệu Nhà trường về tính trung thực và sự chuẩn mực của nội dung được trình bày trong toàn bộ tài liệu này.</w:t>
+        <w:t>Các số liệu, bảng biểu và công thức trong báo cáo được ghi rõ nguồn hoặc xác định là ví dụ minh họa. Các sơ đồ UML và kiến trúc hệ thống được xây dựng để phân tích bài toán đánh giá hiệu quả công việc.</w:t>
+      </w:r>
+    </w:p>
+    <w:p>
+      <w:r>
+        <w:t>Em chịu trách nhiệm về nội dung và việc trích dẫn tài liệu trong báo cáo.</w:t>
       </w:r>
     </w:p>
     <w:p>
@@ -752,6 +756,7 @@
     <w:p>
       <w:pPr>
         <w:pStyle w:val="umctrcnidung"/>
+        <w:pageBreakBefore/>
         <w:spacing w:before="240" w:after="180"/>
       </w:pPr>
       <w:r>
@@ -761,6 +766,7 @@
           <w:sz w:val="30"/>
           <w:szCs w:val="30"/>
         </w:rPr>
+        <w:lastRenderedPageBreak/>
         <w:t>MỤC LỤC</w:t>
       </w:r>
     </w:p>
@@ -786,7 +792,7 @@
       <w:r>
         <w:fldChar w:fldCharType="separate"/>
       </w:r>
-      <w:hyperlink w:anchor="_Toc242651549" w:history="1">
+      <w:hyperlink w:anchor="_Toc243090946" w:history="1">
         <w:r>
           <w:rPr>
             <w:rStyle w:val="Hyperlink"/>
@@ -814,7 +820,7 @@
             <w:noProof/>
             <w:webHidden/>
           </w:rPr>
-          <w:instrText xml:space="preserve"> PAGEREF _Toc242651549 \h </w:instrText>
+          <w:instrText xml:space="preserve"> PAGEREF _Toc243090946 \h </w:instrText>
         </w:r>
         <w:r>
           <w:rPr>
@@ -834,7 +840,7 @@
             <w:noProof/>
             <w:webHidden/>
           </w:rPr>
-          <w:t>6</w:t>
+          <w:t>9</w:t>
         </w:r>
         <w:r>
           <w:rPr>
@@ -858,7 +864,7 @@
           <w14:ligatures w14:val="standardContextual"/>
         </w:rPr>
       </w:pPr>
-      <w:hyperlink w:anchor="_Toc242651550" w:history="1">
+      <w:hyperlink w:anchor="_Toc243090947" w:history="1">
         <w:r>
           <w:rPr>
             <w:rStyle w:val="Hyperlink"/>
@@ -886,7 +892,7 @@
             <w:noProof/>
             <w:webHidden/>
           </w:rPr>
-          <w:instrText xml:space="preserve"> PAGEREF _Toc242651550 \h </w:instrText>
+          <w:instrText xml:space="preserve"> PAGEREF _Toc243090947 \h </w:instrText>
         </w:r>
         <w:r>
           <w:rPr>
@@ -906,7 +912,7 @@
             <w:noProof/>
             <w:webHidden/>
           </w:rPr>
-          <w:t>6</w:t>
+          <w:t>9</w:t>
         </w:r>
         <w:r>
           <w:rPr>
@@ -930,7 +936,7 @@
           <w14:ligatures w14:val="standardContextual"/>
         </w:rPr>
       </w:pPr>
-      <w:hyperlink w:anchor="_Toc242651551" w:history="1">
+      <w:hyperlink w:anchor="_Toc243090948" w:history="1">
         <w:r>
           <w:rPr>
             <w:rStyle w:val="Hyperlink"/>
@@ -958,7 +964,7 @@
             <w:noProof/>
             <w:webHidden/>
           </w:rPr>
-          <w:instrText xml:space="preserve"> PAGEREF _Toc242651551 \h </w:instrText>
+          <w:instrText xml:space="preserve"> PAGEREF _Toc243090948 \h </w:instrText>
         </w:r>
         <w:r>
           <w:rPr>
@@ -978,7 +984,7 @@
             <w:noProof/>
             <w:webHidden/>
           </w:rPr>
-          <w:t>6</w:t>
+          <w:t>9</w:t>
         </w:r>
         <w:r>
           <w:rPr>
@@ -1002,7 +1008,7 @@
           <w14:ligatures w14:val="standardContextual"/>
         </w:rPr>
       </w:pPr>
-      <w:hyperlink w:anchor="_Toc242651552" w:history="1">
+      <w:hyperlink w:anchor="_Toc243090949" w:history="1">
         <w:r>
           <w:rPr>
             <w:rStyle w:val="Hyperlink"/>
@@ -1030,7 +1036,7 @@
             <w:noProof/>
             <w:webHidden/>
           </w:rPr>
-          <w:instrText xml:space="preserve"> PAGEREF _Toc242651552 \h </w:instrText>
+          <w:instrText xml:space="preserve"> PAGEREF _Toc243090949 \h </w:instrText>
         </w:r>
         <w:r>
           <w:rPr>
@@ -1050,7 +1056,7 @@
             <w:noProof/>
             <w:webHidden/>
           </w:rPr>
-          <w:t>6</w:t>
+          <w:t>9</w:t>
         </w:r>
         <w:r>
           <w:rPr>
@@ -1074,7 +1080,7 @@
           <w14:ligatures w14:val="standardContextual"/>
         </w:rPr>
       </w:pPr>
-      <w:hyperlink w:anchor="_Toc242651553" w:history="1">
+      <w:hyperlink w:anchor="_Toc243090950" w:history="1">
         <w:r>
           <w:rPr>
             <w:rStyle w:val="Hyperlink"/>
@@ -1102,7 +1108,7 @@
             <w:noProof/>
             <w:webHidden/>
           </w:rPr>
-          <w:instrText xml:space="preserve"> PAGEREF _Toc242651553 \h </w:instrText>
+          <w:instrText xml:space="preserve"> PAGEREF _Toc243090950 \h </w:instrText>
         </w:r>
         <w:r>
           <w:rPr>
@@ -1122,7 +1128,7 @@
             <w:noProof/>
             <w:webHidden/>
           </w:rPr>
-          <w:t>7</w:t>
+          <w:t>9</w:t>
         </w:r>
         <w:r>
           <w:rPr>
@@ -1146,7 +1152,7 @@
           <w14:ligatures w14:val="standardContextual"/>
         </w:rPr>
       </w:pPr>
-      <w:hyperlink w:anchor="_Toc242651554" w:history="1">
+      <w:hyperlink w:anchor="_Toc243090951" w:history="1">
         <w:r>
           <w:rPr>
             <w:rStyle w:val="Hyperlink"/>
@@ -1174,7 +1180,7 @@
             <w:noProof/>
             <w:webHidden/>
           </w:rPr>
-          <w:instrText xml:space="preserve"> PAGEREF _Toc242651554 \h </w:instrText>
+          <w:instrText xml:space="preserve"> PAGEREF _Toc243090951 \h </w:instrText>
         </w:r>
         <w:r>
           <w:rPr>
@@ -1194,7 +1200,7 @@
             <w:noProof/>
             <w:webHidden/>
           </w:rPr>
-          <w:t>7</w:t>
+          <w:t>10</w:t>
         </w:r>
         <w:r>
           <w:rPr>
@@ -1218,7 +1224,7 @@
           <w14:ligatures w14:val="standardContextual"/>
         </w:rPr>
       </w:pPr>
-      <w:hyperlink w:anchor="_Toc242651555" w:history="1">
+      <w:hyperlink w:anchor="_Toc243090952" w:history="1">
         <w:r>
           <w:rPr>
             <w:rStyle w:val="Hyperlink"/>
@@ -1246,7 +1252,7 @@
             <w:noProof/>
             <w:webHidden/>
           </w:rPr>
-          <w:instrText xml:space="preserve"> PAGEREF _Toc242651555 \h </w:instrText>
+          <w:instrText xml:space="preserve"> PAGEREF _Toc243090952 \h </w:instrText>
         </w:r>
         <w:r>
           <w:rPr>
@@ -1266,7 +1272,7 @@
             <w:noProof/>
             <w:webHidden/>
           </w:rPr>
-          <w:t>7</w:t>
+          <w:t>11</w:t>
         </w:r>
         <w:r>
           <w:rPr>
@@ -1290,7 +1296,7 @@
           <w14:ligatures w14:val="standardContextual"/>
         </w:rPr>
       </w:pPr>
-      <w:hyperlink w:anchor="_Toc242651556" w:history="1">
+      <w:hyperlink w:anchor="_Toc243090953" w:history="1">
         <w:r>
           <w:rPr>
             <w:rStyle w:val="Hyperlink"/>
@@ -1318,7 +1324,7 @@
             <w:noProof/>
             <w:webHidden/>
           </w:rPr>
-          <w:instrText xml:space="preserve"> PAGEREF _Toc242651556 \h </w:instrText>
+          <w:instrText xml:space="preserve"> PAGEREF _Toc243090953 \h </w:instrText>
         </w:r>
         <w:r>
           <w:rPr>
@@ -1338,7 +1344,7 @@
             <w:noProof/>
             <w:webHidden/>
           </w:rPr>
-          <w:t>7</w:t>
+          <w:t>11</w:t>
         </w:r>
         <w:r>
           <w:rPr>
@@ -1362,7 +1368,7 @@
           <w14:ligatures w14:val="standardContextual"/>
         </w:rPr>
       </w:pPr>
-      <w:hyperlink w:anchor="_Toc242651557" w:history="1">
+      <w:hyperlink w:anchor="_Toc243090954" w:history="1">
         <w:r>
           <w:rPr>
             <w:rStyle w:val="Hyperlink"/>
@@ -1391,7 +1397,7 @@
             <w:noProof/>
             <w:webHidden/>
           </w:rPr>
-          <w:instrText xml:space="preserve"> PAGEREF _Toc242651557 \h </w:instrText>
+          <w:instrText xml:space="preserve"> PAGEREF _Toc243090954 \h </w:instrText>
         </w:r>
         <w:r>
           <w:rPr>
@@ -1411,7 +1417,7 @@
             <w:noProof/>
             <w:webHidden/>
           </w:rPr>
-          <w:t>7</w:t>
+          <w:t>11</w:t>
         </w:r>
         <w:r>
           <w:rPr>
@@ -1435,7 +1441,7 @@
           <w14:ligatures w14:val="standardContextual"/>
         </w:rPr>
       </w:pPr>
-      <w:hyperlink w:anchor="_Toc242651558" w:history="1">
+      <w:hyperlink w:anchor="_Toc243090955" w:history="1">
         <w:r>
           <w:rPr>
             <w:rStyle w:val="Hyperlink"/>
@@ -1462,7 +1468,7 @@
             <w:noProof/>
             <w:webHidden/>
           </w:rPr>
-          <w:instrText xml:space="preserve"> PAGEREF _Toc242651558 \h </w:instrText>
+          <w:instrText xml:space="preserve"> PAGEREF _Toc243090955 \h </w:instrText>
         </w:r>
         <w:r>
           <w:rPr>
@@ -1482,7 +1488,7 @@
             <w:noProof/>
             <w:webHidden/>
           </w:rPr>
-          <w:t>7</w:t>
+          <w:t>11</w:t>
         </w:r>
         <w:r>
           <w:rPr>
@@ -1506,7 +1512,7 @@
           <w14:ligatures w14:val="standardContextual"/>
         </w:rPr>
       </w:pPr>
-      <w:hyperlink w:anchor="_Toc242651559" w:history="1">
+      <w:hyperlink w:anchor="_Toc243090956" w:history="1">
         <w:r>
           <w:rPr>
             <w:rStyle w:val="Hyperlink"/>
@@ -1535,7 +1541,7 @@
             <w:noProof/>
             <w:webHidden/>
           </w:rPr>
-          <w:instrText xml:space="preserve"> PAGEREF _Toc242651559 \h </w:instrText>
+          <w:instrText xml:space="preserve"> PAGEREF _Toc243090956 \h </w:instrText>
         </w:r>
         <w:r>
           <w:rPr>
@@ -1555,7 +1561,7 @@
             <w:noProof/>
             <w:webHidden/>
           </w:rPr>
-          <w:t>8</w:t>
+          <w:t>11</w:t>
         </w:r>
         <w:r>
           <w:rPr>
@@ -1579,7 +1585,7 @@
           <w14:ligatures w14:val="standardContextual"/>
         </w:rPr>
       </w:pPr>
-      <w:hyperlink w:anchor="_Toc242651560" w:history="1">
+      <w:hyperlink w:anchor="_Toc243090957" w:history="1">
         <w:r>
           <w:rPr>
             <w:rStyle w:val="Hyperlink"/>
@@ -1607,7 +1613,7 @@
             <w:noProof/>
             <w:webHidden/>
           </w:rPr>
-          <w:instrText xml:space="preserve"> PAGEREF _Toc242651560 \h </w:instrText>
+          <w:instrText xml:space="preserve"> PAGEREF _Toc243090957 \h </w:instrText>
         </w:r>
         <w:r>
           <w:rPr>
@@ -1627,7 +1633,7 @@
             <w:noProof/>
             <w:webHidden/>
           </w:rPr>
-          <w:t>8</w:t>
+          <w:t>12</w:t>
         </w:r>
         <w:r>
           <w:rPr>
@@ -1651,7 +1657,7 @@
           <w14:ligatures w14:val="standardContextual"/>
         </w:rPr>
       </w:pPr>
-      <w:hyperlink w:anchor="_Toc242651561" w:history="1">
+      <w:hyperlink w:anchor="_Toc243090958" w:history="1">
         <w:r>
           <w:rPr>
             <w:rStyle w:val="Hyperlink"/>
@@ -1680,7 +1686,7 @@
             <w:noProof/>
             <w:webHidden/>
           </w:rPr>
-          <w:instrText xml:space="preserve"> PAGEREF _Toc242651561 \h </w:instrText>
+          <w:instrText xml:space="preserve"> PAGEREF _Toc243090958 \h </w:instrText>
         </w:r>
         <w:r>
           <w:rPr>
@@ -1700,7 +1706,7 @@
             <w:noProof/>
             <w:webHidden/>
           </w:rPr>
-          <w:t>8</w:t>
+          <w:t>12</w:t>
         </w:r>
         <w:r>
           <w:rPr>
@@ -1724,7 +1730,7 @@
           <w14:ligatures w14:val="standardContextual"/>
         </w:rPr>
       </w:pPr>
-      <w:hyperlink w:anchor="_Toc242651562" w:history="1">
+      <w:hyperlink w:anchor="_Toc243090959" w:history="1">
         <w:r>
           <w:rPr>
             <w:rStyle w:val="Hyperlink"/>
@@ -1753,7 +1759,7 @@
             <w:noProof/>
             <w:webHidden/>
           </w:rPr>
-          <w:instrText xml:space="preserve"> PAGEREF _Toc242651562 \h </w:instrText>
+          <w:instrText xml:space="preserve"> PAGEREF _Toc243090959 \h </w:instrText>
         </w:r>
         <w:r>
           <w:rPr>
@@ -1773,7 +1779,7 @@
             <w:noProof/>
             <w:webHidden/>
           </w:rPr>
-          <w:t>9</w:t>
+          <w:t>13</w:t>
         </w:r>
         <w:r>
           <w:rPr>
@@ -1797,7 +1803,7 @@
           <w14:ligatures w14:val="standardContextual"/>
         </w:rPr>
       </w:pPr>
-      <w:hyperlink w:anchor="_Toc242651563" w:history="1">
+      <w:hyperlink w:anchor="_Toc243090960" w:history="1">
         <w:r>
           <w:rPr>
             <w:rStyle w:val="Hyperlink"/>
@@ -1825,7 +1831,7 @@
             <w:noProof/>
             <w:webHidden/>
           </w:rPr>
-          <w:instrText xml:space="preserve"> PAGEREF _Toc242651563 \h </w:instrText>
+          <w:instrText xml:space="preserve"> PAGEREF _Toc243090960 \h </w:instrText>
         </w:r>
         <w:r>
           <w:rPr>
@@ -1845,7 +1851,7 @@
             <w:noProof/>
             <w:webHidden/>
           </w:rPr>
-          <w:t>9</w:t>
+          <w:t>13</w:t>
         </w:r>
         <w:r>
           <w:rPr>
@@ -1869,7 +1875,7 @@
           <w14:ligatures w14:val="standardContextual"/>
         </w:rPr>
       </w:pPr>
-      <w:hyperlink w:anchor="_Toc242651564" w:history="1">
+      <w:hyperlink w:anchor="_Toc243090961" w:history="1">
         <w:r>
           <w:rPr>
             <w:rStyle w:val="Hyperlink"/>
@@ -1897,7 +1903,7 @@
             <w:noProof/>
             <w:webHidden/>
           </w:rPr>
-          <w:instrText xml:space="preserve"> PAGEREF _Toc242651564 \h </w:instrText>
+          <w:instrText xml:space="preserve"> PAGEREF _Toc243090961 \h </w:instrText>
         </w:r>
         <w:r>
           <w:rPr>
@@ -1917,7 +1923,7 @@
             <w:noProof/>
             <w:webHidden/>
           </w:rPr>
-          <w:t>10</w:t>
+          <w:t>14</w:t>
         </w:r>
         <w:r>
           <w:rPr>
@@ -1941,7 +1947,7 @@
           <w14:ligatures w14:val="standardContextual"/>
         </w:rPr>
       </w:pPr>
-      <w:hyperlink w:anchor="_Toc242651565" w:history="1">
+      <w:hyperlink w:anchor="_Toc243090962" w:history="1">
         <w:r>
           <w:rPr>
             <w:rStyle w:val="Hyperlink"/>
@@ -1969,7 +1975,7 @@
             <w:noProof/>
             <w:webHidden/>
           </w:rPr>
-          <w:instrText xml:space="preserve"> PAGEREF _Toc242651565 \h </w:instrText>
+          <w:instrText xml:space="preserve"> PAGEREF _Toc243090962 \h </w:instrText>
         </w:r>
         <w:r>
           <w:rPr>
@@ -1989,7 +1995,7 @@
             <w:noProof/>
             <w:webHidden/>
           </w:rPr>
-          <w:t>11</w:t>
+          <w:t>15</w:t>
         </w:r>
         <w:r>
           <w:rPr>
@@ -2013,7 +2019,7 @@
           <w14:ligatures w14:val="standardContextual"/>
         </w:rPr>
       </w:pPr>
-      <w:hyperlink w:anchor="_Toc242651566" w:history="1">
+      <w:hyperlink w:anchor="_Toc243090963" w:history="1">
         <w:r>
           <w:rPr>
             <w:rStyle w:val="Hyperlink"/>
@@ -2042,7 +2048,7 @@
             <w:noProof/>
             <w:webHidden/>
           </w:rPr>
-          <w:instrText xml:space="preserve"> PAGEREF _Toc242651566 \h </w:instrText>
+          <w:instrText xml:space="preserve"> PAGEREF _Toc243090963 \h </w:instrText>
         </w:r>
         <w:r>
           <w:rPr>
@@ -2062,7 +2068,7 @@
             <w:noProof/>
             <w:webHidden/>
           </w:rPr>
-          <w:t>12</w:t>
+          <w:t>16</w:t>
         </w:r>
         <w:r>
           <w:rPr>
@@ -2086,7 +2092,7 @@
           <w14:ligatures w14:val="standardContextual"/>
         </w:rPr>
       </w:pPr>
-      <w:hyperlink w:anchor="_Toc242651567" w:history="1">
+      <w:hyperlink w:anchor="_Toc243090964" w:history="1">
         <w:r>
           <w:rPr>
             <w:rStyle w:val="Hyperlink"/>
@@ -2113,7 +2119,7 @@
             <w:noProof/>
             <w:webHidden/>
           </w:rPr>
-          <w:instrText xml:space="preserve"> PAGEREF _Toc242651567 \h </w:instrText>
+          <w:instrText xml:space="preserve"> PAGEREF _Toc243090964 \h </w:instrText>
         </w:r>
         <w:r>
           <w:rPr>
@@ -2133,7 +2139,7 @@
             <w:noProof/>
             <w:webHidden/>
           </w:rPr>
-          <w:t>12</w:t>
+          <w:t>16</w:t>
         </w:r>
         <w:r>
           <w:rPr>
@@ -2157,7 +2163,7 @@
           <w14:ligatures w14:val="standardContextual"/>
         </w:rPr>
       </w:pPr>
-      <w:hyperlink w:anchor="_Toc242651568" w:history="1">
+      <w:hyperlink w:anchor="_Toc243090965" w:history="1">
         <w:r>
           <w:rPr>
             <w:rStyle w:val="Hyperlink"/>
@@ -2185,7 +2191,7 @@
             <w:noProof/>
             <w:webHidden/>
           </w:rPr>
-          <w:instrText xml:space="preserve"> PAGEREF _Toc242651568 \h </w:instrText>
+          <w:instrText xml:space="preserve"> PAGEREF _Toc243090965 \h </w:instrText>
         </w:r>
         <w:r>
           <w:rPr>
@@ -2205,7 +2211,7 @@
             <w:noProof/>
             <w:webHidden/>
           </w:rPr>
-          <w:t>13</w:t>
+          <w:t>17</w:t>
         </w:r>
         <w:r>
           <w:rPr>
@@ -2229,7 +2235,7 @@
           <w14:ligatures w14:val="standardContextual"/>
         </w:rPr>
       </w:pPr>
-      <w:hyperlink w:anchor="_Toc242651569" w:history="1">
+      <w:hyperlink w:anchor="_Toc243090966" w:history="1">
         <w:r>
           <w:rPr>
             <w:rStyle w:val="Hyperlink"/>
@@ -2257,7 +2263,7 @@
             <w:noProof/>
             <w:webHidden/>
           </w:rPr>
-          <w:instrText xml:space="preserve"> PAGEREF _Toc242651569 \h </w:instrText>
+          <w:instrText xml:space="preserve"> PAGEREF _Toc243090966 \h </w:instrText>
         </w:r>
         <w:r>
           <w:rPr>
@@ -2277,7 +2283,7 @@
             <w:noProof/>
             <w:webHidden/>
           </w:rPr>
-          <w:t>13</w:t>
+          <w:t>18</w:t>
         </w:r>
         <w:r>
           <w:rPr>
@@ -2301,7 +2307,7 @@
           <w14:ligatures w14:val="standardContextual"/>
         </w:rPr>
       </w:pPr>
-      <w:hyperlink w:anchor="_Toc242651570" w:history="1">
+      <w:hyperlink w:anchor="_Toc243090967" w:history="1">
         <w:r>
           <w:rPr>
             <w:rStyle w:val="Hyperlink"/>
@@ -2329,7 +2335,7 @@
             <w:noProof/>
             <w:webHidden/>
           </w:rPr>
-          <w:instrText xml:space="preserve"> PAGEREF _Toc242651570 \h </w:instrText>
+          <w:instrText xml:space="preserve"> PAGEREF _Toc243090967 \h </w:instrText>
         </w:r>
         <w:r>
           <w:rPr>
@@ -2349,7 +2355,7 @@
             <w:noProof/>
             <w:webHidden/>
           </w:rPr>
-          <w:t>13</w:t>
+          <w:t>18</w:t>
         </w:r>
         <w:r>
           <w:rPr>
@@ -2373,7 +2379,7 @@
           <w14:ligatures w14:val="standardContextual"/>
         </w:rPr>
       </w:pPr>
-      <w:hyperlink w:anchor="_Toc242651571" w:history="1">
+      <w:hyperlink w:anchor="_Toc243090968" w:history="1">
         <w:r>
           <w:rPr>
             <w:rStyle w:val="Hyperlink"/>
@@ -2401,7 +2407,7 @@
             <w:noProof/>
             <w:webHidden/>
           </w:rPr>
-          <w:instrText xml:space="preserve"> PAGEREF _Toc242651571 \h </w:instrText>
+          <w:instrText xml:space="preserve"> PAGEREF _Toc243090968 \h </w:instrText>
         </w:r>
         <w:r>
           <w:rPr>
@@ -2421,7 +2427,7 @@
             <w:noProof/>
             <w:webHidden/>
           </w:rPr>
-          <w:t>14</w:t>
+          <w:t>18</w:t>
         </w:r>
         <w:r>
           <w:rPr>
@@ -2445,7 +2451,7 @@
           <w14:ligatures w14:val="standardContextual"/>
         </w:rPr>
       </w:pPr>
-      <w:hyperlink w:anchor="_Toc242651572" w:history="1">
+      <w:hyperlink w:anchor="_Toc243090969" w:history="1">
         <w:r>
           <w:rPr>
             <w:rStyle w:val="Hyperlink"/>
@@ -2473,7 +2479,7 @@
             <w:noProof/>
             <w:webHidden/>
           </w:rPr>
-          <w:instrText xml:space="preserve"> PAGEREF _Toc242651572 \h </w:instrText>
+          <w:instrText xml:space="preserve"> PAGEREF _Toc243090969 \h </w:instrText>
         </w:r>
         <w:r>
           <w:rPr>
@@ -2493,7 +2499,7 @@
             <w:noProof/>
             <w:webHidden/>
           </w:rPr>
-          <w:t>16</w:t>
+          <w:t>20</w:t>
         </w:r>
         <w:r>
           <w:rPr>
@@ -2517,7 +2523,7 @@
           <w14:ligatures w14:val="standardContextual"/>
         </w:rPr>
       </w:pPr>
-      <w:hyperlink w:anchor="_Toc242651573" w:history="1">
+      <w:hyperlink w:anchor="_Toc243090970" w:history="1">
         <w:r>
           <w:rPr>
             <w:rStyle w:val="Hyperlink"/>
@@ -2545,7 +2551,7 @@
             <w:noProof/>
             <w:webHidden/>
           </w:rPr>
-          <w:instrText xml:space="preserve"> PAGEREF _Toc242651573 \h </w:instrText>
+          <w:instrText xml:space="preserve"> PAGEREF _Toc243090970 \h </w:instrText>
         </w:r>
         <w:r>
           <w:rPr>
@@ -2565,7 +2571,7 @@
             <w:noProof/>
             <w:webHidden/>
           </w:rPr>
-          <w:t>19</w:t>
+          <w:t>23</w:t>
         </w:r>
         <w:r>
           <w:rPr>
@@ -2589,7 +2595,7 @@
           <w14:ligatures w14:val="standardContextual"/>
         </w:rPr>
       </w:pPr>
-      <w:hyperlink w:anchor="_Toc242651574" w:history="1">
+      <w:hyperlink w:anchor="_Toc243090971" w:history="1">
         <w:r>
           <w:rPr>
             <w:rStyle w:val="Hyperlink"/>
@@ -2616,7 +2622,7 @@
             <w:noProof/>
             <w:webHidden/>
           </w:rPr>
-          <w:instrText xml:space="preserve"> PAGEREF _Toc242651574 \h </w:instrText>
+          <w:instrText xml:space="preserve"> PAGEREF _Toc243090971 \h </w:instrText>
         </w:r>
         <w:r>
           <w:rPr>
@@ -2636,7 +2642,7 @@
             <w:noProof/>
             <w:webHidden/>
           </w:rPr>
-          <w:t>19</w:t>
+          <w:t>23</w:t>
         </w:r>
         <w:r>
           <w:rPr>
@@ -2660,7 +2666,7 @@
           <w14:ligatures w14:val="standardContextual"/>
         </w:rPr>
       </w:pPr>
-      <w:hyperlink w:anchor="_Toc242651575" w:history="1">
+      <w:hyperlink w:anchor="_Toc243090972" w:history="1">
         <w:r>
           <w:rPr>
             <w:rStyle w:val="Hyperlink"/>
@@ -2687,7 +2693,7 @@
             <w:noProof/>
             <w:webHidden/>
           </w:rPr>
-          <w:instrText xml:space="preserve"> PAGEREF _Toc242651575 \h </w:instrText>
+          <w:instrText xml:space="preserve"> PAGEREF _Toc243090972 \h </w:instrText>
         </w:r>
         <w:r>
           <w:rPr>
@@ -2707,7 +2713,7 @@
             <w:noProof/>
             <w:webHidden/>
           </w:rPr>
-          <w:t>22</w:t>
+          <w:t>26</w:t>
         </w:r>
         <w:r>
           <w:rPr>
@@ -2731,7 +2737,7 @@
           <w14:ligatures w14:val="standardContextual"/>
         </w:rPr>
       </w:pPr>
-      <w:hyperlink w:anchor="_Toc242651576" w:history="1">
+      <w:hyperlink w:anchor="_Toc243090973" w:history="1">
         <w:r>
           <w:rPr>
             <w:rStyle w:val="Hyperlink"/>
@@ -2759,7 +2765,7 @@
             <w:noProof/>
             <w:webHidden/>
           </w:rPr>
-          <w:instrText xml:space="preserve"> PAGEREF _Toc242651576 \h </w:instrText>
+          <w:instrText xml:space="preserve"> PAGEREF _Toc243090973 \h </w:instrText>
         </w:r>
         <w:r>
           <w:rPr>
@@ -2779,7 +2785,7 @@
             <w:noProof/>
             <w:webHidden/>
           </w:rPr>
-          <w:t>30</w:t>
+          <w:t>34</w:t>
         </w:r>
         <w:r>
           <w:rPr>
@@ -2803,7 +2809,7 @@
           <w14:ligatures w14:val="standardContextual"/>
         </w:rPr>
       </w:pPr>
-      <w:hyperlink w:anchor="_Toc242651577" w:history="1">
+      <w:hyperlink w:anchor="_Toc243090974" w:history="1">
         <w:r>
           <w:rPr>
             <w:rStyle w:val="Hyperlink"/>
@@ -2831,7 +2837,7 @@
             <w:noProof/>
             <w:webHidden/>
           </w:rPr>
-          <w:instrText xml:space="preserve"> PAGEREF _Toc242651577 \h </w:instrText>
+          <w:instrText xml:space="preserve"> PAGEREF _Toc243090974 \h </w:instrText>
         </w:r>
         <w:r>
           <w:rPr>
@@ -2851,7 +2857,7 @@
             <w:noProof/>
             <w:webHidden/>
           </w:rPr>
-          <w:t>31</w:t>
+          <w:t>35</w:t>
         </w:r>
         <w:r>
           <w:rPr>
@@ -2875,7 +2881,7 @@
           <w14:ligatures w14:val="standardContextual"/>
         </w:rPr>
       </w:pPr>
-      <w:hyperlink w:anchor="_Toc242651578" w:history="1">
+      <w:hyperlink w:anchor="_Toc243090975" w:history="1">
         <w:r>
           <w:rPr>
             <w:rStyle w:val="Hyperlink"/>
@@ -2903,7 +2909,7 @@
             <w:noProof/>
             <w:webHidden/>
           </w:rPr>
-          <w:instrText xml:space="preserve"> PAGEREF _Toc242651578 \h </w:instrText>
+          <w:instrText xml:space="preserve"> PAGEREF _Toc243090975 \h </w:instrText>
         </w:r>
         <w:r>
           <w:rPr>
@@ -2923,7 +2929,7 @@
             <w:noProof/>
             <w:webHidden/>
           </w:rPr>
-          <w:t>31</w:t>
+          <w:t>35</w:t>
         </w:r>
         <w:r>
           <w:rPr>
@@ -2947,7 +2953,7 @@
           <w14:ligatures w14:val="standardContextual"/>
         </w:rPr>
       </w:pPr>
-      <w:hyperlink w:anchor="_Toc242651579" w:history="1">
+      <w:hyperlink w:anchor="_Toc243090976" w:history="1">
         <w:r>
           <w:rPr>
             <w:rStyle w:val="Hyperlink"/>
@@ -2975,7 +2981,7 @@
             <w:noProof/>
             <w:webHidden/>
           </w:rPr>
-          <w:instrText xml:space="preserve"> PAGEREF _Toc242651579 \h </w:instrText>
+          <w:instrText xml:space="preserve"> PAGEREF _Toc243090976 \h </w:instrText>
         </w:r>
         <w:r>
           <w:rPr>
@@ -2995,7 +3001,7 @@
             <w:noProof/>
             <w:webHidden/>
           </w:rPr>
-          <w:t>31</w:t>
+          <w:t>35</w:t>
         </w:r>
         <w:r>
           <w:rPr>
@@ -3019,7 +3025,7 @@
           <w14:ligatures w14:val="standardContextual"/>
         </w:rPr>
       </w:pPr>
-      <w:hyperlink w:anchor="_Toc242651580" w:history="1">
+      <w:hyperlink w:anchor="_Toc243090977" w:history="1">
         <w:r>
           <w:rPr>
             <w:rStyle w:val="Hyperlink"/>
@@ -3048,7 +3054,7 @@
             <w:noProof/>
             <w:webHidden/>
           </w:rPr>
-          <w:instrText xml:space="preserve"> PAGEREF _Toc242651580 \h </w:instrText>
+          <w:instrText xml:space="preserve"> PAGEREF _Toc243090977 \h </w:instrText>
         </w:r>
         <w:r>
           <w:rPr>
@@ -3068,7 +3074,7 @@
             <w:noProof/>
             <w:webHidden/>
           </w:rPr>
-          <w:t>31</w:t>
+          <w:t>35</w:t>
         </w:r>
         <w:r>
           <w:rPr>
@@ -3092,7 +3098,7 @@
           <w14:ligatures w14:val="standardContextual"/>
         </w:rPr>
       </w:pPr>
-      <w:hyperlink w:anchor="_Toc242651581" w:history="1">
+      <w:hyperlink w:anchor="_Toc243090978" w:history="1">
         <w:r>
           <w:rPr>
             <w:rStyle w:val="Hyperlink"/>
@@ -3121,7 +3127,7 @@
             <w:noProof/>
             <w:webHidden/>
           </w:rPr>
-          <w:instrText xml:space="preserve"> PAGEREF _Toc242651581 \h </w:instrText>
+          <w:instrText xml:space="preserve"> PAGEREF _Toc243090978 \h </w:instrText>
         </w:r>
         <w:r>
           <w:rPr>
@@ -3141,7 +3147,7 @@
             <w:noProof/>
             <w:webHidden/>
           </w:rPr>
-          <w:t>32</w:t>
+          <w:t>36</w:t>
         </w:r>
         <w:r>
           <w:rPr>
@@ -3165,7 +3171,7 @@
           <w14:ligatures w14:val="standardContextual"/>
         </w:rPr>
       </w:pPr>
-      <w:hyperlink w:anchor="_Toc242651582" w:history="1">
+      <w:hyperlink w:anchor="_Toc243090979" w:history="1">
         <w:r>
           <w:rPr>
             <w:rStyle w:val="Hyperlink"/>
@@ -3193,7 +3199,7 @@
             <w:noProof/>
             <w:webHidden/>
           </w:rPr>
-          <w:instrText xml:space="preserve"> PAGEREF _Toc242651582 \h </w:instrText>
+          <w:instrText xml:space="preserve"> PAGEREF _Toc243090979 \h </w:instrText>
         </w:r>
         <w:r>
           <w:rPr>
@@ -3213,7 +3219,7 @@
             <w:noProof/>
             <w:webHidden/>
           </w:rPr>
-          <w:t>33</w:t>
+          <w:t>37</w:t>
         </w:r>
         <w:r>
           <w:rPr>
@@ -3237,7 +3243,7 @@
           <w14:ligatures w14:val="standardContextual"/>
         </w:rPr>
       </w:pPr>
-      <w:hyperlink w:anchor="_Toc242651583" w:history="1">
+      <w:hyperlink w:anchor="_Toc243090980" w:history="1">
         <w:r>
           <w:rPr>
             <w:rStyle w:val="Hyperlink"/>
@@ -3265,7 +3271,7 @@
             <w:noProof/>
             <w:webHidden/>
           </w:rPr>
-          <w:instrText xml:space="preserve"> PAGEREF _Toc242651583 \h </w:instrText>
+          <w:instrText xml:space="preserve"> PAGEREF _Toc243090980 \h </w:instrText>
         </w:r>
         <w:r>
           <w:rPr>
@@ -3285,7 +3291,7 @@
             <w:noProof/>
             <w:webHidden/>
           </w:rPr>
-          <w:t>33</w:t>
+          <w:t>37</w:t>
         </w:r>
         <w:r>
           <w:rPr>
@@ -3309,7 +3315,7 @@
           <w14:ligatures w14:val="standardContextual"/>
         </w:rPr>
       </w:pPr>
-      <w:hyperlink w:anchor="_Toc242651584" w:history="1">
+      <w:hyperlink w:anchor="_Toc243090981" w:history="1">
         <w:r>
           <w:rPr>
             <w:rStyle w:val="Hyperlink"/>
@@ -3337,7 +3343,7 @@
             <w:noProof/>
             <w:webHidden/>
           </w:rPr>
-          <w:instrText xml:space="preserve"> PAGEREF _Toc242651584 \h </w:instrText>
+          <w:instrText xml:space="preserve"> PAGEREF _Toc243090981 \h </w:instrText>
         </w:r>
         <w:r>
           <w:rPr>
@@ -3357,7 +3363,7 @@
             <w:noProof/>
             <w:webHidden/>
           </w:rPr>
-          <w:t>33</w:t>
+          <w:t>38</w:t>
         </w:r>
         <w:r>
           <w:rPr>
@@ -3381,7 +3387,7 @@
           <w14:ligatures w14:val="standardContextual"/>
         </w:rPr>
       </w:pPr>
-      <w:hyperlink w:anchor="_Toc242651585" w:history="1">
+      <w:hyperlink w:anchor="_Toc243090982" w:history="1">
         <w:r>
           <w:rPr>
             <w:rStyle w:val="Hyperlink"/>
@@ -3409,7 +3415,7 @@
             <w:noProof/>
             <w:webHidden/>
           </w:rPr>
-          <w:instrText xml:space="preserve"> PAGEREF _Toc242651585 \h </w:instrText>
+          <w:instrText xml:space="preserve"> PAGEREF _Toc243090982 \h </w:instrText>
         </w:r>
         <w:r>
           <w:rPr>
@@ -3429,7 +3435,7 @@
             <w:noProof/>
             <w:webHidden/>
           </w:rPr>
-          <w:t>34</w:t>
+          <w:t>38</w:t>
         </w:r>
         <w:r>
           <w:rPr>
@@ -3453,7 +3459,7 @@
           <w14:ligatures w14:val="standardContextual"/>
         </w:rPr>
       </w:pPr>
-      <w:hyperlink w:anchor="_Toc242651586" w:history="1">
+      <w:hyperlink w:anchor="_Toc243090983" w:history="1">
         <w:r>
           <w:rPr>
             <w:rStyle w:val="Hyperlink"/>
@@ -3481,7 +3487,7 @@
             <w:noProof/>
             <w:webHidden/>
           </w:rPr>
-          <w:instrText xml:space="preserve"> PAGEREF _Toc242651586 \h </w:instrText>
+          <w:instrText xml:space="preserve"> PAGEREF _Toc243090983 \h </w:instrText>
         </w:r>
         <w:r>
           <w:rPr>
@@ -3501,7 +3507,7 @@
             <w:noProof/>
             <w:webHidden/>
           </w:rPr>
-          <w:t>34</w:t>
+          <w:t>39</w:t>
         </w:r>
         <w:r>
           <w:rPr>
@@ -3523,8 +3529,8 @@
     <w:p>
       <w:pPr>
         <w:pStyle w:val="umctrcnidung"/>
-        <w:keepNext w:val="0"/>
         <w:keepLines w:val="0"/>
+        <w:pageBreakBefore/>
         <w:spacing w:before="240" w:after="180"/>
       </w:pPr>
       <w:r>
@@ -3534,6 +3540,7 @@
           <w:sz w:val="30"/>
           <w:szCs w:val="30"/>
         </w:rPr>
+        <w:lastRenderedPageBreak/>
         <w:t>DANH MỤC THUẬT NGỮ VÀ TỪ VIẾT TẮT CHUYÊN MÔN</w:t>
       </w:r>
     </w:p>
@@ -3566,6 +3573,7 @@
       </w:tblGrid>
       <w:tr>
         <w:trPr>
+          <w:cantSplit/>
           <w:tblHeader/>
         </w:trPr>
         <w:tc>
@@ -3669,6 +3677,9 @@
         </w:tc>
       </w:tr>
       <w:tr>
+        <w:trPr>
+          <w:cantSplit/>
+        </w:trPr>
         <w:tc>
           <w:tcPr>
             <w:tcW w:w="800" w:type="dxa"/>
@@ -3764,6 +3775,9 @@
         </w:tc>
       </w:tr>
       <w:tr>
+        <w:trPr>
+          <w:cantSplit/>
+        </w:trPr>
         <w:tc>
           <w:tcPr>
             <w:tcW w:w="800" w:type="dxa"/>
@@ -3859,6 +3873,9 @@
         </w:tc>
       </w:tr>
       <w:tr>
+        <w:trPr>
+          <w:cantSplit/>
+        </w:trPr>
         <w:tc>
           <w:tcPr>
             <w:tcW w:w="800" w:type="dxa"/>
@@ -3954,6 +3971,9 @@
         </w:tc>
       </w:tr>
       <w:tr>
+        <w:trPr>
+          <w:cantSplit/>
+        </w:trPr>
         <w:tc>
           <w:tcPr>
             <w:tcW w:w="800" w:type="dxa"/>
@@ -4049,6 +4069,9 @@
         </w:tc>
       </w:tr>
       <w:tr>
+        <w:trPr>
+          <w:cantSplit/>
+        </w:trPr>
         <w:tc>
           <w:tcPr>
             <w:tcW w:w="800" w:type="dxa"/>
@@ -4144,6 +4167,9 @@
         </w:tc>
       </w:tr>
       <w:tr>
+        <w:trPr>
+          <w:cantSplit/>
+        </w:trPr>
         <w:tc>
           <w:tcPr>
             <w:tcW w:w="800" w:type="dxa"/>
@@ -4239,6 +4265,9 @@
         </w:tc>
       </w:tr>
       <w:tr>
+        <w:trPr>
+          <w:cantSplit/>
+        </w:trPr>
         <w:tc>
           <w:tcPr>
             <w:tcW w:w="800" w:type="dxa"/>
@@ -4334,6 +4363,9 @@
         </w:tc>
       </w:tr>
       <w:tr>
+        <w:trPr>
+          <w:cantSplit/>
+        </w:trPr>
         <w:tc>
           <w:tcPr>
             <w:tcW w:w="800" w:type="dxa"/>
@@ -4429,6 +4461,9 @@
         </w:tc>
       </w:tr>
       <w:tr>
+        <w:trPr>
+          <w:cantSplit/>
+        </w:trPr>
         <w:tc>
           <w:tcPr>
             <w:tcW w:w="800" w:type="dxa"/>
@@ -4518,12 +4553,15 @@
                 <w:sz w:val="24"/>
                 <w:szCs w:val="22"/>
               </w:rPr>
-              <w:t>Hệ thống thông tin quản trị nguồn nhân lực tích hợp toàn diện trong tổ chức.</w:t>
+              <w:t>Hệ thống thông tin quản lý các nghiệp vụ nhân sự dùng chung trong tổ chức.</w:t>
             </w:r>
           </w:p>
         </w:tc>
       </w:tr>
       <w:tr>
+        <w:trPr>
+          <w:cantSplit/>
+        </w:trPr>
         <w:tc>
           <w:tcPr>
             <w:tcW w:w="800" w:type="dxa"/>
@@ -4619,6 +4657,9 @@
         </w:tc>
       </w:tr>
       <w:tr>
+        <w:trPr>
+          <w:cantSplit/>
+        </w:trPr>
         <w:tc>
           <w:tcPr>
             <w:tcW w:w="800" w:type="dxa"/>
@@ -4714,6 +4755,9 @@
         </w:tc>
       </w:tr>
       <w:tr>
+        <w:trPr>
+          <w:cantSplit/>
+        </w:trPr>
         <w:tc>
           <w:tcPr>
             <w:tcW w:w="800" w:type="dxa"/>
@@ -4809,6 +4853,9 @@
         </w:tc>
       </w:tr>
       <w:tr>
+        <w:trPr>
+          <w:cantSplit/>
+        </w:trPr>
         <w:tc>
           <w:tcPr>
             <w:tcW w:w="800" w:type="dxa"/>
@@ -4904,6 +4951,9 @@
         </w:tc>
       </w:tr>
       <w:tr>
+        <w:trPr>
+          <w:cantSplit/>
+        </w:trPr>
         <w:tc>
           <w:tcPr>
             <w:tcW w:w="800" w:type="dxa"/>
@@ -4993,12 +5043,15 @@
                 <w:sz w:val="24"/>
                 <w:szCs w:val="22"/>
               </w:rPr>
-              <w:t>Phương pháp quản trị mục tiêu và các kết quả then chốt định hướng chuyển dịch và đổi mới đột phá.</w:t>
+              <w:t>Phương pháp quản trị theo mục tiêu và các kết quả cần đạt trong kỳ.</w:t>
             </w:r>
           </w:p>
         </w:tc>
       </w:tr>
       <w:tr>
+        <w:trPr>
+          <w:cantSplit/>
+        </w:trPr>
         <w:tc>
           <w:tcPr>
             <w:tcW w:w="800" w:type="dxa"/>
@@ -5026,7 +5079,6 @@
                 <w:sz w:val="24"/>
                 <w:szCs w:val="22"/>
               </w:rPr>
-              <w:lastRenderedPageBreak/>
               <w:t>15</w:t>
             </w:r>
           </w:p>
@@ -5095,6 +5147,9 @@
         </w:tc>
       </w:tr>
       <w:tr>
+        <w:trPr>
+          <w:cantSplit/>
+        </w:trPr>
         <w:tc>
           <w:tcPr>
             <w:tcW w:w="800" w:type="dxa"/>
@@ -5190,6 +5245,9 @@
         </w:tc>
       </w:tr>
       <w:tr>
+        <w:trPr>
+          <w:cantSplit/>
+        </w:trPr>
         <w:tc>
           <w:tcPr>
             <w:tcW w:w="800" w:type="dxa"/>
@@ -5217,6 +5275,7 @@
                 <w:sz w:val="24"/>
                 <w:szCs w:val="22"/>
               </w:rPr>
+              <w:lastRenderedPageBreak/>
               <w:t>17</w:t>
             </w:r>
           </w:p>
@@ -5285,6 +5344,9 @@
         </w:tc>
       </w:tr>
       <w:tr>
+        <w:trPr>
+          <w:cantSplit/>
+        </w:trPr>
         <w:tc>
           <w:tcPr>
             <w:tcW w:w="800" w:type="dxa"/>
@@ -5380,6 +5442,9 @@
         </w:tc>
       </w:tr>
       <w:tr>
+        <w:trPr>
+          <w:cantSplit/>
+        </w:trPr>
         <w:tc>
           <w:tcPr>
             <w:tcW w:w="800" w:type="dxa"/>
@@ -5475,6 +5540,9 @@
         </w:tc>
       </w:tr>
       <w:tr>
+        <w:trPr>
+          <w:cantSplit/>
+        </w:trPr>
         <w:tc>
           <w:tcPr>
             <w:tcW w:w="800" w:type="dxa"/>
@@ -5570,6 +5638,9 @@
         </w:tc>
       </w:tr>
       <w:tr>
+        <w:trPr>
+          <w:cantSplit/>
+        </w:trPr>
         <w:tc>
           <w:tcPr>
             <w:tcW w:w="800" w:type="dxa"/>
@@ -5668,8 +5739,8 @@
     <w:p>
       <w:pPr>
         <w:pStyle w:val="umctrcnidung"/>
-        <w:keepNext w:val="0"/>
         <w:keepLines w:val="0"/>
+        <w:pageBreakBefore/>
         <w:spacing w:before="240" w:after="180"/>
       </w:pPr>
       <w:r>
@@ -5679,6 +5750,7 @@
           <w:sz w:val="30"/>
           <w:szCs w:val="30"/>
         </w:rPr>
+        <w:lastRenderedPageBreak/>
         <w:t>DANH MỤC BẢNG BIỂU VÀ SƠ ĐỒ</w:t>
       </w:r>
     </w:p>
@@ -5719,7 +5791,7 @@
       <w:r>
         <w:fldChar w:fldCharType="separate"/>
       </w:r>
-      <w:hyperlink w:anchor="_Toc242651587" w:history="1">
+      <w:hyperlink w:anchor="_Toc243090984" w:history="1">
         <w:r>
           <w:rPr>
             <w:rStyle w:val="Hyperlink"/>
@@ -5746,7 +5818,7 @@
             <w:noProof/>
             <w:webHidden/>
           </w:rPr>
-          <w:instrText xml:space="preserve"> PAGEREF _Toc242651587 \h </w:instrText>
+          <w:instrText xml:space="preserve"> PAGEREF _Toc243090984 \h </w:instrText>
         </w:r>
         <w:r>
           <w:rPr>
@@ -5766,7 +5838,7 @@
             <w:noProof/>
             <w:webHidden/>
           </w:rPr>
-          <w:t>7</w:t>
+          <w:t>11</w:t>
         </w:r>
         <w:r>
           <w:rPr>
@@ -5790,7 +5862,7 @@
           <w14:ligatures w14:val="standardContextual"/>
         </w:rPr>
       </w:pPr>
-      <w:hyperlink w:anchor="_Toc242651588" w:history="1">
+      <w:hyperlink w:anchor="_Toc243090985" w:history="1">
         <w:r>
           <w:rPr>
             <w:rStyle w:val="Hyperlink"/>
@@ -5817,7 +5889,7 @@
             <w:noProof/>
             <w:webHidden/>
           </w:rPr>
-          <w:instrText xml:space="preserve"> PAGEREF _Toc242651588 \h </w:instrText>
+          <w:instrText xml:space="preserve"> PAGEREF _Toc243090985 \h </w:instrText>
         </w:r>
         <w:r>
           <w:rPr>
@@ -5837,7 +5909,7 @@
             <w:noProof/>
             <w:webHidden/>
           </w:rPr>
-          <w:t>9</w:t>
+          <w:t>13</w:t>
         </w:r>
         <w:r>
           <w:rPr>
@@ -5861,7 +5933,7 @@
           <w14:ligatures w14:val="standardContextual"/>
         </w:rPr>
       </w:pPr>
-      <w:hyperlink w:anchor="_Toc242651589" w:history="1">
+      <w:hyperlink w:anchor="_Toc243090986" w:history="1">
         <w:r>
           <w:rPr>
             <w:rStyle w:val="Hyperlink"/>
@@ -5888,7 +5960,7 @@
             <w:noProof/>
             <w:webHidden/>
           </w:rPr>
-          <w:instrText xml:space="preserve"> PAGEREF _Toc242651589 \h </w:instrText>
+          <w:instrText xml:space="preserve"> PAGEREF _Toc243090986 \h </w:instrText>
         </w:r>
         <w:r>
           <w:rPr>
@@ -5908,7 +5980,7 @@
             <w:noProof/>
             <w:webHidden/>
           </w:rPr>
-          <w:t>12</w:t>
+          <w:t>16</w:t>
         </w:r>
         <w:r>
           <w:rPr>
@@ -5932,7 +6004,7 @@
           <w14:ligatures w14:val="standardContextual"/>
         </w:rPr>
       </w:pPr>
-      <w:hyperlink w:anchor="_Toc242651590" w:history="1">
+      <w:hyperlink w:anchor="_Toc243090987" w:history="1">
         <w:r>
           <w:rPr>
             <w:rStyle w:val="Hyperlink"/>
@@ -5959,7 +6031,7 @@
             <w:noProof/>
             <w:webHidden/>
           </w:rPr>
-          <w:instrText xml:space="preserve"> PAGEREF _Toc242651590 \h </w:instrText>
+          <w:instrText xml:space="preserve"> PAGEREF _Toc243090987 \h </w:instrText>
         </w:r>
         <w:r>
           <w:rPr>
@@ -5979,7 +6051,7 @@
             <w:noProof/>
             <w:webHidden/>
           </w:rPr>
-          <w:t>12</w:t>
+          <w:t>16</w:t>
         </w:r>
         <w:r>
           <w:rPr>
@@ -6003,7 +6075,7 @@
           <w14:ligatures w14:val="standardContextual"/>
         </w:rPr>
       </w:pPr>
-      <w:hyperlink w:anchor="_Toc242651591" w:history="1">
+      <w:hyperlink w:anchor="_Toc243090988" w:history="1">
         <w:r>
           <w:rPr>
             <w:rStyle w:val="Hyperlink"/>
@@ -6030,7 +6102,7 @@
             <w:noProof/>
             <w:webHidden/>
           </w:rPr>
-          <w:instrText xml:space="preserve"> PAGEREF _Toc242651591 \h </w:instrText>
+          <w:instrText xml:space="preserve"> PAGEREF _Toc243090988 \h </w:instrText>
         </w:r>
         <w:r>
           <w:rPr>
@@ -6050,7 +6122,7 @@
             <w:noProof/>
             <w:webHidden/>
           </w:rPr>
-          <w:t>19</w:t>
+          <w:t>23</w:t>
         </w:r>
         <w:r>
           <w:rPr>
@@ -6074,7 +6146,7 @@
           <w14:ligatures w14:val="standardContextual"/>
         </w:rPr>
       </w:pPr>
-      <w:hyperlink w:anchor="_Toc242651592" w:history="1">
+      <w:hyperlink w:anchor="_Toc243090989" w:history="1">
         <w:r>
           <w:rPr>
             <w:rStyle w:val="Hyperlink"/>
@@ -6101,7 +6173,7 @@
             <w:noProof/>
             <w:webHidden/>
           </w:rPr>
-          <w:instrText xml:space="preserve"> PAGEREF _Toc242651592 \h </w:instrText>
+          <w:instrText xml:space="preserve"> PAGEREF _Toc243090989 \h </w:instrText>
         </w:r>
         <w:r>
           <w:rPr>
@@ -6121,7 +6193,7 @@
             <w:noProof/>
             <w:webHidden/>
           </w:rPr>
-          <w:t>23</w:t>
+          <w:t>27</w:t>
         </w:r>
         <w:r>
           <w:rPr>
@@ -6145,7 +6217,7 @@
           <w14:ligatures w14:val="standardContextual"/>
         </w:rPr>
       </w:pPr>
-      <w:hyperlink w:anchor="_Toc242651593" w:history="1">
+      <w:hyperlink w:anchor="_Toc243090990" w:history="1">
         <w:r>
           <w:rPr>
             <w:rStyle w:val="Hyperlink"/>
@@ -6172,7 +6244,7 @@
             <w:noProof/>
             <w:webHidden/>
           </w:rPr>
-          <w:instrText xml:space="preserve"> PAGEREF _Toc242651593 \h </w:instrText>
+          <w:instrText xml:space="preserve"> PAGEREF _Toc243090990 \h </w:instrText>
         </w:r>
         <w:r>
           <w:rPr>
@@ -6192,7 +6264,7 @@
             <w:noProof/>
             <w:webHidden/>
           </w:rPr>
-          <w:t>31</w:t>
+          <w:t>35</w:t>
         </w:r>
         <w:r>
           <w:rPr>
@@ -6216,7 +6288,7 @@
           <w14:ligatures w14:val="standardContextual"/>
         </w:rPr>
       </w:pPr>
-      <w:hyperlink w:anchor="_Toc242651594" w:history="1">
+      <w:hyperlink w:anchor="_Toc243090991" w:history="1">
         <w:r>
           <w:rPr>
             <w:rStyle w:val="Hyperlink"/>
@@ -6243,7 +6315,7 @@
             <w:noProof/>
             <w:webHidden/>
           </w:rPr>
-          <w:instrText xml:space="preserve"> PAGEREF _Toc242651594 \h </w:instrText>
+          <w:instrText xml:space="preserve"> PAGEREF _Toc243090991 \h </w:instrText>
         </w:r>
         <w:r>
           <w:rPr>
@@ -6263,7 +6335,7 @@
             <w:noProof/>
             <w:webHidden/>
           </w:rPr>
-          <w:t>32</w:t>
+          <w:t>36</w:t>
         </w:r>
         <w:r>
           <w:rPr>
@@ -6317,7 +6389,7 @@
       <w:r>
         <w:fldChar w:fldCharType="separate"/>
       </w:r>
-      <w:hyperlink w:anchor="_Toc242651595" w:history="1">
+      <w:hyperlink w:anchor="_Toc243090992" w:history="1">
         <w:r>
           <w:rPr>
             <w:rStyle w:val="Hyperlink"/>
@@ -6344,7 +6416,7 @@
             <w:noProof/>
             <w:webHidden/>
           </w:rPr>
-          <w:instrText xml:space="preserve"> PAGEREF _Toc242651595 \h </w:instrText>
+          <w:instrText xml:space="preserve"> PAGEREF _Toc243090992 \h </w:instrText>
         </w:r>
         <w:r>
           <w:rPr>
@@ -6364,7 +6436,7 @@
             <w:noProof/>
             <w:webHidden/>
           </w:rPr>
-          <w:t>14</w:t>
+          <w:t>18</w:t>
         </w:r>
         <w:r>
           <w:rPr>
@@ -6388,7 +6460,7 @@
           <w14:ligatures w14:val="standardContextual"/>
         </w:rPr>
       </w:pPr>
-      <w:hyperlink w:anchor="_Toc242651596" w:history="1">
+      <w:hyperlink w:anchor="_Toc243090993" w:history="1">
         <w:r>
           <w:rPr>
             <w:rStyle w:val="Hyperlink"/>
@@ -6415,7 +6487,7 @@
             <w:noProof/>
             <w:webHidden/>
           </w:rPr>
-          <w:instrText xml:space="preserve"> PAGEREF _Toc242651596 \h </w:instrText>
+          <w:instrText xml:space="preserve"> PAGEREF _Toc243090993 \h </w:instrText>
         </w:r>
         <w:r>
           <w:rPr>
@@ -6435,7 +6507,7 @@
             <w:noProof/>
             <w:webHidden/>
           </w:rPr>
-          <w:t>14</w:t>
+          <w:t>19</w:t>
         </w:r>
         <w:r>
           <w:rPr>
@@ -6459,7 +6531,7 @@
           <w14:ligatures w14:val="standardContextual"/>
         </w:rPr>
       </w:pPr>
-      <w:hyperlink w:anchor="_Toc242651597" w:history="1">
+      <w:hyperlink w:anchor="_Toc243090994" w:history="1">
         <w:r>
           <w:rPr>
             <w:rStyle w:val="Hyperlink"/>
@@ -6486,7 +6558,7 @@
             <w:noProof/>
             <w:webHidden/>
           </w:rPr>
-          <w:instrText xml:space="preserve"> PAGEREF _Toc242651597 \h </w:instrText>
+          <w:instrText xml:space="preserve"> PAGEREF _Toc243090994 \h </w:instrText>
         </w:r>
         <w:r>
           <w:rPr>
@@ -6506,7 +6578,7 @@
             <w:noProof/>
             <w:webHidden/>
           </w:rPr>
-          <w:t>15</w:t>
+          <w:t>19</w:t>
         </w:r>
         <w:r>
           <w:rPr>
@@ -6530,7 +6602,7 @@
           <w14:ligatures w14:val="standardContextual"/>
         </w:rPr>
       </w:pPr>
-      <w:hyperlink w:anchor="_Toc242651598" w:history="1">
+      <w:hyperlink w:anchor="_Toc243090995" w:history="1">
         <w:r>
           <w:rPr>
             <w:rStyle w:val="Hyperlink"/>
@@ -6557,7 +6629,7 @@
             <w:noProof/>
             <w:webHidden/>
           </w:rPr>
-          <w:instrText xml:space="preserve"> PAGEREF _Toc242651598 \h </w:instrText>
+          <w:instrText xml:space="preserve"> PAGEREF _Toc243090995 \h </w:instrText>
         </w:r>
         <w:r>
           <w:rPr>
@@ -6577,7 +6649,7 @@
             <w:noProof/>
             <w:webHidden/>
           </w:rPr>
-          <w:t>16</w:t>
+          <w:t>20</w:t>
         </w:r>
         <w:r>
           <w:rPr>
@@ -6601,7 +6673,7 @@
           <w14:ligatures w14:val="standardContextual"/>
         </w:rPr>
       </w:pPr>
-      <w:hyperlink w:anchor="_Toc242651599" w:history="1">
+      <w:hyperlink w:anchor="_Toc243090996" w:history="1">
         <w:r>
           <w:rPr>
             <w:rStyle w:val="Hyperlink"/>
@@ -6628,7 +6700,7 @@
             <w:noProof/>
             <w:webHidden/>
           </w:rPr>
-          <w:instrText xml:space="preserve"> PAGEREF _Toc242651599 \h </w:instrText>
+          <w:instrText xml:space="preserve"> PAGEREF _Toc243090996 \h </w:instrText>
         </w:r>
         <w:r>
           <w:rPr>
@@ -6648,7 +6720,7 @@
             <w:noProof/>
             <w:webHidden/>
           </w:rPr>
-          <w:t>17</w:t>
+          <w:t>21</w:t>
         </w:r>
         <w:r>
           <w:rPr>
@@ -6672,7 +6744,7 @@
           <w14:ligatures w14:val="standardContextual"/>
         </w:rPr>
       </w:pPr>
-      <w:hyperlink w:anchor="_Toc242651600" w:history="1">
+      <w:hyperlink w:anchor="_Toc243090997" w:history="1">
         <w:r>
           <w:rPr>
             <w:rStyle w:val="Hyperlink"/>
@@ -6699,7 +6771,7 @@
             <w:noProof/>
             <w:webHidden/>
           </w:rPr>
-          <w:instrText xml:space="preserve"> PAGEREF _Toc242651600 \h </w:instrText>
+          <w:instrText xml:space="preserve"> PAGEREF _Toc243090997 \h </w:instrText>
         </w:r>
         <w:r>
           <w:rPr>
@@ -6719,7 +6791,7 @@
             <w:noProof/>
             <w:webHidden/>
           </w:rPr>
-          <w:t>18</w:t>
+          <w:t>22</w:t>
         </w:r>
         <w:r>
           <w:rPr>
@@ -6743,7 +6815,7 @@
           <w14:ligatures w14:val="standardContextual"/>
         </w:rPr>
       </w:pPr>
-      <w:hyperlink w:anchor="_Toc242651601" w:history="1">
+      <w:hyperlink w:anchor="_Toc243090998" w:history="1">
         <w:r>
           <w:rPr>
             <w:rStyle w:val="Hyperlink"/>
@@ -6770,7 +6842,7 @@
             <w:noProof/>
             <w:webHidden/>
           </w:rPr>
-          <w:instrText xml:space="preserve"> PAGEREF _Toc242651601 \h </w:instrText>
+          <w:instrText xml:space="preserve"> PAGEREF _Toc243090998 \h </w:instrText>
         </w:r>
         <w:r>
           <w:rPr>
@@ -6790,7 +6862,7 @@
             <w:noProof/>
             <w:webHidden/>
           </w:rPr>
-          <w:t>18</w:t>
+          <w:t>22</w:t>
         </w:r>
         <w:r>
           <w:rPr>
@@ -6814,7 +6886,7 @@
           <w14:ligatures w14:val="standardContextual"/>
         </w:rPr>
       </w:pPr>
-      <w:hyperlink w:anchor="_Toc242651602" w:history="1">
+      <w:hyperlink w:anchor="_Toc243090999" w:history="1">
         <w:r>
           <w:rPr>
             <w:rStyle w:val="Hyperlink"/>
@@ -6841,7 +6913,7 @@
             <w:noProof/>
             <w:webHidden/>
           </w:rPr>
-          <w:instrText xml:space="preserve"> PAGEREF _Toc242651602 \h </w:instrText>
+          <w:instrText xml:space="preserve"> PAGEREF _Toc243090999 \h </w:instrText>
         </w:r>
         <w:r>
           <w:rPr>
@@ -6861,7 +6933,7 @@
             <w:noProof/>
             <w:webHidden/>
           </w:rPr>
-          <w:t>19</w:t>
+          <w:t>23</w:t>
         </w:r>
         <w:r>
           <w:rPr>
@@ -6885,7 +6957,7 @@
           <w14:ligatures w14:val="standardContextual"/>
         </w:rPr>
       </w:pPr>
-      <w:hyperlink w:anchor="_Toc242651603" w:history="1">
+      <w:hyperlink w:anchor="_Toc243091000" w:history="1">
         <w:r>
           <w:rPr>
             <w:rStyle w:val="Hyperlink"/>
@@ -6912,7 +6984,7 @@
             <w:noProof/>
             <w:webHidden/>
           </w:rPr>
-          <w:instrText xml:space="preserve"> PAGEREF _Toc242651603 \h </w:instrText>
+          <w:instrText xml:space="preserve"> PAGEREF _Toc243091000 \h </w:instrText>
         </w:r>
         <w:r>
           <w:rPr>
@@ -6932,7 +7004,7 @@
             <w:noProof/>
             <w:webHidden/>
           </w:rPr>
-          <w:t>22</w:t>
+          <w:t>26</w:t>
         </w:r>
         <w:r>
           <w:rPr>
@@ -6956,7 +7028,7 @@
           <w14:ligatures w14:val="standardContextual"/>
         </w:rPr>
       </w:pPr>
-      <w:hyperlink w:anchor="_Toc242651604" w:history="1">
+      <w:hyperlink w:anchor="_Toc243091001" w:history="1">
         <w:r>
           <w:rPr>
             <w:rStyle w:val="Hyperlink"/>
@@ -6983,7 +7055,7 @@
             <w:noProof/>
             <w:webHidden/>
           </w:rPr>
-          <w:instrText xml:space="preserve"> PAGEREF _Toc242651604 \h </w:instrText>
+          <w:instrText xml:space="preserve"> PAGEREF _Toc243091001 \h </w:instrText>
         </w:r>
         <w:r>
           <w:rPr>
@@ -7003,7 +7075,7 @@
             <w:noProof/>
             <w:webHidden/>
           </w:rPr>
-          <w:t>25</w:t>
+          <w:t>29</w:t>
         </w:r>
         <w:r>
           <w:rPr>
@@ -7027,7 +7099,7 @@
           <w14:ligatures w14:val="standardContextual"/>
         </w:rPr>
       </w:pPr>
-      <w:hyperlink w:anchor="_Toc242651605" w:history="1">
+      <w:hyperlink w:anchor="_Toc243091002" w:history="1">
         <w:r>
           <w:rPr>
             <w:rStyle w:val="Hyperlink"/>
@@ -7054,7 +7126,7 @@
             <w:noProof/>
             <w:webHidden/>
           </w:rPr>
-          <w:instrText xml:space="preserve"> PAGEREF _Toc242651605 \h </w:instrText>
+          <w:instrText xml:space="preserve"> PAGEREF _Toc243091002 \h </w:instrText>
         </w:r>
         <w:r>
           <w:rPr>
@@ -7074,7 +7146,7 @@
             <w:noProof/>
             <w:webHidden/>
           </w:rPr>
-          <w:t>26</w:t>
+          <w:t>30</w:t>
         </w:r>
         <w:r>
           <w:rPr>
@@ -7098,7 +7170,7 @@
           <w14:ligatures w14:val="standardContextual"/>
         </w:rPr>
       </w:pPr>
-      <w:hyperlink w:anchor="_Toc242651606" w:history="1">
+      <w:hyperlink w:anchor="_Toc243091003" w:history="1">
         <w:r>
           <w:rPr>
             <w:rStyle w:val="Hyperlink"/>
@@ -7125,7 +7197,7 @@
             <w:noProof/>
             <w:webHidden/>
           </w:rPr>
-          <w:instrText xml:space="preserve"> PAGEREF _Toc242651606 \h </w:instrText>
+          <w:instrText xml:space="preserve"> PAGEREF _Toc243091003 \h </w:instrText>
         </w:r>
         <w:r>
           <w:rPr>
@@ -7145,7 +7217,7 @@
             <w:noProof/>
             <w:webHidden/>
           </w:rPr>
-          <w:t>27</w:t>
+          <w:t>31</w:t>
         </w:r>
         <w:r>
           <w:rPr>
@@ -7169,7 +7241,7 @@
           <w14:ligatures w14:val="standardContextual"/>
         </w:rPr>
       </w:pPr>
-      <w:hyperlink w:anchor="_Toc242651607" w:history="1">
+      <w:hyperlink w:anchor="_Toc243091004" w:history="1">
         <w:r>
           <w:rPr>
             <w:rStyle w:val="Hyperlink"/>
@@ -7196,7 +7268,7 @@
             <w:noProof/>
             <w:webHidden/>
           </w:rPr>
-          <w:instrText xml:space="preserve"> PAGEREF _Toc242651607 \h </w:instrText>
+          <w:instrText xml:space="preserve"> PAGEREF _Toc243091004 \h </w:instrText>
         </w:r>
         <w:r>
           <w:rPr>
@@ -7216,7 +7288,7 @@
             <w:noProof/>
             <w:webHidden/>
           </w:rPr>
-          <w:t>28</w:t>
+          <w:t>32</w:t>
         </w:r>
         <w:r>
           <w:rPr>
@@ -7240,7 +7312,7 @@
           <w14:ligatures w14:val="standardContextual"/>
         </w:rPr>
       </w:pPr>
-      <w:hyperlink w:anchor="_Toc242651608" w:history="1">
+      <w:hyperlink w:anchor="_Toc243091005" w:history="1">
         <w:r>
           <w:rPr>
             <w:rStyle w:val="Hyperlink"/>
@@ -7267,7 +7339,7 @@
             <w:noProof/>
             <w:webHidden/>
           </w:rPr>
-          <w:instrText xml:space="preserve"> PAGEREF _Toc242651608 \h </w:instrText>
+          <w:instrText xml:space="preserve"> PAGEREF _Toc243091005 \h </w:instrText>
         </w:r>
         <w:r>
           <w:rPr>
@@ -7287,7 +7359,7 @@
             <w:noProof/>
             <w:webHidden/>
           </w:rPr>
-          <w:t>29</w:t>
+          <w:t>33</w:t>
         </w:r>
         <w:r>
           <w:rPr>
@@ -7311,7 +7383,7 @@
           <w14:ligatures w14:val="standardContextual"/>
         </w:rPr>
       </w:pPr>
-      <w:hyperlink w:anchor="_Toc242651609" w:history="1">
+      <w:hyperlink w:anchor="_Toc243091006" w:history="1">
         <w:r>
           <w:rPr>
             <w:rStyle w:val="Hyperlink"/>
@@ -7338,7 +7410,7 @@
             <w:noProof/>
             <w:webHidden/>
           </w:rPr>
-          <w:instrText xml:space="preserve"> PAGEREF _Toc242651609 \h </w:instrText>
+          <w:instrText xml:space="preserve"> PAGEREF _Toc243091006 \h </w:instrText>
         </w:r>
         <w:r>
           <w:rPr>
@@ -7358,7 +7430,7 @@
             <w:noProof/>
             <w:webHidden/>
           </w:rPr>
-          <w:t>30</w:t>
+          <w:t>34</w:t>
         </w:r>
         <w:r>
           <w:rPr>
@@ -7383,7 +7455,7 @@
         <w:pageBreakBefore/>
         <w:spacing w:before="240" w:after="180"/>
       </w:pPr>
-      <w:bookmarkStart w:id="0" w:name="_Toc242651549"/>
+      <w:bookmarkStart w:id="0" w:name="_Toc243090946"/>
       <w:r>
         <w:rPr>
           <w:bCs/>
@@ -7401,7 +7473,7 @@
         <w:pStyle w:val="mc1"/>
         <w:spacing w:before="240" w:after="100"/>
       </w:pPr>
-      <w:bookmarkStart w:id="1" w:name="_Toc242651550"/>
+      <w:bookmarkStart w:id="1" w:name="_Toc243090947"/>
       <w:r>
         <w:rPr>
           <w:bCs/>
@@ -7420,7 +7492,7 @@
     </w:p>
     <w:p>
       <w:r>
-        <w:t>Khu vực công áp dụng khung riêng theo đối tượng: công chức tại cơ quan hành chính theo Nghị định 335/2025/NĐ-CP (hiệu lực từ 01/01/2026) và viên chức tại đơn vị sự nghiệp công lập theo Nghị định 233/2026/NĐ-CP (hiệu lực từ 01/07/2026). Hai nghị định quy định khung điểm, điều kiện xếp loại và tỷ lệ xuất sắc trong phạm vi công vụ; các tỷ lệ này tuyệt đối không áp vào doanh nghiệp. Kết luận 14-KL/TW không tự tạo điểm cộng hay miễn trừ tự động; tình huống cụ thể phải do cấp có thẩm quyền xem xét.</w:t>
+        <w:t>Khu vực công áp dụng khung riêng theo đối tượng: công chức tại cơ quan hành chính theo Nghị định 335/2025/NĐ-CP (hiệu lực từ 01/01/2026) và viên chức tại đơn vị sự nghiệp công lập theo Nghị định 233/2026/NĐ-CP (hiệu lực từ 01/07/2026). Hai nghị định quy định khung điểm, điều kiện xếp loại và tỷ lệ xuất sắc trong phạm vi công vụ; các tỷ lệ này không áp dụng cho doanh nghiệp. Kết luận 14-KL/TW không tự tạo điểm cộng hay miễn trừ tự động; tình huống cụ thể phải do cấp có thẩm quyền xem xét.</w:t>
       </w:r>
     </w:p>
     <w:p>
@@ -7433,7 +7505,7 @@
         <w:pStyle w:val="mc1"/>
         <w:spacing w:before="240" w:after="100"/>
       </w:pPr>
-      <w:bookmarkStart w:id="2" w:name="_Toc242651551"/>
+      <w:bookmarkStart w:id="2" w:name="_Toc243090948"/>
       <w:r>
         <w:rPr>
           <w:bCs/>
@@ -7452,7 +7524,7 @@
     </w:p>
     <w:p>
       <w:r>
-        <w:t>Đề tài hệ thống hóa BSC, OKR, PDCA và 3P để làm cơ sở xây dựng chỉ tiêu KPI cho doanh nghiệp; đồng thời cập nhật căn cứ đánh giá công chức theo Nghị định 335/2025/NĐ-CP và viên chức theo Nghị định 233/2026/NĐ-CP. Nội dung nghiên cứu còn khảo sát yêu cầu nghiệp vụ của hai nhóm tổ chức, mô hình hóa hệ thống bằng UML, đề xuất kiến trúc nhiều tầng và mô hình dữ liệu 26 bảng, cùng kế hoạch triển khai 16 tuần, quản trị rủi ro và lộ trình ứng dụng AI.</w:t>
+        <w:t>Đề tài hệ thống hóa BSC, OKR, PDCA và 3P để làm cơ sở xây dựng chỉ tiêu KPI cho doanh nghiệp; đồng thời cập nhật căn cứ đánh giá công chức theo Nghị định 335/2025/NĐ-CP và viên chức theo Nghị định 233/2026/NĐ-CP. Nội dung nghiên cứu còn khảo sát yêu cầu nghiệp vụ của hai nhóm tổ chức, mô hình hóa hệ thống bằng UML, đề xuất kiến trúc nhiều tầng và mô hình dữ liệu 24 bảng, cùng kế hoạch triển khai 16 tuần, quản trị rủi ro và lộ trình ứng dụng AI.</w:t>
       </w:r>
     </w:p>
     <w:p>
@@ -7460,7 +7532,7 @@
         <w:pStyle w:val="mc1"/>
         <w:spacing w:before="240" w:after="100"/>
       </w:pPr>
-      <w:bookmarkStart w:id="3" w:name="_Toc242651552"/>
+      <w:bookmarkStart w:id="3" w:name="_Toc243090949"/>
       <w:r>
         <w:rPr>
           <w:bCs/>
@@ -7479,7 +7551,7 @@
     </w:p>
     <w:p>
       <w:r>
-        <w:t>Phạm vi nghiên cứu gồm hai bối cảnh được tách riêng: doanh nghiệp sản xuất - kinh doanh, nơi ERP/MES/IoT có thể là nguồn tích hợp nếu doanh nghiệp có và cấp quyền kết nối; cơ quan hành chính/đơn vị sự nghiệp công lập, nơi dữ liệu nhiệm vụ và phân loại tuân theo chế độ công chức hoặc viên chức tương ứng. Ví dụ KPI, tên tổ chức, số liệu, bảng biểu, yêu cầu phi chức năng, sơ đồ UML, kiến trúc và CSDL 26 bảng trong báo cáo là mockup/giả định phân tích, không phải dữ liệu khảo sát hay kết quả kiểm thử đã xác minh. HRMS đang đối chiếu là ứng dụng web Next.js, API NestJS, PostgreSQL/Prisma với phân hệ chu kỳ, KRA, minh chứng, điểm và phản hồi doanh nghiệp; không có sản phẩm KPI tách biệt hay các tích hợp ERP/MES/IoT/Kafka/Redis/MinIO/DVC nêu trong phương án này.</w:t>
+        <w:t>Báo cáo phân biệt hai bối cảnh: đánh giá KPI tại doanh nghiệp và đánh giá công chức, viên chức tại cơ quan, đơn vị công lập. Số liệu và mô hình 24 bảng trong phương án thiết kế là giả định phân tích. Ứng dụng dùng để đối chiếu là HRMS xây dựng bằng Next.js, NestJS và PostgreSQL; chưa có sản phẩm KPI riêng hoặc kết nối ERP, MES, IoT, Kafka, Redis, MinIO và DVC được nêu trong hướng phát triển.</w:t>
       </w:r>
     </w:p>
     <w:p>
@@ -7487,7 +7559,29 @@
         <w:pStyle w:val="mc1"/>
         <w:spacing w:before="240" w:after="100"/>
       </w:pPr>
-      <w:bookmarkStart w:id="4" w:name="_Toc242651553"/>
+      <w:bookmarkStart w:id="4" w:name="_Toc243090950"/>
+      <w:r>
+        <w:rPr>
+          <w:bCs/>
+          <w:color w:val="000000"/>
+          <w:sz w:val="28"/>
+          <w:szCs w:val="28"/>
+        </w:rPr>
+        <w:t>4. Phương pháp nghiên cứu</w:t>
+      </w:r>
+      <w:bookmarkEnd w:id="4"/>
+    </w:p>
+    <w:p>
+      <w:r>
+        <w:t>Đề tài kết hợp khảo cứu văn bản pháp quy và tài liệu quản trị về BSC/KPI với phân tích, thiết kế hướng đối tượng bằng UML. Các công thức chuẩn hóa điểm và kiểm tra dữ liệu bất thường được mô hình hóa để làm rõ cách hệ thống xử lý kết quả.</w:t>
+      </w:r>
+    </w:p>
+    <w:p>
+      <w:pPr>
+        <w:pStyle w:val="mc1"/>
+        <w:spacing w:before="240" w:after="100"/>
+      </w:pPr>
+      <w:bookmarkStart w:id="5" w:name="_Toc243090951"/>
       <w:r>
         <w:rPr>
           <w:bCs/>
@@ -7496,28 +7590,6 @@
           <w:szCs w:val="28"/>
         </w:rPr>
         <w:lastRenderedPageBreak/>
-        <w:t>4. Phương pháp nghiên cứu</w:t>
-      </w:r>
-      <w:bookmarkEnd w:id="4"/>
-    </w:p>
-    <w:p>
-      <w:r>
-        <w:t>Đề tài kết hợp khảo cứu văn bản pháp quy và tài liệu quản trị về BSC/KPI với phân tích, thiết kế hướng đối tượng bằng UML. Các công thức chuẩn hóa điểm và kiểm tra dữ liệu bất thường được mô hình hóa để làm rõ cách hệ thống xử lý kết quả.</w:t>
-      </w:r>
-    </w:p>
-    <w:p>
-      <w:pPr>
-        <w:pStyle w:val="mc1"/>
-        <w:spacing w:before="240" w:after="100"/>
-      </w:pPr>
-      <w:bookmarkStart w:id="5" w:name="_Toc242651554"/>
-      <w:r>
-        <w:rPr>
-          <w:bCs/>
-          <w:color w:val="000000"/>
-          <w:sz w:val="28"/>
-          <w:szCs w:val="28"/>
-        </w:rPr>
         <w:t>5. Cấu trúc của báo cáo</w:t>
       </w:r>
       <w:bookmarkEnd w:id="5"/>
@@ -7530,9 +7602,10 @@
     <w:p>
       <w:pPr>
         <w:pStyle w:val="CHNG"/>
+        <w:pageBreakBefore/>
         <w:jc w:val="both"/>
       </w:pPr>
-      <w:bookmarkStart w:id="6" w:name="_Toc242651555"/>
+      <w:bookmarkStart w:id="6" w:name="_Toc243090952"/>
       <w:r>
         <w:rPr>
           <w:bCs/>
@@ -7540,6 +7613,7 @@
           <w:sz w:val="30"/>
           <w:szCs w:val="30"/>
         </w:rPr>
+        <w:lastRenderedPageBreak/>
         <w:t>CHƯƠNG 1: CƠ SỞ LÝ LUẬN VỀ QUẢN TRỊ HIỆU SUẤT VÀ HỆ THỐNG THÔNG TIN ĐÁNH GIÁ KPI</w:t>
       </w:r>
       <w:bookmarkEnd w:id="6"/>
@@ -7549,7 +7623,7 @@
         <w:pStyle w:val="mc1"/>
         <w:spacing w:before="240" w:after="100"/>
       </w:pPr>
-      <w:bookmarkStart w:id="7" w:name="_Toc242651556"/>
+      <w:bookmarkStart w:id="7" w:name="_Toc243090953"/>
       <w:r>
         <w:rPr>
           <w:bCs/>
@@ -7571,7 +7645,7 @@
         <w:pStyle w:val="mc2"/>
         <w:spacing w:before="180" w:after="80"/>
       </w:pPr>
-      <w:bookmarkStart w:id="8" w:name="_Toc242651557"/>
+      <w:bookmarkStart w:id="8" w:name="_Toc243090954"/>
       <w:r>
         <w:rPr>
           <w:b/>
@@ -7592,7 +7666,7 @@
         <w:pStyle w:val="mc2"/>
         <w:spacing w:before="180" w:after="80"/>
       </w:pPr>
-      <w:bookmarkStart w:id="9" w:name="_Toc242651558"/>
+      <w:bookmarkStart w:id="9" w:name="_Toc243090955"/>
       <w:r>
         <w:t>1.1.2. Mô hình OKR và mối liên hệ với KPI</w:t>
       </w:r>
@@ -7608,7 +7682,7 @@
         <w:pStyle w:val="KPITableCaption"/>
         <w:keepNext/>
       </w:pPr>
-      <w:bookmarkStart w:id="10" w:name="_Toc242651587"/>
+      <w:bookmarkStart w:id="10" w:name="_Toc243090984"/>
       <w:r>
         <w:t>Bảng 1.1. Đối chiếu BSC, OKR và KPI trong quản trị hiệu suất</w:t>
       </w:r>
@@ -7638,6 +7712,7 @@
       </w:tblGrid>
       <w:tr>
         <w:trPr>
+          <w:cantSplit/>
           <w:tblHeader/>
         </w:trPr>
         <w:tc>
@@ -7741,6 +7816,9 @@
         </w:tc>
       </w:tr>
       <w:tr>
+        <w:trPr>
+          <w:cantSplit/>
+        </w:trPr>
         <w:tc>
           <w:tcPr>
             <w:tcW w:w="1800" w:type="dxa"/>
@@ -7836,6 +7914,9 @@
         </w:tc>
       </w:tr>
       <w:tr>
+        <w:trPr>
+          <w:cantSplit/>
+        </w:trPr>
         <w:tc>
           <w:tcPr>
             <w:tcW w:w="1800" w:type="dxa"/>
@@ -7931,6 +8012,9 @@
         </w:tc>
       </w:tr>
       <w:tr>
+        <w:trPr>
+          <w:cantSplit/>
+        </w:trPr>
         <w:tc>
           <w:tcPr>
             <w:tcW w:w="1800" w:type="dxa"/>
@@ -8026,6 +8110,9 @@
         </w:tc>
       </w:tr>
       <w:tr>
+        <w:trPr>
+          <w:cantSplit/>
+        </w:trPr>
         <w:tc>
           <w:tcPr>
             <w:tcW w:w="1800" w:type="dxa"/>
@@ -8121,6 +8208,9 @@
         </w:tc>
       </w:tr>
       <w:tr>
+        <w:trPr>
+          <w:cantSplit/>
+        </w:trPr>
         <w:tc>
           <w:tcPr>
             <w:tcW w:w="1800" w:type="dxa"/>
@@ -8148,7 +8238,6 @@
                 <w:sz w:val="24"/>
                 <w:szCs w:val="22"/>
               </w:rPr>
-              <w:lastRenderedPageBreak/>
               <w:t>Tính chất mục tiêu</w:t>
             </w:r>
           </w:p>
@@ -8180,7 +8269,7 @@
                 <w:sz w:val="24"/>
                 <w:szCs w:val="22"/>
               </w:rPr>
-              <w:t>Định lượng rõ ràng, mang tính giao khoán từ trên xuống</w:t>
+              <w:t>Chỉ tiêu định lượng được cấp quản lý giao cho từng vị trí.</w:t>
             </w:r>
           </w:p>
         </w:tc>
@@ -8222,7 +8311,7 @@
         <w:pStyle w:val="mc2"/>
         <w:spacing w:before="180" w:after="80"/>
       </w:pPr>
-      <w:bookmarkStart w:id="11" w:name="_Toc242651559"/>
+      <w:bookmarkStart w:id="11" w:name="_Toc243090956"/>
       <w:r>
         <w:rPr>
           <w:b/>
@@ -8240,7 +8329,11 @@
     </w:p>
     <w:p>
       <w:r>
-        <w:t>HRMS doanh nghiệp tập trung đánh giá hiệu quả bằng KPI/KRA. Nhân viên cập nhật kết quả và minh chứng cho mục tiêu được giao; quản lý trực tiếp chấm từng mục tiêu theo thang 0–100. Điểm kỳ được tính theo trọng số đã giao, tổng trọng số phải bằng 100%. Hệ thống không tổng hợp điểm tự đánh giá, đồng nghiệp hoặc cấp dưới vào kết quả KPI.</w:t>
+        <w:t xml:space="preserve">HRMS doanh nghiệp đánh giá hiệu quả bằng KPI/KRA. Từ phiên bản ngày 16/10/2026, mục tiêu có thể chấm theo bảng tiêu chí định tính hoặc quy đổi từ mục tiêu </w:t>
+      </w:r>
+      <w:r>
+        <w:lastRenderedPageBreak/>
+        <w:t>và kết quả định lượng theo chiều đo đã giao. Nhân viên cập nhật kết quả, minh chứng; quản lý đối chiếu và ghi giải trình. Điểm từng mục tiêu giới hạn 0–100; điểm kỳ cộng theo trọng số đủ 100%. Điểm tự đánh giá, đồng nghiệp và cấp dưới không tham gia phép tính KPI hiện hành.</w:t>
       </w:r>
     </w:p>
     <w:p>
@@ -8253,7 +8346,7 @@
         <w:pStyle w:val="mc1"/>
         <w:spacing w:before="240" w:after="100"/>
       </w:pPr>
-      <w:bookmarkStart w:id="12" w:name="_Toc242651560"/>
+      <w:bookmarkStart w:id="12" w:name="_Toc243090957"/>
       <w:r>
         <w:rPr>
           <w:bCs/>
@@ -8275,7 +8368,7 @@
         <w:pStyle w:val="mc2"/>
         <w:spacing w:before="180" w:after="80"/>
       </w:pPr>
-      <w:bookmarkStart w:id="13" w:name="_Toc242651561"/>
+      <w:bookmarkStart w:id="13" w:name="_Toc243090958"/>
       <w:r>
         <w:rPr>
           <w:b/>
@@ -8301,7 +8394,7 @@
         <w:pStyle w:val="KPITableCaption"/>
         <w:keepNext/>
       </w:pPr>
-      <w:bookmarkStart w:id="14" w:name="_Toc242651588"/>
+      <w:bookmarkStart w:id="14" w:name="_Toc243090985"/>
       <w:r>
         <w:lastRenderedPageBreak/>
         <w:t>Bảng 1.2. Khung xếp loại công chức, viên chức áp dụng năm 2026</w:t>
@@ -8326,16 +8419,62 @@
         <w:tblLook w:val="0000" w:firstRow="0" w:lastRow="0" w:firstColumn="0" w:lastColumn="0" w:noHBand="0" w:noVBand="0"/>
       </w:tblPr>
       <w:tblGrid>
-        <w:gridCol w:w="2167"/>
-        <w:gridCol w:w="5441"/>
-        <w:gridCol w:w="1453"/>
+        <w:gridCol w:w="2163"/>
+        <w:gridCol w:w="5430"/>
+        <w:gridCol w:w="1468"/>
       </w:tblGrid>
       <w:tr>
         <w:trPr>
+          <w:cantSplit/>
           <w:tblHeader/>
         </w:trPr>
         <w:tc>
           <w:tcPr>
+            <w:tcW w:w="2167" w:type="dxa"/>
+          </w:tcPr>
+          <w:p>
+            <w:r>
+              <w:rPr>
+                <w:b/>
+              </w:rPr>
+              <w:t>Nội dung</w:t>
+            </w:r>
+          </w:p>
+        </w:tc>
+        <w:tc>
+          <w:tcPr>
+            <w:tcW w:w="5441" w:type="dxa"/>
+          </w:tcPr>
+          <w:p>
+            <w:r>
+              <w:rPr>
+                <w:b/>
+              </w:rPr>
+              <w:t>Quy định tham chiếu</w:t>
+            </w:r>
+          </w:p>
+        </w:tc>
+        <w:tc>
+          <w:tcPr>
+            <w:tcW w:w="1453" w:type="dxa"/>
+          </w:tcPr>
+          <w:p>
+            <w:r>
+              <w:rPr>
+                <w:b/>
+              </w:rPr>
+              <w:t>Phạm vi áp dụng</w:t>
+            </w:r>
+          </w:p>
+        </w:tc>
+      </w:tr>
+      <w:tr>
+        <w:trPr>
+          <w:cantSplit/>
+          <w:tblHeader/>
+        </w:trPr>
+        <w:tc>
+          <w:tcPr>
             <w:tcW w:w="2200" w:type="dxa"/>
             <w:tcBorders>
               <w:top w:val="single" w:sz="6" w:space="0" w:color="595959"/>
@@ -8435,6 +8574,9 @@
         </w:tc>
       </w:tr>
       <w:tr>
+        <w:trPr>
+          <w:cantSplit/>
+        </w:trPr>
         <w:tc>
           <w:tcPr>
             <w:tcW w:w="2200" w:type="dxa"/>
@@ -8530,6 +8672,9 @@
         </w:tc>
       </w:tr>
       <w:tr>
+        <w:trPr>
+          <w:cantSplit/>
+        </w:trPr>
         <w:tc>
           <w:tcPr>
             <w:tcW w:w="2200" w:type="dxa"/>
@@ -8625,6 +8770,9 @@
         </w:tc>
       </w:tr>
       <w:tr>
+        <w:trPr>
+          <w:cantSplit/>
+        </w:trPr>
         <w:tc>
           <w:tcPr>
             <w:tcW w:w="2200" w:type="dxa"/>
@@ -8720,6 +8868,9 @@
         </w:tc>
       </w:tr>
       <w:tr>
+        <w:trPr>
+          <w:cantSplit/>
+        </w:trPr>
         <w:tc>
           <w:tcPr>
             <w:tcW w:w="2200" w:type="dxa"/>
@@ -8820,7 +8971,7 @@
         <w:pStyle w:val="mc2"/>
         <w:spacing w:before="180" w:after="80"/>
       </w:pPr>
-      <w:bookmarkStart w:id="15" w:name="_Toc242651562"/>
+      <w:bookmarkStart w:id="15" w:name="_Toc243090959"/>
       <w:r>
         <w:rPr>
           <w:b/>
@@ -8841,7 +8992,7 @@
         <w:pStyle w:val="mc1"/>
         <w:spacing w:before="240" w:after="100"/>
       </w:pPr>
-      <w:bookmarkStart w:id="16" w:name="_Toc242651563"/>
+      <w:bookmarkStart w:id="16" w:name="_Toc243090960"/>
       <w:r>
         <w:rPr>
           <w:bCs/>
@@ -8855,7 +9006,11 @@
     </w:p>
     <w:p>
       <w:r>
-        <w:t>Trong sản xuất, KPI có thể gắn với hiệu quả sử dụng nguồn lực, chất lượng sản phẩm và mức độ đáp ứng khách hàng. OEE được tính bằng mức độ sẵn sàng nhân với hiệu suất vận hành và tỷ lệ chất lượng; PPM là số sản phẩm lỗi trên một triệu sản phẩm. Hai chỉ số này chỉ phù hợp khi doanh nghiệp thống nhất cách đo và nguồn dữ liệu. Nếu được cấp quyền kết nối ERP, MES hoặc IoT, đơn vị có thể lấy sản lượng, thời gian vận hành và lỗi theo lô để đối soát. HRMS hiện chưa kết nối các nguồn này. Việc kiểm soát dữ liệu dựa trên phân quyền, nhật ký thay đổi, khóa kỳ và đối chiếu chứng từ; phát hiện ngoại lệ hoặc băm SHA-256 chỉ là lựa chọn kỹ thuật theo mức độ rủi ro, không thay thế kiểm tra nghiệp vụ.</w:t>
+        <w:t xml:space="preserve">Trong sản xuất, KPI có thể gắn với hiệu quả sử dụng nguồn lực, chất lượng sản phẩm và mức độ đáp ứng khách hàng. OEE được tính bằng mức độ sẵn sàng nhân với hiệu suất vận hành và tỷ lệ chất lượng; PPM là số sản phẩm lỗi trên một triệu sản phẩm. Hai chỉ số này chỉ phù hợp khi doanh nghiệp thống nhất cách đo và nguồn dữ liệu. Nếu được cấp quyền kết nối ERP, MES hoặc IoT, đơn vị có thể lấy sản lượng, thời gian vận hành và lỗi theo lô để đối soát. HRMS hiện chưa kết nối các nguồn này. Việc kiểm soát dữ liệu dựa trên phân quyền, nhật ký thay đổi, khóa kỳ và đối chiếu chứng từ; phát hiện </w:t>
+      </w:r>
+      <w:r>
+        <w:lastRenderedPageBreak/>
+        <w:t>ngoại lệ hoặc băm SHA-256 chỉ là lựa chọn kỹ thuật theo mức độ rủi ro, không thay thế kiểm tra nghiệp vụ.</w:t>
       </w:r>
     </w:p>
     <w:p>
@@ -8863,7 +9018,7 @@
         <w:pStyle w:val="mc1"/>
         <w:spacing w:before="240" w:after="100"/>
       </w:pPr>
-      <w:bookmarkStart w:id="17" w:name="_Toc242651564"/>
+      <w:bookmarkStart w:id="17" w:name="_Toc243090961"/>
       <w:r>
         <w:rPr>
           <w:bCs/>
@@ -8871,14 +9026,13 @@
           <w:sz w:val="28"/>
           <w:szCs w:val="28"/>
         </w:rPr>
-        <w:lastRenderedPageBreak/>
         <w:t>1.4. Mô hình toán học và công thức tính toán chỉ số hiệu quả</w:t>
       </w:r>
       <w:bookmarkEnd w:id="17"/>
     </w:p>
     <w:p>
       <w:r>
-        <w:t>Phần này gồm các mô hình quy đổi tham khảo ở Công thức 1.1–1.3 và phép tính HRMS đang dùng ở Công thức 1.4. HRMS chưa tự lấy dữ liệu thô từ ERP/CRM để chạy ba công thức đầu; quản lý nhập điểm mục tiêu dựa trên kết quả và minh chứng, hệ thống tổng hợp điểm kỳ theo trọng số ở Công thức 1.4.</w:t>
+        <w:t>Công thức 1.1–1.3 trình bày các phương án quy đổi tham khảo, có thể dùng trần 120 điểm trong mô hình nghiên cứu. Phiên bản HRMS ngày 16/10/2026 sử dụng quy ước riêng: chỉ tiêu càng cao càng tốt tính thực tế/mục tiêu × 100; càng thấp càng tốt tính mục tiêu/thực tế × 100; đạt/không đạt dùng 1/0. Điểm được giới hạn 0–100. Với mục tiêu 0 ở chiều giảm, thực tế 0 đạt 100 điểm, khác 0 đạt 0 điểm; với mục tiêu dương và thực tế 0 ở chiều giảm, điểm là 100. Dữ liệu do người có quyền nhập và xác nhận bằng minh chứng; chưa có kết nối lấy số liệu ERP/CRM tự động.</w:t>
       </w:r>
     </w:p>
     <w:p>
@@ -9015,6 +9169,7 @@
           <w:i/>
           <w:iCs/>
         </w:rPr>
+        <w:lastRenderedPageBreak/>
         <w:t>Giải thích: Trong đó: w_i là trọng số của chỉ tiêu thứ i; S_i là điểm số thành phần của chỉ tiêu thứ i; tổng trọng số của toàn bộ danh mục chỉ tiêu giao cho một cá nhân trong chu kỳ bắt buộc phải đúng bằng 100%.</w:t>
       </w:r>
     </w:p>
@@ -9033,7 +9188,7 @@
           <w:b/>
           <w:bCs/>
         </w:rPr>
-        <w:t>Điểm KPI kỳ = Σ (điểm quản lý chấm cho mục tiêu × trọng số mục tiêu); tổng trọng số các mục tiêu được giao trong kỳ bằng 100%.</w:t>
+        <w:t>Điểm KPI kỳ = Σ (điểm đã xác nhận của mục tiêu × trọng số mục tiêu / 100), trong đó trọng số được nhập theo phần trăm và tổng bằng 100%.</w:t>
       </w:r>
     </w:p>
     <w:p>
@@ -9042,8 +9197,7 @@
           <w:i/>
           <w:iCs/>
         </w:rPr>
-        <w:lastRenderedPageBreak/>
-        <w:t>Điểm từng mục tiêu do quản lý chấm trên thang 0–100, căn cứ kết quả thực tế và minh chứng đã lưu. Chỉ hoàn tất điểm kỳ khi các mục tiêu đều có điểm và tổng trọng số đạt 100%; việc xếp loại theo quy chế của đơn vị. Điểm KPI không tự quyết định lương hoặc thưởng.</w:t>
+        <w:t>Điểm từng mục tiêu được quản lý xác nhận trên thang 0–100 từ bảng tiêu chí hoặc công thức định lượng đã chọn. Hệ thống lưu mục tiêu, thực tế, đơn vị, chiều đo và giải trình; chặn chấm khi thiếu minh chứng. Chỉ hoàn tất điểm kỳ khi tổng trọng số bằng 100% và mọi mục tiêu có điểm. Xếp loại là quy ước của đơn vị; không tự quyết định lương hoặc thưởng.</w:t>
       </w:r>
     </w:p>
     <w:p>
@@ -9062,7 +9216,7 @@
         <w:keepLines/>
       </w:pPr>
       <w:r>
-        <w:t>Các ví dụ dưới đây dùng số minh họa. Công thức 1.1–1.3 chỉ cách quy đổi tham khảo; Công thức 1.4 mô tả cách HRMS tự cộng điểm do quản lý nhập. Điểm KPI không tự chuyển thành tiền lương hoặc thưởng.</w:t>
+        <w:t>Các ví dụ dưới đây dùng số minh họa. Phương án có trần 120 và công thức nghịch tuyến tính trong Công thức 1.1–1.3 thuộc mô hình nghiên cứu; không đồng nhất với quy tắc giới hạn 100 và công thức mục tiêu/thực tế được triển khai trong HRMS ngày 16/10/2026. Công thức 1.4 mô tả phép cộng có trọng số của hệ thống. Điểm KPI không tự chuyển thành tiền lương hoặc thưởng.</w:t>
       </w:r>
     </w:p>
     <w:p>
@@ -9140,7 +9294,7 @@
         <w:pStyle w:val="mc1"/>
         <w:spacing w:before="240" w:after="100"/>
       </w:pPr>
-      <w:bookmarkStart w:id="18" w:name="_Toc242651565"/>
+      <w:bookmarkStart w:id="18" w:name="_Toc243090962"/>
       <w:r>
         <w:rPr>
           <w:bCs/>
@@ -9154,7 +9308,11 @@
     </w:p>
     <w:p>
       <w:r>
-        <w:t>Từ điển chỉ số trong báo cáo là thư viện ví dụ để minh họa khả năng cấu hình. Khi triển khai thực tế cần HR và quản lý chuyên môn xác nhận định nghĩa, đơn vị đo, nguồn dữ liệu, kỳ đo, mức sàn/trần và người chịu trách nhiệm; mẫu khu vực công phải theo chế độ riêng.</w:t>
+        <w:t xml:space="preserve">Từ điển chỉ số trong báo cáo là thư viện ví dụ để minh họa khả năng cấu hình. Khi triển khai thực tế cần HR và quản lý chuyên môn xác nhận định nghĩa, đơn vị đo, </w:t>
+      </w:r>
+      <w:r>
+        <w:lastRenderedPageBreak/>
+        <w:t>nguồn dữ liệu, kỳ đo, mức sàn/trần và người chịu trách nhiệm; mẫu khu vực công phải theo chế độ riêng.</w:t>
       </w:r>
     </w:p>
     <w:p>
@@ -9162,14 +9320,13 @@
         <w:pStyle w:val="mc2"/>
         <w:spacing w:before="180" w:after="80"/>
       </w:pPr>
-      <w:bookmarkStart w:id="19" w:name="_Toc242651566"/>
+      <w:bookmarkStart w:id="19" w:name="_Toc243090963"/>
       <w:r>
         <w:rPr>
           <w:b/>
           <w:bCs/>
           <w:color w:val="000000"/>
         </w:rPr>
-        <w:lastRenderedPageBreak/>
         <w:t>1.5.1. Từ điển chỉ số KPI Doanh nghiệp (Vị trí Trưởng phòng Kinh doanh)</w:t>
       </w:r>
       <w:bookmarkEnd w:id="19"/>
@@ -9179,7 +9336,7 @@
         <w:pStyle w:val="KPITableCaption"/>
         <w:keepNext/>
       </w:pPr>
-      <w:bookmarkStart w:id="20" w:name="_Toc242651589"/>
+      <w:bookmarkStart w:id="20" w:name="_Toc243090986"/>
       <w:r>
         <w:t>Bảng 1.3. Từ điển chỉ số KPI tham khảo cho Trưởng phòng Kinh doanh</w:t>
       </w:r>
@@ -9212,6 +9369,7 @@
       </w:tblGrid>
       <w:tr>
         <w:trPr>
+          <w:cantSplit/>
           <w:tblHeader/>
         </w:trPr>
         <w:tc>
@@ -9414,6 +9572,9 @@
         </w:tc>
       </w:tr>
       <w:tr>
+        <w:trPr>
+          <w:cantSplit/>
+        </w:trPr>
         <w:tc>
           <w:tcPr>
             <w:tcW w:w="1200" w:type="dxa"/>
@@ -9602,6 +9763,9 @@
         </w:tc>
       </w:tr>
       <w:tr>
+        <w:trPr>
+          <w:cantSplit/>
+        </w:trPr>
         <w:tc>
           <w:tcPr>
             <w:tcW w:w="1200" w:type="dxa"/>
@@ -9790,6 +9954,9 @@
         </w:tc>
       </w:tr>
       <w:tr>
+        <w:trPr>
+          <w:cantSplit/>
+        </w:trPr>
         <w:tc>
           <w:tcPr>
             <w:tcW w:w="1200" w:type="dxa"/>
@@ -9978,6 +10145,9 @@
         </w:tc>
       </w:tr>
       <w:tr>
+        <w:trPr>
+          <w:cantSplit/>
+        </w:trPr>
         <w:tc>
           <w:tcPr>
             <w:tcW w:w="1200" w:type="dxa"/>
@@ -10166,6 +10336,9 @@
         </w:tc>
       </w:tr>
       <w:tr>
+        <w:trPr>
+          <w:cantSplit/>
+        </w:trPr>
         <w:tc>
           <w:tcPr>
             <w:tcW w:w="1200" w:type="dxa"/>
@@ -10354,6 +10527,9 @@
         </w:tc>
       </w:tr>
       <w:tr>
+        <w:trPr>
+          <w:cantSplit/>
+        </w:trPr>
         <w:tc>
           <w:tcPr>
             <w:tcW w:w="1200" w:type="dxa"/>
@@ -10547,7 +10723,7 @@
         <w:pStyle w:val="mc2"/>
         <w:spacing w:before="180" w:after="80"/>
       </w:pPr>
-      <w:bookmarkStart w:id="21" w:name="_Toc242651567"/>
+      <w:bookmarkStart w:id="21" w:name="_Toc243090964"/>
       <w:r>
         <w:t>1.5.2. Ví dụ tiêu chí khu vực công theo khung năm 2026</w:t>
       </w:r>
@@ -10558,7 +10734,7 @@
         <w:pStyle w:val="KPITableCaption"/>
         <w:keepNext/>
       </w:pPr>
-      <w:bookmarkStart w:id="22" w:name="_Toc242651590"/>
+      <w:bookmarkStart w:id="22" w:name="_Toc243090987"/>
       <w:r>
         <w:t>Bảng 1.4. Ví dụ tiêu chí đánh giá khu vực công theo khung năm 2026</w:t>
       </w:r>
@@ -10590,6 +10766,7 @@
       </w:tblGrid>
       <w:tr>
         <w:trPr>
+          <w:cantSplit/>
           <w:tblHeader/>
         </w:trPr>
         <w:tc>
@@ -10759,6 +10936,9 @@
         </w:tc>
       </w:tr>
       <w:tr>
+        <w:trPr>
+          <w:cantSplit/>
+        </w:trPr>
         <w:tc>
           <w:tcPr>
             <w:tcW w:w="1200" w:type="dxa"/>
@@ -10916,6 +11096,9 @@
         </w:tc>
       </w:tr>
       <w:tr>
+        <w:trPr>
+          <w:cantSplit/>
+        </w:trPr>
         <w:tc>
           <w:tcPr>
             <w:tcW w:w="1200" w:type="dxa"/>
@@ -10943,6 +11126,7 @@
                 <w:sz w:val="24"/>
                 <w:szCs w:val="22"/>
               </w:rPr>
+              <w:lastRenderedPageBreak/>
               <w:t>TC-C-02</w:t>
             </w:r>
           </w:p>
@@ -11073,6 +11257,9 @@
         </w:tc>
       </w:tr>
       <w:tr>
+        <w:trPr>
+          <w:cantSplit/>
+        </w:trPr>
         <w:tc>
           <w:tcPr>
             <w:tcW w:w="1200" w:type="dxa"/>
@@ -11100,7 +11287,6 @@
                 <w:sz w:val="24"/>
                 <w:szCs w:val="22"/>
               </w:rPr>
-              <w:lastRenderedPageBreak/>
               <w:t>TC-V-01</w:t>
             </w:r>
           </w:p>
@@ -11231,6 +11417,9 @@
         </w:tc>
       </w:tr>
       <w:tr>
+        <w:trPr>
+          <w:cantSplit/>
+        </w:trPr>
         <w:tc>
           <w:tcPr>
             <w:tcW w:w="1200" w:type="dxa"/>
@@ -11388,6 +11577,9 @@
         </w:tc>
       </w:tr>
       <w:tr>
+        <w:trPr>
+          <w:cantSplit/>
+        </w:trPr>
         <w:tc>
           <w:tcPr>
             <w:tcW w:w="1200" w:type="dxa"/>
@@ -11550,7 +11742,7 @@
         <w:pStyle w:val="mc1"/>
         <w:spacing w:before="180" w:after="80"/>
       </w:pPr>
-      <w:bookmarkStart w:id="23" w:name="_Toc242651568"/>
+      <w:bookmarkStart w:id="23" w:name="_Toc243090965"/>
       <w:r>
         <w:rPr>
           <w:bCs/>
@@ -11569,9 +11761,10 @@
     <w:p>
       <w:pPr>
         <w:pStyle w:val="CHNG"/>
+        <w:pageBreakBefore/>
         <w:jc w:val="both"/>
       </w:pPr>
-      <w:bookmarkStart w:id="24" w:name="_Toc242651569"/>
+      <w:bookmarkStart w:id="24" w:name="_Toc243090966"/>
       <w:r>
         <w:rPr>
           <w:bCs/>
@@ -11579,6 +11772,7 @@
           <w:sz w:val="30"/>
           <w:szCs w:val="30"/>
         </w:rPr>
+        <w:lastRenderedPageBreak/>
         <w:t>CHƯƠNG 2: PHÂN TÍCH VÀ THIẾT KẾ HỆ THỐNG THÔNG TIN ĐÁNH GIÁ KPI</w:t>
       </w:r>
       <w:bookmarkEnd w:id="24"/>
@@ -11588,7 +11782,7 @@
         <w:pStyle w:val="mc1"/>
         <w:spacing w:before="240" w:after="100"/>
       </w:pPr>
-      <w:bookmarkStart w:id="25" w:name="_Toc242651570"/>
+      <w:bookmarkStart w:id="25" w:name="_Toc243090967"/>
       <w:r>
         <w:rPr>
           <w:bCs/>
@@ -11625,7 +11819,7 @@
         <w:pStyle w:val="mc1"/>
         <w:spacing w:before="240" w:after="100"/>
       </w:pPr>
-      <w:bookmarkStart w:id="26" w:name="_Toc242651571"/>
+      <w:bookmarkStart w:id="26" w:name="_Toc243090968"/>
       <w:r>
         <w:rPr>
           <w:bCs/>
@@ -11633,14 +11827,13 @@
           <w:sz w:val="28"/>
           <w:szCs w:val="28"/>
         </w:rPr>
-        <w:lastRenderedPageBreak/>
         <w:t>2.2. Phân tích cấu trúc hệ thống</w:t>
       </w:r>
       <w:bookmarkEnd w:id="26"/>
     </w:p>
     <w:p>
       <w:r>
-        <w:t>Cấu trúc tĩnh của hệ thống được mô hình hóa hướng đối tượng bằng bốn biểu đồ kỹ thuật chuyên biệt:</w:t>
+        <w:t>Cấu trúc hệ thống được trình bày qua bốn nhóm biểu đồ sau:</w:t>
       </w:r>
     </w:p>
     <w:p>
@@ -11655,7 +11848,7 @@
           <w:noProof/>
         </w:rPr>
         <w:drawing>
-          <wp:inline distT="0" distB="0" distL="0" distR="0" wp14:anchorId="5F09132D" wp14:editId="7A319969">
+          <wp:inline distT="0" distB="0" distL="0" distR="0" wp14:anchorId="5F831611" wp14:editId="42F28236">
             <wp:extent cx="5532120" cy="2643124"/>
             <wp:effectExtent l="0" t="0" r="0" b="0"/>
             <wp:docPr id="958090139" name="Picture 958090139"/>
@@ -11696,7 +11889,7 @@
         <w:pStyle w:val="KPIFigureCaption"/>
         <w:spacing w:before="40" w:after="180"/>
       </w:pPr>
-      <w:bookmarkStart w:id="27" w:name="_Toc242651595"/>
+      <w:bookmarkStart w:id="27" w:name="_Toc243090992"/>
       <w:r>
         <w:t>Hình 2.1. Sơ đồ tác nhân đánh giá KPI</w:t>
       </w:r>
@@ -11718,8 +11911,9 @@
         <w:rPr>
           <w:noProof/>
         </w:rPr>
+        <w:lastRenderedPageBreak/>
         <w:drawing>
-          <wp:inline distT="0" distB="0" distL="0" distR="0" wp14:anchorId="5BD738D8" wp14:editId="6AAC9F4B">
+          <wp:inline distT="0" distB="0" distL="0" distR="0" wp14:anchorId="6C7A2B01" wp14:editId="25D0B9F4">
             <wp:extent cx="5532120" cy="4056888"/>
             <wp:effectExtent l="0" t="0" r="0" b="0"/>
             <wp:docPr id="958090140" name="Picture 958090140"/>
@@ -11760,7 +11954,7 @@
         <w:pStyle w:val="KPIFigureCaption"/>
         <w:spacing w:before="40" w:after="180"/>
       </w:pPr>
-      <w:bookmarkStart w:id="28" w:name="_Toc242651596"/>
+      <w:bookmarkStart w:id="28" w:name="_Toc243090993"/>
       <w:r>
         <w:t>Hình 2.2. Biểu đồ Use Case đánh giá KPI doanh nghiệp</w:t>
       </w:r>
@@ -11768,7 +11962,6 @@
     </w:p>
     <w:p>
       <w:r>
-        <w:lastRenderedPageBreak/>
         <w:t>Một kỳ bắt đầu khi HR hoặc quản lý được giao quyền tạo chu kỳ. Mục tiêu có thể giao cho cá nhân hoặc cả đơn vị; trường hợp giao theo đơn vị, HRMS tạo mục tiêu riêng và thông báo đến từng người. Nhân viên gửi kết quả cùng minh chứng, còn quản lý trực tiếp đối chiếu trước khi chấm.</w:t>
       </w:r>
     </w:p>
@@ -11784,7 +11977,7 @@
           <w:noProof/>
         </w:rPr>
         <w:drawing>
-          <wp:inline distT="0" distB="0" distL="0" distR="0" wp14:anchorId="7B67DE81" wp14:editId="5ACFE808">
+          <wp:inline distT="0" distB="0" distL="0" distR="0" wp14:anchorId="537A9164" wp14:editId="20289BAC">
             <wp:extent cx="5532120" cy="3196336"/>
             <wp:effectExtent l="0" t="0" r="0" b="0"/>
             <wp:docPr id="958090141" name="Picture 958090141"/>
@@ -11825,7 +12018,7 @@
         <w:pStyle w:val="KPIFigureCaption"/>
         <w:spacing w:before="40" w:after="180"/>
       </w:pPr>
-      <w:bookmarkStart w:id="29" w:name="_Toc242651597"/>
+      <w:bookmarkStart w:id="29" w:name="_Toc243090994"/>
       <w:r>
         <w:t>Hình 2.3. Sơ đồ gói nghiệp vụ KPI</w:t>
       </w:r>
@@ -11833,7 +12026,11 @@
     </w:p>
     <w:p>
       <w:r>
-        <w:t>Người dùng thao tác trên giao diện web; yêu cầu đi qua API để kiểm tra quyền và xử lý nghiệp vụ trước khi lưu vào PostgreSQL. Prisma là lớp truy cập dữ liệu giữa API và cơ sở dữ liệu. ERP, CRM và Jira chưa nối vào luồng KPI, nên kết quả vẫn do người dùng cập nhật trong HRMS.</w:t>
+        <w:t xml:space="preserve">Người dùng thao tác trên giao diện web; yêu cầu đi qua API để kiểm tra quyền và xử lý nghiệp vụ trước khi lưu vào PostgreSQL. Prisma là lớp truy cập dữ liệu giữa </w:t>
+      </w:r>
+      <w:r>
+        <w:lastRenderedPageBreak/>
+        <w:t>API và cơ sở dữ liệu. ERP, CRM và Jira chưa nối vào luồng KPI, nên kết quả vẫn do người dùng cập nhật trong HRMS.</w:t>
       </w:r>
     </w:p>
     <w:p>
@@ -11847,9 +12044,8 @@
         <w:rPr>
           <w:noProof/>
         </w:rPr>
-        <w:lastRenderedPageBreak/>
         <w:drawing>
-          <wp:inline distT="0" distB="0" distL="0" distR="0" wp14:anchorId="75056DC5" wp14:editId="6C5109DD">
+          <wp:inline distT="0" distB="0" distL="0" distR="0" wp14:anchorId="50E8D001" wp14:editId="0E808AE3">
             <wp:extent cx="5532120" cy="3872484"/>
             <wp:effectExtent l="0" t="0" r="0" b="0"/>
             <wp:docPr id="958090142" name="Picture 958090142"/>
@@ -11890,7 +12086,7 @@
         <w:pStyle w:val="KPIFigureCaption"/>
         <w:spacing w:before="40" w:after="180"/>
       </w:pPr>
-      <w:bookmarkStart w:id="30" w:name="_Toc242651598"/>
+      <w:bookmarkStart w:id="30" w:name="_Toc243090995"/>
       <w:r>
         <w:t>Hình 2.4. Sơ đồ lớp rút gọn đánh giá KPI doanh nghiệp</w:t>
       </w:r>
@@ -11898,7 +12094,7 @@
     </w:p>
     <w:p>
       <w:r>
-        <w:t>Một mục tiêu luôn gắn với chu kỳ và người chịu trách nhiệm, cùng trọng số, kết quả và minh chứng cần đối chiếu. Khi giao theo đơn vị, hệ thống tạo các bản ghi cho từng nhân viên và lưu thông tin phạm vi giao. Mã người dùng hiện được kiểm tra ở tầng nghiệp vụ; trong schema Prisma chưa có khóa ngoại tương ứng.</w:t>
+        <w:t>Một mục tiêu luôn gắn với chu kỳ và người chịu trách nhiệm, cùng trọng số, kết quả và minh chứng cần đối chiếu. Khi giao theo đơn vị, hệ thống tạo các bản ghi cho từng nhân viên và lưu thông tin phạm vi giao. Mã người dùng hiện được kiểm tra ở tầng nghiệp vụ; trong lược đồ dữ liệu Prisma chưa có khóa ngoại tương ứng.</w:t>
       </w:r>
     </w:p>
     <w:p>
@@ -11906,7 +12102,7 @@
         <w:pStyle w:val="mc1"/>
         <w:spacing w:before="240" w:after="100"/>
       </w:pPr>
-      <w:bookmarkStart w:id="31" w:name="_Toc242651572"/>
+      <w:bookmarkStart w:id="31" w:name="_Toc243090969"/>
       <w:r>
         <w:rPr>
           <w:bCs/>
@@ -11936,7 +12132,7 @@
         </w:rPr>
         <w:lastRenderedPageBreak/>
         <w:drawing>
-          <wp:inline distT="0" distB="0" distL="0" distR="0" wp14:anchorId="7BF44151" wp14:editId="647ABF21">
+          <wp:inline distT="0" distB="0" distL="0" distR="0" wp14:anchorId="745CD5BE" wp14:editId="2880CB77">
             <wp:extent cx="5532120" cy="4610100"/>
             <wp:effectExtent l="0" t="0" r="0" b="0"/>
             <wp:docPr id="958090143" name="Picture 958090143"/>
@@ -11977,7 +12173,7 @@
         <w:pStyle w:val="KPIFigureCaption"/>
         <w:spacing w:before="40" w:after="180"/>
       </w:pPr>
-      <w:bookmarkStart w:id="32" w:name="_Toc242651599"/>
+      <w:bookmarkStart w:id="32" w:name="_Toc243090996"/>
       <w:r>
         <w:t>Hình 2.5. Biểu đồ tuần tự giao mục tiêu và chấm điểm KPI</w:t>
       </w:r>
@@ -12001,7 +12197,7 @@
         </w:rPr>
         <w:lastRenderedPageBreak/>
         <w:drawing>
-          <wp:inline distT="0" distB="0" distL="0" distR="0" wp14:anchorId="540334D2" wp14:editId="1A0E4258">
+          <wp:inline distT="0" distB="0" distL="0" distR="0" wp14:anchorId="700A6E5E" wp14:editId="5B38F9B1">
             <wp:extent cx="5532120" cy="4610100"/>
             <wp:effectExtent l="0" t="0" r="0" b="0"/>
             <wp:docPr id="958090144" name="Picture 958090144"/>
@@ -12042,7 +12238,7 @@
         <w:pStyle w:val="KPIFigureCaption"/>
         <w:spacing w:before="40" w:after="180"/>
       </w:pPr>
-      <w:bookmarkStart w:id="33" w:name="_Toc242651600"/>
+      <w:bookmarkStart w:id="33" w:name="_Toc243090997"/>
       <w:r>
         <w:t>Hình 2.6. Biểu đồ hoạt động đánh giá khu vực công năm 2026</w:t>
       </w:r>
@@ -12065,7 +12261,7 @@
           <w:noProof/>
         </w:rPr>
         <w:drawing>
-          <wp:inline distT="0" distB="0" distL="0" distR="0" wp14:anchorId="3013EC95" wp14:editId="0767D5F7">
+          <wp:inline distT="0" distB="0" distL="0" distR="0" wp14:anchorId="33CFEAB8" wp14:editId="4A6C7281">
             <wp:extent cx="5532120" cy="2520188"/>
             <wp:effectExtent l="0" t="0" r="0" b="0"/>
             <wp:docPr id="958090145" name="Picture 958090145"/>
@@ -12106,7 +12302,7 @@
         <w:pStyle w:val="KPIFigureCaption"/>
         <w:spacing w:before="40" w:after="180"/>
       </w:pPr>
-      <w:bookmarkStart w:id="34" w:name="_Toc242651601"/>
+      <w:bookmarkStart w:id="34" w:name="_Toc243090998"/>
       <w:r>
         <w:t>Hình 2.7. Biểu đồ trạng thái chu kỳ đánh giá HRMS</w:t>
       </w:r>
@@ -12126,7 +12322,7 @@
         <w:pStyle w:val="mc1"/>
         <w:spacing w:before="240" w:after="100"/>
       </w:pPr>
-      <w:bookmarkStart w:id="35" w:name="_Toc242651573"/>
+      <w:bookmarkStart w:id="35" w:name="_Toc243090970"/>
       <w:r>
         <w:rPr>
           <w:bCs/>
@@ -12150,7 +12346,7 @@
           <w:noProof/>
         </w:rPr>
         <w:drawing>
-          <wp:inline distT="0" distB="0" distL="0" distR="0" wp14:anchorId="3588234C" wp14:editId="42BEE7C9">
+          <wp:inline distT="0" distB="0" distL="0" distR="0" wp14:anchorId="3D719AA7" wp14:editId="4A46BFB3">
             <wp:extent cx="5532120" cy="3257804"/>
             <wp:effectExtent l="0" t="0" r="0" b="0"/>
             <wp:docPr id="958090146" name="Picture 958090146"/>
@@ -12191,7 +12387,7 @@
         <w:pStyle w:val="KPIFigureCaption"/>
         <w:spacing w:before="40" w:after="180"/>
       </w:pPr>
-      <w:bookmarkStart w:id="36" w:name="_Toc242651602"/>
+      <w:bookmarkStart w:id="36" w:name="_Toc243090999"/>
       <w:r>
         <w:t>Hình 2.8. Kiến trúc HRMS hiện tại và điểm tích hợp đề xuất</w:t>
       </w:r>
@@ -12207,7 +12403,7 @@
         <w:pStyle w:val="mc2"/>
         <w:spacing w:before="180" w:after="80"/>
       </w:pPr>
-      <w:bookmarkStart w:id="37" w:name="_Toc242651574"/>
+      <w:bookmarkStart w:id="37" w:name="_Toc243090971"/>
       <w:r>
         <w:t>2.4.1. Mô hình dữ liệu đề xuất và đối chiếu HRMS hiện tại</w:t>
       </w:r>
@@ -12223,7 +12419,7 @@
         <w:pStyle w:val="KPITableCaption"/>
         <w:keepNext/>
       </w:pPr>
-      <w:bookmarkStart w:id="38" w:name="_Toc242651591"/>
+      <w:bookmarkStart w:id="38" w:name="_Toc243090988"/>
       <w:r>
         <w:t>Bảng 2.1. Mô hình dữ liệu 24 bảng đề xuất, không phải lược đồ HRMS hiện tại</w:t>
       </w:r>
@@ -12256,6 +12452,7 @@
       </w:tblGrid>
       <w:tr>
         <w:trPr>
+          <w:cantSplit/>
           <w:tblHeader/>
         </w:trPr>
         <w:tc>
@@ -12422,6 +12619,9 @@
         </w:tc>
       </w:tr>
       <w:tr>
+        <w:trPr>
+          <w:cantSplit/>
+        </w:trPr>
         <w:tc>
           <w:tcPr>
             <w:tcW w:w="1008" w:type="dxa"/>
@@ -12511,7 +12711,7 @@
                 <w:sz w:val="24"/>
                 <w:szCs w:val="22"/>
               </w:rPr>
-              <w:t>Danh khoản người dùng, mã nhân viên hoặc công chức, mật khẩu mã hóa</w:t>
+              <w:t>Tài khoản người dùng, mã nhân viên hoặc công chức, mật khẩu mã hóa</w:t>
             </w:r>
           </w:p>
         </w:tc>
@@ -12579,6 +12779,9 @@
         </w:tc>
       </w:tr>
       <w:tr>
+        <w:trPr>
+          <w:cantSplit/>
+        </w:trPr>
         <w:tc>
           <w:tcPr>
             <w:tcW w:w="1008" w:type="dxa"/>
@@ -12736,6 +12939,9 @@
         </w:tc>
       </w:tr>
       <w:tr>
+        <w:trPr>
+          <w:cantSplit/>
+        </w:trPr>
         <w:tc>
           <w:tcPr>
             <w:tcW w:w="1008" w:type="dxa"/>
@@ -12894,6 +13100,9 @@
         </w:tc>
       </w:tr>
       <w:tr>
+        <w:trPr>
+          <w:cantSplit/>
+        </w:trPr>
         <w:tc>
           <w:tcPr>
             <w:tcW w:w="1008" w:type="dxa"/>
@@ -13051,6 +13260,9 @@
         </w:tc>
       </w:tr>
       <w:tr>
+        <w:trPr>
+          <w:cantSplit/>
+        </w:trPr>
         <w:tc>
           <w:tcPr>
             <w:tcW w:w="1008" w:type="dxa"/>
@@ -13208,6 +13420,9 @@
         </w:tc>
       </w:tr>
       <w:tr>
+        <w:trPr>
+          <w:cantSplit/>
+        </w:trPr>
         <w:tc>
           <w:tcPr>
             <w:tcW w:w="1008" w:type="dxa"/>
@@ -13365,6 +13580,9 @@
         </w:tc>
       </w:tr>
       <w:tr>
+        <w:trPr>
+          <w:cantSplit/>
+        </w:trPr>
         <w:tc>
           <w:tcPr>
             <w:tcW w:w="1008" w:type="dxa"/>
@@ -13522,6 +13740,9 @@
         </w:tc>
       </w:tr>
       <w:tr>
+        <w:trPr>
+          <w:cantSplit/>
+        </w:trPr>
         <w:tc>
           <w:tcPr>
             <w:tcW w:w="1008" w:type="dxa"/>
@@ -13679,6 +13900,9 @@
         </w:tc>
       </w:tr>
       <w:tr>
+        <w:trPr>
+          <w:cantSplit/>
+        </w:trPr>
         <w:tc>
           <w:tcPr>
             <w:tcW w:w="1008" w:type="dxa"/>
@@ -13836,6 +14060,9 @@
         </w:tc>
       </w:tr>
       <w:tr>
+        <w:trPr>
+          <w:cantSplit/>
+        </w:trPr>
         <w:tc>
           <w:tcPr>
             <w:tcW w:w="1008" w:type="dxa"/>
@@ -13993,6 +14220,9 @@
         </w:tc>
       </w:tr>
       <w:tr>
+        <w:trPr>
+          <w:cantSplit/>
+        </w:trPr>
         <w:tc>
           <w:tcPr>
             <w:tcW w:w="1008" w:type="dxa"/>
@@ -14150,6 +14380,9 @@
         </w:tc>
       </w:tr>
       <w:tr>
+        <w:trPr>
+          <w:cantSplit/>
+        </w:trPr>
         <w:tc>
           <w:tcPr>
             <w:tcW w:w="1008" w:type="dxa"/>
@@ -14307,6 +14540,9 @@
         </w:tc>
       </w:tr>
       <w:tr>
+        <w:trPr>
+          <w:cantSplit/>
+        </w:trPr>
         <w:tc>
           <w:tcPr>
             <w:tcW w:w="1008" w:type="dxa"/>
@@ -14334,6 +14570,7 @@
                 <w:sz w:val="24"/>
                 <w:szCs w:val="22"/>
               </w:rPr>
+              <w:lastRenderedPageBreak/>
               <w:t>13</w:t>
             </w:r>
           </w:p>
@@ -14396,15 +14633,7 @@
                 <w:sz w:val="24"/>
                 <w:szCs w:val="22"/>
               </w:rPr>
-              <w:t xml:space="preserve">Hồ sơ đăng ký đề án đổi mới sáng tạo </w:t>
-            </w:r>
-            <w:r>
-              <w:rPr>
-                <w:sz w:val="24"/>
-                <w:szCs w:val="22"/>
-              </w:rPr>
-              <w:lastRenderedPageBreak/>
-              <w:t>theo Kết luận 14-KL/TW</w:t>
+              <w:t>Hồ sơ đăng ký đề án đổi mới sáng tạo theo Kết luận 14-KL/TW</w:t>
             </w:r>
           </w:p>
         </w:tc>
@@ -14435,7 +14664,6 @@
                 <w:sz w:val="24"/>
                 <w:szCs w:val="22"/>
               </w:rPr>
-              <w:lastRenderedPageBreak/>
               <w:t>id (UUID)</w:t>
             </w:r>
           </w:p>
@@ -14473,6 +14701,9 @@
         </w:tc>
       </w:tr>
       <w:tr>
+        <w:trPr>
+          <w:cantSplit/>
+        </w:trPr>
         <w:tc>
           <w:tcPr>
             <w:tcW w:w="1008" w:type="dxa"/>
@@ -14630,6 +14861,9 @@
         </w:tc>
       </w:tr>
       <w:tr>
+        <w:trPr>
+          <w:cantSplit/>
+        </w:trPr>
         <w:tc>
           <w:tcPr>
             <w:tcW w:w="1008" w:type="dxa"/>
@@ -14787,6 +15021,9 @@
         </w:tc>
       </w:tr>
       <w:tr>
+        <w:trPr>
+          <w:cantSplit/>
+        </w:trPr>
         <w:tc>
           <w:tcPr>
             <w:tcW w:w="1008" w:type="dxa"/>
@@ -14944,6 +15181,9 @@
         </w:tc>
       </w:tr>
       <w:tr>
+        <w:trPr>
+          <w:cantSplit/>
+        </w:trPr>
         <w:tc>
           <w:tcPr>
             <w:tcW w:w="1008" w:type="dxa"/>
@@ -15101,6 +15341,9 @@
         </w:tc>
       </w:tr>
       <w:tr>
+        <w:trPr>
+          <w:cantSplit/>
+        </w:trPr>
         <w:tc>
           <w:tcPr>
             <w:tcW w:w="1008" w:type="dxa"/>
@@ -15258,6 +15501,9 @@
         </w:tc>
       </w:tr>
       <w:tr>
+        <w:trPr>
+          <w:cantSplit/>
+        </w:trPr>
         <w:tc>
           <w:tcPr>
             <w:tcW w:w="1008" w:type="dxa"/>
@@ -15415,6 +15661,9 @@
         </w:tc>
       </w:tr>
       <w:tr>
+        <w:trPr>
+          <w:cantSplit/>
+        </w:trPr>
         <w:tc>
           <w:tcPr>
             <w:tcW w:w="1008" w:type="dxa"/>
@@ -15572,6 +15821,9 @@
         </w:tc>
       </w:tr>
       <w:tr>
+        <w:trPr>
+          <w:cantSplit/>
+        </w:trPr>
         <w:tc>
           <w:tcPr>
             <w:tcW w:w="1008" w:type="dxa"/>
@@ -15729,6 +15981,9 @@
         </w:tc>
       </w:tr>
       <w:tr>
+        <w:trPr>
+          <w:cantSplit/>
+        </w:trPr>
         <w:tc>
           <w:tcPr>
             <w:tcW w:w="1008" w:type="dxa"/>
@@ -15756,6 +16011,7 @@
                 <w:sz w:val="24"/>
                 <w:szCs w:val="22"/>
               </w:rPr>
+              <w:lastRenderedPageBreak/>
               <w:t>22</w:t>
             </w:r>
           </w:p>
@@ -15886,6 +16142,9 @@
         </w:tc>
       </w:tr>
       <w:tr>
+        <w:trPr>
+          <w:cantSplit/>
+        </w:trPr>
         <w:tc>
           <w:tcPr>
             <w:tcW w:w="1008" w:type="dxa"/>
@@ -15913,7 +16172,6 @@
                 <w:sz w:val="24"/>
                 <w:szCs w:val="22"/>
               </w:rPr>
-              <w:lastRenderedPageBreak/>
               <w:t>23</w:t>
             </w:r>
           </w:p>
@@ -16044,6 +16302,9 @@
         </w:tc>
       </w:tr>
       <w:tr>
+        <w:trPr>
+          <w:cantSplit/>
+        </w:trPr>
         <w:tc>
           <w:tcPr>
             <w:tcW w:w="1008" w:type="dxa"/>
@@ -16213,7 +16474,7 @@
           <w:noProof/>
         </w:rPr>
         <w:drawing>
-          <wp:inline distT="0" distB="0" distL="0" distR="0" wp14:anchorId="30CEE74E" wp14:editId="0C8C7AA6">
+          <wp:inline distT="0" distB="0" distL="0" distR="0" wp14:anchorId="1735175D" wp14:editId="6ACDFC63">
             <wp:extent cx="5532120" cy="3995420"/>
             <wp:effectExtent l="0" t="0" r="0" b="0"/>
             <wp:docPr id="958090147" name="Picture 958090147"/>
@@ -16254,7 +16515,7 @@
         <w:pStyle w:val="KPIFigureCaption"/>
         <w:spacing w:before="40" w:after="180"/>
       </w:pPr>
-      <w:bookmarkStart w:id="39" w:name="_Toc242651603"/>
+      <w:bookmarkStart w:id="39" w:name="_Toc243091000"/>
       <w:r>
         <w:t>Hình 2.9. ERD rút gọn cho dữ liệu KPI doanh nghiệp</w:t>
       </w:r>
@@ -16269,7 +16530,7 @@
       <w:pPr>
         <w:pStyle w:val="mc2"/>
       </w:pPr>
-      <w:bookmarkStart w:id="40" w:name="_Toc242651575"/>
+      <w:bookmarkStart w:id="40" w:name="_Toc243090972"/>
       <w:r>
         <w:t>2.4.2. Giao diện phân hệ đánh giá KPI</w:t>
       </w:r>
@@ -16277,7 +16538,11 @@
     </w:p>
     <w:p>
       <w:r>
-        <w:t>Phân hệ được mở từ menu Phát triển → Đánh giá &amp; Đào tạo → Đánh giá KPI, tại địa chỉ /performance. Trang dùng chung khung giao diện HRMS: menu chức năng bên trái, thanh tìm kiếm và thông báo ở phía trên, đường dẫn điều hướng và vùng thao tác ở giữa. Menu và nút thao tác được bật theo vai trò; hướng dẫn quy trình mở tại /performance-guide.</w:t>
+        <w:t xml:space="preserve">Phân hệ được mở từ menu Phát triển → Đánh giá &amp; Đào tạo → Đánh giá KPI, tại địa chỉ /performance. Trang dùng chung khung giao diện HRMS: menu chức năng bên trái, thanh tìm kiếm và thông báo ở phía trên, đường dẫn điều hướng và vùng thao </w:t>
+      </w:r>
+      <w:r>
+        <w:lastRenderedPageBreak/>
+        <w:t>tác ở giữa. Menu và nút thao tác được bật theo vai trò; hướng dẫn quy trình mở tại /performance-guide.</w:t>
       </w:r>
     </w:p>
     <w:p>
@@ -16289,7 +16554,6 @@
         <w:rPr>
           <w:b/>
         </w:rPr>
-        <w:lastRenderedPageBreak/>
         <w:t>Trang tổng quan đánh giá</w:t>
       </w:r>
     </w:p>
@@ -16312,7 +16576,7 @@
     </w:p>
     <w:p>
       <w:r>
-        <w:t>Trang có các tab Mục tiêu KRA, Biểu mẫu chuẩn, Quy ước xếp loại và Chu kỳ đánh giá; chế độ khu vực công có thêm tab Hiệu chuẩn công vụ cho người có quyền. Thẻ mục tiêu thể hiện người được giao, nội dung và chỉ số đo, thời hạn, trọng số, kết quả/minh chứng và điểm quản lý chấm. Nhân viên cập nhật kết quả, gửi minh chứng; quản lý ghi điểm cho mục tiêu thuộc phạm vi phụ trách.</w:t>
+        <w:t>Trang có các thẻ Mục tiêu KRA, Biểu mẫu chuẩn, Quy ước xếp loại và Chu kỳ đánh giá; chế độ khu vực công có thêm Hiệu chuẩn công vụ cho người có quyền. Mục tiêu lưu chỉ số đo, mức cần đạt, chiều đo, trọng số, kết quả và minh chứng. Quản lý xác nhận kết quả và ghi giải trình; hệ thống tính điểm chỉ tiêu định lượng, còn chỉ tiêu định tính dùng điểm chấm theo bảng tiêu chí đã thống nhất.</w:t>
       </w:r>
     </w:p>
     <w:p>
@@ -16364,7 +16628,7 @@
         <w:pStyle w:val="KPITableCaption"/>
         <w:keepNext/>
       </w:pPr>
-      <w:bookmarkStart w:id="41" w:name="_Toc242651592"/>
+      <w:bookmarkStart w:id="41" w:name="_Toc243090989"/>
       <w:r>
         <w:t>Bảng 2.2. Danh mục màn hình và địa chỉ truy cập phân hệ KPI</w:t>
       </w:r>
@@ -16674,7 +16938,7 @@
               <w:rPr>
                 <w:sz w:val="24"/>
               </w:rPr>
-              <w:t>Danh sách mục tiêu theo người và chu kỳ; mỗi mục tiêu có mô tả, chỉ số đo, thời hạn, trọng số, kết quả/minh chứng và điểm quản lý chấm. Người được giao cập nhật kết quả, minh chứng; quản lý chấm điểm. Tổng trọng số mục tiêu doanh nghiệp phải đủ 100%.</w:t>
+              <w:t>Danh sách mục tiêu theo người và chu kỳ, gồm chỉ số đo, mức cần đạt, chiều đo, thời hạn, trọng số, kết quả và minh chứng. Quản lý xác nhận số liệu, ghi giải trình hoặc chấm điểm định tính. Điểm định lượng được tính theo công thức đã chọn. Tổng trọng số mục tiêu doanh nghiệp phải bằng 100%.</w:t>
             </w:r>
           </w:p>
         </w:tc>
@@ -17286,10 +17550,10 @@
           <w:noProof/>
         </w:rPr>
         <w:drawing>
-          <wp:inline distT="0" distB="0" distL="0" distR="0" wp14:anchorId="0449E795" wp14:editId="2245F83A">
-            <wp:extent cx="5897880" cy="4820600"/>
+          <wp:inline distT="0" distB="0" distL="0" distR="0" wp14:anchorId="7B58453E" wp14:editId="04654F4B">
+            <wp:extent cx="5580000" cy="3100000"/>
             <wp:effectExtent l="0" t="0" r="0" b="0"/>
-            <wp:docPr id="958090070" name="Picture 958090070"/>
+            <wp:docPr id="958090148" name="Picture 958090148"/>
             <wp:cNvGraphicFramePr>
               <a:graphicFrameLocks xmlns:a="http://schemas.openxmlformats.org/drawingml/2006/main" noChangeAspect="1"/>
             </wp:cNvGraphicFramePr>
@@ -17297,7 +17561,7 @@
               <a:graphicData uri="http://schemas.openxmlformats.org/drawingml/2006/picture">
                 <pic:pic xmlns:pic="http://schemas.openxmlformats.org/drawingml/2006/picture">
                   <pic:nvPicPr>
-                    <pic:cNvPr id="0" name="performance-live.png"/>
+                    <pic:cNvPr id="0" name="ui_performance_20261017.png"/>
                     <pic:cNvPicPr/>
                   </pic:nvPicPr>
                   <pic:blipFill>
@@ -17309,7 +17573,7 @@
                   <pic:spPr>
                     <a:xfrm>
                       <a:off x="0" y="0"/>
-                      <a:ext cx="5897880" cy="4820600"/>
+                      <a:ext cx="5580000" cy="3100000"/>
                     </a:xfrm>
                     <a:prstGeom prst="rect">
                       <a:avLst/>
@@ -17327,7 +17591,7 @@
         <w:pStyle w:val="KPIFigureCaption"/>
       </w:pPr>
       <w:bookmarkStart w:id="42" w:name="_Toc242620195"/>
-      <w:bookmarkStart w:id="43" w:name="_Toc242651604"/>
+      <w:bookmarkStart w:id="43" w:name="_Toc243091001"/>
       <w:r>
         <w:t>Hình 2.10. Trang tổng quan phân hệ đánh giá KPI</w:t>
       </w:r>
@@ -17366,7 +17630,7 @@
           <w:noProof/>
         </w:rPr>
         <w:drawing>
-          <wp:inline distT="0" distB="0" distL="0" distR="0" wp14:anchorId="71508C47" wp14:editId="3A227D60">
+          <wp:inline distT="0" distB="0" distL="0" distR="0" wp14:anchorId="3D9F95C9" wp14:editId="2E4219EF">
             <wp:extent cx="5897880" cy="5044669"/>
             <wp:effectExtent l="0" t="0" r="0" b="0"/>
             <wp:docPr id="958090071" name="Picture 958090071"/>
@@ -17407,7 +17671,7 @@
         <w:pStyle w:val="KPIFigureCaption"/>
       </w:pPr>
       <w:bookmarkStart w:id="44" w:name="_Toc242620196"/>
-      <w:bookmarkStart w:id="45" w:name="_Toc242651605"/>
+      <w:bookmarkStart w:id="45" w:name="_Toc243091002"/>
       <w:r>
         <w:t>Hình 2.11. Danh sách chu kỳ đánh giá KPI</w:t>
       </w:r>
@@ -17446,10 +17710,10 @@
           <w:noProof/>
         </w:rPr>
         <w:drawing>
-          <wp:inline distT="0" distB="0" distL="0" distR="0" wp14:anchorId="58308FD5" wp14:editId="5A0AD4EA">
-            <wp:extent cx="5897880" cy="4965409"/>
+          <wp:inline distT="0" distB="0" distL="0" distR="0" wp14:anchorId="38E9BE77" wp14:editId="7A3CB07F">
+            <wp:extent cx="5580000" cy="3100000"/>
             <wp:effectExtent l="0" t="0" r="0" b="0"/>
-            <wp:docPr id="958090072" name="Picture 958090072"/>
+            <wp:docPr id="958090149" name="Picture 958090149"/>
             <wp:cNvGraphicFramePr>
               <a:graphicFrameLocks xmlns:a="http://schemas.openxmlformats.org/drawingml/2006/main" noChangeAspect="1"/>
             </wp:cNvGraphicFramePr>
@@ -17457,11 +17721,11 @@
               <a:graphicData uri="http://schemas.openxmlformats.org/drawingml/2006/picture">
                 <pic:pic xmlns:pic="http://schemas.openxmlformats.org/drawingml/2006/picture">
                   <pic:nvPicPr>
-                    <pic:cNvPr id="0" name="performance-goals.png"/>
+                    <pic:cNvPr id="0" name="ui_performance_20261017.png"/>
                     <pic:cNvPicPr/>
                   </pic:nvPicPr>
                   <pic:blipFill>
-                    <a:blip r:embed="rId19"/>
+                    <a:blip r:embed="rId17"/>
                     <a:stretch>
                       <a:fillRect/>
                     </a:stretch>
@@ -17469,7 +17733,7 @@
                   <pic:spPr>
                     <a:xfrm>
                       <a:off x="0" y="0"/>
-                      <a:ext cx="5897880" cy="4965409"/>
+                      <a:ext cx="5580000" cy="3100000"/>
                     </a:xfrm>
                     <a:prstGeom prst="rect">
                       <a:avLst/>
@@ -17487,7 +17751,7 @@
         <w:pStyle w:val="KPIFigureCaption"/>
       </w:pPr>
       <w:bookmarkStart w:id="46" w:name="_Toc242620197"/>
-      <w:bookmarkStart w:id="47" w:name="_Toc242651606"/>
+      <w:bookmarkStart w:id="47" w:name="_Toc243091003"/>
       <w:r>
         <w:t>Hình 2.12. Danh sách mục tiêu KRA/KPI</w:t>
       </w:r>
@@ -17526,7 +17790,7 @@
           <w:noProof/>
         </w:rPr>
         <w:drawing>
-          <wp:inline distT="0" distB="0" distL="0" distR="0" wp14:anchorId="6C96FC7B" wp14:editId="7760F4F7">
+          <wp:inline distT="0" distB="0" distL="0" distR="0" wp14:anchorId="054BED1B" wp14:editId="4CD3C6C0">
             <wp:extent cx="5806440" cy="6522492"/>
             <wp:effectExtent l="0" t="0" r="0" b="0"/>
             <wp:docPr id="958090073" name="Picture 958090073"/>
@@ -17541,7 +17805,7 @@
                     <pic:cNvPicPr/>
                   </pic:nvPicPr>
                   <pic:blipFill>
-                    <a:blip r:embed="rId20"/>
+                    <a:blip r:embed="rId19"/>
                     <a:stretch>
                       <a:fillRect/>
                     </a:stretch>
@@ -17567,7 +17831,7 @@
         <w:pStyle w:val="KPIFigureCaption"/>
       </w:pPr>
       <w:bookmarkStart w:id="48" w:name="_Toc242620198"/>
-      <w:bookmarkStart w:id="49" w:name="_Toc242651607"/>
+      <w:bookmarkStart w:id="49" w:name="_Toc243091004"/>
       <w:r>
         <w:t>Hình 2.13. Thư viện biểu mẫu KPI</w:t>
       </w:r>
@@ -17606,7 +17870,7 @@
           <w:noProof/>
         </w:rPr>
         <w:drawing>
-          <wp:inline distT="0" distB="0" distL="0" distR="0" wp14:anchorId="5DA2925A" wp14:editId="40D572D1">
+          <wp:inline distT="0" distB="0" distL="0" distR="0" wp14:anchorId="737C9873" wp14:editId="0DF178C7">
             <wp:extent cx="4572000" cy="7401942"/>
             <wp:effectExtent l="0" t="0" r="0" b="0"/>
             <wp:docPr id="958090074" name="Picture 958090074"/>
@@ -17621,7 +17885,7 @@
                     <pic:cNvPicPr/>
                   </pic:nvPicPr>
                   <pic:blipFill>
-                    <a:blip r:embed="rId21"/>
+                    <a:blip r:embed="rId20"/>
                     <a:stretch>
                       <a:fillRect/>
                     </a:stretch>
@@ -17647,7 +17911,7 @@
         <w:pStyle w:val="KPIFigureCaption"/>
       </w:pPr>
       <w:bookmarkStart w:id="50" w:name="_Toc242620199"/>
-      <w:bookmarkStart w:id="51" w:name="_Toc242651608"/>
+      <w:bookmarkStart w:id="51" w:name="_Toc243091005"/>
       <w:r>
         <w:t>Hình 2.14. Quy ước chấm điểm và xếp loại KPI</w:t>
       </w:r>
@@ -17686,10 +17950,10 @@
           <w:noProof/>
         </w:rPr>
         <w:drawing>
-          <wp:inline distT="0" distB="0" distL="0" distR="0" wp14:anchorId="57A299E2" wp14:editId="13F66AC4">
-            <wp:extent cx="5760720" cy="6739815"/>
+          <wp:inline distT="0" distB="0" distL="0" distR="0" wp14:anchorId="03B32DA8" wp14:editId="0BEB44D3">
+            <wp:extent cx="5580000" cy="3100000"/>
             <wp:effectExtent l="0" t="0" r="0" b="0"/>
-            <wp:docPr id="958090075" name="Picture 958090075"/>
+            <wp:docPr id="958090150" name="Picture 958090150"/>
             <wp:cNvGraphicFramePr>
               <a:graphicFrameLocks xmlns:a="http://schemas.openxmlformats.org/drawingml/2006/main" noChangeAspect="1"/>
             </wp:cNvGraphicFramePr>
@@ -17697,11 +17961,11 @@
               <a:graphicData uri="http://schemas.openxmlformats.org/drawingml/2006/picture">
                 <pic:pic xmlns:pic="http://schemas.openxmlformats.org/drawingml/2006/picture">
                   <pic:nvPicPr>
-                    <pic:cNvPr id="0" name="performance-guide.png"/>
+                    <pic:cNvPr id="0" name="ui_performance_guide_20261017.png"/>
                     <pic:cNvPicPr/>
                   </pic:nvPicPr>
                   <pic:blipFill>
-                    <a:blip r:embed="rId22"/>
+                    <a:blip r:embed="rId21"/>
                     <a:stretch>
                       <a:fillRect/>
                     </a:stretch>
@@ -17709,7 +17973,7 @@
                   <pic:spPr>
                     <a:xfrm>
                       <a:off x="0" y="0"/>
-                      <a:ext cx="5760720" cy="6739815"/>
+                      <a:ext cx="5580000" cy="3100000"/>
                     </a:xfrm>
                     <a:prstGeom prst="rect">
                       <a:avLst/>
@@ -17727,7 +17991,7 @@
         <w:pStyle w:val="KPIFigureCaption"/>
       </w:pPr>
       <w:bookmarkStart w:id="52" w:name="_Toc242620200"/>
-      <w:bookmarkStart w:id="53" w:name="_Toc242651609"/>
+      <w:bookmarkStart w:id="53" w:name="_Toc243091006"/>
       <w:r>
         <w:t>Hình 2.15. Trang hướng dẫn thao tác đánh giá KPI</w:t>
       </w:r>
@@ -17739,7 +18003,7 @@
         <w:pStyle w:val="mc1"/>
         <w:spacing w:before="180" w:after="80"/>
       </w:pPr>
-      <w:bookmarkStart w:id="54" w:name="_Toc242651576"/>
+      <w:bookmarkStart w:id="54" w:name="_Toc243090973"/>
       <w:r>
         <w:rPr>
           <w:bCs/>
@@ -17758,9 +18022,10 @@
     <w:p>
       <w:pPr>
         <w:pStyle w:val="CHNG"/>
+        <w:pageBreakBefore/>
         <w:jc w:val="both"/>
       </w:pPr>
-      <w:bookmarkStart w:id="55" w:name="_Toc242651577"/>
+      <w:bookmarkStart w:id="55" w:name="_Toc243090974"/>
       <w:r>
         <w:rPr>
           <w:bCs/>
@@ -17778,7 +18043,7 @@
         <w:pStyle w:val="mc1"/>
         <w:spacing w:before="240" w:after="100"/>
       </w:pPr>
-      <w:bookmarkStart w:id="56" w:name="_Toc242651578"/>
+      <w:bookmarkStart w:id="56" w:name="_Toc243090975"/>
       <w:r>
         <w:rPr>
           <w:bCs/>
@@ -17807,7 +18072,7 @@
     </w:p>
     <w:p>
       <w:r>
-        <w:t>Thứ ba: Hoàn thiện hồ sơ phân tích thiết kế gồm 9 sơ đồ UML/kiến trúc và mô hình CSDL 26 bảng. Các tích hợp ERP/MES/IoT, hàng đợi, chống gian lận và hiệu năng chưa được xây dựng hay kiểm chứng.</w:t>
+        <w:t>Thứ ba: Hoàn thiện hồ sơ phân tích thiết kế gồm 9 sơ đồ UML/kiến trúc và mô hình CSDL 24 bảng. Các tích hợp ERP/MES/IoT, hàng đợi, chống gian lận và hiệu năng chưa được xây dựng hay kiểm chứng.</w:t>
       </w:r>
     </w:p>
     <w:p>
@@ -17815,7 +18080,7 @@
         <w:pStyle w:val="mc1"/>
         <w:spacing w:before="240" w:after="100"/>
       </w:pPr>
-      <w:bookmarkStart w:id="57" w:name="_Toc242651579"/>
+      <w:bookmarkStart w:id="57" w:name="_Toc243090976"/>
       <w:r>
         <w:rPr>
           <w:bCs/>
@@ -17832,7 +18097,7 @@
         <w:pStyle w:val="mc2"/>
         <w:spacing w:before="180" w:after="80"/>
       </w:pPr>
-      <w:bookmarkStart w:id="58" w:name="_Toc242651580"/>
+      <w:bookmarkStart w:id="58" w:name="_Toc243090977"/>
       <w:r>
         <w:rPr>
           <w:b/>
@@ -17848,7 +18113,7 @@
         <w:pStyle w:val="KPITableCaption"/>
         <w:keepNext/>
       </w:pPr>
-      <w:bookmarkStart w:id="59" w:name="_Toc242651593"/>
+      <w:bookmarkStart w:id="59" w:name="_Toc243090990"/>
       <w:r>
         <w:t>Bảng 3.1. Kế hoạch triển khai hệ thống trong 16 tuần</w:t>
       </w:r>
@@ -17879,6 +18144,7 @@
       </w:tblGrid>
       <w:tr>
         <w:trPr>
+          <w:cantSplit/>
           <w:tblHeader/>
         </w:trPr>
         <w:tc>
@@ -18015,6 +18281,9 @@
         </w:tc>
       </w:tr>
       <w:tr>
+        <w:trPr>
+          <w:cantSplit/>
+        </w:trPr>
         <w:tc>
           <w:tcPr>
             <w:tcW w:w="2200" w:type="dxa"/>
@@ -18141,6 +18410,9 @@
         </w:tc>
       </w:tr>
       <w:tr>
+        <w:trPr>
+          <w:cantSplit/>
+        </w:trPr>
         <w:tc>
           <w:tcPr>
             <w:tcW w:w="2200" w:type="dxa"/>
@@ -18260,6 +18532,9 @@
         </w:tc>
       </w:tr>
       <w:tr>
+        <w:trPr>
+          <w:cantSplit/>
+        </w:trPr>
         <w:tc>
           <w:tcPr>
             <w:tcW w:w="2200" w:type="dxa"/>
@@ -18386,6 +18661,9 @@
         </w:tc>
       </w:tr>
       <w:tr>
+        <w:trPr>
+          <w:cantSplit/>
+        </w:trPr>
         <w:tc>
           <w:tcPr>
             <w:tcW w:w="2200" w:type="dxa"/>
@@ -18505,6 +18783,9 @@
         </w:tc>
       </w:tr>
       <w:tr>
+        <w:trPr>
+          <w:cantSplit/>
+        </w:trPr>
         <w:tc>
           <w:tcPr>
             <w:tcW w:w="2200" w:type="dxa"/>
@@ -18631,6 +18912,9 @@
         </w:tc>
       </w:tr>
       <w:tr>
+        <w:trPr>
+          <w:cantSplit/>
+        </w:trPr>
         <w:tc>
           <w:tcPr>
             <w:tcW w:w="2200" w:type="dxa"/>
@@ -18750,6 +19034,9 @@
         </w:tc>
       </w:tr>
       <w:tr>
+        <w:trPr>
+          <w:cantSplit/>
+        </w:trPr>
         <w:tc>
           <w:tcPr>
             <w:tcW w:w="2200" w:type="dxa"/>
@@ -18876,6 +19163,9 @@
         </w:tc>
       </w:tr>
       <w:tr>
+        <w:trPr>
+          <w:cantSplit/>
+        </w:trPr>
         <w:tc>
           <w:tcPr>
             <w:tcW w:w="2200" w:type="dxa"/>
@@ -19000,7 +19290,7 @@
         <w:pStyle w:val="mc2"/>
         <w:spacing w:before="180" w:after="80"/>
       </w:pPr>
-      <w:bookmarkStart w:id="60" w:name="_Toc242651581"/>
+      <w:bookmarkStart w:id="60" w:name="_Toc243090978"/>
       <w:r>
         <w:rPr>
           <w:b/>
@@ -19016,7 +19306,7 @@
         <w:pStyle w:val="KPITableCaption"/>
         <w:keepNext/>
       </w:pPr>
-      <w:bookmarkStart w:id="61" w:name="_Toc242651594"/>
+      <w:bookmarkStart w:id="61" w:name="_Toc243090991"/>
       <w:r>
         <w:t>Bảng 3.2. Ma trận nhận diện và quản trị rủi ro triển khai</w:t>
       </w:r>
@@ -19048,6 +19338,7 @@
       </w:tblGrid>
       <w:tr>
         <w:trPr>
+          <w:cantSplit/>
           <w:tblHeader/>
         </w:trPr>
         <w:tc>
@@ -19217,6 +19508,9 @@
         </w:tc>
       </w:tr>
       <w:tr>
+        <w:trPr>
+          <w:cantSplit/>
+        </w:trPr>
         <w:tc>
           <w:tcPr>
             <w:tcW w:w="800" w:type="dxa"/>
@@ -19374,6 +19668,9 @@
         </w:tc>
       </w:tr>
       <w:tr>
+        <w:trPr>
+          <w:cantSplit/>
+        </w:trPr>
         <w:tc>
           <w:tcPr>
             <w:tcW w:w="800" w:type="dxa"/>
@@ -19531,6 +19828,9 @@
         </w:tc>
       </w:tr>
       <w:tr>
+        <w:trPr>
+          <w:cantSplit/>
+        </w:trPr>
         <w:tc>
           <w:tcPr>
             <w:tcW w:w="800" w:type="dxa"/>
@@ -19688,6 +19988,9 @@
         </w:tc>
       </w:tr>
       <w:tr>
+        <w:trPr>
+          <w:cantSplit/>
+        </w:trPr>
         <w:tc>
           <w:tcPr>
             <w:tcW w:w="800" w:type="dxa"/>
@@ -19845,6 +20148,9 @@
         </w:tc>
       </w:tr>
       <w:tr>
+        <w:trPr>
+          <w:cantSplit/>
+        </w:trPr>
         <w:tc>
           <w:tcPr>
             <w:tcW w:w="800" w:type="dxa"/>
@@ -20002,6 +20308,9 @@
         </w:tc>
       </w:tr>
       <w:tr>
+        <w:trPr>
+          <w:cantSplit/>
+        </w:trPr>
         <w:tc>
           <w:tcPr>
             <w:tcW w:w="800" w:type="dxa"/>
@@ -20029,6 +20338,7 @@
                 <w:sz w:val="24"/>
                 <w:szCs w:val="22"/>
               </w:rPr>
+              <w:lastRenderedPageBreak/>
               <w:t>RR-06</w:t>
             </w:r>
           </w:p>
@@ -20060,15 +20370,7 @@
                 <w:sz w:val="24"/>
                 <w:szCs w:val="22"/>
               </w:rPr>
-              <w:t xml:space="preserve">Rò rỉ thông tin đánh giá cá nhân và dữ </w:t>
-            </w:r>
-            <w:r>
-              <w:rPr>
-                <w:sz w:val="24"/>
-                <w:szCs w:val="22"/>
-              </w:rPr>
-              <w:lastRenderedPageBreak/>
-              <w:t>liệu thu nhập nhạy cảm</w:t>
+              <w:t>Rò rỉ thông tin đánh giá cá nhân và dữ liệu thu nhập nhạy cảm</w:t>
             </w:r>
           </w:p>
         </w:tc>
@@ -20099,7 +20401,6 @@
                 <w:sz w:val="24"/>
                 <w:szCs w:val="22"/>
               </w:rPr>
-              <w:lastRenderedPageBreak/>
               <w:t>Thấp</w:t>
             </w:r>
           </w:p>
@@ -20173,7 +20474,7 @@
         <w:pStyle w:val="mc1"/>
         <w:spacing w:before="240" w:after="100"/>
       </w:pPr>
-      <w:bookmarkStart w:id="62" w:name="_Toc242651582"/>
+      <w:bookmarkStart w:id="62" w:name="_Toc243090979"/>
       <w:r>
         <w:rPr>
           <w:bCs/>
@@ -20210,7 +20511,7 @@
         <w:pStyle w:val="mc1"/>
         <w:spacing w:before="240" w:after="100"/>
       </w:pPr>
-      <w:bookmarkStart w:id="63" w:name="_Toc242651583"/>
+      <w:bookmarkStart w:id="63" w:name="_Toc243090980"/>
       <w:r>
         <w:rPr>
           <w:bCs/>
@@ -20272,7 +20573,7 @@
         <w:pStyle w:val="mc1"/>
         <w:spacing w:before="240" w:after="100"/>
       </w:pPr>
-      <w:bookmarkStart w:id="64" w:name="_Toc242651584"/>
+      <w:bookmarkStart w:id="64" w:name="_Toc243090981"/>
       <w:r>
         <w:rPr>
           <w:bCs/>
@@ -20280,17 +20581,14 @@
           <w:sz w:val="28"/>
           <w:szCs w:val="28"/>
         </w:rPr>
+        <w:lastRenderedPageBreak/>
         <w:t>3.5. Đánh giá ưu điểm, hạn chế và khuyến nghị</w:t>
       </w:r>
       <w:bookmarkEnd w:id="64"/>
     </w:p>
     <w:p>
       <w:r>
-        <w:t xml:space="preserve">Thiết kế tách quy tắc, quy trình và căn cứ đánh giá giữa doanh nghiệp với khu vực công. Kết quả KPI gắn với mục tiêu và minh chứng; việc lấy dữ liệu tự động từ </w:t>
-      </w:r>
-      <w:r>
-        <w:lastRenderedPageBreak/>
-        <w:t>ERP, MES, IoT hoặc Một cửa chỉ thực hiện được sau khi có kết nối và kiểm tra nguồn. Nhánh công vụ phân biệt căn cứ cho công chức và viên chức, đồng thời ghi nhận quyết định về tỷ lệ xếp loại; phần mềm chưa thay thế toàn bộ hồ sơ và quy trình của từng cơ quan.</w:t>
+        <w:t>Thiết kế tách quy tắc, quy trình và căn cứ đánh giá giữa doanh nghiệp với khu vực công. Kết quả KPI gắn với mục tiêu và minh chứng; việc lấy dữ liệu tự động từ ERP, MES, IoT hoặc Một cửa chỉ thực hiện được sau khi có kết nối và kiểm tra nguồn. Nhánh công vụ phân biệt căn cứ cho công chức và viên chức, đồng thời ghi nhận quyết định về tỷ lệ xếp loại; phần mềm chưa thay thế toàn bộ hồ sơ và quy trình của từng cơ quan.</w:t>
       </w:r>
     </w:p>
     <w:p>
@@ -20308,7 +20606,7 @@
         <w:pStyle w:val="mc1"/>
         <w:spacing w:before="180" w:after="80"/>
       </w:pPr>
-      <w:bookmarkStart w:id="65" w:name="_Toc242651585"/>
+      <w:bookmarkStart w:id="65" w:name="_Toc243090982"/>
       <w:r>
         <w:rPr>
           <w:bCs/>
@@ -20327,9 +20625,10 @@
     <w:p>
       <w:pPr>
         <w:pStyle w:val="PHN"/>
+        <w:pageBreakBefore/>
         <w:spacing w:before="240" w:after="180"/>
       </w:pPr>
-      <w:bookmarkStart w:id="66" w:name="_Toc242651586"/>
+      <w:bookmarkStart w:id="66" w:name="_Toc243090983"/>
       <w:r>
         <w:rPr>
           <w:bCs/>
@@ -20337,6 +20636,7 @@
           <w:sz w:val="30"/>
           <w:szCs w:val="30"/>
         </w:rPr>
+        <w:lastRenderedPageBreak/>
         <w:t>TÀI LIỆU THAM KHẢO</w:t>
       </w:r>
       <w:bookmarkEnd w:id="66"/>
@@ -20413,7 +20713,6 @@
         <w:ind w:firstLine="450"/>
       </w:pPr>
       <w:r>
-        <w:lastRenderedPageBreak/>
         <w:t>7. Cổng Thông tin điện tử Chính phủ, toàn văn và thông tin hướng dẫn thi hành Nghị định 335/2025/NĐ-CP và Nghị định 233/2026/NĐ-CP (truy cập ngày 05/10/2026).</w:t>
       </w:r>
     </w:p>
@@ -20480,6 +20779,7 @@
         <w:ind w:firstLine="450"/>
       </w:pPr>
       <w:r>
+        <w:lastRenderedPageBreak/>
         <w:t>13. Dennis, A., Wixom, B. H., &amp; Tegarden, D. (2015), Systems Analysis and Design: An Object-Oriented Approach with UML, 5th Edition, John Wiley &amp; Sons, New York.</w:t>
       </w:r>
     </w:p>
@@ -20492,11 +20792,248 @@
         <w:t>14. Sommerville, I. (2016), Software Engineering, 10th Edition, Pearson Education, London.</w:t>
       </w:r>
     </w:p>
+    <w:p>
+      <w:pPr>
+        <w:sectPr>
+          <w:footerReference w:type="default" r:id="rId22"/>
+          <w:pgSz w:w="11906" w:h="16838"/>
+          <w:pgMar w:top="1134" w:right="1134" w:bottom="1134" w:left="1701" w:header="708" w:footer="708" w:gutter="0"/>
+          <w:pgNumType w:start="1"/>
+          <w:cols w:space="720"/>
+          <w:docGrid w:linePitch="360"/>
+        </w:sectPr>
+      </w:pPr>
+    </w:p>
+    <w:p>
+      <w:pPr>
+        <w:pStyle w:val="HRAuditHeading"/>
+      </w:pPr>
+      <w:r>
+        <w:lastRenderedPageBreak/>
+        <w:t>PHỤ LỤC ĐỐI CHIẾU HỆ THỐNG NGÀY 17 THÁNG 10 NĂM 2026</w:t>
+      </w:r>
+    </w:p>
+    <w:p>
+      <w:pPr>
+        <w:pStyle w:val="HRAuditHeading"/>
+      </w:pPr>
+      <w:r>
+        <w:t>Phạm vi và dữ liệu vận hành</w:t>
+      </w:r>
+    </w:p>
+    <w:p>
+      <w:pPr>
+        <w:pStyle w:val="HRAuditBody"/>
+      </w:pPr>
+      <w:r>
+        <w:t>Phụ lục cập nhật những nội dung đã triển khai sau phiên bản báo cáo trước. Phạm vi vận hành là doanh nghiệp trong bộ dữ liệu mô phỏng học phần. Số liệu đối chiếu được ghi tại doc/BAO_CAO_RA_SOAT_HR_20261016.md và danh mục kiểm tra từng tài khoản kèm theo; các mô hình mở rộng trong báo cáo vẫn là thiết kế đề xuất nếu chưa có bằng chứng triển khai.</w:t>
+      </w:r>
+    </w:p>
+    <w:p>
+      <w:pPr>
+        <w:pStyle w:val="HRAuditBody"/>
+      </w:pPr>
+      <w:r>
+        <w:t>Hồ sơ demo mang trạng thái Đã xác minh, có thời điểm, tài khoản xác minh và nguồn ACADEMIC_SIMULATION. Căn cước được kiểm tra cấu trúc mã giới tính, thế kỷ và năm sinh với hồ sơ; không coi dữ liệu mô phỏng là kết quả xác thực với cơ quan nhà nước. Mã nhân viên, ngày sinh, nơi cư trú, nhận lương và mã BHXH được hoàn thiện để quy trình chạy xuyên suốt.</w:t>
+      </w:r>
+    </w:p>
+    <w:p>
+      <w:pPr>
+        <w:pStyle w:val="HRAuditHeading"/>
+      </w:pPr>
+      <w:r>
+        <w:t>Hợp đồng và nguồn lương</w:t>
+      </w:r>
+    </w:p>
+    <w:p>
+      <w:pPr>
+        <w:pStyle w:val="HRAuditBody"/>
+      </w:pPr>
+      <w:r>
+        <w:t>Mỗi nhân sự đang làm có hợp đồng hiệu lực theo ngày và bản điện tử riêng. Hợp đồng thể hiện bên giao kết, định danh người lao động, công việc, địa điểm, thời hạn, mức lương, phụ cấp, kỳ trả, nâng lương, thời giờ, bảo hộ, bảo hiểm và đào tạo. Bản in dùng khổ A4, phông Times New Roman và khu vực ký; nội dung phụ cấp đọc từ cùng cấu hình mà bộ tính lương sử dụng.</w:t>
+      </w:r>
+    </w:p>
+    <w:p>
+      <w:pPr>
+        <w:pStyle w:val="HRAuditBody"/>
+      </w:pPr>
+      <w:r>
+        <w:t>Phụ lục điều chỉnh lương giữ nguyên hợp đồng gốc và ngày hết hạn; chỉ phụ lục tiền lương cũ bị đóng khi có bản thay thế. Phụ lục không biến hợp đồng ngắn hạn thành hợp đồng dài hạn để đổi chế độ khấu trừ thuế. Ngưỡng khấu trừ 10% lưu theo hiệu lực chính sách: 2 triệu đồng/lần trước 01/07/2026, 5 triệu đồng/lần từ 01/07/2026. Phiếu lương đã khóa/chi trả giữ nguyên dữ liệu đã chốt, không bị tính lại bởi thao tác đồng bộ hồ sơ.</w:t>
+      </w:r>
+    </w:p>
+    <w:p>
+      <w:pPr>
+        <w:pStyle w:val="HRAuditHeading"/>
+      </w:pPr>
+      <w:r>
+        <w:t>Điều động chức vụ khen thưởng và kỷ luật</w:t>
+      </w:r>
+    </w:p>
+    <w:p>
+      <w:pPr>
+        <w:pStyle w:val="HRAuditBody"/>
+      </w:pPr>
+      <w:r>
+        <w:t>Bổ nhiệm, miễn nhiệm và bãi nhiệm được phân biệt với chấm dứt quan hệ lao động. Thay đổi chức vụ cập nhật chức danh, đơn vị và lịch sử bổ nhiệm theo ngày hiệu lực; không tự khóa tài khoản. Các thay đổi lương cần quyết định riêng trong khung đã duyệt. Quyết định khen thưởng và kỷ luật có hiệu lực được nối vào lịch sử hồ sơ.</w:t>
+      </w:r>
+    </w:p>
+    <w:p>
+      <w:pPr>
+        <w:pStyle w:val="HRAuditBody"/>
+      </w:pPr>
+      <w:r>
+        <w:t>Kỷ luật lao động doanh nghiệp gồm khiển trách, kéo dài thời hạn nâng lương tối đa 6 tháng, cách chức và sa thải. Không phạt tiền/cắt lương thay kỷ luật. Phê duyệt yêu cầu số quyết định, căn cứ, hồ sơ minh chứng và xác nhận thủ tục. Sa thải và thôi việc nối quy trình bàn giao, đóng hợp đồng, thu hồi phiên đăng nhập; không đồng nhất miễn nhiệm chức vụ với sa thải.</w:t>
+      </w:r>
+    </w:p>
+    <w:p>
+      <w:r>
+        <w:br w:type="page"/>
+      </w:r>
+    </w:p>
+    <w:p>
+      <w:pPr>
+        <w:pStyle w:val="HRAuditHeading"/>
+      </w:pPr>
+      <w:r>
+        <w:lastRenderedPageBreak/>
+        <w:t>QUY ƯỚC KPI VÀ BẰNG CHỨNG KIỂM TRA</w:t>
+      </w:r>
+    </w:p>
+    <w:p>
+      <w:pPr>
+        <w:pStyle w:val="HRAuditHeading"/>
+      </w:pPr>
+      <w:r>
+        <w:t>Cách đo đã triển khai</w:t>
+      </w:r>
+    </w:p>
+    <w:p>
+      <w:pPr>
+        <w:pStyle w:val="HRAuditBody"/>
+      </w:pPr>
+      <w:r>
+        <w:t>Càng cao càng tốt: điểm = min(100, thực tế / mục tiêu × 100), mục tiêu phải lớn hơn 0.</w:t>
+      </w:r>
+    </w:p>
+    <w:p>
+      <w:pPr>
+        <w:pStyle w:val="HRAuditBody"/>
+      </w:pPr>
+      <w:r>
+        <w:t>Càng thấp càng tốt: điểm = min(100, mục tiêu / thực tế × 100). Nếu mục tiêu = 0, kết quả = 0 đạt 100 điểm, còn lại 0; nếu mục tiêu &gt; 0 và thực tế = 0, điểm = 100.</w:t>
+      </w:r>
+    </w:p>
+    <w:p>
+      <w:pPr>
+        <w:pStyle w:val="HRAuditBody"/>
+      </w:pPr>
+      <w:r>
+        <w:t>Đạt/không đạt: mục tiêu 1; thực tế 1 đạt 100 điểm, thực tế 0 đạt 0 điểm. Không nhận giá trị trung gian.</w:t>
+      </w:r>
+    </w:p>
+    <w:p>
+      <w:pPr>
+        <w:pStyle w:val="HRAuditBody"/>
+      </w:pPr>
+      <w:r>
+        <w:t>Định tính: quản lý chấm theo bảng tiêu chí chấm điểm đã thống nhất, có minh chứng và giải trình. Điểm kỳ = tổng (điểm mục tiêu × trọng số / 100); mọi trọng số phải dương và tổng bằng 100%.</w:t>
+      </w:r>
+    </w:p>
+    <w:p>
+      <w:pPr>
+        <w:pStyle w:val="HRAuditBody"/>
+      </w:pPr>
+      <w:r>
+        <w:t>Ví dụ: chỉ tiêu tăng có mục tiêu 100, thực tế 80 cho 80 điểm; chỉ tiêu giảm mục tiêu 20, thực tế 25 cũng cho 80 điểm. Với trọng số 40%, 35%, 25% và điểm 90, 80, 100 thì điểm kỳ là 36 + 28 + 25 = 89. Không dùng công thức tham khảo trần 120 để giải thích điểm của phiên bản đang chạy.</w:t>
+      </w:r>
+    </w:p>
+    <w:p>
+      <w:pPr>
+        <w:pStyle w:val="HRAuditHeading"/>
+      </w:pPr>
+      <w:r>
+        <w:t>Phạm vi của chuẩn quốc tế và biểu mẫu Việt Nam</w:t>
+      </w:r>
+    </w:p>
+    <w:p>
+      <w:pPr>
+        <w:pStyle w:val="HRAuditBody"/>
+      </w:pPr>
+      <w:r>
+        <w:t>ISO 30414:2025 cung cấp yêu cầu và khuyến nghị báo cáo vốn nhân lực; ISO 30405:2023 hướng dẫn tuyển dụng. Việc tham khảo các phạm vi này không đồng nghĩa phần mềm được chứng nhận ISO. Không có một công thức KPI duy nhất bắt buộc cho mọi vị trí. Quy ước chiều đo, giới hạn điểm và xếp loại trong bản demo là chính sách đánh giá đã khai báo.</w:t>
+      </w:r>
+    </w:p>
+    <w:p>
+      <w:pPr>
+        <w:pStyle w:val="HRAuditBody"/>
+      </w:pPr>
+      <w:r>
+        <w:t>Nội dung hợp đồng lao động đối chiếu Điều 21 Bộ luật Lao động và Điều 3 Thông tư 10/2020/TT-BLĐTBXH; mẫu doanh nghiệp không được gọi là mẫu pháp quy thống nhất khi pháp luật không ấn định một mẫu chung. Mẫu 2C-BNV trong nhánh công vụ vẫn là tham chiếu lịch sử, không áp dụng cho hồ sơ doanh nghiệp. Nhánh công vụ cần kiểm chứng riêng theo loại cán bộ, công chức hoặc viên chức.</w:t>
+      </w:r>
+    </w:p>
+    <w:p>
+      <w:pPr>
+        <w:pStyle w:val="HRAuditHeading"/>
+      </w:pPr>
+      <w:r>
+        <w:t>Kiểm tra và nguồn đối chiếu</w:t>
+      </w:r>
+    </w:p>
+    <w:p>
+      <w:pPr>
+        <w:pStyle w:val="HRAuditBody"/>
+      </w:pPr>
+      <w:r>
+        <w:t>Kiểm tra kiểu dữ liệu và build cả API/giao diện; kiểm thử đơn vị và tích hợp trên PostgreSQL riêng; kiểm tra chạy lại đồng bộ không tạo trùng; đối chiếu từng tài khoản và tổng phiếu/kỳ lương. Kết luận đạt chỉ áp dụng những kiểm tra được ghi trong báo cáo đối chiếu, không thay thế kiểm định mọi tình huống vận hành thực tế.</w:t>
+      </w:r>
+    </w:p>
+    <w:p>
+      <w:pPr>
+        <w:pStyle w:val="HRAuditBody"/>
+      </w:pPr>
+      <w:r>
+        <w:rPr>
+          <w:sz w:val="20"/>
+        </w:rPr>
+        <w:t>Bộ luật Lao động 45/2019/QH14: https://vanban.chinhphu.vn/?docid=198540&amp;pageid=27160</w:t>
+      </w:r>
+    </w:p>
+    <w:p>
+      <w:pPr>
+        <w:pStyle w:val="HRAuditBody"/>
+      </w:pPr>
+      <w:r>
+        <w:rPr>
+          <w:sz w:val="20"/>
+        </w:rPr>
+        <w:t>Thông tư 10/2020/TT-BLĐTBXH: https://vbpl.vn/botuphap/Pages/vbpq-toanvan.aspx?ItemID=146696</w:t>
+      </w:r>
+    </w:p>
+    <w:p>
+      <w:pPr>
+        <w:pStyle w:val="HRAuditBody"/>
+      </w:pPr>
+      <w:r>
+        <w:rPr>
+          <w:sz w:val="20"/>
+        </w:rPr>
+        <w:t>ISO 30414:2025: https://www.iso.org/standard/30414</w:t>
+      </w:r>
+    </w:p>
+    <w:p>
+      <w:pPr>
+        <w:pStyle w:val="HRAuditBody"/>
+      </w:pPr>
+      <w:r>
+        <w:rPr>
+          <w:sz w:val="20"/>
+        </w:rPr>
+        <w:t>ISO 30405:2023: https://www.iso.org/standard/79488.html</w:t>
+      </w:r>
+    </w:p>
     <w:sectPr>
-      <w:footerReference w:type="default" r:id="rId23"/>
       <w:pgSz w:w="11906" w:h="16838"/>
-      <w:pgMar w:top="1134" w:right="1134" w:bottom="1134" w:left="1701" w:header="708" w:footer="708" w:gutter="0"/>
-      <w:pgNumType w:start="1"/>
+      <w:pgMar w:top="1134" w:right="850" w:bottom="1134" w:left="1701" w:header="708" w:footer="708" w:gutter="0"/>
       <w:cols w:space="720"/>
       <w:docGrid w:linePitch="360"/>
     </w:sectPr>
@@ -21529,6 +22066,24 @@
       <w:ind w:firstLine="0"/>
     </w:pPr>
   </w:style>
+  <w:style w:type="paragraph" w:customStyle="1" w:styleId="HRAuditHeading">
+    <w:name w:val="HR Audit Heading"/>
+    <w:pPr>
+      <w:keepNext/>
+      <w:spacing w:after="120" w:line="276" w:lineRule="auto"/>
+    </w:pPr>
+    <w:rPr>
+      <w:b/>
+      <w:sz w:val="28"/>
+    </w:rPr>
+  </w:style>
+  <w:style w:type="paragraph" w:customStyle="1" w:styleId="HRAuditBody">
+    <w:name w:val="HR Audit Body"/>
+    <w:pPr>
+      <w:spacing w:after="120" w:line="276" w:lineRule="auto"/>
+      <w:jc w:val="both"/>
+    </w:pPr>
+  </w:style>
 </w:styles>
 </file>
 

</xml_diff>